<commit_message>
docs: refine report prose, redesign cover and verify reported results
</commit_message>
<xml_diff>
--- a/docs/assessment/FormBridge-AT2-Report.docx
+++ b/docs/assessment/FormBridge-AT2-Report.docx
@@ -4,66 +4,79 @@
   <w:body>
     <w:p>
       <w:pPr>
-        <w:spacing w:after="560"/>
+        <w:spacing w:after="100"/>
       </w:pPr>
+      <w:r>
+        <w:rPr>
+          <w:rFonts w:ascii="Arial" w:hAnsi="Arial"/>
+          <w:b/>
+          <w:color w:val="203D35"/>
+          <w:sz w:val="18"/>
+        </w:rPr>
+        <w:t>36118   /   APPLIED NATURAL LANGUAGE PROCESSING</w:t>
+      </w:r>
     </w:p>
     <w:p>
       <w:pPr>
-        <w:pStyle w:val="Heading1"/>
-        <w:spacing w:before="300" w:after="280"/>
+        <w:spacing w:after="580"/>
       </w:pPr>
       <w:r>
         <w:rPr>
-          <w:sz w:val="94"/>
+          <w:rFonts w:ascii="Arial" w:hAnsi="Arial"/>
+          <w:color w:val="526258"/>
+          <w:sz w:val="18"/>
+        </w:rPr>
+        <w:t>SPRING 2026     ·     ASSESSMENT TASK 2, PART B</w:t>
+      </w:r>
+    </w:p>
+    <w:p>
+      <w:pPr>
+        <w:spacing w:after="180"/>
+      </w:pPr>
+      <w:r>
+        <w:rPr>
+          <w:rFonts w:ascii="Georgia" w:hAnsi="Georgia"/>
+          <w:color w:val="203D35"/>
+          <w:sz w:val="108"/>
         </w:rPr>
         <w:t>FormBridge</w:t>
       </w:r>
     </w:p>
     <w:p>
       <w:pPr>
-        <w:pStyle w:val="Heading2"/>
-        <w:spacing w:after="360"/>
+        <w:spacing w:after="440" w:line="259" w:lineRule="auto"/>
       </w:pPr>
       <w:r>
         <w:rPr>
           <w:rFonts w:ascii="Georgia" w:hAnsi="Georgia"/>
-          <w:b w:val="0"/>
+          <w:color w:val="203D35"/>
           <w:sz w:val="38"/>
         </w:rPr>
         <w:t>Evidence-linked dialogue state tracking for restaurant booking briefs</w:t>
       </w:r>
     </w:p>
     <w:p>
+      <w:pPr>
+        <w:spacing w:after="180"/>
+      </w:pPr>
       <w:r>
         <w:rPr>
+          <w:rFonts w:ascii="Arial" w:hAnsi="Arial"/>
           <w:b/>
+          <w:color w:val="526258"/>
+          <w:sz w:val="18"/>
         </w:rPr>
-        <w:t>36118 Applied Natural Language Processing · Spring 2026</w:t>
-      </w:r>
-    </w:p>
-    <w:p>
-      <w:r>
-        <w:rPr>
-          <w:b/>
-        </w:rPr>
-        <w:t>Assessment Task 2, Part B · Group technical report</w:t>
-      </w:r>
-    </w:p>
-    <w:p>
-      <w:r>
-        <w:t>A restaurant booking desk that keeps the conversation, the current request and the human review together.</w:t>
+        <w:t>GROUP TECHNICAL REPORT</w:t>
       </w:r>
     </w:p>
     <w:p>
       <w:pPr>
-        <w:keepNext/>
-        <w:spacing w:before="80" w:after="60"/>
-        <w:jc w:val="center"/>
+        <w:spacing w:after="160"/>
       </w:pPr>
       <w:r>
         <w:drawing>
           <wp:inline xmlns:a="http://schemas.openxmlformats.org/drawingml/2006/main" xmlns:pic="http://schemas.openxmlformats.org/drawingml/2006/picture">
-            <wp:extent cx="6126480" cy="1229327"/>
+            <wp:extent cx="6126480" cy="3829050"/>
             <wp:docPr id="1" name="Picture 1"/>
             <wp:cNvGraphicFramePr>
               <a:graphicFrameLocks noChangeAspect="1"/>
@@ -72,7 +85,7 @@
               <a:graphicData uri="http://schemas.openxmlformats.org/drawingml/2006/picture">
                 <pic:pic>
                   <pic:nvPicPr>
-                    <pic:cNvPr id="0" name="cover-product.jpg"/>
+                    <pic:cNvPr id="0" name="workspace-approved.jpg"/>
                     <pic:cNvPicPr/>
                   </pic:nvPicPr>
                   <pic:blipFill>
@@ -84,7 +97,7 @@
                   <pic:spPr>
                     <a:xfrm>
                       <a:off x="0" y="0"/>
-                      <a:ext cx="6126480" cy="1229327"/>
+                      <a:ext cx="6126480" cy="3829050"/>
                     </a:xfrm>
                     <a:prstGeom prst="rect"/>
                   </pic:spPr>
@@ -96,47 +109,47 @@
       </w:r>
     </w:p>
     <w:p>
+      <w:pPr>
+        <w:pStyle w:val="Caption"/>
+        <w:spacing w:after="400"/>
+      </w:pPr>
       <w:r>
-        <w:rPr>
-          <w:b/>
-        </w:rPr>
-        <w:t>Group members:</w:t>
-      </w:r>
-      <w:r>
-        <w:t xml:space="preserve"> [Add each member's full name and student ID]</w:t>
+        <w:t>The conversation and the reviewed booking brief in the live application.</w:t>
       </w:r>
     </w:p>
     <w:p>
+      <w:pPr>
+        <w:spacing w:after="200"/>
+        <w:pBdr>
+          <w:bottom w:val="single" w:sz="9" w:color="203D35"/>
+        </w:pBdr>
+      </w:pPr>
+    </w:p>
+    <w:p>
+      <w:pPr>
+        <w:spacing w:after="140"/>
+      </w:pPr>
       <w:r>
         <w:rPr>
-          <w:b/>
+          <w:rFonts w:ascii="Arial" w:hAnsi="Arial"/>
+          <w:color w:val="526258"/>
+          <w:sz w:val="20"/>
         </w:rPr>
-        <w:t>Individual submitting student:</w:t>
-      </w:r>
-      <w:r>
-        <w:t xml:space="preserve"> [Add name and student ID]</w:t>
+        <w:t>11 October 2026</w:t>
       </w:r>
     </w:p>
     <w:p>
+      <w:pPr>
+        <w:spacing w:after="80"/>
+      </w:pPr>
       <w:r>
         <w:rPr>
+          <w:rFonts w:ascii="Arial" w:hAnsi="Arial"/>
           <w:b/>
+          <w:color w:val="526258"/>
+          <w:sz w:val="18"/>
         </w:rPr>
-        <w:t>Report date:</w:t>
-      </w:r>
-      <w:r>
-        <w:t xml:space="preserve"> 11 October 2026</w:t>
-      </w:r>
-    </w:p>
-    <w:p>
-      <w:r>
-        <w:rPr>
-          <w:b/>
-        </w:rPr>
-        <w:t>Application:</w:t>
-      </w:r>
-      <w:r>
-        <w:t xml:space="preserve"> </w:t>
+        <w:t xml:space="preserve">Application  </w:t>
       </w:r>
       <w:hyperlink r:id="rId12">
         <w:r>
@@ -148,14 +161,17 @@
       </w:hyperlink>
     </w:p>
     <w:p>
+      <w:pPr>
+        <w:spacing w:after="80"/>
+      </w:pPr>
       <w:r>
         <w:rPr>
+          <w:rFonts w:ascii="Arial" w:hAnsi="Arial"/>
           <w:b/>
+          <w:color w:val="526258"/>
+          <w:sz w:val="18"/>
         </w:rPr>
-        <w:t>Source repository:</w:t>
-      </w:r>
-      <w:r>
-        <w:t xml:space="preserve"> </w:t>
+        <w:t xml:space="preserve">Source repository  </w:t>
       </w:r>
       <w:hyperlink r:id="rId13">
         <w:r>
@@ -167,34 +183,12 @@
       </w:hyperlink>
     </w:p>
     <w:p>
-      <w:r>
-        <w:rPr>
-          <w:b/>
-        </w:rPr>
-        <w:t>Project scope:</w:t>
-      </w:r>
-      <w:r>
-        <w:t xml:space="preserve"> English-language restaurant enquiries; five booking fields; staff-reviewed text and JSON handoff.</w:t>
-      </w:r>
-    </w:p>
-    <w:p>
-      <w:r>
-        <w:rPr>
-          <w:b/>
-        </w:rPr>
-        <w:t>Evidence version:</w:t>
-      </w:r>
-      <w:r>
-        <w:t xml:space="preserve"> Application release 0b6bc90; evaluated extraction and runner frozen at 32af459. Later evidence and media commits do not change the evaluated source.</w:t>
-      </w:r>
-    </w:p>
-    <w:p>
       <w:pPr>
         <w:pStyle w:val="Heading1"/>
         <w:pageBreakBefore/>
       </w:pPr>
       <w:r>
-        <w:t>Abstract and report guide</w:t>
+        <w:t>Abstract</w:t>
       </w:r>
     </w:p>
     <w:p>
@@ -209,7 +203,7 @@
     </w:p>
     <w:p>
       <w:r>
-        <w:t>The application demonstrates a practical review workflow rather than autonomous reservation execution. Recorded browser checks cover 20 ordinary enquiries and 15 edge cases; native text and JSON downloads were verified. No recruited-user study was conducted. The evidence supports a functioning, reviewable NLP application within a narrow domain, with clear limits on generalisation and measured user benefit.</w:t>
+        <w:t>The application supports review and handoff of a booking brief; it does not reserve a table. Recorded browser checks cover 20 ordinary enquiries and 15 edge cases; native text and JSON downloads were verified. No recruited-user study was conducted. The results show that the application supports the tested workflow. Broader extraction accuracy and benefits for restaurant staff require further evaluation.</w:t>
       </w:r>
     </w:p>
     <w:p>
@@ -976,7 +970,7 @@
                 <w:rFonts w:ascii="Arial" w:hAnsi="Arial"/>
                 <w:sz w:val="18"/>
               </w:rPr>
-              <w:t>Appendices A–C: reproduction, evidence and acknowledgement</w:t>
+              <w:t>Appendices A–B: reproduction and supporting results</w:t>
             </w:r>
           </w:p>
         </w:tc>
@@ -1036,7 +1030,7 @@
     </w:p>
     <w:p>
       <w:r>
-        <w:t>FormBridge is intended for small restaurant service teams, particularly staff preparing or handing over enquiries. Its design assumption is that the conversation and the booking details should be reviewed together. This is a proposed workflow need, supported by realistic enquiry scenarios; the project did not conduct interviews or establish demand through restaurant adoption.</w:t>
+        <w:t>FormBridge is intended for small restaurant service teams, particularly staff preparing or handing over enquiries. It places the conversation beside the current booking details so staff can check them together. The workflow was designed from restaurant enquiry scenarios; interviews and adoption testing were outside the project evaluation.</w:t>
       </w:r>
     </w:p>
     <w:p>
@@ -1054,7 +1048,7 @@
     </w:p>
     <w:p>
       <w:r>
-        <w:t>The primary objective was to produce a usable web application that gathers five booking details, responds to revisions and makes the resulting brief easy to inspect. The technical objectives were to compare traditional and contextual extraction, implement explicit evidence and temporal checks, and preserve enough configuration and output information for another person to reproduce the experiment.</w:t>
+        <w:t>The primary objective was to build a web application that gathers five booking details, tracks revisions and lets staff inspect the current request. The technical objectives were to compare rules with contextual extraction, check supporting evidence and dates, and retain the configuration and outputs needed to reproduce the experiments.</w:t>
       </w:r>
     </w:p>
     <w:p>
@@ -1435,7 +1429,7 @@
     </w:p>
     <w:p>
       <w:r>
-        <w:t>Success means that staff can enter their own enquiry, inspect the current values and their sources, resolve uncertainty and export a reviewed brief. The evaluation assesses those implemented behaviours and automatic extraction within the stated scope. It does not measure real restaurant outcomes, revenue or time saved during actual service.</w:t>
+        <w:t>Success means that staff can enter an enquiry, inspect the values and their sources, resolve uncertainty and export a reviewed brief. Evaluation covers these functions and automatic extraction within the stated scope. Effects on restaurant operations were not measured.</w:t>
       </w:r>
     </w:p>
     <w:p>
@@ -1474,7 +1468,7 @@
                     <pic:cNvPicPr/>
                   </pic:nvPicPr>
                   <pic:blipFill>
-                    <a:blip r:embed="rId14"/>
+                    <a:blip r:embed="rId11"/>
                     <a:stretch>
                       <a:fillRect/>
                     </a:stretch>
@@ -1498,7 +1492,7 @@
         <w:pStyle w:val="Caption"/>
       </w:pPr>
       <w:r>
-        <w:t>Figure 1. Current live application, captured on 11 October 2026 using an authored enquiry. The reviewed request is Juniper, Sydney, 18 October 2026, 8:30 pm and five guests. The screenshot illustrates behaviour; it is not a benchmark result.</w:t>
+        <w:t>Figure 1. Live application captured on 11 October 2026. The example request is Juniper, Sydney, 18 October 2026, 8:30 pm and five guests. Source: original product capture using a fictional enquiry.</w:t>
       </w:r>
     </w:p>
     <w:p>
@@ -1635,7 +1629,7 @@
       <w:r>
         <w:drawing>
           <wp:inline xmlns:a="http://schemas.openxmlformats.org/drawingml/2006/main" xmlns:pic="http://schemas.openxmlformats.org/drawingml/2006/picture">
-            <wp:extent cx="6126480" cy="2083499"/>
+            <wp:extent cx="6126480" cy="1992553"/>
             <wp:docPr id="3" name="Picture 3"/>
             <wp:cNvGraphicFramePr>
               <a:graphicFrameLocks noChangeAspect="1"/>
@@ -1648,7 +1642,7 @@
                     <pic:cNvPicPr/>
                   </pic:nvPicPr>
                   <pic:blipFill>
-                    <a:blip r:embed="rId15"/>
+                    <a:blip r:embed="rId14"/>
                     <a:stretch>
                       <a:fillRect/>
                     </a:stretch>
@@ -1656,7 +1650,7 @@
                   <pic:spPr>
                     <a:xfrm>
                       <a:off x="0" y="0"/>
-                      <a:ext cx="6126480" cy="2083499"/>
+                      <a:ext cx="6126480" cy="1992553"/>
                     </a:xfrm>
                     <a:prstGeom prst="rect"/>
                   </pic:spPr>
@@ -1713,7 +1707,7 @@
     </w:p>
     <w:p>
       <w:r>
-        <w:t>The draft uses browser session storage. There is no FormBridge account or customer database. This keeps the submission focused on one review session and limits application-side persistence, but excludes shared inboxes, durable case histories and cross-device collaboration. Downloads are explicit local exports. Provider processing and retention remain a separate concern, discussed in Section 10.</w:t>
+        <w:t>The draft uses browser session storage and can be downloaded as a local file. The application has no accounts or customer database, so it supports individual review sessions rather than shared inboxes, long-term case histories or cross-device collaboration. External model processing is discussed in Section 10.</w:t>
       </w:r>
     </w:p>
     <w:p>
@@ -2085,17 +2079,17 @@
     </w:p>
     <w:p>
       <w:r>
-        <w:t>The rules recognise common party-size phrases, full calendar dates, explicit times, after-time constraints and named restaurants or cities in restricted patterns. They process messages in order and use a simple acceptance pattern to connect a customer reply with the preceding staff message. This is a substantive baseline, although its limited lexical patterns are unlikely to cover the variation in a public dialogue corpus. It uses no learned parameters or API tokens.</w:t>
+        <w:t>The rules recognise common party-size phrases, full calendar dates, explicit times, after-time constraints and named restaurants or cities in restricted patterns. They process messages in order and use a simple acceptance pattern to connect a customer reply with the preceding staff message. Its restricted vocabulary limits coverage of varied dialogue. It uses no learned parameters or API tokens.</w:t>
       </w:r>
     </w:p>
     <w:p>
       <w:r>
-        <w:t>The direct baseline reconstructs the five-field state at every customer turn. Its structured output contains value, status and constraint, but no evidence citations. Its prompt also prohibits invented values and unaccepted staff offers. This provides a fairer control than comparing FormBridge with an unrestricted summarisation prompt.</w:t>
+        <w:t>The direct baseline reconstructs the five-field state at every customer turn. Its structured output contains value, status and constraint, but no evidence citations. Its prompt instructs the model to avoid invented values and unaccepted staff offers. Both contextual methods therefore target the same booking-state task.</w:t>
       </w:r>
     </w:p>
     <w:p>
       <w:r>
-        <w:t>FormBridge reconstructs candidates from the same visible prefix. Prior browser state supplies staff overrides and history; it is not itself proof that a predicted value is true. The current method is therefore best described as contextual state extraction with deterministic reconciliation, rather than a model that learns from the user's corrections.</w:t>
+        <w:t>FormBridge reconstructs candidate values from the same visible prefix. Previous browser state supplies staff overrides and history; supporting utterances determine whether a candidate is accepted. Corrections update the brief without changing model weights.</w:t>
       </w:r>
     </w:p>
     <w:p>
@@ -2118,7 +2112,7 @@
     </w:p>
     <w:p>
       <w:r>
-        <w:t>The final production settings are GPT-6 Luna for primary extraction and at most one GPT-6.1 Sol repair, with low reasoning effort. The controlled comparison instead uses GPT-6 Luna for both AI approaches and for every repair. These names are recorded project configurations and provider-returned model identifiers. They are aliases rather than immutable research checkpoints, so future provider reruns may differ.</w:t>
+        <w:t>The deployed configuration uses GPT-6 Luna for extraction and at most one GPT-6.1 Sol repair, with low reasoning effort. The controlled comparison uses GPT-6 Luna for both approaches and repairs. Primary requests have a 12-second timeout; repairs have a 10-second timeout. SDK retries are disabled. Output budgets are 2,400 tokens for FormBridge and 900 for direct extraction. These model names are provider aliases, so a future rerun may use an updated model.</w:t>
       </w:r>
     </w:p>
     <w:p>
@@ -2126,12 +2120,12 @@
         <w:pStyle w:val="Heading2"/>
       </w:pPr>
       <w:r>
-        <w:t>4.3 Avoiding unnecessary complexity</w:t>
+        <w:t>4.3 Scope of the model implementation</w:t>
       </w:r>
     </w:p>
     <w:p>
       <w:r>
-        <w:t>Retrieval-augmented generation was not implemented because the required evidence is the conversation itself; no external document corpus is needed. Fine-tuning, multilingual support and booking integrations remain future options. The project contribution is the implemented combination of contextual extraction, checked evidence, explicit uncertainty and human review, not a claim of a new foundational language model.</w:t>
+        <w:t>Retrieval-augmented generation was unnecessary for this task because all required evidence is in the conversation. Fine-tuning, multilingual support and booking integrations were outside scope. The implementation combines an existing language model with evidence checks, uncertainty handling and a staff review workflow.</w:t>
       </w:r>
     </w:p>
     <w:p>
@@ -2565,7 +2559,7 @@
     </w:p>
     <w:p>
       <w:r>
-        <w:t>If validation finds a repairable inconsistency, the model receives targeted feedback and may return one revised candidate state. It does not receive gold labels or benchmark answers. A failed repair produces a review warning; the first candidate remains subject to the same checks. If the initial request fails, the last valid brief is preserved and the unfinished update can be retried.</w:t>
+        <w:t>If validation finds a repairable inconsistency, the model receives targeted feedback and may return one revised candidate state. It does not receive dataset labels or benchmark answers. A failed repair produces a review warning; the first candidate remains subject to the same checks. If the initial request fails, the last valid brief is preserved and the unfinished update can be retried.</w:t>
       </w:r>
     </w:p>
     <w:p>
@@ -2590,7 +2584,7 @@
                     <pic:cNvPicPr/>
                   </pic:nvPicPr>
                   <pic:blipFill>
-                    <a:blip r:embed="rId16"/>
+                    <a:blip r:embed="rId15"/>
                     <a:stretch>
                       <a:fillRect/>
                     </a:stretch>
@@ -2614,7 +2608,7 @@
         <w:pStyle w:val="Caption"/>
       </w:pPr>
       <w:r>
-        <w:t>Figure 3. Two crops from real live-app captures of the same authored conversation. Left: the exact time remains unresolved after “after 8 pm”. Right: the accepted 8:30 pm time links the staff offer and customer reply.</w:t>
+        <w:t>Figure 3. Time correction and acceptance in the live application. Left: “after 8 pm” leaves the exact time unresolved. Right: accepting 8:30 pm links the staff offer and customer reply. Source: original product captures.</w:t>
       </w:r>
     </w:p>
     <w:p>
@@ -2627,12 +2621,12 @@
     </w:p>
     <w:p>
       <w:r>
-        <w:t>An historical dataset may label a date as “March 10th” without a year. FormBridge can retain that stated value while asking which year is intended. A correct field under the benchmark can therefore be unready for approval. Inventing a year would improve apparent completeness while reducing trustworthiness.</w:t>
+        <w:t>A historical dataset may label a date as “March 10th” without a year. FormBridge can retain that stated value while asking which year is intended. A correct field under the benchmark can therefore be unready for approval. Inventing a year would improve apparent completeness while reducing trustworthiness.</w:t>
       </w:r>
     </w:p>
     <w:p>
       <w:r>
-        <w:t>The guard remains fallible. It can miss genuine implicit acceptance, retain an older value when it rejects a newer candidate, or preserve an unsupported constraint if the cited context is misleading. Prompt-level instruction handling and a small pattern filter are also incomplete defences against adversarial text. Human inspection remains necessary; the project does not claim a measured zero-hallucination rate.</w:t>
+        <w:t>Evidence checking can miss implicit acceptance or reject a valid correction. A quotation may also be present but misinterpreted. Prompt instructions and pattern filters provide limited protection against adversarial input. Staff review is therefore necessary, and an unsupported-value rate was not independently measured.</w:t>
       </w:r>
     </w:p>
     <w:p>
@@ -3173,12 +3167,12 @@
         <w:ind w:left="216" w:hanging="216"/>
       </w:pPr>
       <w:r>
-        <w:t>6. For evaluation, retain prefixes within the 30-message application limit, apply the frozen exclusions and select the recorded dialogue IDs.</w:t>
+        <w:t>6. For evaluation, retain prefixes within the 30-message application limit, apply the exclusion list and select the recorded dialogue IDs.</w:t>
       </w:r>
     </w:p>
     <w:p>
       <w:r>
-        <w:t>The extractor receives utterances, speakers and message IDs. Gold states are kept outside its input. Historical reference dates are null, so a phrase such as “today” is not silently interpreted using the execution date. Dataset schema defaults are not passed into the model as customer statements.</w:t>
+        <w:t>The extractor receives utterances, speakers and message IDs. The annotated reference states are kept outside its input. Historical reference dates are null, so a phrase such as “today” is not silently interpreted using the execution date. Dataset schema defaults are not passed into the model as customer statements.</w:t>
       </w:r>
     </w:p>
     <w:p>
@@ -3213,22 +3207,22 @@
         <w:pStyle w:val="Heading2"/>
       </w:pPr>
       <w:r>
-        <w:t>6.1 Frozen protocol and fair comparison</w:t>
+        <w:t>6.1 Comparing the methods</w:t>
       </w:r>
     </w:p>
     <w:p>
       <w:r>
-        <w:t>The final protocol was frozen on 1 October 2026. Rules, direct extraction and FormBridge receive identical ordered conversation prefixes, with analysis after every customer message. Automatic scores use the final five-field state at the same endpoint. Staff edits are excluded. In-process execution binds the evaluation to the inspected analyzer rather than to a changing deployed endpoint.</w:t>
+        <w:t>Rules, direct extraction and FormBridge process the same ordered conversation, with analysis after every customer message. Each method is scored on its final five-field state after the same message. Staff edits are excluded from automatic scoring. The evaluation runs the application analysis code directly, avoiding differences caused by changes to the deployed website.</w:t>
       </w:r>
     </w:p>
     <w:p>
       <w:r>
-        <w:t>Two experiments answer different questions. The production-configuration runs check the selected deployable system on the inspected 20-dialogue regression sample and a repeatedly used 20-dialogue development selection. The controlled comparison fixes model identity: both AI systems, including FormBridge's repair, use GPT-6 Luna with low reasoning. Prompt detail, evidence generation and additional calls still differ, so this is a comparison of complete approaches rather than an ablation of validation alone.</w:t>
+        <w:t>Two experiments answer different questions. The production-configuration runs check the selected deployable system on the inspected 20-dialogue regression sample and a repeatedly used 20-dialogue development selection. The controlled comparison fixes model identity: both AI systems, including FormBridge's repair, use GPT-6 Luna with low reasoning. The prompts, evidence generation and number of calls differ, so the comparison measures complete systems rather than the isolated effect of validation.</w:t>
       </w:r>
     </w:p>
     <w:p>
       <w:r>
-        <w:t>A further controlled run evaluated all 13 eligible test dialogues remaining after excluding 60 previously selected IDs, including interrupted selections. IDs and exclusions were frozen before calls. No prompt or matcher changes were made after these final runs began. Those 13 cases now form used evaluation data; they cannot be presented as untouched on future reruns.</w:t>
+        <w:t>A further controlled run evaluated all 13 eligible test dialogues remaining after excluding 60 previously selected IDs, including interrupted selections. IDs and exclusions were fixed before calls, and prompts and matching rules remained unchanged throughout the runs. These cases had not been selected in earlier project experiments; subsequent reuse would be a regression check.</w:t>
       </w:r>
     </w:p>
     <w:p>
@@ -3241,7 +3235,7 @@
     </w:p>
     <w:p>
       <w:r>
-        <w:t>For N attempted dialogues, field accuracy is the number of matching final values divided by 5N. Complete-brief accuracy is the number of dialogues in which all five values match divided by N. Failed dialogues remain in both denominators. An absent gold slot matches only a null prediction.</w:t>
+        <w:t>For N attempted dialogues, field accuracy is the number of matching final values divided by 5N. Complete-brief accuracy is the number of dialogues in which all five values match divided by N. Failed dialogues remain in both denominators. An absent reference slot matches only a null prediction.</w:t>
       </w:r>
     </w:p>
     <w:p>
@@ -3284,7 +3278,7 @@
     </w:p>
     <w:p>
       <w:r>
-        <w:t>Selections, predictions, per-prefix usage and warnings are saved as versioned JSON, with a summary CSV. SHA-256 fingerprints bind the extractor and runner to the recorded results; source changes invalidate a completed run. Exact commands and dataset acquisition steps appear in Appendix A.</w:t>
+        <w:t>Selections, predictions, per-prefix usage and warnings are saved as versioned JSON, with a summary CSV. SHA-256 fingerprints record the extractor and runner used for each experiment. Exact commands and dataset acquisition steps appear in Appendix A.</w:t>
       </w:r>
     </w:p>
     <w:p>
@@ -4280,7 +4274,7 @@
                     <pic:cNvPicPr/>
                   </pic:nvPicPr>
                   <pic:blipFill>
-                    <a:blip r:embed="rId17"/>
+                    <a:blip r:embed="rId16"/>
                     <a:stretch>
                       <a:fillRect/>
                     </a:stretch>
@@ -4309,7 +4303,7 @@
     </w:p>
     <w:p>
       <w:r>
-        <w:t>The contextual systems substantially outperform the explicit-pattern baseline on these selections. Both AI systems reach 92% canonical field accuracy on development data and 95.4% on the smaller test remainder. FormBridge's advantage under the strict matcher disappears after format equivalence is accepted. That supports a representation-consistency finding, not a claim of superior semantic accuracy.</w:t>
+        <w:t>Both contextual systems outperform the rule baseline on these selections, reaching 92% canonical field accuracy on development data and 95.4% on the smaller test remainder. FormBridge's advantage under strict matching disappears when equivalent formats are accepted. The difference concerns how values are represented; canonical value accuracy is equal.</w:t>
       </w:r>
     </w:p>
     <w:p>
@@ -4673,7 +4667,7 @@
     </w:p>
     <w:p>
       <w:r>
-        <w:t>The development production run recorded two failed repairs while preserving checked first-pass state; no complete dialogue failed. These warnings remain in the saved traces. The regression sample had been inspected during development, so its perfect score is a check on known cases. Neither table supports universal accuracy or a statistically established advantage over direct extraction.</w:t>
+        <w:t>The production development run recorded two failed repair calls and retained the checked first-pass state; no dialogue failed completely. The inspected regression score describes performance on known cases. The small samples do not establish general accuracy or a statistically significant advantage over direct extraction.</w:t>
       </w:r>
     </w:p>
     <w:p>
@@ -5261,7 +5255,7 @@
         <w:pStyle w:val="Caption"/>
       </w:pPr>
       <w:r>
-        <w:t>Table 3. Observed request accounting, not invoiced spend or isolated throughput. Each time covers multiple customer turns.</w:t>
+        <w:t>Table 3. Returned API usage and mean replay time. Replay time covers multiple customer turns; token totals are observed usage rather than invoiced cost.</w:t>
       </w:r>
     </w:p>
     <w:p>
@@ -5393,7 +5387,7 @@
                 <w:rFonts w:ascii="Arial" w:hAnsi="Arial"/>
                 <w:sz w:val="18"/>
               </w:rPr>
-              <w:t>Production development dialogues 1_00005 and 1_00017 omit a gold date or party size carried from earlier staff summaries. Explicit acceptance and multi-message evidence were added, but carryover remains a weakness.</w:t>
+              <w:t>Production development dialogues 1_00005 and 1_00017 omit an annotated date or party size carried from earlier staff summaries. Explicit acceptance and multi-message evidence were added, but carryover remains a weakness.</w:t>
             </w:r>
           </w:p>
         </w:tc>
@@ -5448,7 +5442,7 @@
                 <w:rFonts w:ascii="Arial" w:hAnsi="Arial"/>
                 <w:sz w:val="18"/>
               </w:rPr>
-              <w:t>Development 1_00006 loses date and party size after a customer rejects one summary and accepts a shorter revision. Test 1_00027 omits three gold slots after repeated corrections; both AI systems make those omissions in the controlled run.</w:t>
+              <w:t>Development 1_00006 loses date and party size after a customer rejects one summary and accepts a shorter revision. Test 1_00027 omits three reference slots after repeated corrections; both AI systems make those omissions in the controlled run.</w:t>
             </w:r>
           </w:p>
         </w:tc>
@@ -5503,7 +5497,7 @@
                 <w:rFonts w:ascii="Arial" w:hAnsi="Arial"/>
                 <w:sz w:val="18"/>
               </w:rPr>
-              <w:t>Controlled development 4_00069 predicts “the 5th of this month” against “5th of this month”. The canonical fallback still marks this wording difference wrong; the frozen result was retained.</w:t>
+              <w:t>Controlled development 4_00069 predicts “the 5th of this month” against “5th of this month”. The matching rule still marks this wording difference wrong; the reported score was not changed.</w:t>
             </w:r>
           </w:p>
         </w:tc>
@@ -5576,7 +5570,7 @@
     </w:p>
     <w:p>
       <w:r>
-        <w:t>Inspection of the upstream conversations supports this diagnosis, but the saved traces do not retain every intermediate candidate and rejection decision. They cannot assign each omission conclusively to extraction, repair or reconciliation. More detailed decision tracing is a priority. Removing uncertainty merely to match inherited labels would be a poor product solution.</w:t>
+        <w:t>The original conversations show these carryover patterns, but the saved traces do not retain every intermediate candidate and rejection decision. They therefore cannot establish whether extraction, repair or reconciliation caused each omission. Future evaluation needs both detailed decision traces and annotations that distinguish a supported carryover from an unresolved request.</w:t>
       </w:r>
     </w:p>
     <w:p>
@@ -5622,12 +5616,12 @@
           </w:p>
           <w:p>
             <w:r>
-              <w:t>The interface uses a conversation panel beside a booking slip on desktop. On mobile, explicit tabs switch between conversation and brief. Restaurant language, cream paper surfaces and restrained green styling establish a coherent context, while the five values remain the centre of the task. Technical comparison modes and internal evaluation figures are kept outside the staff workspace.</w:t>
+              <w:t>On desktop, the conversation appears beside a booking slip. Mobile tabs switch between the two views without discarding the draft. Familiar restaurant terms, cream surfaces and green accents organise the five details, while text and icons identify their status.</w:t>
             </w:r>
           </w:p>
           <w:p>
             <w:r>
-              <w:t>The design gives users status visibility, recognisable terminology and ways to recover from mistakes, consistent with Nielsen's usability principles (Nielsen, 1994). Source links, explanations of uncertainty and editable values also align with guidance for helping people understand and correct AI behaviour (Amershi et al., 2019). These sources inform the design rationale; they are not evidence that FormBridge has passed a formal usability study.</w:t>
+              <w:t>Status labels, familiar terms and editable values follow Nielsen's usability principles (Nielsen, 1994). Source links and explanations of uncertainty also support checking and correcting model output, as recommended by Amershi et al. (2019). These principles guided the interface design; its usability has not been tested with recruited participants.</w:t>
             </w:r>
           </w:p>
           <w:p>
@@ -5640,12 +5634,12 @@
           </w:p>
           <w:p>
             <w:r>
-              <w:t>The recorded live browser run passed 20 ordinary enquiry cases and 15 edge cases. It exercised custom input, corrections, uncertain dates and times, staff acceptance, cancellation, manual overrides, refresh and mobile switching. These are team-authored engineering cases, not a sample of restaurant customers. Their pass counts concern the specified checks rather than a general model accuracy rate.</w:t>
+              <w:t>The recorded browser run passed all 20 ordinary enquiry cases and 15 edge cases. The authored cases exercised custom input, corrections, uncertain dates and times, staff acceptance, cancellation, manual overrides, refresh and mobile switching. Each pass refers to the case's specified functional checks, rather than general extraction accuracy.</w:t>
             </w:r>
           </w:p>
           <w:p>
             <w:r>
-              <w:t>Four native downloads were saved and opened: draft text, approved text, approved JSON and revised unresolved draft JSON. Checks covered values, transcript, source IDs, revision history, status and cleared approval after a correction. Earlier automation download-event timeouts were resolved by checking the actual files through the browser's native save flow.</w:t>
+              <w:t>Four downloads were saved and opened: draft text, approved text, approved JSON and revised unresolved draft JSON. Checks covered values, transcript, source IDs, revision history and review status. A correction cleared approval in the revised export. Native file inspection verified delivery where browser automation had not returned a download event.</w:t>
             </w:r>
           </w:p>
           <w:p>
@@ -5663,7 +5657,7 @@
           </w:p>
           <w:p>
             <w:r>
-              <w:t>No recruited-user study was conducted. We therefore do not claim a satisfaction score, measured time saving, reduced workload or validated adoption by restaurant staff. The next usability evaluation should give participants matched transcript-to-brief tasks with and without FormBridge, counterbalance task order and record completion time, remaining errors and source-check behaviour. Proxy participants should be labelled as proxies. This would test whether additional review controls help in practice and whether the analysis delay disrupts the workflow.</w:t>
+              <w:t>The functional checks did not measure satisfaction, task completion time or adoption by restaurant staff. A usability study should compare matched transcript-to-brief tasks with and without FormBridge, vary task order and record completion time, remaining errors and source checks. Restaurant staff would be the preferred participants; classmates would provide proxy feedback. The study should also test whether analysis delays disrupt the workflow.</w:t>
             </w:r>
           </w:p>
         </w:tc>
@@ -5698,7 +5692,7 @@
                           <pic:cNvPicPr/>
                         </pic:nvPicPr>
                         <pic:blipFill>
-                          <a:blip r:embed="rId18"/>
+                          <a:blip r:embed="rId17"/>
                           <a:stretch>
                             <a:fillRect/>
                           </a:stretch>
@@ -5752,7 +5746,7 @@
     </w:p>
     <w:p>
       <w:r>
-        <w:t>The API key stays on the server. Analysis requests use store: false and do not create a FormBridge customer database. This does not establish zero provider retention. OpenAI documents separate abuse-monitoring and application-state controls, including possible retention and caching (OpenAI, n.d.-a). The report therefore distinguishes a browser-local draft from external inference processing.</w:t>
+        <w:t>The API key stays on the server. Analysis requests use store: false and do not create a FormBridge customer database. This does not establish zero provider retention. OpenAI documents separate abuse-monitoring and application-state controls, including possible retention and caching (OpenAI, n.d.-a). Browser-local storage therefore does not make model processing local or establish zero retention.</w:t>
       </w:r>
     </w:p>
     <w:p>
@@ -5780,7 +5774,7 @@
     </w:p>
     <w:p>
       <w:r>
-        <w:t>English-only patterns, a 30-message cap and party sizes of 1–30 limit applicability. Tab-local storage and a process-local limiter suit the current demonstration but do not establish production-scale reliability. No legal compliance certification or complete security assessment is claimed.</w:t>
+        <w:t>English-only patterns, a 30-message cap and party sizes of 1–30 limit applicability. Tab-local storage and a process-local limiter suit the current demonstration but do not establish production-scale reliability. A complete security or legal compliance assessment was outside the project evaluation.</w:t>
       </w:r>
     </w:p>
     <w:p>
@@ -5878,7 +5872,7 @@
     </w:p>
     <w:p>
       <w:r>
-        <w:t>These changes follow from observed limitations. The current project establishes the reviewable application and a reproducible comparison; it does not claim that all future restaurant workflows are supported.</w:t>
+        <w:t>These priorities address the observed extraction errors, unmeasured user benefits and limits of individual browser sessions.</w:t>
       </w:r>
     </w:p>
     <w:p>
@@ -6312,7 +6306,7 @@
                 <w:rFonts w:ascii="Arial" w:hAnsi="Arial"/>
                 <w:sz w:val="18"/>
               </w:rPr>
-              <w:t>Frozen protocol, same-model replay, final result files, clean-checkout checks and verified native exports</w:t>
+              <w:t>Fixed evaluation settings, same-model comparison, result files, clean-checkout checks and verified exports</w:t>
             </w:r>
           </w:p>
         </w:tc>
@@ -6408,7 +6402,7 @@
         <w:pStyle w:val="Caption"/>
       </w:pPr>
       <w:r>
-        <w:t>Table 4. Periods are derived from repository and saved-evidence records. They describe work products rather than imply equal participation or hours worked.</w:t>
+        <w:t>Table 4. Project phases and deliverables recorded in the repository.</w:t>
       </w:r>
     </w:p>
     <w:p>
@@ -6421,372 +6415,7 @@
     </w:p>
     <w:p>
       <w:r>
-        <w:t>Karthik Ramesh was responsible for technical implementation. The contribution record below is awaiting the group's confirmation of individual responsibilities and report sections.</w:t>
-      </w:r>
-    </w:p>
-    <w:tbl>
-      <w:tblPr>
-        <w:tblW w:type="auto" w:w="0"/>
-        <w:jc w:val="center"/>
-        <w:tblLayout w:type="fixed"/>
-        <w:tblLook w:firstColumn="1" w:firstRow="1" w:lastColumn="0" w:lastRow="0" w:noHBand="0" w:noVBand="1" w:val="04A0"/>
-      </w:tblPr>
-      <w:tblGrid>
-        <w:gridCol w:w="3012"/>
-        <w:gridCol w:w="6705"/>
-      </w:tblGrid>
-      <w:tr>
-        <w:trPr>
-          <w:cantSplit/>
-          <w:tblHeader/>
-        </w:trPr>
-        <w:tc>
-          <w:tcPr>
-            <w:tcW w:type="dxa" w:w="3012"/>
-            <w:vAlign w:val="center"/>
-            <w:shd w:fill="203D35"/>
-            <w:tcMar>
-              <w:top w:w="45" w:type="dxa"/>
-              <w:bottom w:w="45" w:type="dxa"/>
-              <w:left w:w="45" w:type="dxa"/>
-              <w:right w:w="45" w:type="dxa"/>
-            </w:tcMar>
-          </w:tcPr>
-          <w:p>
-            <w:pPr>
-              <w:spacing w:after="30" w:before="30" w:line="245" w:lineRule="auto"/>
-            </w:pPr>
-            <w:r>
-              <w:rPr>
-                <w:rFonts w:ascii="Arial" w:hAnsi="Arial"/>
-                <w:b/>
-                <w:color w:val="FFFFFF"/>
-                <w:sz w:val="18"/>
-              </w:rPr>
-              <w:t>Member and student ID</w:t>
-            </w:r>
-          </w:p>
-        </w:tc>
-        <w:tc>
-          <w:tcPr>
-            <w:tcW w:type="dxa" w:w="6705"/>
-            <w:vAlign w:val="center"/>
-            <w:shd w:fill="203D35"/>
-            <w:tcMar>
-              <w:top w:w="45" w:type="dxa"/>
-              <w:bottom w:w="45" w:type="dxa"/>
-              <w:left w:w="45" w:type="dxa"/>
-              <w:right w:w="45" w:type="dxa"/>
-            </w:tcMar>
-          </w:tcPr>
-          <w:p>
-            <w:pPr>
-              <w:spacing w:after="30" w:before="30" w:line="245" w:lineRule="auto"/>
-            </w:pPr>
-            <w:r>
-              <w:rPr>
-                <w:rFonts w:ascii="Arial" w:hAnsi="Arial"/>
-                <w:b/>
-                <w:color w:val="FFFFFF"/>
-                <w:sz w:val="18"/>
-              </w:rPr>
-              <w:t>Actual contribution and evidence</w:t>
-            </w:r>
-          </w:p>
-        </w:tc>
-      </w:tr>
-      <w:tr>
-        <w:trPr>
-          <w:cantSplit/>
-        </w:trPr>
-        <w:tc>
-          <w:tcPr>
-            <w:tcW w:type="dxa" w:w="3012"/>
-            <w:vAlign w:val="center"/>
-            <w:shd w:fill="F1F4EC"/>
-            <w:tcMar>
-              <w:top w:w="45" w:type="dxa"/>
-              <w:bottom w:w="45" w:type="dxa"/>
-              <w:left w:w="45" w:type="dxa"/>
-              <w:right w:w="45" w:type="dxa"/>
-            </w:tcMar>
-          </w:tcPr>
-          <w:p>
-            <w:pPr>
-              <w:spacing w:after="30" w:before="30" w:line="245" w:lineRule="auto"/>
-            </w:pPr>
-            <w:r>
-              <w:rPr>
-                <w:rFonts w:ascii="Arial" w:hAnsi="Arial"/>
-                <w:sz w:val="18"/>
-              </w:rPr>
-              <w:t>Karthik Ramesh · [Student ID]</w:t>
-            </w:r>
-          </w:p>
-        </w:tc>
-        <w:tc>
-          <w:tcPr>
-            <w:tcW w:type="dxa" w:w="6705"/>
-            <w:vAlign w:val="center"/>
-            <w:shd w:fill="F1F4EC"/>
-            <w:tcMar>
-              <w:top w:w="45" w:type="dxa"/>
-              <w:bottom w:w="45" w:type="dxa"/>
-              <w:left w:w="45" w:type="dxa"/>
-              <w:right w:w="45" w:type="dxa"/>
-            </w:tcMar>
-          </w:tcPr>
-          <w:p>
-            <w:pPr>
-              <w:spacing w:after="30" w:before="30" w:line="245" w:lineRule="auto"/>
-            </w:pPr>
-            <w:r>
-              <w:rPr>
-                <w:rFonts w:ascii="Arial" w:hAnsi="Arial"/>
-                <w:sz w:val="18"/>
-              </w:rPr>
-              <w:t>Technical implementation responsibility; confirm the final ownership statement and report sections</w:t>
-            </w:r>
-          </w:p>
-        </w:tc>
-      </w:tr>
-      <w:tr>
-        <w:trPr>
-          <w:cantSplit/>
-        </w:trPr>
-        <w:tc>
-          <w:tcPr>
-            <w:tcW w:type="dxa" w:w="3012"/>
-            <w:vAlign w:val="center"/>
-            <w:shd w:fill="FFFFFF"/>
-            <w:tcMar>
-              <w:top w:w="45" w:type="dxa"/>
-              <w:bottom w:w="45" w:type="dxa"/>
-              <w:left w:w="45" w:type="dxa"/>
-              <w:right w:w="45" w:type="dxa"/>
-            </w:tcMar>
-          </w:tcPr>
-          <w:p>
-            <w:pPr>
-              <w:spacing w:after="30" w:before="30" w:line="245" w:lineRule="auto"/>
-            </w:pPr>
-            <w:r>
-              <w:rPr>
-                <w:rFonts w:ascii="Arial" w:hAnsi="Arial"/>
-                <w:sz w:val="18"/>
-              </w:rPr>
-              <w:t>[Member 2 · Student ID]</w:t>
-            </w:r>
-          </w:p>
-        </w:tc>
-        <w:tc>
-          <w:tcPr>
-            <w:tcW w:type="dxa" w:w="6705"/>
-            <w:vAlign w:val="center"/>
-            <w:shd w:fill="FFFFFF"/>
-            <w:tcMar>
-              <w:top w:w="45" w:type="dxa"/>
-              <w:bottom w:w="45" w:type="dxa"/>
-              <w:left w:w="45" w:type="dxa"/>
-              <w:right w:w="45" w:type="dxa"/>
-            </w:tcMar>
-          </w:tcPr>
-          <w:p>
-            <w:pPr>
-              <w:spacing w:after="30" w:before="30" w:line="245" w:lineRule="auto"/>
-            </w:pPr>
-            <w:r>
-              <w:rPr>
-                <w:rFonts w:ascii="Arial" w:hAnsi="Arial"/>
-                <w:sz w:val="18"/>
-              </w:rPr>
-              <w:t>[Confirmed work, report sections and supporting evidence]</w:t>
-            </w:r>
-          </w:p>
-        </w:tc>
-      </w:tr>
-      <w:tr>
-        <w:trPr>
-          <w:cantSplit/>
-        </w:trPr>
-        <w:tc>
-          <w:tcPr>
-            <w:tcW w:type="dxa" w:w="3012"/>
-            <w:vAlign w:val="center"/>
-            <w:shd w:fill="F1F4EC"/>
-            <w:tcMar>
-              <w:top w:w="45" w:type="dxa"/>
-              <w:bottom w:w="45" w:type="dxa"/>
-              <w:left w:w="45" w:type="dxa"/>
-              <w:right w:w="45" w:type="dxa"/>
-            </w:tcMar>
-          </w:tcPr>
-          <w:p>
-            <w:pPr>
-              <w:spacing w:after="30" w:before="30" w:line="245" w:lineRule="auto"/>
-            </w:pPr>
-            <w:r>
-              <w:rPr>
-                <w:rFonts w:ascii="Arial" w:hAnsi="Arial"/>
-                <w:sz w:val="18"/>
-              </w:rPr>
-              <w:t>[Member 3 · Student ID]</w:t>
-            </w:r>
-          </w:p>
-        </w:tc>
-        <w:tc>
-          <w:tcPr>
-            <w:tcW w:type="dxa" w:w="6705"/>
-            <w:vAlign w:val="center"/>
-            <w:shd w:fill="F1F4EC"/>
-            <w:tcMar>
-              <w:top w:w="45" w:type="dxa"/>
-              <w:bottom w:w="45" w:type="dxa"/>
-              <w:left w:w="45" w:type="dxa"/>
-              <w:right w:w="45" w:type="dxa"/>
-            </w:tcMar>
-          </w:tcPr>
-          <w:p>
-            <w:pPr>
-              <w:spacing w:after="30" w:before="30" w:line="245" w:lineRule="auto"/>
-            </w:pPr>
-            <w:r>
-              <w:rPr>
-                <w:rFonts w:ascii="Arial" w:hAnsi="Arial"/>
-                <w:sz w:val="18"/>
-              </w:rPr>
-              <w:t>[Confirmed work, report sections and supporting evidence]</w:t>
-            </w:r>
-          </w:p>
-        </w:tc>
-      </w:tr>
-      <w:tr>
-        <w:trPr>
-          <w:cantSplit/>
-        </w:trPr>
-        <w:tc>
-          <w:tcPr>
-            <w:tcW w:type="dxa" w:w="3012"/>
-            <w:vAlign w:val="center"/>
-            <w:shd w:fill="FFFFFF"/>
-            <w:tcMar>
-              <w:top w:w="45" w:type="dxa"/>
-              <w:bottom w:w="45" w:type="dxa"/>
-              <w:left w:w="45" w:type="dxa"/>
-              <w:right w:w="45" w:type="dxa"/>
-            </w:tcMar>
-          </w:tcPr>
-          <w:p>
-            <w:pPr>
-              <w:spacing w:after="30" w:before="30" w:line="245" w:lineRule="auto"/>
-            </w:pPr>
-            <w:r>
-              <w:rPr>
-                <w:rFonts w:ascii="Arial" w:hAnsi="Arial"/>
-                <w:sz w:val="18"/>
-              </w:rPr>
-              <w:t>[Member 4 · Student ID]</w:t>
-            </w:r>
-          </w:p>
-        </w:tc>
-        <w:tc>
-          <w:tcPr>
-            <w:tcW w:type="dxa" w:w="6705"/>
-            <w:vAlign w:val="center"/>
-            <w:shd w:fill="FFFFFF"/>
-            <w:tcMar>
-              <w:top w:w="45" w:type="dxa"/>
-              <w:bottom w:w="45" w:type="dxa"/>
-              <w:left w:w="45" w:type="dxa"/>
-              <w:right w:w="45" w:type="dxa"/>
-            </w:tcMar>
-          </w:tcPr>
-          <w:p>
-            <w:pPr>
-              <w:spacing w:after="30" w:before="30" w:line="245" w:lineRule="auto"/>
-            </w:pPr>
-            <w:r>
-              <w:rPr>
-                <w:rFonts w:ascii="Arial" w:hAnsi="Arial"/>
-                <w:sz w:val="18"/>
-              </w:rPr>
-              <w:t>[Confirmed work, report sections and supporting evidence]</w:t>
-            </w:r>
-          </w:p>
-        </w:tc>
-      </w:tr>
-      <w:tr>
-        <w:trPr>
-          <w:cantSplit/>
-        </w:trPr>
-        <w:tc>
-          <w:tcPr>
-            <w:tcW w:type="dxa" w:w="3012"/>
-            <w:vAlign w:val="center"/>
-            <w:shd w:fill="F1F4EC"/>
-            <w:tcMar>
-              <w:top w:w="45" w:type="dxa"/>
-              <w:bottom w:w="45" w:type="dxa"/>
-              <w:left w:w="45" w:type="dxa"/>
-              <w:right w:w="45" w:type="dxa"/>
-            </w:tcMar>
-          </w:tcPr>
-          <w:p>
-            <w:pPr>
-              <w:spacing w:after="30" w:before="30" w:line="245" w:lineRule="auto"/>
-            </w:pPr>
-            <w:r>
-              <w:rPr>
-                <w:rFonts w:ascii="Arial" w:hAnsi="Arial"/>
-                <w:sz w:val="18"/>
-              </w:rPr>
-              <w:t>[Member 5 · Student ID]</w:t>
-            </w:r>
-          </w:p>
-        </w:tc>
-        <w:tc>
-          <w:tcPr>
-            <w:tcW w:type="dxa" w:w="6705"/>
-            <w:vAlign w:val="center"/>
-            <w:shd w:fill="F1F4EC"/>
-            <w:tcMar>
-              <w:top w:w="45" w:type="dxa"/>
-              <w:bottom w:w="45" w:type="dxa"/>
-              <w:left w:w="45" w:type="dxa"/>
-              <w:right w:w="45" w:type="dxa"/>
-            </w:tcMar>
-          </w:tcPr>
-          <w:p>
-            <w:pPr>
-              <w:spacing w:after="30" w:before="30" w:line="245" w:lineRule="auto"/>
-            </w:pPr>
-            <w:r>
-              <w:rPr>
-                <w:rFonts w:ascii="Arial" w:hAnsi="Arial"/>
-                <w:sz w:val="18"/>
-              </w:rPr>
-              <w:t>[Confirmed work, report sections and supporting evidence]</w:t>
-            </w:r>
-          </w:p>
-        </w:tc>
-      </w:tr>
-    </w:tbl>
-    <w:p>
-      <w:pPr>
-        <w:spacing w:after="20"/>
-      </w:pPr>
-    </w:p>
-    <w:p>
-      <w:pPr>
-        <w:pStyle w:val="Caption"/>
-      </w:pPr>
-      <w:r>
-        <w:t>Table 5. Individual contributions. Bracketed fields require confirmation before submission.</w:t>
-      </w:r>
-    </w:p>
-    <w:p>
-      <w:r>
-        <w:t>The reproducibility guide, saved selections and outputs provide a shared technical evidence base for the group's analysis and report writing. Individual participation and peer assessment are recorded separately through SPARKPlus.</w:t>
+        <w:t>Karthik Ramesh was responsible for technical implementation. The delivered technical work includes the web application, analysis pipeline, evaluation runner, deployment and supporting product media.</w:t>
       </w:r>
     </w:p>
     <w:p>
@@ -6804,7 +6433,7 @@
     </w:p>
     <w:p>
       <w:r>
-        <w:t>The experiments show a substantial contextual advantage over the implemented rules, and equal canonical value accuracy between direct extraction and FormBridge on the controlled selections. More consistent representations, visible uncertainty and traceable review come with higher processing overhead. The next step is to test whether those controls improve human task performance, while strengthening error tracing and evaluation on new data. FormBridge's value lies in connecting language understanding to a practical, accountable review workflow.</w:t>
+        <w:t>Both contextual approaches exceeded the rule baseline, and their canonical value accuracy was equal on the controlled selections. FormBridge added source links, uncertainty handling and review controls at the cost of more tokens and longer replay times. Testing whether those controls reduce staff errors is the next step. The project demonstrates how dialogue state tracking can support a restaurant booking handoff while leaving the final decision with staff.</w:t>
       </w:r>
     </w:p>
     <w:p>
@@ -6818,29 +6447,29 @@
     </w:p>
     <w:p>
       <w:pPr>
-        <w:spacing w:after="180"/>
-        <w:ind w:left="317" w:hanging="317"/>
+        <w:spacing w:after="0" w:line="480" w:lineRule="auto"/>
+        <w:ind w:left="720" w:hanging="720"/>
       </w:pPr>
       <w:r>
         <w:rPr>
-          <w:sz w:val="20"/>
+          <w:sz w:val="21"/>
         </w:rPr>
         <w:t xml:space="preserve">Amershi, S., Weld, D., Vorvoreanu, M., Fourney, A., Nushi, B., Collisson, P., Suh, J., Iqbal, S., Bennett, P. N., Inkpen, K., Teevan, J., Kikin-Gil, R., &amp; Horvitz, E. (2019). Guidelines for human-AI interaction. In </w:t>
       </w:r>
       <w:r>
         <w:rPr>
           <w:i/>
-          <w:sz w:val="20"/>
+          <w:sz w:val="21"/>
         </w:rPr>
         <w:t>Proceedings of the 2019 CHI Conference on Human Factors in Computing Systems</w:t>
       </w:r>
       <w:r>
         <w:rPr>
-          <w:sz w:val="20"/>
+          <w:sz w:val="21"/>
         </w:rPr>
         <w:t xml:space="preserve"> (pp. 1–13). Association for Computing Machinery. </w:t>
       </w:r>
-      <w:hyperlink r:id="rId19">
+      <w:hyperlink r:id="rId18">
         <w:r>
           <w:rPr>
             <w:color w:val="203D35"/>
@@ -6851,29 +6480,29 @@
     </w:p>
     <w:p>
       <w:pPr>
-        <w:spacing w:after="180"/>
-        <w:ind w:left="317" w:hanging="317"/>
+        <w:spacing w:after="0" w:line="480" w:lineRule="auto"/>
+        <w:ind w:left="720" w:hanging="720"/>
       </w:pPr>
       <w:r>
         <w:rPr>
-          <w:sz w:val="20"/>
+          <w:sz w:val="21"/>
         </w:rPr>
         <w:t xml:space="preserve">Google Research. (n.d.). </w:t>
       </w:r>
       <w:r>
         <w:rPr>
           <w:i/>
-          <w:sz w:val="20"/>
+          <w:sz w:val="21"/>
         </w:rPr>
         <w:t>Schema-Guided Dialogue dataset</w:t>
       </w:r>
       <w:r>
         <w:rPr>
-          <w:sz w:val="20"/>
+          <w:sz w:val="21"/>
         </w:rPr>
         <w:t xml:space="preserve"> [Data set; revision e852981ae34990f4358979625854259302feaa78]. GitHub. </w:t>
       </w:r>
-      <w:hyperlink r:id="rId20">
+      <w:hyperlink r:id="rId19">
         <w:r>
           <w:rPr>
             <w:color w:val="203D35"/>
@@ -6884,29 +6513,29 @@
     </w:p>
     <w:p>
       <w:pPr>
-        <w:spacing w:after="180"/>
-        <w:ind w:left="317" w:hanging="317"/>
+        <w:spacing w:after="0" w:line="480" w:lineRule="auto"/>
+        <w:ind w:left="720" w:hanging="720"/>
       </w:pPr>
       <w:r>
         <w:rPr>
-          <w:sz w:val="20"/>
+          <w:sz w:val="21"/>
         </w:rPr>
         <w:t xml:space="preserve">Nielsen, J. (1994, April 24). </w:t>
       </w:r>
       <w:r>
         <w:rPr>
           <w:i/>
-          <w:sz w:val="20"/>
+          <w:sz w:val="21"/>
         </w:rPr>
         <w:t>10 usability heuristics for user interface design</w:t>
       </w:r>
       <w:r>
         <w:rPr>
-          <w:sz w:val="20"/>
+          <w:sz w:val="21"/>
         </w:rPr>
         <w:t xml:space="preserve">. Nielsen Norman Group. </w:t>
       </w:r>
-      <w:hyperlink r:id="rId21">
+      <w:hyperlink r:id="rId20">
         <w:r>
           <w:rPr>
             <w:color w:val="203D35"/>
@@ -6917,29 +6546,29 @@
     </w:p>
     <w:p>
       <w:pPr>
-        <w:spacing w:after="180"/>
-        <w:ind w:left="317" w:hanging="317"/>
+        <w:spacing w:after="0" w:line="480" w:lineRule="auto"/>
+        <w:ind w:left="720" w:hanging="720"/>
       </w:pPr>
       <w:r>
         <w:rPr>
-          <w:sz w:val="20"/>
+          <w:sz w:val="21"/>
         </w:rPr>
         <w:t xml:space="preserve">OpenAI. (n.d.-a). </w:t>
       </w:r>
       <w:r>
         <w:rPr>
           <w:i/>
-          <w:sz w:val="20"/>
+          <w:sz w:val="21"/>
         </w:rPr>
         <w:t>Data controls in the OpenAI platform</w:t>
       </w:r>
       <w:r>
         <w:rPr>
-          <w:sz w:val="20"/>
+          <w:sz w:val="21"/>
         </w:rPr>
         <w:t xml:space="preserve">. Retrieved October 11, 2026, from </w:t>
       </w:r>
-      <w:hyperlink r:id="rId22">
+      <w:hyperlink r:id="rId21">
         <w:r>
           <w:rPr>
             <w:color w:val="203D35"/>
@@ -6950,29 +6579,29 @@
     </w:p>
     <w:p>
       <w:pPr>
-        <w:spacing w:after="180"/>
-        <w:ind w:left="317" w:hanging="317"/>
+        <w:spacing w:after="0" w:line="480" w:lineRule="auto"/>
+        <w:ind w:left="720" w:hanging="720"/>
       </w:pPr>
       <w:r>
         <w:rPr>
-          <w:sz w:val="20"/>
+          <w:sz w:val="21"/>
         </w:rPr>
         <w:t xml:space="preserve">OpenAI. (n.d.-b). </w:t>
       </w:r>
       <w:r>
         <w:rPr>
           <w:i/>
-          <w:sz w:val="20"/>
+          <w:sz w:val="21"/>
         </w:rPr>
         <w:t>Structured model outputs</w:t>
       </w:r>
       <w:r>
         <w:rPr>
-          <w:sz w:val="20"/>
+          <w:sz w:val="21"/>
         </w:rPr>
         <w:t xml:space="preserve">. Retrieved October 11, 2026, from </w:t>
       </w:r>
-      <w:hyperlink r:id="rId23">
+      <w:hyperlink r:id="rId22">
         <w:r>
           <w:rPr>
             <w:color w:val="203D35"/>
@@ -6983,29 +6612,29 @@
     </w:p>
     <w:p>
       <w:pPr>
-        <w:spacing w:after="180"/>
-        <w:ind w:left="317" w:hanging="317"/>
+        <w:spacing w:after="0" w:line="480" w:lineRule="auto"/>
+        <w:ind w:left="720" w:hanging="720"/>
       </w:pPr>
       <w:r>
         <w:rPr>
-          <w:sz w:val="20"/>
+          <w:sz w:val="21"/>
         </w:rPr>
         <w:t xml:space="preserve">Rastogi, A., Zang, X., Sunkara, S., Gupta, R., &amp; Khaitan, P. (2020). Towards scalable multi-domain conversational agents: The Schema-Guided Dialogue dataset. </w:t>
       </w:r>
       <w:r>
         <w:rPr>
           <w:i/>
-          <w:sz w:val="20"/>
+          <w:sz w:val="21"/>
         </w:rPr>
         <w:t>Proceedings of the AAAI Conference on Artificial Intelligence, 34</w:t>
       </w:r>
       <w:r>
         <w:rPr>
-          <w:sz w:val="20"/>
+          <w:sz w:val="21"/>
         </w:rPr>
         <w:t xml:space="preserve">(5), 8689–8696. </w:t>
       </w:r>
-      <w:hyperlink r:id="rId24">
+      <w:hyperlink r:id="rId23">
         <w:r>
           <w:rPr>
             <w:color w:val="203D35"/>
@@ -7016,29 +6645,29 @@
     </w:p>
     <w:p>
       <w:pPr>
-        <w:spacing w:after="180"/>
-        <w:ind w:left="317" w:hanging="317"/>
+        <w:spacing w:after="0" w:line="480" w:lineRule="auto"/>
+        <w:ind w:left="720" w:hanging="720"/>
       </w:pPr>
       <w:r>
         <w:rPr>
-          <w:sz w:val="20"/>
+          <w:sz w:val="21"/>
         </w:rPr>
         <w:t xml:space="preserve">Wu, C.-S., Madotto, A., Hosseini-Asl, E., Xiong, C., Socher, R., &amp; Fung, P. (2019). Transferable multi-domain state generator for task-oriented dialogue systems. In A. Korhonen, D. Traum, &amp; L. Màrquez (Eds.), </w:t>
       </w:r>
       <w:r>
         <w:rPr>
           <w:i/>
-          <w:sz w:val="20"/>
+          <w:sz w:val="21"/>
         </w:rPr>
         <w:t>Proceedings of the 57th Annual Meeting of the Association for Computational Linguistics</w:t>
       </w:r>
       <w:r>
         <w:rPr>
-          <w:sz w:val="20"/>
+          <w:sz w:val="21"/>
         </w:rPr>
         <w:t xml:space="preserve"> (pp. 808–819). Association for Computational Linguistics. </w:t>
       </w:r>
-      <w:hyperlink r:id="rId25">
+      <w:hyperlink r:id="rId24">
         <w:r>
           <w:rPr>
             <w:color w:val="203D35"/>
@@ -7049,63 +6678,11 @@
     </w:p>
     <w:p>
       <w:pPr>
-        <w:pStyle w:val="Heading2"/>
-      </w:pPr>
-      <w:r>
-        <w:t>Project evidence</w:t>
-      </w:r>
-    </w:p>
-    <w:p>
-      <w:pPr>
-        <w:spacing w:after="180"/>
-        <w:ind w:left="317" w:hanging="317"/>
-      </w:pPr>
-      <w:r>
-        <w:rPr>
-          <w:sz w:val="20"/>
-        </w:rPr>
-        <w:t>All project-specific numbers, implemented features and release claims in this report derive from the repository and records listed in Appendix B. Screenshots in Figures 1, 3 and 5 are original captures of the public FormBridge application on 11 October 2026, using an authored restaurant conversation. They contain no recruited-user observations or customer records.</w:t>
-      </w:r>
-    </w:p>
-    <w:p>
-      <w:pPr>
-        <w:spacing w:after="180"/>
-        <w:ind w:left="317" w:hanging="317"/>
-      </w:pPr>
-      <w:r>
-        <w:rPr>
-          <w:sz w:val="20"/>
-        </w:rPr>
-        <w:t>The upstream examples examined in Section 8 are dataset-derived material from the pinned Google Research revision. Their source is attributed above and they remain subject to the upstream Creative Commons Attribution-ShareAlike 4.0 International licence. The evidence package retains the relevant licence information.</w:t>
-      </w:r>
-    </w:p>
-    <w:p>
-      <w:pPr>
-        <w:spacing w:after="180"/>
-        <w:ind w:left="317" w:hanging="317"/>
-      </w:pPr>
-      <w:r>
-        <w:rPr>
-          <w:sz w:val="20"/>
-        </w:rPr>
-        <w:t>The report follows APA-style author–date citations. References to prior research describe the task and design rationale; their reported performance is not presented as FormBridge's performance.</w:t>
-      </w:r>
-    </w:p>
-    <w:p>
-      <w:pPr>
         <w:pStyle w:val="Heading1"/>
         <w:pageBreakBefore/>
       </w:pPr>
       <w:r>
         <w:t>Appendix A. Reproducing the application and evaluation</w:t>
-      </w:r>
-    </w:p>
-    <w:p>
-      <w:r>
-        <w:rPr>
-          <w:b/>
-        </w:rPr>
-        <w:t>Not included in the 15-page main report.</w:t>
       </w:r>
     </w:p>
     <w:p>
@@ -7118,7 +6695,7 @@
     </w:p>
     <w:p>
       <w:r>
-        <w:t>Prerequisites are Node.js 24, pnpm 11.24.0, Git and an OpenAI API project with access to the configured models. The repository is private: provide assessor access or a source archive. Installation and build do not require a secret key; new model analysis does.</w:t>
+        <w:t>Prerequisites are Node.js 24, pnpm 11.24.0, Git, repository access and an OpenAI API project with access to the configured models. Installation and build do not require an API key; model analysis does.</w:t>
       </w:r>
     </w:p>
     <w:p>
@@ -7153,9 +6730,9 @@
     </w:p>
     <w:p>
       <w:r>
-        <w:t xml:space="preserve">Set your own OPENAI_API_KEY in the private environment file and visit </w:t>
+        <w:t xml:space="preserve">The server reads OPENAI_API_KEY from the private environment file. The application runs at </w:t>
       </w:r>
-      <w:hyperlink r:id="rId26">
+      <w:hyperlink r:id="rId25">
         <w:r>
           <w:rPr>
             <w:color w:val="203D35"/>
@@ -7164,7 +6741,7 @@
         </w:r>
       </w:hyperlink>
       <w:r>
-        <w:t xml:space="preserve"> Never submit the real key. The earlier evaluation source commit is 32af459b6a1cd20ede9b08c2b73c20a0c385301e; the later release has unchanged extractor and runner fingerprints.</w:t>
+        <w:t xml:space="preserve"> The evaluation used source commit 32af459b6a1cd20ede9b08c2b73c20a0c385301e; the application release above has unchanged extractor and runner fingerprints.</w:t>
       </w:r>
     </w:p>
     <w:p>
@@ -7212,7 +6789,7 @@
     </w:p>
     <w:p>
       <w:r>
-        <w:t>The tag must be unique; completed results and selection manifests refuse overwrites. Do not repeatedly run the experiment and select the best outcome. All systems receive identical customer prefixes, and the extractor receives no gold values. A future repeat is a reproduction attempt on previously used data.</w:t>
+        <w:t>Each run needs a unique tag because completed results and selection manifests refuse overwrites. All systems receive identical customer prefixes, and the extractor receives no reference values. A repeat uses previously evaluated data and constitutes a reproduction attempt.</w:t>
       </w:r>
     </w:p>
     <w:p>
@@ -7225,12 +6802,12 @@
     </w:p>
     <w:p>
       <w:r>
-        <w:t>The runner writes a selection manifest before inference, progress during execution and a completed report containing values, strict/canonical matches, brief states, prefix usage, latency and warnings. Partial progress is not a finished result. Compare the saved manifest and fingerprints before comparing scores.</w:t>
+        <w:t>The runner writes a selection manifest before inference and a completed result file containing values, strict/canonical matches, brief states, prefix usage, latency and warnings. The manifest and source fingerprints identify the configuration associated with each completed result.</w:t>
       </w:r>
     </w:p>
     <w:p>
       <w:r>
-        <w:t>A rerun uses paid API calls and may differ because of provider alias updates or inference variability. The saved JSON and CSV allow the submitted findings to be independently checked without spending on a repeat.</w:t>
+        <w:t>Provider alias updates and inference variability may change a rerun's outputs. The saved JSON and CSV permit inspection of the reported findings without new API requests.</w:t>
       </w:r>
     </w:p>
     <w:p>
@@ -7282,7 +6859,7 @@
     </w:p>
     <w:p>
       <w:r>
-        <w:t>The exclusion file is the union of 60 previously selected test IDs, including interrupted runs. The remaining 13 were selected before the final comparison. Repeating them does not create another untouched test set.</w:t>
+        <w:t>The exclusion file contains 60 previously selected test IDs, including interrupted runs. The remaining 13 were selected before the final comparison. Subsequent runs reuse that same selection.</w:t>
       </w:r>
     </w:p>
     <w:p>
@@ -7353,7 +6930,7 @@
     </w:p>
     <w:p>
       <w:r>
-        <w:t>Start with a new brief; enter the four-message enquiry from Section 2 with a valid future date. Confirm four guests and 7 pm, then five guests and an unresolved after-8 preference, then accepted 8:30 pm. Inspect both time sources. Approve the resolved brief and download text and JSON; open the files and check the values and reviewed status. Add a further correction and confirm that approval clears. Refresh and inspect the restored draft. A native Save As dialog may need to finish before a browser download event is observed.</w:t>
+        <w:t>Start with a new brief; enter the four-message enquiry from Section 2 with a valid future date. Confirm four guests and 7 pm, then five guests and an unresolved after-8 preference, then accepted 8:30 pm. Inspect both time sources. Approve the resolved brief and download text and JSON; open the files and check the values and reviewed status. Add a further correction and confirm that approval clears. Refresh and inspect the restored draft. Downloads can be checked directly from the saved files.</w:t>
       </w:r>
     </w:p>
     <w:p>
@@ -7474,7 +7051,7 @@
                 <w:rFonts w:ascii="Arial" w:hAnsi="Arial"/>
                 <w:sz w:val="18"/>
               </w:rPr>
-              <w:t>Frozen protocol</w:t>
+              <w:t>Evaluation settings and sample selection</w:t>
             </w:r>
           </w:p>
         </w:tc>
@@ -8172,7 +7749,7 @@
     </w:p>
     <w:p>
       <w:r>
-        <w:t>The evaluated extractor fingerprint is a1113cf69b4d8ab94586a6e02c4cafba988c919dfcd4496e37ac269d0a16dbf6. The runner fingerprint is 8d35ba98fb2dc0934e72a076df5d7e235b67b0e362beb3b5772a446e48f9cc9f. Both were rechecked against the inspected report source. The browser-case record is an earlier live release check; the later evaluation runner change did not alter the product interface.</w:t>
+        <w:t>Source fingerprints are recorded in the completed evaluation files. The browser-case record covers an earlier product release; the later evaluation runner change did not alter the interface.</w:t>
       </w:r>
     </w:p>
     <w:p>
@@ -8185,25 +7762,12 @@
     </w:p>
     <w:p>
       <w:r>
-        <w:t>Dataset error analysis inspected development dialogues 1_00005, 1_00006 and 1_00017, and test dialogue 1_00027 in the pinned upstream dialogue files. It did not change the gold labels or rescore the frozen runs. The report figure data are generated from the saved summary CSV; individual field and error observations come from the saved prediction records.</w:t>
+        <w:t>Error analysis used development dialogues 1_00005, 1_00006 and 1_00017, and test dialogue 1_00027 from the pinned SGD revision. The original labels and final run scores were retained. Figure 4 uses the saved summary CSV; field-level observations use the saved predictions. Dataset-derived material is attributed to Google Research and is subject to the dataset's Creative Commons Attribution-ShareAlike 4.0 International licence.</w:t>
       </w:r>
     </w:p>
     <w:p>
       <w:r>
-        <w:t>Fresh screenshot capture adds an illustrative live enquiry rather than a new benchmark. Public product media and README copy are separate from these assessment materials.</w:t>
-      </w:r>
-    </w:p>
-    <w:p>
-      <w:pPr>
-        <w:pStyle w:val="Heading2"/>
-      </w:pPr>
-      <w:r>
-        <w:t>Appendix C. AI assistance acknowledgement</w:t>
-      </w:r>
-    </w:p>
-    <w:p>
-      <w:r>
-        <w:t>Generative AI tools assisted application development, testing support, figure preparation and the first draft of this report. Evaluation figures were taken from retained experiment records, and the product images were captured from the live application. AI assistance does not replace the submitting authors' responsibility for checking the technical claims, references and contribution statements. This acknowledgement should be aligned with the subject's declaration requirements before submission.</w:t>
+        <w:t>Figures 1, 3 and 5 are original captures of the live application on 11 October 2026 using a fictional restaurant enquiry. They illustrate the interface without including customer records. Figure 2 describes the implemented processing flow.</w:t>
       </w:r>
     </w:p>
     <w:sectPr>

</xml_diff>

<commit_message>
docs: match report cover to supplied UTS academic layout
</commit_message>
<xml_diff>
--- a/docs/assessment/FormBridge-AT2-Report.docx
+++ b/docs/assessment/FormBridge-AT2-Report.docx
@@ -4,79 +4,13 @@
   <w:body>
     <w:p>
       <w:pPr>
-        <w:spacing w:after="100"/>
-      </w:pPr>
-      <w:r>
-        <w:rPr>
-          <w:rFonts w:ascii="Arial" w:hAnsi="Arial"/>
-          <w:b/>
-          <w:color w:val="203D35"/>
-          <w:sz w:val="18"/>
-        </w:rPr>
-        <w:t>36118   /   APPLIED NATURAL LANGUAGE PROCESSING</w:t>
-      </w:r>
-    </w:p>
-    <w:p>
-      <w:pPr>
-        <w:spacing w:after="580"/>
-      </w:pPr>
-      <w:r>
-        <w:rPr>
-          <w:rFonts w:ascii="Arial" w:hAnsi="Arial"/>
-          <w:color w:val="526258"/>
-          <w:sz w:val="18"/>
-        </w:rPr>
-        <w:t>SPRING 2026     ·     ASSESSMENT TASK 2, PART B</w:t>
-      </w:r>
-    </w:p>
-    <w:p>
-      <w:pPr>
-        <w:spacing w:after="180"/>
-      </w:pPr>
-      <w:r>
-        <w:rPr>
-          <w:rFonts w:ascii="Georgia" w:hAnsi="Georgia"/>
-          <w:color w:val="203D35"/>
-          <w:sz w:val="108"/>
-        </w:rPr>
-        <w:t>FormBridge</w:t>
-      </w:r>
-    </w:p>
-    <w:p>
-      <w:pPr>
-        <w:spacing w:after="440" w:line="259" w:lineRule="auto"/>
-      </w:pPr>
-      <w:r>
-        <w:rPr>
-          <w:rFonts w:ascii="Georgia" w:hAnsi="Georgia"/>
-          <w:color w:val="203D35"/>
-          <w:sz w:val="38"/>
-        </w:rPr>
-        <w:t>Evidence-linked dialogue state tracking for restaurant booking briefs</w:t>
-      </w:r>
-    </w:p>
-    <w:p>
-      <w:pPr>
-        <w:spacing w:after="180"/>
-      </w:pPr>
-      <w:r>
-        <w:rPr>
-          <w:rFonts w:ascii="Arial" w:hAnsi="Arial"/>
-          <w:b/>
-          <w:color w:val="526258"/>
-          <w:sz w:val="18"/>
-        </w:rPr>
-        <w:t>GROUP TECHNICAL REPORT</w:t>
-      </w:r>
-    </w:p>
-    <w:p>
-      <w:pPr>
-        <w:spacing w:after="160"/>
+        <w:spacing w:before="520" w:after="1500" w:line="240" w:lineRule="auto"/>
+        <w:jc w:val="center"/>
       </w:pPr>
       <w:r>
         <w:drawing>
           <wp:inline xmlns:a="http://schemas.openxmlformats.org/drawingml/2006/main" xmlns:pic="http://schemas.openxmlformats.org/drawingml/2006/picture">
-            <wp:extent cx="6126480" cy="3829050"/>
+            <wp:extent cx="4953000" cy="1216138"/>
             <wp:docPr id="1" name="Picture 1"/>
             <wp:cNvGraphicFramePr>
               <a:graphicFrameLocks noChangeAspect="1"/>
@@ -85,7 +19,7 @@
               <a:graphicData uri="http://schemas.openxmlformats.org/drawingml/2006/picture">
                 <pic:pic>
                   <pic:nvPicPr>
-                    <pic:cNvPr id="0" name="workspace-approved.jpg"/>
+                    <pic:cNvPr id="0" name="uts-logo.jpg"/>
                     <pic:cNvPicPr/>
                   </pic:nvPicPr>
                   <pic:blipFill>
@@ -97,7 +31,7 @@
                   <pic:spPr>
                     <a:xfrm>
                       <a:off x="0" y="0"/>
-                      <a:ext cx="6126480" cy="3829050"/>
+                      <a:ext cx="4953000" cy="1216138"/>
                     </a:xfrm>
                     <a:prstGeom prst="rect"/>
                   </pic:spPr>
@@ -110,77 +44,83 @@
     </w:p>
     <w:p>
       <w:pPr>
-        <w:pStyle w:val="Caption"/>
-        <w:spacing w:after="400"/>
+        <w:keepNext/>
+        <w:spacing w:before="0" w:after="160" w:line="240" w:lineRule="auto"/>
+        <w:jc w:val="center"/>
       </w:pPr>
       <w:r>
-        <w:t>The conversation and the reviewed booking brief in the live application.</w:t>
+        <w:rPr>
+          <w:rFonts w:ascii="Liberation Serif" w:hAnsi="Liberation Serif"/>
+          <w:b/>
+          <w:color w:val="202932"/>
+          <w:sz w:val="38"/>
+        </w:rPr>
+        <w:t>Assignment 2: End-to-end NLP Project</w:t>
       </w:r>
     </w:p>
     <w:p>
       <w:pPr>
-        <w:spacing w:after="200"/>
-        <w:pBdr>
-          <w:bottom w:val="single" w:sz="9" w:color="203D35"/>
-        </w:pBdr>
-      </w:pPr>
-    </w:p>
-    <w:p>
-      <w:pPr>
-        <w:spacing w:after="140"/>
+        <w:keepNext/>
+        <w:spacing w:before="0" w:after="380" w:line="240" w:lineRule="auto"/>
+        <w:jc w:val="center"/>
       </w:pPr>
       <w:r>
         <w:rPr>
-          <w:rFonts w:ascii="Arial" w:hAnsi="Arial"/>
-          <w:color w:val="526258"/>
-          <w:sz w:val="20"/>
+          <w:rFonts w:ascii="Liberation Serif" w:hAnsi="Liberation Serif"/>
+          <w:b/>
+          <w:color w:val="202932"/>
+          <w:sz w:val="28"/>
         </w:rPr>
-        <w:t>11 October 2026</w:t>
+        <w:t>FormBridge: Restaurant Booking Briefs</w:t>
       </w:r>
     </w:p>
     <w:p>
       <w:pPr>
-        <w:spacing w:after="80"/>
+        <w:keepNext/>
+        <w:spacing w:before="0" w:after="2800" w:line="240" w:lineRule="auto"/>
+        <w:jc w:val="center"/>
       </w:pPr>
       <w:r>
         <w:rPr>
-          <w:rFonts w:ascii="Arial" w:hAnsi="Arial"/>
+          <w:rFonts w:ascii="Liberation Serif" w:hAnsi="Liberation Serif"/>
           <w:b/>
-          <w:color w:val="526258"/>
-          <w:sz w:val="18"/>
+          <w:color w:val="202932"/>
+          <w:sz w:val="28"/>
         </w:rPr>
-        <w:t xml:space="preserve">Application  </w:t>
+        <w:t>36118 Applied Natural Language Processing</w:t>
       </w:r>
-      <w:hyperlink r:id="rId12">
-        <w:r>
-          <w:rPr>
-            <w:color w:val="203D35"/>
-          </w:rPr>
-          <w:t>https://formbridge-nlp-at2.vercel.app/</w:t>
-        </w:r>
-      </w:hyperlink>
     </w:p>
     <w:p>
       <w:pPr>
-        <w:spacing w:after="80"/>
+        <w:keepNext/>
+        <w:spacing w:before="0" w:after="80" w:line="240" w:lineRule="auto"/>
+        <w:jc w:val="left"/>
       </w:pPr>
       <w:r>
         <w:rPr>
-          <w:rFonts w:ascii="Arial" w:hAnsi="Arial"/>
+          <w:rFonts w:ascii="Liberation Serif" w:hAnsi="Liberation Serif"/>
           <w:b/>
-          <w:color w:val="526258"/>
-          <w:sz w:val="18"/>
+          <w:color w:val="202932"/>
+          <w:sz w:val="23"/>
         </w:rPr>
-        <w:t xml:space="preserve">Source repository  </w:t>
+        <w:t>Student Name: Karthik Ramesh</w:t>
       </w:r>
-      <w:hyperlink r:id="rId13">
-        <w:r>
-          <w:rPr>
-            <w:color w:val="203D35"/>
-          </w:rPr>
-          <w:t>https://github.com/KarthikRamesh9149/NLP-AT2</w:t>
-        </w:r>
-      </w:hyperlink>
+    </w:p>
+    <w:p>
+      <w:pPr>
+        <w:keepNext w:val="0"/>
+        <w:spacing w:before="0" w:after="360" w:line="240" w:lineRule="auto"/>
+        <w:jc w:val="left"/>
+      </w:pPr>
+      <w:r>
+        <w:rPr>
+          <w:rFonts w:ascii="Liberation Serif" w:hAnsi="Liberation Serif"/>
+          <w:b/>
+          <w:color w:val="202932"/>
+          <w:sz w:val="23"/>
+        </w:rPr>
+        <w:t>Student ID: 26043455</w:t>
+      </w:r>
     </w:p>
     <w:p>
       <w:pPr>
@@ -1468,7 +1408,7 @@
                     <pic:cNvPicPr/>
                   </pic:nvPicPr>
                   <pic:blipFill>
-                    <a:blip r:embed="rId11"/>
+                    <a:blip r:embed="rId12"/>
                     <a:stretch>
                       <a:fillRect/>
                     </a:stretch>
@@ -1642,7 +1582,7 @@
                     <pic:cNvPicPr/>
                   </pic:nvPicPr>
                   <pic:blipFill>
-                    <a:blip r:embed="rId14"/>
+                    <a:blip r:embed="rId13"/>
                     <a:stretch>
                       <a:fillRect/>
                     </a:stretch>
@@ -2584,7 +2524,7 @@
                     <pic:cNvPicPr/>
                   </pic:nvPicPr>
                   <pic:blipFill>
-                    <a:blip r:embed="rId15"/>
+                    <a:blip r:embed="rId14"/>
                     <a:stretch>
                       <a:fillRect/>
                     </a:stretch>
@@ -4274,7 +4214,7 @@
                     <pic:cNvPicPr/>
                   </pic:nvPicPr>
                   <pic:blipFill>
-                    <a:blip r:embed="rId16"/>
+                    <a:blip r:embed="rId15"/>
                     <a:stretch>
                       <a:fillRect/>
                     </a:stretch>
@@ -5692,7 +5632,7 @@
                           <pic:cNvPicPr/>
                         </pic:nvPicPr>
                         <pic:blipFill>
-                          <a:blip r:embed="rId17"/>
+                          <a:blip r:embed="rId16"/>
                           <a:stretch>
                             <a:fillRect/>
                           </a:stretch>
@@ -6469,7 +6409,7 @@
         </w:rPr>
         <w:t xml:space="preserve"> (pp. 1–13). Association for Computing Machinery. </w:t>
       </w:r>
-      <w:hyperlink r:id="rId18">
+      <w:hyperlink r:id="rId17">
         <w:r>
           <w:rPr>
             <w:color w:val="203D35"/>
@@ -6502,7 +6442,7 @@
         </w:rPr>
         <w:t xml:space="preserve"> [Data set; revision e852981ae34990f4358979625854259302feaa78]. GitHub. </w:t>
       </w:r>
-      <w:hyperlink r:id="rId19">
+      <w:hyperlink r:id="rId18">
         <w:r>
           <w:rPr>
             <w:color w:val="203D35"/>
@@ -6535,7 +6475,7 @@
         </w:rPr>
         <w:t xml:space="preserve">. Nielsen Norman Group. </w:t>
       </w:r>
-      <w:hyperlink r:id="rId20">
+      <w:hyperlink r:id="rId19">
         <w:r>
           <w:rPr>
             <w:color w:val="203D35"/>
@@ -6568,7 +6508,7 @@
         </w:rPr>
         <w:t xml:space="preserve">. Retrieved October 11, 2026, from </w:t>
       </w:r>
-      <w:hyperlink r:id="rId21">
+      <w:hyperlink r:id="rId20">
         <w:r>
           <w:rPr>
             <w:color w:val="203D35"/>
@@ -6601,7 +6541,7 @@
         </w:rPr>
         <w:t xml:space="preserve">. Retrieved October 11, 2026, from </w:t>
       </w:r>
-      <w:hyperlink r:id="rId22">
+      <w:hyperlink r:id="rId21">
         <w:r>
           <w:rPr>
             <w:color w:val="203D35"/>
@@ -6634,7 +6574,7 @@
         </w:rPr>
         <w:t xml:space="preserve">(5), 8689–8696. </w:t>
       </w:r>
-      <w:hyperlink r:id="rId23">
+      <w:hyperlink r:id="rId22">
         <w:r>
           <w:rPr>
             <w:color w:val="203D35"/>
@@ -6667,7 +6607,7 @@
         </w:rPr>
         <w:t xml:space="preserve"> (pp. 808–819). Association for Computational Linguistics. </w:t>
       </w:r>
-      <w:hyperlink r:id="rId24">
+      <w:hyperlink r:id="rId23">
         <w:r>
           <w:rPr>
             <w:color w:val="203D35"/>
@@ -6732,7 +6672,7 @@
       <w:r>
         <w:t xml:space="preserve">The server reads OPENAI_API_KEY from the private environment file. The application runs at </w:t>
       </w:r>
-      <w:hyperlink r:id="rId25">
+      <w:hyperlink r:id="rId24">
         <w:r>
           <w:rPr>
             <w:color w:val="203D35"/>
@@ -6927,6 +6867,19 @@
       <w:r>
         <w:t>A.6 Interface and download reproduction</w:t>
       </w:r>
+    </w:p>
+    <w:p>
+      <w:r>
+        <w:t xml:space="preserve">Live application: </w:t>
+      </w:r>
+      <w:hyperlink r:id="rId25">
+        <w:r>
+          <w:rPr>
+            <w:color w:val="203D35"/>
+          </w:rPr>
+          <w:t>https://formbridge-nlp-at2.vercel.app/</w:t>
+        </w:r>
+      </w:hyperlink>
     </w:p>
     <w:p>
       <w:r>

</xml_diff>

<commit_message>
docs: strengthen assessment evidence and include verified post-fix live checks
</commit_message>
<xml_diff>
--- a/docs/assessment/FormBridge-AT2-Report.docx
+++ b/docs/assessment/FormBridge-AT2-Report.docx
@@ -143,7 +143,7 @@
     </w:p>
     <w:p>
       <w:r>
-        <w:t>The application supports review and handoff of a booking brief; it does not reserve a table. Recorded browser checks cover 20 ordinary enquiries and 15 edge cases; native text and JSON downloads were verified. No recruited-user study was conducted. The results show that the application supports the tested workflow. Broader extraction accuracy and benefits for restaurant staff require further evaluation.</w:t>
+        <w:t>The application supports review and handoff of a booking brief; it does not reserve a table. Recorded browser checks cover 20 ordinary enquiries and 15 edge cases; native text and JSON downloads were verified. A retrospective source review found clear support for 61 of 62 non-empty predictions, with one ambiguous carryover. Eight of nine reviewed clarification questions addressed the outstanding task; the cancellation follow-up was then corrected. Eight live checks passed after deployment, including four repeated booking tasks with no field errors. No recruited-user study was conducted. Benefits for restaurant staff require participant evaluation.</w:t>
       </w:r>
     </w:p>
     <w:p>
@@ -910,7 +910,7 @@
                 <w:rFonts w:ascii="Arial" w:hAnsi="Arial"/>
                 <w:sz w:val="18"/>
               </w:rPr>
-              <w:t>Appendices A–B: reproduction and supporting results</w:t>
+              <w:t>Appendices A–D: reproduction and supporting results</w:t>
             </w:r>
           </w:p>
         </w:tc>
@@ -935,7 +935,7 @@
                 <w:rFonts w:ascii="Arial" w:hAnsi="Arial"/>
                 <w:sz w:val="18"/>
               </w:rPr>
-              <w:t>16–18</w:t>
+              <w:t>16–20</w:t>
             </w:r>
           </w:p>
         </w:tc>
@@ -1395,7 +1395,7 @@
       <w:r>
         <w:drawing>
           <wp:inline xmlns:a="http://schemas.openxmlformats.org/drawingml/2006/main" xmlns:pic="http://schemas.openxmlformats.org/drawingml/2006/picture">
-            <wp:extent cx="5669280" cy="3543300"/>
+            <wp:extent cx="3931920" cy="4502198"/>
             <wp:docPr id="2" name="Picture 2"/>
             <wp:cNvGraphicFramePr>
               <a:graphicFrameLocks noChangeAspect="1"/>
@@ -1404,7 +1404,7 @@
               <a:graphicData uri="http://schemas.openxmlformats.org/drawingml/2006/picture">
                 <pic:pic>
                   <pic:nvPicPr>
-                    <pic:cNvPr id="0" name="workspace-approved.jpg"/>
+                    <pic:cNvPr id="0" name="booking-card-detail.jpg"/>
                     <pic:cNvPicPr/>
                   </pic:nvPicPr>
                   <pic:blipFill>
@@ -1416,7 +1416,7 @@
                   <pic:spPr>
                     <a:xfrm>
                       <a:off x="0" y="0"/>
-                      <a:ext cx="5669280" cy="3543300"/>
+                      <a:ext cx="3931920" cy="4502198"/>
                     </a:xfrm>
                     <a:prstGeom prst="rect"/>
                   </pic:spPr>
@@ -1432,7 +1432,7 @@
         <w:pStyle w:val="Caption"/>
       </w:pPr>
       <w:r>
-        <w:t>Figure 1. Live application captured on 11 October 2026. The example request is Juniper, Sydney, 18 October 2026, 8:30 pm and five guests. Source: original product capture using a fictional enquiry.</w:t>
+        <w:t>Figure 1. Reviewed booking details and handoff controls. The customer has accepted 8:30 pm for five guests at Juniper, Sydney, on 18 October 2026. Source: original live-app capture, 11 October 2026, using a fictional enquiry.</w:t>
       </w:r>
     </w:p>
     <w:p>
@@ -1457,7 +1457,7 @@
         <w:t>Gather:</w:t>
       </w:r>
       <w:r>
-        <w:t xml:space="preserve"> Enter “A table for four at Juniper in Sydney on 18 October 2026 at 7 pm.”</w:t>
+        <w:t xml:space="preserve"> Enter four guests, Juniper, Sydney, 18 October 2026 and 7 pm.</w:t>
       </w:r>
     </w:p>
     <w:p>
@@ -1474,7 +1474,7 @@
         <w:t>Revise:</w:t>
       </w:r>
       <w:r>
-        <w:t xml:space="preserve"> Add “Actually, make that five guests, and sometime after 8 pm instead.” Five guests becomes the current value; the exact time remains open.</w:t>
+        <w:t xml:space="preserve"> Change to five guests after 8 pm. Guest count updates; exact time stays open.</w:t>
       </w:r>
     </w:p>
     <w:p>
@@ -1491,7 +1491,7 @@
         <w:t>Clarify:</w:t>
       </w:r>
       <w:r>
-        <w:t xml:space="preserve"> The application suggests a question asking for the exact time. Staff can copy it and add the customer's reply.</w:t>
+        <w:t xml:space="preserve"> Copy the suggested question and add the customer's response.</w:t>
       </w:r>
     </w:p>
     <w:p>
@@ -1508,7 +1508,7 @@
         <w:t>Check:</w:t>
       </w:r>
       <w:r>
-        <w:t xml:space="preserve"> A staff offer of 8:30 pm becomes ready after the customer accepts. Selecting Time displays both source messages.</w:t>
+        <w:t xml:space="preserve"> After the customer accepts staff's 8:30 pm offer, inspect both time sources.</w:t>
       </w:r>
     </w:p>
     <w:p>
@@ -1525,7 +1525,7 @@
         <w:t>Hand over:</w:t>
       </w:r>
       <w:r>
-        <w:t xml:space="preserve"> Staff review or edit the details, approve the current revision and download text or JSON.</w:t>
+        <w:t xml:space="preserve"> Review, approve and download text or JSON.</w:t>
       </w:r>
     </w:p>
     <w:p>
@@ -2019,17 +2019,17 @@
     </w:p>
     <w:p>
       <w:r>
-        <w:t>The rules recognise common party-size phrases, full calendar dates, explicit times, after-time constraints and named restaurants or cities in restricted patterns. They process messages in order and use a simple acceptance pattern to connect a customer reply with the preceding staff message. Its restricted vocabulary limits coverage of varied dialogue. It uses no learned parameters or API tokens.</w:t>
+        <w:t>Rules recognise explicit booking phrases and straightforward corrections. Messages are processed in order, with simple acceptance of a preceding staff offer. Restricted patterns limit coverage of varied dialogue; no learned parameters or API tokens are used.</w:t>
       </w:r>
     </w:p>
     <w:p>
       <w:r>
-        <w:t>The direct baseline reconstructs the five-field state at every customer turn. Its structured output contains value, status and constraint, but no evidence citations. Its prompt instructs the model to avoid invented values and unaccepted staff offers. Both contextual methods therefore target the same booking-state task.</w:t>
+        <w:t>The direct baseline reconstructs value, status and constraint at every customer turn, without evidence citations. Its prompt rejects invented values and unaccepted offers. Both contextual methods target the same five-field task.</w:t>
       </w:r>
     </w:p>
     <w:p>
       <w:r>
-        <w:t>FormBridge reconstructs candidate values from the same visible prefix. Previous browser state supplies staff overrides and history; supporting utterances determine whether a candidate is accepted. Corrections update the brief without changing model weights.</w:t>
+        <w:t>FormBridge reconstructs candidates from the same prefix. Browser state supplies staff overrides and history; supporting utterances determine acceptance. Corrections change the brief, not model weights.</w:t>
       </w:r>
     </w:p>
     <w:p>
@@ -2042,7 +2042,7 @@
     </w:p>
     <w:p>
       <w:r>
-        <w:t>Contextual extraction was selected because acceptance, correction and omitted context extend beyond a small set of regular expressions. A hosted model allowed the project to spend effort on state integrity, review controls and comparison, without assembling a new training corpus or serving a fine-tuned model. This choice brings network dependency, variable latency, external data processing and limited control over model weights.</w:t>
+        <w:t>Acceptance, correction and omitted context extend beyond simple regular expressions. A hosted model allowed effort to focus on state integrity and review without training or serving new weights. Tradeoffs include network dependency, variable latency and external data processing.</w:t>
       </w:r>
     </w:p>
     <w:p>
@@ -2053,6 +2053,11 @@
     <w:p>
       <w:r>
         <w:t>The deployed configuration uses GPT-6 Luna for extraction and at most one GPT-6.1 Sol repair, with low reasoning effort. The controlled comparison uses GPT-6 Luna for both approaches and repairs. Primary requests have a 12-second timeout; repairs have a 10-second timeout. SDK retries are disabled. Output budgets are 2,400 tokens for FormBridge and 900 for direct extraction. These model names are provider aliases, so a future rerun may use an updated model.</w:t>
+      </w:r>
+    </w:p>
+    <w:p>
+      <w:r>
+        <w:t>Luna was retained as the primary model after development trials. An earlier Sol-led 10-dialogue pilot had one terminal failure and longer replay times; its different prompt and repair settings prevent a pure model ranking. Sol is reserved for a second check when validation detects an issue. Low reasoning and one repair limit waiting and usage. The 12- and 10-second limits leave headroom within Vercel's 30-second route limit; disabling SDK retries avoids additional waits. The larger FormBridge output budget accommodates five sets of source quotations. These are engineering choices, not proven optimal settings.</w:t>
       </w:r>
     </w:p>
     <w:p>
@@ -2511,7 +2516,7 @@
       <w:r>
         <w:drawing>
           <wp:inline xmlns:a="http://schemas.openxmlformats.org/drawingml/2006/main" xmlns:pic="http://schemas.openxmlformats.org/drawingml/2006/picture">
-            <wp:extent cx="6126480" cy="1815666"/>
+            <wp:extent cx="5212080" cy="2546360"/>
             <wp:docPr id="4" name="Picture 4"/>
             <wp:cNvGraphicFramePr>
               <a:graphicFrameLocks noChangeAspect="1"/>
@@ -2520,7 +2525,7 @@
               <a:graphicData uri="http://schemas.openxmlformats.org/drawingml/2006/picture">
                 <pic:pic>
                   <pic:nvPicPr>
-                    <pic:cNvPr id="0" name="uncertainty-and-evidence.jpg"/>
+                    <pic:cNvPr id="0" name="accepted-time-detail.jpg"/>
                     <pic:cNvPicPr/>
                   </pic:nvPicPr>
                   <pic:blipFill>
@@ -2532,7 +2537,7 @@
                   <pic:spPr>
                     <a:xfrm>
                       <a:off x="0" y="0"/>
-                      <a:ext cx="6126480" cy="1815666"/>
+                      <a:ext cx="5212080" cy="2546360"/>
                     </a:xfrm>
                     <a:prstGeom prst="rect"/>
                   </pic:spPr>
@@ -2548,7 +2553,7 @@
         <w:pStyle w:val="Caption"/>
       </w:pPr>
       <w:r>
-        <w:t>Figure 3. Time correction and acceptance in the live application. Left: “after 8 pm” leaves the exact time unresolved. Right: accepting 8:30 pm links the staff offer and customer reply. Source: original product captures.</w:t>
+        <w:t>Figure 3. Expanded Time field linking the 8:30 pm staff offer and the customer's acceptance. Source: original live-app capture, 11 October 2026. An enlarged unresolved-time example appears in Appendix C.</w:t>
       </w:r>
     </w:p>
     <w:p>
@@ -2566,7 +2571,7 @@
     </w:p>
     <w:p>
       <w:r>
-        <w:t>Evidence checking can miss implicit acceptance or reject a valid correction. A quotation may also be present but misinterpreted. Prompt instructions and pattern filters provide limited protection against adversarial input. Staff review is therefore necessary, and an unsupported-value rate was not independently measured.</w:t>
+        <w:t>Evidence checking can miss implicit acceptance or reject a valid correction. A quotation may also be present but misinterpreted. Prompt instructions and pattern filters provide limited protection against adversarial input. The retrospective source audit in Section 6.2 evaluates retained final values; it does not establish reliable evidence interpretation for arbitrary conversations.</w:t>
       </w:r>
     </w:p>
     <w:p>
@@ -3205,7 +3210,7 @@
     </w:p>
     <w:p>
       <w:r>
-        <w:t>No independent aggregate score was produced for evidence correctness, unsupported values, clarification accuracy or real-user task completion. These require additional annotation or participants. The functional checks assess selected behaviours rather than replace those missing measurements.</w:t>
+        <w:t>A supplementary retrospective audit inspected all 65 FormBridge field positions in the saved 13-dialogue test remainder. Each non-empty value was checked against its linked messages and visible conversation: explicit customer statements or scoped acceptance counted as supported; disputed carryover counted as ambiguous. Omissions remained separate. Nine clarification questions from the recorded edge cases were judged against the missing detail or customer intent, including cancellation. This was a single review of known outputs, without a second rating. It evaluates source support and question relevance separately from field matching, but does not measure unseen performance or user benefit. Appendix C gives the outcomes and criteria.</w:t>
       </w:r>
     </w:p>
     <w:p>
@@ -5510,7 +5515,12 @@
     </w:p>
     <w:p>
       <w:r>
-        <w:t>The original conversations show these carryover patterns, but the saved traces do not retain every intermediate candidate and rejection decision. They therefore cannot establish whether extraction, repair or reconciliation caused each omission. Future evaluation needs both detailed decision traces and annotations that distinguish a supported carryover from an unresolved request.</w:t>
+        <w:t>The source audit found clear support for 61/62 non-empty final values, with one ambiguous date carryover in 4_00026. No clearly invented value was observed; three omitted slots remain in the 65-position denominator. All 12 retained dates without a year remained unready for approval. Eight of nine clarification questions were appropriate. After whole-request cancellation, the remaining question asked for a restaurant as though starting a new enquiry. The fields were correctly cleared, but that question missed the customer's intent. The deployed correction now acknowledges cancellation; the exact case passed on replay (Appendix D).</w:t>
+      </w:r>
+    </w:p>
+    <w:p>
+      <w:r>
+        <w:t>These reviews distinguish value matching, source support and conversational usefulness. The saved traces omit intermediate candidate decisions, so they cannot assign each error to extraction, repair or reconciliation. No second reviewer checked the source and question ratings.</w:t>
       </w:r>
     </w:p>
     <w:p>
@@ -5530,13 +5540,13 @@
         <w:tblLook w:firstColumn="1" w:firstRow="1" w:lastColumn="0" w:lastRow="0" w:noHBand="0" w:noVBand="1" w:val="04A0"/>
       </w:tblPr>
       <w:tblGrid>
-        <w:gridCol w:w="6379"/>
-        <w:gridCol w:w="3326"/>
+        <w:gridCol w:w="4867"/>
+        <w:gridCol w:w="4838"/>
       </w:tblGrid>
       <w:tr>
         <w:tc>
           <w:tcPr>
-            <w:tcW w:type="dxa" w:w="6379"/>
+            <w:tcW w:type="dxa" w:w="4867"/>
             <w:vAlign w:val="top"/>
             <w:tcMar>
               <w:top w:w="0" w:type="dxa"/>
@@ -5561,7 +5571,7 @@
           </w:p>
           <w:p>
             <w:r>
-              <w:t>Status labels, familiar terms and editable values follow Nielsen's usability principles (Nielsen, 1994). Source links and explanations of uncertainty also support checking and correcting model output, as recommended by Amershi et al. (2019). These principles guided the interface design; its usability has not been tested with recruited participants.</w:t>
+              <w:t>Status labels, familiar terms and editable values follow Nielsen's usability principles (Nielsen, 1994). Source links and uncertainty explanations support checking and correcting model output (Amershi et al., 2019). These principles guided the design; recruited participants have not evaluated it.</w:t>
             </w:r>
           </w:p>
           <w:p>
@@ -5574,17 +5584,17 @@
           </w:p>
           <w:p>
             <w:r>
-              <w:t>The recorded browser run passed all 20 ordinary enquiry cases and 15 edge cases. The authored cases exercised custom input, corrections, uncertain dates and times, staff acceptance, cancellation, manual overrides, refresh and mobile switching. Each pass refers to the case's specified functional checks, rather than general extraction accuracy.</w:t>
+              <w:t>The recorded browser run passed 20 ordinary enquiries and 15 edge cases covering custom input, corrections, uncertainty, acceptance, cancellation, staff edits, refresh and mobile switching. Passing refers to specified functional checks. A later review found an inappropriate cancellation question. After correction, eight live checks passed: four repeated booking tasks and four cancellation/reopening checks (Appendix D).</w:t>
             </w:r>
           </w:p>
           <w:p>
             <w:r>
-              <w:t>Four downloads were saved and opened: draft text, approved text, approved JSON and revised unresolved draft JSON. Checks covered values, transcript, source IDs, revision history and review status. A correction cleared approval in the revised export. Native file inspection verified delivery where browser automation had not returned a download event.</w:t>
+              <w:t>Four downloaded files were opened: draft text, approved text, approved JSON and revised draft JSON. Values, transcript, source IDs, history and review status were checked. A correction cleared approval. Native file inspection confirmed delivery despite the missing browser download event.</w:t>
             </w:r>
           </w:p>
           <w:p>
             <w:r>
-              <w:t>The interface includes labelled inputs and edit controls, a skip link, modal keyboard focus handling and reduced-motion support. The code and recorded interaction checks support these implementation claims. No formal accessibility conformance audit has been completed.</w:t>
+              <w:t>Labelled controls, a skip link, modal focus handling and reduced-motion support are implemented. No formal accessibility conformance audit has been completed.</w:t>
             </w:r>
           </w:p>
           <w:p>
@@ -5597,13 +5607,13 @@
           </w:p>
           <w:p>
             <w:r>
-              <w:t>The functional checks did not measure satisfaction, task completion time or adoption by restaurant staff. A usability study should compare matched transcript-to-brief tasks with and without FormBridge, vary task order and record completion time, remaining errors and source checks. Restaurant staff would be the preferred participants; classmates would provide proxy feedback. The study should also test whether analysis delays disrupt the workflow.</w:t>
+              <w:t>The repeated tasks had no errors across 20 field positions. Ten displayed time citations were inspected; both complete briefs were approved and both unresolved briefs stayed blocked. These are browser functional observations. Task time, satisfaction and staff adoption remain unmeasured; a participant comparison is still needed.</w:t>
             </w:r>
           </w:p>
         </w:tc>
         <w:tc>
           <w:tcPr>
-            <w:tcW w:type="dxa" w:w="3326"/>
+            <w:tcW w:type="dxa" w:w="4838"/>
             <w:vAlign w:val="top"/>
             <w:tcMar>
               <w:top w:w="0" w:type="dxa"/>
@@ -5619,7 +5629,7 @@
             <w:r>
               <w:drawing>
                 <wp:inline xmlns:a="http://schemas.openxmlformats.org/drawingml/2006/main" xmlns:pic="http://schemas.openxmlformats.org/drawingml/2006/picture">
-                  <wp:extent cx="1847088" cy="4475230"/>
+                  <wp:extent cx="2880360" cy="6978701"/>
                   <wp:docPr id="6" name="Picture 6"/>
                   <wp:cNvGraphicFramePr>
                     <a:graphicFrameLocks noChangeAspect="1"/>
@@ -5640,7 +5650,7 @@
                         <pic:spPr>
                           <a:xfrm>
                             <a:off x="0" y="0"/>
-                            <a:ext cx="1847088" cy="4475230"/>
+                            <a:ext cx="2880360" cy="6978701"/>
                           </a:xfrm>
                           <a:prstGeom prst="rect"/>
                         </pic:spPr>
@@ -5709,7 +5719,7 @@
     </w:p>
     <w:p>
       <w:r>
-        <w:t>The controlled experiment fixes model identity, but evidence prompts and repair budgets differ. It cannot isolate validation as the causal source of improvement. Values are scored at the final turn; intermediate-turn accuracy, unsupported-value rates, evidence correctness and clarification quality were not independently quantified. The canonical scorer still misses some harmless wording differences. API aliases, concurrent provider use and incomplete failed-call token reporting limit exact regeneration and cost conclusions.</w:t>
+        <w:t>The controlled experiment fixes model identity, but evidence prompts and repair budgets differ. It cannot isolate validation as the causal source of improvement. Values are scored at the final turn. The supplementary source and clarification audit uses known outputs, one reviewer and a small selection; it cannot establish unseen support precision or inter-rater reliability. Intermediate-turn accuracy remains unquantified. The canonical scorer still misses harmless wording differences. API aliases, concurrent provider use and incomplete failed-call token reporting limit regeneration and cost conclusions.</w:t>
       </w:r>
     </w:p>
     <w:p>
@@ -6331,6 +6341,86 @@
           </w:p>
         </w:tc>
       </w:tr>
+      <w:tr>
+        <w:trPr>
+          <w:cantSplit/>
+        </w:trPr>
+        <w:tc>
+          <w:tcPr>
+            <w:tcW w:type="dxa" w:w="2664"/>
+            <w:vAlign w:val="center"/>
+            <w:shd w:fill="FFFFFF"/>
+            <w:tcMar>
+              <w:top w:w="45" w:type="dxa"/>
+              <w:bottom w:w="45" w:type="dxa"/>
+              <w:left w:w="45" w:type="dxa"/>
+              <w:right w:w="45" w:type="dxa"/>
+            </w:tcMar>
+          </w:tcPr>
+          <w:p>
+            <w:pPr>
+              <w:spacing w:after="30" w:before="30" w:line="245" w:lineRule="auto"/>
+            </w:pPr>
+            <w:r>
+              <w:rPr>
+                <w:rFonts w:ascii="Arial" w:hAnsi="Arial"/>
+                <w:sz w:val="18"/>
+              </w:rPr>
+              <w:t>Report audit and targeted correction</w:t>
+            </w:r>
+          </w:p>
+        </w:tc>
+        <w:tc>
+          <w:tcPr>
+            <w:tcW w:type="dxa" w:w="1800"/>
+            <w:vAlign w:val="center"/>
+            <w:shd w:fill="FFFFFF"/>
+            <w:tcMar>
+              <w:top w:w="45" w:type="dxa"/>
+              <w:bottom w:w="45" w:type="dxa"/>
+              <w:left w:w="45" w:type="dxa"/>
+              <w:right w:w="45" w:type="dxa"/>
+            </w:tcMar>
+          </w:tcPr>
+          <w:p>
+            <w:pPr>
+              <w:spacing w:after="30" w:before="30" w:line="245" w:lineRule="auto"/>
+            </w:pPr>
+            <w:r>
+              <w:rPr>
+                <w:rFonts w:ascii="Arial" w:hAnsi="Arial"/>
+                <w:sz w:val="18"/>
+              </w:rPr>
+              <w:t>11 October</w:t>
+            </w:r>
+          </w:p>
+        </w:tc>
+        <w:tc>
+          <w:tcPr>
+            <w:tcW w:type="dxa" w:w="5253"/>
+            <w:vAlign w:val="center"/>
+            <w:shd w:fill="FFFFFF"/>
+            <w:tcMar>
+              <w:top w:w="45" w:type="dxa"/>
+              <w:bottom w:w="45" w:type="dxa"/>
+              <w:left w:w="45" w:type="dxa"/>
+              <w:right w:w="45" w:type="dxa"/>
+            </w:tcMar>
+          </w:tcPr>
+          <w:p>
+            <w:pPr>
+              <w:spacing w:after="30" w:before="30" w:line="245" w:lineRule="auto"/>
+            </w:pPr>
+            <w:r>
+              <w:rPr>
+                <w:rFonts w:ascii="Arial" w:hAnsi="Arial"/>
+                <w:sz w:val="18"/>
+              </w:rPr>
+              <w:t>Source and question review, corrected cancellation follow-up and eight deployed task checks</w:t>
+            </w:r>
+          </w:p>
+        </w:tc>
+      </w:tr>
     </w:tbl>
     <w:p>
       <w:pPr>
@@ -6658,7 +6748,24 @@
         <w:t>pnpm install --frozen-lockfile</w:t>
         <w:br/>
         <w:t>cp .env.example .env.local</w:t>
-        <w:br/>
+      </w:r>
+    </w:p>
+    <w:p>
+      <w:r>
+        <w:t>Edit .env.local and set OPENAI_API_KEY to your own project key before model analysis. Keep this file private. Then run:</w:t>
+      </w:r>
+    </w:p>
+    <w:p>
+      <w:pPr>
+        <w:spacing w:after="140" w:line="240" w:lineRule="auto"/>
+        <w:shd w:fill="F1F4EC"/>
+      </w:pPr>
+      <w:r>
+        <w:rPr>
+          <w:rFonts w:ascii="Courier New" w:hAnsi="Courier New"/>
+          <w:color w:val="203D35"/>
+          <w:sz w:val="15"/>
+        </w:rPr>
         <w:t>pnpm test</w:t>
         <w:br/>
         <w:t>pnpm typecheck</w:t>
@@ -6670,7 +6777,7 @@
     </w:p>
     <w:p>
       <w:r>
-        <w:t xml:space="preserve">The server reads OPENAI_API_KEY from the private environment file. The application runs at </w:t>
+        <w:t xml:space="preserve">The application runs at </w:t>
       </w:r>
       <w:hyperlink r:id="rId24">
         <w:r>
@@ -6681,7 +6788,7 @@
         </w:r>
       </w:hyperlink>
       <w:r>
-        <w:t xml:space="preserve"> The evaluation used source commit 32af459b6a1cd20ede9b08c2b73c20a0c385301e; the application release above has unchanged extractor and runner fingerprints.</w:t>
+        <w:t xml:space="preserve"> The foreground pnpm start process occupies this terminal. Open another terminal in NLP-AT2 for the commands below, or stop the server first: in-process evaluation does not require it. The evaluation used source commit 32af459b6a1cd20ede9b08c2b73c20a0c385301e; the release above has unchanged extractor and runner fingerprints.</w:t>
       </w:r>
     </w:p>
     <w:p>
@@ -7389,6 +7496,61 @@
                 <w:rFonts w:ascii="Arial" w:hAnsi="Arial"/>
                 <w:sz w:val="18"/>
               </w:rPr>
+              <w:t>Model-selection development trials</w:t>
+            </w:r>
+          </w:p>
+        </w:tc>
+        <w:tc>
+          <w:tcPr>
+            <w:tcW w:type="dxa" w:w="6705"/>
+            <w:vAlign w:val="center"/>
+            <w:shd w:fill="FFFFFF"/>
+            <w:tcMar>
+              <w:top w:w="45" w:type="dxa"/>
+              <w:bottom w:w="45" w:type="dxa"/>
+              <w:left w:w="45" w:type="dxa"/>
+              <w:right w:w="45" w:type="dxa"/>
+            </w:tcMar>
+          </w:tcPr>
+          <w:p>
+            <w:pPr>
+              <w:spacing w:after="30" w:before="30" w:line="245" w:lineRule="auto"/>
+            </w:pPr>
+            <w:r>
+              <w:rPr>
+                <w:rFonts w:ascii="Arial" w:hAnsi="Arial"/>
+                <w:sz w:val="18"/>
+              </w:rPr>
+              <w:t>evaluation/results/sgd-dev-10-grounded-luna-pilot.json; evaluation/results/sgd-dev-10-grounded-v3-development.json</w:t>
+            </w:r>
+          </w:p>
+        </w:tc>
+      </w:tr>
+      <w:tr>
+        <w:trPr>
+          <w:cantSplit/>
+        </w:trPr>
+        <w:tc>
+          <w:tcPr>
+            <w:tcW w:type="dxa" w:w="3012"/>
+            <w:vAlign w:val="center"/>
+            <w:shd w:fill="F1F4EC"/>
+            <w:tcMar>
+              <w:top w:w="45" w:type="dxa"/>
+              <w:bottom w:w="45" w:type="dxa"/>
+              <w:left w:w="45" w:type="dxa"/>
+              <w:right w:w="45" w:type="dxa"/>
+            </w:tcMar>
+          </w:tcPr>
+          <w:p>
+            <w:pPr>
+              <w:spacing w:after="30" w:before="30" w:line="245" w:lineRule="auto"/>
+            </w:pPr>
+            <w:r>
+              <w:rPr>
+                <w:rFonts w:ascii="Arial" w:hAnsi="Arial"/>
+                <w:sz w:val="18"/>
+              </w:rPr>
               <w:t>Dataset audit and licence</w:t>
             </w:r>
           </w:p>
@@ -7397,7 +7559,7 @@
           <w:tcPr>
             <w:tcW w:type="dxa" w:w="6705"/>
             <w:vAlign w:val="center"/>
-            <w:shd w:fill="FFFFFF"/>
+            <w:shd w:fill="F1F4EC"/>
             <w:tcMar>
               <w:top w:w="45" w:type="dxa"/>
               <w:bottom w:w="45" w:type="dxa"/>
@@ -7427,7 +7589,7 @@
           <w:tcPr>
             <w:tcW w:type="dxa" w:w="3012"/>
             <w:vAlign w:val="center"/>
-            <w:shd w:fill="F1F4EC"/>
+            <w:shd w:fill="FFFFFF"/>
             <w:tcMar>
               <w:top w:w="45" w:type="dxa"/>
               <w:bottom w:w="45" w:type="dxa"/>
@@ -7452,7 +7614,7 @@
           <w:tcPr>
             <w:tcW w:type="dxa" w:w="6705"/>
             <w:vAlign w:val="center"/>
-            <w:shd w:fill="F1F4EC"/>
+            <w:shd w:fill="FFFFFF"/>
             <w:tcMar>
               <w:top w:w="45" w:type="dxa"/>
               <w:bottom w:w="45" w:type="dxa"/>
@@ -7482,7 +7644,7 @@
           <w:tcPr>
             <w:tcW w:type="dxa" w:w="3012"/>
             <w:vAlign w:val="center"/>
-            <w:shd w:fill="FFFFFF"/>
+            <w:shd w:fill="F1F4EC"/>
             <w:tcMar>
               <w:top w:w="45" w:type="dxa"/>
               <w:bottom w:w="45" w:type="dxa"/>
@@ -7507,6 +7669,36 @@
           <w:tcPr>
             <w:tcW w:type="dxa" w:w="6705"/>
             <w:vAlign w:val="center"/>
+            <w:shd w:fill="F1F4EC"/>
+            <w:tcMar>
+              <w:top w:w="45" w:type="dxa"/>
+              <w:bottom w:w="45" w:type="dxa"/>
+              <w:left w:w="45" w:type="dxa"/>
+              <w:right w:w="45" w:type="dxa"/>
+            </w:tcMar>
+          </w:tcPr>
+          <w:p>
+            <w:pPr>
+              <w:spacing w:after="30" w:before="30" w:line="245" w:lineRule="auto"/>
+            </w:pPr>
+            <w:r>
+              <w:rPr>
+                <w:rFonts w:ascii="Arial" w:hAnsi="Arial"/>
+                <w:sz w:val="18"/>
+              </w:rPr>
+              <w:t>evaluation/results/browser-use-35-final.json</w:t>
+            </w:r>
+          </w:p>
+        </w:tc>
+      </w:tr>
+      <w:tr>
+        <w:trPr>
+          <w:cantSplit/>
+        </w:trPr>
+        <w:tc>
+          <w:tcPr>
+            <w:tcW w:type="dxa" w:w="3012"/>
+            <w:vAlign w:val="center"/>
             <w:shd w:fill="FFFFFF"/>
             <w:tcMar>
               <w:top w:w="45" w:type="dxa"/>
@@ -7524,7 +7716,142 @@
                 <w:rFonts w:ascii="Arial" w:hAnsi="Arial"/>
                 <w:sz w:val="18"/>
               </w:rPr>
-              <w:t>evaluation/results/browser-use-35-final.json</w:t>
+              <w:t>Source and clarification review</w:t>
+            </w:r>
+          </w:p>
+        </w:tc>
+        <w:tc>
+          <w:tcPr>
+            <w:tcW w:type="dxa" w:w="6705"/>
+            <w:vAlign w:val="center"/>
+            <w:shd w:fill="FFFFFF"/>
+            <w:tcMar>
+              <w:top w:w="45" w:type="dxa"/>
+              <w:bottom w:w="45" w:type="dxa"/>
+              <w:left w:w="45" w:type="dxa"/>
+              <w:right w:w="45" w:type="dxa"/>
+            </w:tcMar>
+          </w:tcPr>
+          <w:p>
+            <w:pPr>
+              <w:spacing w:after="30" w:before="30" w:line="245" w:lineRule="auto"/>
+            </w:pPr>
+            <w:r>
+              <w:rPr>
+                <w:rFonts w:ascii="Arial" w:hAnsi="Arial"/>
+                <w:sz w:val="18"/>
+              </w:rPr>
+              <w:t>docs/assessment/feature-audit.json</w:t>
+            </w:r>
+          </w:p>
+        </w:tc>
+      </w:tr>
+      <w:tr>
+        <w:trPr>
+          <w:cantSplit/>
+        </w:trPr>
+        <w:tc>
+          <w:tcPr>
+            <w:tcW w:type="dxa" w:w="3012"/>
+            <w:vAlign w:val="center"/>
+            <w:shd w:fill="F1F4EC"/>
+            <w:tcMar>
+              <w:top w:w="45" w:type="dxa"/>
+              <w:bottom w:w="45" w:type="dxa"/>
+              <w:left w:w="45" w:type="dxa"/>
+              <w:right w:w="45" w:type="dxa"/>
+            </w:tcMar>
+          </w:tcPr>
+          <w:p>
+            <w:pPr>
+              <w:spacing w:after="30" w:before="30" w:line="245" w:lineRule="auto"/>
+            </w:pPr>
+            <w:r>
+              <w:rPr>
+                <w:rFonts w:ascii="Arial" w:hAnsi="Arial"/>
+                <w:sz w:val="18"/>
+              </w:rPr>
+              <w:t>Live task checks and post-fix replay</w:t>
+            </w:r>
+          </w:p>
+        </w:tc>
+        <w:tc>
+          <w:tcPr>
+            <w:tcW w:type="dxa" w:w="6705"/>
+            <w:vAlign w:val="center"/>
+            <w:shd w:fill="F1F4EC"/>
+            <w:tcMar>
+              <w:top w:w="45" w:type="dxa"/>
+              <w:bottom w:w="45" w:type="dxa"/>
+              <w:left w:w="45" w:type="dxa"/>
+              <w:right w:w="45" w:type="dxa"/>
+            </w:tcMar>
+          </w:tcPr>
+          <w:p>
+            <w:pPr>
+              <w:spacing w:after="30" w:before="30" w:line="245" w:lineRule="auto"/>
+            </w:pPr>
+            <w:r>
+              <w:rPr>
+                <w:rFonts w:ascii="Arial" w:hAnsi="Arial"/>
+                <w:sz w:val="18"/>
+              </w:rPr>
+              <w:t>docs/assessment/browser-task-checks-20261011.json; docs/assessment/browser-task-retest-20261011.json</w:t>
+            </w:r>
+          </w:p>
+        </w:tc>
+      </w:tr>
+      <w:tr>
+        <w:trPr>
+          <w:cantSplit/>
+        </w:trPr>
+        <w:tc>
+          <w:tcPr>
+            <w:tcW w:type="dxa" w:w="3012"/>
+            <w:vAlign w:val="center"/>
+            <w:shd w:fill="FFFFFF"/>
+            <w:tcMar>
+              <w:top w:w="45" w:type="dxa"/>
+              <w:bottom w:w="45" w:type="dxa"/>
+              <w:left w:w="45" w:type="dxa"/>
+              <w:right w:w="45" w:type="dxa"/>
+            </w:tcMar>
+          </w:tcPr>
+          <w:p>
+            <w:pPr>
+              <w:spacing w:after="30" w:before="30" w:line="245" w:lineRule="auto"/>
+            </w:pPr>
+            <w:r>
+              <w:rPr>
+                <w:rFonts w:ascii="Arial" w:hAnsi="Arial"/>
+                <w:sz w:val="18"/>
+              </w:rPr>
+              <w:t>Participant tasks and recording sheet</w:t>
+            </w:r>
+          </w:p>
+        </w:tc>
+        <w:tc>
+          <w:tcPr>
+            <w:tcW w:type="dxa" w:w="6705"/>
+            <w:vAlign w:val="center"/>
+            <w:shd w:fill="FFFFFF"/>
+            <w:tcMar>
+              <w:top w:w="45" w:type="dxa"/>
+              <w:bottom w:w="45" w:type="dxa"/>
+              <w:left w:w="45" w:type="dxa"/>
+              <w:right w:w="45" w:type="dxa"/>
+            </w:tcMar>
+          </w:tcPr>
+          <w:p>
+            <w:pPr>
+              <w:spacing w:after="30" w:before="30" w:line="245" w:lineRule="auto"/>
+            </w:pPr>
+            <w:r>
+              <w:rPr>
+                <w:rFonts w:ascii="Arial" w:hAnsi="Arial"/>
+                <w:sz w:val="18"/>
+              </w:rPr>
+              <w:t>docs/assessment/Usability-study.md; docs/assessment/usability-observations.csv</w:t>
             </w:r>
           </w:p>
         </w:tc>
@@ -7702,7 +8029,7 @@
     </w:p>
     <w:p>
       <w:r>
-        <w:t>Source fingerprints are recorded in the completed evaluation files. The browser-case record covers an earlier product release; the later evaluation runner change did not alter the interface.</w:t>
+        <w:t>Source fingerprints are recorded in the completed evaluation files. The 35-case record covers an earlier release. The 11 October replay used b256d49; its cancellation presentation change leaves the recorded extractor fingerprint unchanged.</w:t>
       </w:r>
     </w:p>
     <w:p>
@@ -7721,6 +8048,1376 @@
     <w:p>
       <w:r>
         <w:t>Figures 1, 3 and 5 are original captures of the live application on 11 October 2026 using a fictional restaurant enquiry. They illustrate the interface without including customer records. Figure 2 describes the implemented processing flow.</w:t>
+      </w:r>
+    </w:p>
+    <w:p>
+      <w:r>
+        <w:t>The source/clarification review retains predicted values, source IDs, visible messages and rating rationales in feature-audit.json. Run verify-feature-audit.py in docs/assessment with Python 3 to check input correspondence and recount annotations without API calls. The script verifies accounting, not the correctness of the semantic ratings.</w:t>
+      </w:r>
+    </w:p>
+    <w:p>
+      <w:pPr>
+        <w:pStyle w:val="Heading1"/>
+        <w:pageBreakBefore/>
+      </w:pPr>
+      <w:r>
+        <w:t>Appendix C. Source support and clarification review</w:t>
+      </w:r>
+    </w:p>
+    <w:p>
+      <w:pPr>
+        <w:pStyle w:val="Heading2"/>
+      </w:pPr>
+      <w:r>
+        <w:t>C.1 Criteria and results</w:t>
+      </w:r>
+    </w:p>
+    <w:p>
+      <w:r>
+        <w:t>The source review used the unchanged final predictions for all 13 test-remainder dialogues and their original visible prefixes at the pinned SGD revision. A value counted as supported when the cited messages established a customer statement or an accepted staff value. Conflicting or incomplete acceptance scope was labelled ambiguous. Null predictions were omissions and were excluded from support precision, while remaining in field-accuracy denominators. This single retrospective review was not blind to results and had no independent second rater.</w:t>
+      </w:r>
+    </w:p>
+    <w:tbl>
+      <w:tblPr>
+        <w:tblW w:type="auto" w:w="0"/>
+        <w:jc w:val="center"/>
+        <w:tblLayout w:type="fixed"/>
+        <w:tblLook w:firstColumn="1" w:firstRow="1" w:lastColumn="0" w:lastRow="0" w:noHBand="0" w:noVBand="1" w:val="04A0"/>
+      </w:tblPr>
+      <w:tblGrid>
+        <w:gridCol w:w="3012"/>
+        <w:gridCol w:w="6705"/>
+      </w:tblGrid>
+      <w:tr>
+        <w:trPr>
+          <w:cantSplit/>
+          <w:tblHeader/>
+        </w:trPr>
+        <w:tc>
+          <w:tcPr>
+            <w:tcW w:type="dxa" w:w="3012"/>
+            <w:vAlign w:val="center"/>
+            <w:shd w:fill="203D35"/>
+            <w:tcMar>
+              <w:top w:w="45" w:type="dxa"/>
+              <w:bottom w:w="45" w:type="dxa"/>
+              <w:left w:w="45" w:type="dxa"/>
+              <w:right w:w="45" w:type="dxa"/>
+            </w:tcMar>
+          </w:tcPr>
+          <w:p>
+            <w:pPr>
+              <w:spacing w:after="30" w:before="30" w:line="245" w:lineRule="auto"/>
+            </w:pPr>
+            <w:r>
+              <w:rPr>
+                <w:rFonts w:ascii="Arial" w:hAnsi="Arial"/>
+                <w:b/>
+                <w:color w:val="FFFFFF"/>
+                <w:sz w:val="18"/>
+              </w:rPr>
+              <w:t>Measure</w:t>
+            </w:r>
+          </w:p>
+        </w:tc>
+        <w:tc>
+          <w:tcPr>
+            <w:tcW w:type="dxa" w:w="6705"/>
+            <w:vAlign w:val="center"/>
+            <w:shd w:fill="203D35"/>
+            <w:tcMar>
+              <w:top w:w="45" w:type="dxa"/>
+              <w:bottom w:w="45" w:type="dxa"/>
+              <w:left w:w="45" w:type="dxa"/>
+              <w:right w:w="45" w:type="dxa"/>
+            </w:tcMar>
+          </w:tcPr>
+          <w:p>
+            <w:pPr>
+              <w:spacing w:after="30" w:before="30" w:line="245" w:lineRule="auto"/>
+            </w:pPr>
+            <w:r>
+              <w:rPr>
+                <w:rFonts w:ascii="Arial" w:hAnsi="Arial"/>
+                <w:b/>
+                <w:color w:val="FFFFFF"/>
+                <w:sz w:val="18"/>
+              </w:rPr>
+              <w:t>Observed result</w:t>
+            </w:r>
+          </w:p>
+        </w:tc>
+      </w:tr>
+      <w:tr>
+        <w:trPr>
+          <w:cantSplit/>
+        </w:trPr>
+        <w:tc>
+          <w:tcPr>
+            <w:tcW w:type="dxa" w:w="3012"/>
+            <w:vAlign w:val="center"/>
+            <w:shd w:fill="F1F4EC"/>
+            <w:tcMar>
+              <w:top w:w="45" w:type="dxa"/>
+              <w:bottom w:w="45" w:type="dxa"/>
+              <w:left w:w="45" w:type="dxa"/>
+              <w:right w:w="45" w:type="dxa"/>
+            </w:tcMar>
+          </w:tcPr>
+          <w:p>
+            <w:pPr>
+              <w:spacing w:after="30" w:before="30" w:line="245" w:lineRule="auto"/>
+            </w:pPr>
+            <w:r>
+              <w:rPr>
+                <w:rFonts w:ascii="Arial" w:hAnsi="Arial"/>
+                <w:sz w:val="18"/>
+              </w:rPr>
+              <w:t>Fields inspected</w:t>
+            </w:r>
+          </w:p>
+        </w:tc>
+        <w:tc>
+          <w:tcPr>
+            <w:tcW w:type="dxa" w:w="6705"/>
+            <w:vAlign w:val="center"/>
+            <w:shd w:fill="F1F4EC"/>
+            <w:tcMar>
+              <w:top w:w="45" w:type="dxa"/>
+              <w:bottom w:w="45" w:type="dxa"/>
+              <w:left w:w="45" w:type="dxa"/>
+              <w:right w:w="45" w:type="dxa"/>
+            </w:tcMar>
+          </w:tcPr>
+          <w:p>
+            <w:pPr>
+              <w:spacing w:after="30" w:before="30" w:line="245" w:lineRule="auto"/>
+            </w:pPr>
+            <w:r>
+              <w:rPr>
+                <w:rFonts w:ascii="Arial" w:hAnsi="Arial"/>
+                <w:sz w:val="18"/>
+              </w:rPr>
+              <w:t>65</w:t>
+            </w:r>
+          </w:p>
+        </w:tc>
+      </w:tr>
+      <w:tr>
+        <w:trPr>
+          <w:cantSplit/>
+        </w:trPr>
+        <w:tc>
+          <w:tcPr>
+            <w:tcW w:type="dxa" w:w="3012"/>
+            <w:vAlign w:val="center"/>
+            <w:shd w:fill="FFFFFF"/>
+            <w:tcMar>
+              <w:top w:w="45" w:type="dxa"/>
+              <w:bottom w:w="45" w:type="dxa"/>
+              <w:left w:w="45" w:type="dxa"/>
+              <w:right w:w="45" w:type="dxa"/>
+            </w:tcMar>
+          </w:tcPr>
+          <w:p>
+            <w:pPr>
+              <w:spacing w:after="30" w:before="30" w:line="245" w:lineRule="auto"/>
+            </w:pPr>
+            <w:r>
+              <w:rPr>
+                <w:rFonts w:ascii="Arial" w:hAnsi="Arial"/>
+                <w:sz w:val="18"/>
+              </w:rPr>
+              <w:t>Non-empty values with valid cited IDs</w:t>
+            </w:r>
+          </w:p>
+        </w:tc>
+        <w:tc>
+          <w:tcPr>
+            <w:tcW w:type="dxa" w:w="6705"/>
+            <w:vAlign w:val="center"/>
+            <w:shd w:fill="FFFFFF"/>
+            <w:tcMar>
+              <w:top w:w="45" w:type="dxa"/>
+              <w:bottom w:w="45" w:type="dxa"/>
+              <w:left w:w="45" w:type="dxa"/>
+              <w:right w:w="45" w:type="dxa"/>
+            </w:tcMar>
+          </w:tcPr>
+          <w:p>
+            <w:pPr>
+              <w:spacing w:after="30" w:before="30" w:line="245" w:lineRule="auto"/>
+            </w:pPr>
+            <w:r>
+              <w:rPr>
+                <w:rFonts w:ascii="Arial" w:hAnsi="Arial"/>
+                <w:sz w:val="18"/>
+              </w:rPr>
+              <w:t>62/62; 171 citation references</w:t>
+            </w:r>
+          </w:p>
+        </w:tc>
+      </w:tr>
+      <w:tr>
+        <w:trPr>
+          <w:cantSplit/>
+        </w:trPr>
+        <w:tc>
+          <w:tcPr>
+            <w:tcW w:type="dxa" w:w="3012"/>
+            <w:vAlign w:val="center"/>
+            <w:shd w:fill="F1F4EC"/>
+            <w:tcMar>
+              <w:top w:w="45" w:type="dxa"/>
+              <w:bottom w:w="45" w:type="dxa"/>
+              <w:left w:w="45" w:type="dxa"/>
+              <w:right w:w="45" w:type="dxa"/>
+            </w:tcMar>
+          </w:tcPr>
+          <w:p>
+            <w:pPr>
+              <w:spacing w:after="30" w:before="30" w:line="245" w:lineRule="auto"/>
+            </w:pPr>
+            <w:r>
+              <w:rPr>
+                <w:rFonts w:ascii="Arial" w:hAnsi="Arial"/>
+                <w:sz w:val="18"/>
+              </w:rPr>
+              <w:t>Values with clear source support</w:t>
+            </w:r>
+          </w:p>
+        </w:tc>
+        <w:tc>
+          <w:tcPr>
+            <w:tcW w:type="dxa" w:w="6705"/>
+            <w:vAlign w:val="center"/>
+            <w:shd w:fill="F1F4EC"/>
+            <w:tcMar>
+              <w:top w:w="45" w:type="dxa"/>
+              <w:bottom w:w="45" w:type="dxa"/>
+              <w:left w:w="45" w:type="dxa"/>
+              <w:right w:w="45" w:type="dxa"/>
+            </w:tcMar>
+          </w:tcPr>
+          <w:p>
+            <w:pPr>
+              <w:spacing w:after="30" w:before="30" w:line="245" w:lineRule="auto"/>
+            </w:pPr>
+            <w:r>
+              <w:rPr>
+                <w:rFonts w:ascii="Arial" w:hAnsi="Arial"/>
+                <w:sz w:val="18"/>
+              </w:rPr>
+              <w:t>61/62 (98.4%)</w:t>
+            </w:r>
+          </w:p>
+        </w:tc>
+      </w:tr>
+      <w:tr>
+        <w:trPr>
+          <w:cantSplit/>
+        </w:trPr>
+        <w:tc>
+          <w:tcPr>
+            <w:tcW w:type="dxa" w:w="3012"/>
+            <w:vAlign w:val="center"/>
+            <w:shd w:fill="FFFFFF"/>
+            <w:tcMar>
+              <w:top w:w="45" w:type="dxa"/>
+              <w:bottom w:w="45" w:type="dxa"/>
+              <w:left w:w="45" w:type="dxa"/>
+              <w:right w:w="45" w:type="dxa"/>
+            </w:tcMar>
+          </w:tcPr>
+          <w:p>
+            <w:pPr>
+              <w:spacing w:after="30" w:before="30" w:line="245" w:lineRule="auto"/>
+            </w:pPr>
+            <w:r>
+              <w:rPr>
+                <w:rFonts w:ascii="Arial" w:hAnsi="Arial"/>
+                <w:sz w:val="18"/>
+              </w:rPr>
+              <w:t>Ambiguous support</w:t>
+            </w:r>
+          </w:p>
+        </w:tc>
+        <w:tc>
+          <w:tcPr>
+            <w:tcW w:type="dxa" w:w="6705"/>
+            <w:vAlign w:val="center"/>
+            <w:shd w:fill="FFFFFF"/>
+            <w:tcMar>
+              <w:top w:w="45" w:type="dxa"/>
+              <w:bottom w:w="45" w:type="dxa"/>
+              <w:left w:w="45" w:type="dxa"/>
+              <w:right w:w="45" w:type="dxa"/>
+            </w:tcMar>
+          </w:tcPr>
+          <w:p>
+            <w:pPr>
+              <w:spacing w:after="30" w:before="30" w:line="245" w:lineRule="auto"/>
+            </w:pPr>
+            <w:r>
+              <w:rPr>
+                <w:rFonts w:ascii="Arial" w:hAnsi="Arial"/>
+                <w:sz w:val="18"/>
+              </w:rPr>
+              <w:t>1/62 (1.6%)</w:t>
+            </w:r>
+          </w:p>
+        </w:tc>
+      </w:tr>
+      <w:tr>
+        <w:trPr>
+          <w:cantSplit/>
+        </w:trPr>
+        <w:tc>
+          <w:tcPr>
+            <w:tcW w:type="dxa" w:w="3012"/>
+            <w:vAlign w:val="center"/>
+            <w:shd w:fill="F1F4EC"/>
+            <w:tcMar>
+              <w:top w:w="45" w:type="dxa"/>
+              <w:bottom w:w="45" w:type="dxa"/>
+              <w:left w:w="45" w:type="dxa"/>
+              <w:right w:w="45" w:type="dxa"/>
+            </w:tcMar>
+          </w:tcPr>
+          <w:p>
+            <w:pPr>
+              <w:spacing w:after="30" w:before="30" w:line="245" w:lineRule="auto"/>
+            </w:pPr>
+            <w:r>
+              <w:rPr>
+                <w:rFonts w:ascii="Arial" w:hAnsi="Arial"/>
+                <w:sz w:val="18"/>
+              </w:rPr>
+              <w:t>Clearly unsupported values observed</w:t>
+            </w:r>
+          </w:p>
+        </w:tc>
+        <w:tc>
+          <w:tcPr>
+            <w:tcW w:type="dxa" w:w="6705"/>
+            <w:vAlign w:val="center"/>
+            <w:shd w:fill="F1F4EC"/>
+            <w:tcMar>
+              <w:top w:w="45" w:type="dxa"/>
+              <w:bottom w:w="45" w:type="dxa"/>
+              <w:left w:w="45" w:type="dxa"/>
+              <w:right w:w="45" w:type="dxa"/>
+            </w:tcMar>
+          </w:tcPr>
+          <w:p>
+            <w:pPr>
+              <w:spacing w:after="30" w:before="30" w:line="245" w:lineRule="auto"/>
+            </w:pPr>
+            <w:r>
+              <w:rPr>
+                <w:rFonts w:ascii="Arial" w:hAnsi="Arial"/>
+                <w:sz w:val="18"/>
+              </w:rPr>
+              <w:t>0/62</w:t>
+            </w:r>
+          </w:p>
+        </w:tc>
+      </w:tr>
+      <w:tr>
+        <w:trPr>
+          <w:cantSplit/>
+        </w:trPr>
+        <w:tc>
+          <w:tcPr>
+            <w:tcW w:type="dxa" w:w="3012"/>
+            <w:vAlign w:val="center"/>
+            <w:shd w:fill="FFFFFF"/>
+            <w:tcMar>
+              <w:top w:w="45" w:type="dxa"/>
+              <w:bottom w:w="45" w:type="dxa"/>
+              <w:left w:w="45" w:type="dxa"/>
+              <w:right w:w="45" w:type="dxa"/>
+            </w:tcMar>
+          </w:tcPr>
+          <w:p>
+            <w:pPr>
+              <w:spacing w:after="30" w:before="30" w:line="245" w:lineRule="auto"/>
+            </w:pPr>
+            <w:r>
+              <w:rPr>
+                <w:rFonts w:ascii="Arial" w:hAnsi="Arial"/>
+                <w:sz w:val="18"/>
+              </w:rPr>
+              <w:t>Omitted reference slots</w:t>
+            </w:r>
+          </w:p>
+        </w:tc>
+        <w:tc>
+          <w:tcPr>
+            <w:tcW w:type="dxa" w:w="6705"/>
+            <w:vAlign w:val="center"/>
+            <w:shd w:fill="FFFFFF"/>
+            <w:tcMar>
+              <w:top w:w="45" w:type="dxa"/>
+              <w:bottom w:w="45" w:type="dxa"/>
+              <w:left w:w="45" w:type="dxa"/>
+              <w:right w:w="45" w:type="dxa"/>
+            </w:tcMar>
+          </w:tcPr>
+          <w:p>
+            <w:pPr>
+              <w:spacing w:after="30" w:before="30" w:line="245" w:lineRule="auto"/>
+            </w:pPr>
+            <w:r>
+              <w:rPr>
+                <w:rFonts w:ascii="Arial" w:hAnsi="Arial"/>
+                <w:sz w:val="18"/>
+              </w:rPr>
+              <w:t>3/65 (4.6%)</w:t>
+            </w:r>
+          </w:p>
+        </w:tc>
+      </w:tr>
+      <w:tr>
+        <w:trPr>
+          <w:cantSplit/>
+        </w:trPr>
+        <w:tc>
+          <w:tcPr>
+            <w:tcW w:type="dxa" w:w="3012"/>
+            <w:vAlign w:val="center"/>
+            <w:shd w:fill="F1F4EC"/>
+            <w:tcMar>
+              <w:top w:w="45" w:type="dxa"/>
+              <w:bottom w:w="45" w:type="dxa"/>
+              <w:left w:w="45" w:type="dxa"/>
+              <w:right w:w="45" w:type="dxa"/>
+            </w:tcMar>
+          </w:tcPr>
+          <w:p>
+            <w:pPr>
+              <w:spacing w:after="30" w:before="30" w:line="245" w:lineRule="auto"/>
+            </w:pPr>
+            <w:r>
+              <w:rPr>
+                <w:rFonts w:ascii="Arial" w:hAnsi="Arial"/>
+                <w:sz w:val="18"/>
+              </w:rPr>
+              <w:t>Retained year-missing dates marked unresolved</w:t>
+            </w:r>
+          </w:p>
+        </w:tc>
+        <w:tc>
+          <w:tcPr>
+            <w:tcW w:type="dxa" w:w="6705"/>
+            <w:vAlign w:val="center"/>
+            <w:shd w:fill="F1F4EC"/>
+            <w:tcMar>
+              <w:top w:w="45" w:type="dxa"/>
+              <w:bottom w:w="45" w:type="dxa"/>
+              <w:left w:w="45" w:type="dxa"/>
+              <w:right w:w="45" w:type="dxa"/>
+            </w:tcMar>
+          </w:tcPr>
+          <w:p>
+            <w:pPr>
+              <w:spacing w:after="30" w:before="30" w:line="245" w:lineRule="auto"/>
+            </w:pPr>
+            <w:r>
+              <w:rPr>
+                <w:rFonts w:ascii="Arial" w:hAnsi="Arial"/>
+                <w:sz w:val="18"/>
+              </w:rPr>
+              <w:t>12/12</w:t>
+            </w:r>
+          </w:p>
+        </w:tc>
+      </w:tr>
+      <w:tr>
+        <w:trPr>
+          <w:cantSplit/>
+        </w:trPr>
+        <w:tc>
+          <w:tcPr>
+            <w:tcW w:type="dxa" w:w="3012"/>
+            <w:vAlign w:val="center"/>
+            <w:shd w:fill="FFFFFF"/>
+            <w:tcMar>
+              <w:top w:w="45" w:type="dxa"/>
+              <w:bottom w:w="45" w:type="dxa"/>
+              <w:left w:w="45" w:type="dxa"/>
+              <w:right w:w="45" w:type="dxa"/>
+            </w:tcMar>
+          </w:tcPr>
+          <w:p>
+            <w:pPr>
+              <w:spacing w:after="30" w:before="30" w:line="245" w:lineRule="auto"/>
+            </w:pPr>
+            <w:r>
+              <w:rPr>
+                <w:rFonts w:ascii="Arial" w:hAnsi="Arial"/>
+                <w:sz w:val="18"/>
+              </w:rPr>
+              <w:t>Appropriate clarification questions</w:t>
+            </w:r>
+          </w:p>
+        </w:tc>
+        <w:tc>
+          <w:tcPr>
+            <w:tcW w:type="dxa" w:w="6705"/>
+            <w:vAlign w:val="center"/>
+            <w:shd w:fill="FFFFFF"/>
+            <w:tcMar>
+              <w:top w:w="45" w:type="dxa"/>
+              <w:bottom w:w="45" w:type="dxa"/>
+              <w:left w:w="45" w:type="dxa"/>
+              <w:right w:w="45" w:type="dxa"/>
+            </w:tcMar>
+          </w:tcPr>
+          <w:p>
+            <w:pPr>
+              <w:spacing w:after="30" w:before="30" w:line="245" w:lineRule="auto"/>
+            </w:pPr>
+            <w:r>
+              <w:rPr>
+                <w:rFonts w:ascii="Arial" w:hAnsi="Arial"/>
+                <w:sz w:val="18"/>
+              </w:rPr>
+              <w:t>8/9 (88.9%)</w:t>
+            </w:r>
+          </w:p>
+        </w:tc>
+      </w:tr>
+    </w:tbl>
+    <w:p>
+      <w:pPr>
+        <w:spacing w:after="20"/>
+      </w:pPr>
+    </w:p>
+    <w:p>
+      <w:r>
+        <w:t>For 4_00026, March 1st appears in a staff summary that the customer corrects for party size and time. The later acceptance confirms only those changes. Carrying the date forward is plausible, but its support is less explicit than a direct reconfirmation. It is therefore counted as ambiguous despite matching the dataset label.</w:t>
+      </w:r>
+    </w:p>
+    <w:p>
+      <w:r>
+        <w:t>Question review covered E01–E05, E07–E08 and E10–E11 in the existing browser record. A question needed to request the missing detail without choosing an unaccepted value. After whole-request cancellation, the criterion instead required acknowledging cancellation. E07 cleared all five fields but asked “Which restaurant would you like?”; it failed that conversational criterion. The other eight questions addressed the missing or uncertain detail. The authored functional pass count is unchanged because the original checks did not include this criterion.</w:t>
+      </w:r>
+    </w:p>
+    <w:p>
+      <w:pPr>
+        <w:pStyle w:val="Heading2"/>
+      </w:pPr>
+      <w:r>
+        <w:t>C.2 Uncertainty in the interface</w:t>
+      </w:r>
+    </w:p>
+    <w:p>
+      <w:pPr>
+        <w:keepNext/>
+        <w:spacing w:before="80" w:after="60"/>
+        <w:jc w:val="center"/>
+      </w:pPr>
+      <w:r>
+        <w:drawing>
+          <wp:inline xmlns:a="http://schemas.openxmlformats.org/drawingml/2006/main" xmlns:pic="http://schemas.openxmlformats.org/drawingml/2006/picture">
+            <wp:extent cx="5852160" cy="2267154"/>
+            <wp:docPr id="7" name="Picture 7"/>
+            <wp:cNvGraphicFramePr>
+              <a:graphicFrameLocks noChangeAspect="1"/>
+            </wp:cNvGraphicFramePr>
+            <a:graphic>
+              <a:graphicData uri="http://schemas.openxmlformats.org/drawingml/2006/picture">
+                <pic:pic>
+                  <pic:nvPicPr>
+                    <pic:cNvPr id="0" name="uncertain-time-detail.jpg"/>
+                    <pic:cNvPicPr/>
+                  </pic:nvPicPr>
+                  <pic:blipFill>
+                    <a:blip r:embed="rId26"/>
+                    <a:stretch>
+                      <a:fillRect/>
+                    </a:stretch>
+                  </pic:blipFill>
+                  <pic:spPr>
+                    <a:xfrm>
+                      <a:off x="0" y="0"/>
+                      <a:ext cx="5852160" cy="2267154"/>
+                    </a:xfrm>
+                    <a:prstGeom prst="rect"/>
+                  </pic:spPr>
+                </pic:pic>
+              </a:graphicData>
+            </a:graphic>
+          </wp:inline>
+        </w:drawing>
+      </w:r>
+    </w:p>
+    <w:p>
+      <w:pPr>
+        <w:pStyle w:val="Caption"/>
+      </w:pPr>
+      <w:r>
+        <w:t>Figure 6. The customer changes to five guests after 8 pm. The exact time remains open and the suggested question preserves the constraint. Source: original live-app capture, 11 October 2026.</w:t>
+      </w:r>
+    </w:p>
+    <w:p>
+      <w:pPr>
+        <w:pStyle w:val="Heading1"/>
+        <w:pageBreakBefore/>
+      </w:pPr>
+      <w:r>
+        <w:t>Appendix D. Live task replay after correction</w:t>
+      </w:r>
+    </w:p>
+    <w:p>
+      <w:pPr>
+        <w:pStyle w:val="Heading2"/>
+      </w:pPr>
+      <w:r>
+        <w:t>D.1 Method and observed outcomes</w:t>
+      </w:r>
+    </w:p>
+    <w:p>
+      <w:r>
+        <w:t>The public app was tested through its mobile interface on 11 October 2026 at release b256d49. Fictional conversations underwent live analysis; checks inspected values, time sources, questions and approval. A1/B1 accept offers and revise guest counts; A2/B2 reject offers and retain time preferences. All four passed before and after correction.</w:t>
+      </w:r>
+    </w:p>
+    <w:tbl>
+      <w:tblPr>
+        <w:tblW w:type="auto" w:w="0"/>
+        <w:jc w:val="center"/>
+        <w:tblLayout w:type="fixed"/>
+        <w:tblLook w:firstColumn="1" w:firstRow="1" w:lastColumn="0" w:lastRow="0" w:noHBand="0" w:noVBand="1" w:val="04A0"/>
+      </w:tblPr>
+      <w:tblGrid>
+        <w:gridCol w:w="3239"/>
+        <w:gridCol w:w="3239"/>
+        <w:gridCol w:w="3239"/>
+      </w:tblGrid>
+      <w:tr>
+        <w:trPr>
+          <w:cantSplit/>
+          <w:tblHeader/>
+        </w:trPr>
+        <w:tc>
+          <w:tcPr>
+            <w:tcW w:type="dxa" w:w="3239"/>
+            <w:vAlign w:val="center"/>
+            <w:shd w:fill="203D35"/>
+            <w:tcMar>
+              <w:top w:w="45" w:type="dxa"/>
+              <w:bottom w:w="45" w:type="dxa"/>
+              <w:left w:w="45" w:type="dxa"/>
+              <w:right w:w="45" w:type="dxa"/>
+            </w:tcMar>
+          </w:tcPr>
+          <w:p>
+            <w:pPr>
+              <w:spacing w:after="30" w:before="30" w:line="245" w:lineRule="auto"/>
+            </w:pPr>
+            <w:r>
+              <w:rPr>
+                <w:rFonts w:ascii="Arial" w:hAnsi="Arial"/>
+                <w:b/>
+                <w:color w:val="FFFFFF"/>
+                <w:sz w:val="18"/>
+              </w:rPr>
+              <w:t>Check</w:t>
+            </w:r>
+          </w:p>
+        </w:tc>
+        <w:tc>
+          <w:tcPr>
+            <w:tcW w:type="dxa" w:w="3239"/>
+            <w:vAlign w:val="center"/>
+            <w:shd w:fill="203D35"/>
+            <w:tcMar>
+              <w:top w:w="45" w:type="dxa"/>
+              <w:bottom w:w="45" w:type="dxa"/>
+              <w:left w:w="45" w:type="dxa"/>
+              <w:right w:w="45" w:type="dxa"/>
+            </w:tcMar>
+          </w:tcPr>
+          <w:p>
+            <w:pPr>
+              <w:spacing w:after="30" w:before="30" w:line="245" w:lineRule="auto"/>
+            </w:pPr>
+            <w:r>
+              <w:rPr>
+                <w:rFonts w:ascii="Arial" w:hAnsi="Arial"/>
+                <w:b/>
+                <w:color w:val="FFFFFF"/>
+                <w:sz w:val="18"/>
+              </w:rPr>
+              <w:t>Required outcome</w:t>
+            </w:r>
+          </w:p>
+        </w:tc>
+        <w:tc>
+          <w:tcPr>
+            <w:tcW w:type="dxa" w:w="3239"/>
+            <w:vAlign w:val="center"/>
+            <w:shd w:fill="203D35"/>
+            <w:tcMar>
+              <w:top w:w="45" w:type="dxa"/>
+              <w:bottom w:w="45" w:type="dxa"/>
+              <w:left w:w="45" w:type="dxa"/>
+              <w:right w:w="45" w:type="dxa"/>
+            </w:tcMar>
+          </w:tcPr>
+          <w:p>
+            <w:pPr>
+              <w:spacing w:after="30" w:before="30" w:line="245" w:lineRule="auto"/>
+            </w:pPr>
+            <w:r>
+              <w:rPr>
+                <w:rFonts w:ascii="Arial" w:hAnsi="Arial"/>
+                <w:b/>
+                <w:color w:val="FFFFFF"/>
+                <w:sz w:val="18"/>
+              </w:rPr>
+              <w:t>Observed outcome</w:t>
+            </w:r>
+          </w:p>
+        </w:tc>
+      </w:tr>
+      <w:tr>
+        <w:trPr>
+          <w:cantSplit/>
+        </w:trPr>
+        <w:tc>
+          <w:tcPr>
+            <w:tcW w:type="dxa" w:w="3239"/>
+            <w:vAlign w:val="center"/>
+            <w:shd w:fill="F1F4EC"/>
+            <w:tcMar>
+              <w:top w:w="45" w:type="dxa"/>
+              <w:bottom w:w="45" w:type="dxa"/>
+              <w:left w:w="45" w:type="dxa"/>
+              <w:right w:w="45" w:type="dxa"/>
+            </w:tcMar>
+          </w:tcPr>
+          <w:p>
+            <w:pPr>
+              <w:spacing w:after="30" w:before="30" w:line="245" w:lineRule="auto"/>
+            </w:pPr>
+            <w:r>
+              <w:rPr>
+                <w:rFonts w:ascii="Arial" w:hAnsi="Arial"/>
+                <w:sz w:val="18"/>
+              </w:rPr>
+              <w:t>A1: Juniper, Sydney</w:t>
+            </w:r>
+          </w:p>
+        </w:tc>
+        <w:tc>
+          <w:tcPr>
+            <w:tcW w:type="dxa" w:w="3239"/>
+            <w:vAlign w:val="center"/>
+            <w:shd w:fill="F1F4EC"/>
+            <w:tcMar>
+              <w:top w:w="45" w:type="dxa"/>
+              <w:bottom w:w="45" w:type="dxa"/>
+              <w:left w:w="45" w:type="dxa"/>
+              <w:right w:w="45" w:type="dxa"/>
+            </w:tcMar>
+          </w:tcPr>
+          <w:p>
+            <w:pPr>
+              <w:spacing w:after="30" w:before="30" w:line="245" w:lineRule="auto"/>
+            </w:pPr>
+            <w:r>
+              <w:rPr>
+                <w:rFonts w:ascii="Arial" w:hAnsi="Arial"/>
+                <w:sz w:val="18"/>
+              </w:rPr>
+              <w:t>18 Oct 2027; 7:30 pm; five guests</w:t>
+            </w:r>
+          </w:p>
+        </w:tc>
+        <w:tc>
+          <w:tcPr>
+            <w:tcW w:type="dxa" w:w="3239"/>
+            <w:vAlign w:val="center"/>
+            <w:shd w:fill="F1F4EC"/>
+            <w:tcMar>
+              <w:top w:w="45" w:type="dxa"/>
+              <w:bottom w:w="45" w:type="dxa"/>
+              <w:left w:w="45" w:type="dxa"/>
+              <w:right w:w="45" w:type="dxa"/>
+            </w:tcMar>
+          </w:tcPr>
+          <w:p>
+            <w:pPr>
+              <w:spacing w:after="30" w:before="30" w:line="245" w:lineRule="auto"/>
+            </w:pPr>
+            <w:r>
+              <w:rPr>
+                <w:rFonts w:ascii="Arial" w:hAnsi="Arial"/>
+                <w:sz w:val="18"/>
+              </w:rPr>
+              <w:t>Correct; two time sources; approved</w:t>
+            </w:r>
+          </w:p>
+        </w:tc>
+      </w:tr>
+      <w:tr>
+        <w:trPr>
+          <w:cantSplit/>
+        </w:trPr>
+        <w:tc>
+          <w:tcPr>
+            <w:tcW w:type="dxa" w:w="3239"/>
+            <w:vAlign w:val="center"/>
+            <w:shd w:fill="FFFFFF"/>
+            <w:tcMar>
+              <w:top w:w="45" w:type="dxa"/>
+              <w:bottom w:w="45" w:type="dxa"/>
+              <w:left w:w="45" w:type="dxa"/>
+              <w:right w:w="45" w:type="dxa"/>
+            </w:tcMar>
+          </w:tcPr>
+          <w:p>
+            <w:pPr>
+              <w:spacing w:after="30" w:before="30" w:line="245" w:lineRule="auto"/>
+            </w:pPr>
+            <w:r>
+              <w:rPr>
+                <w:rFonts w:ascii="Arial" w:hAnsi="Arial"/>
+                <w:sz w:val="18"/>
+              </w:rPr>
+              <w:t>B1: Willow House, Melbourne</w:t>
+            </w:r>
+          </w:p>
+        </w:tc>
+        <w:tc>
+          <w:tcPr>
+            <w:tcW w:type="dxa" w:w="3239"/>
+            <w:vAlign w:val="center"/>
+            <w:shd w:fill="FFFFFF"/>
+            <w:tcMar>
+              <w:top w:w="45" w:type="dxa"/>
+              <w:bottom w:w="45" w:type="dxa"/>
+              <w:left w:w="45" w:type="dxa"/>
+              <w:right w:w="45" w:type="dxa"/>
+            </w:tcMar>
+          </w:tcPr>
+          <w:p>
+            <w:pPr>
+              <w:spacing w:after="30" w:before="30" w:line="245" w:lineRule="auto"/>
+            </w:pPr>
+            <w:r>
+              <w:rPr>
+                <w:rFonts w:ascii="Arial" w:hAnsi="Arial"/>
+                <w:sz w:val="18"/>
+              </w:rPr>
+              <w:t>19 Oct 2027; 6:45 pm; three guests</w:t>
+            </w:r>
+          </w:p>
+        </w:tc>
+        <w:tc>
+          <w:tcPr>
+            <w:tcW w:type="dxa" w:w="3239"/>
+            <w:vAlign w:val="center"/>
+            <w:shd w:fill="FFFFFF"/>
+            <w:tcMar>
+              <w:top w:w="45" w:type="dxa"/>
+              <w:bottom w:w="45" w:type="dxa"/>
+              <w:left w:w="45" w:type="dxa"/>
+              <w:right w:w="45" w:type="dxa"/>
+            </w:tcMar>
+          </w:tcPr>
+          <w:p>
+            <w:pPr>
+              <w:spacing w:after="30" w:before="30" w:line="245" w:lineRule="auto"/>
+            </w:pPr>
+            <w:r>
+              <w:rPr>
+                <w:rFonts w:ascii="Arial" w:hAnsi="Arial"/>
+                <w:sz w:val="18"/>
+              </w:rPr>
+              <w:t>Correct; two time sources; approved</w:t>
+            </w:r>
+          </w:p>
+        </w:tc>
+      </w:tr>
+      <w:tr>
+        <w:trPr>
+          <w:cantSplit/>
+        </w:trPr>
+        <w:tc>
+          <w:tcPr>
+            <w:tcW w:type="dxa" w:w="3239"/>
+            <w:vAlign w:val="center"/>
+            <w:shd w:fill="F1F4EC"/>
+            <w:tcMar>
+              <w:top w:w="45" w:type="dxa"/>
+              <w:bottom w:w="45" w:type="dxa"/>
+              <w:left w:w="45" w:type="dxa"/>
+              <w:right w:w="45" w:type="dxa"/>
+            </w:tcMar>
+          </w:tcPr>
+          <w:p>
+            <w:pPr>
+              <w:spacing w:after="30" w:before="30" w:line="245" w:lineRule="auto"/>
+            </w:pPr>
+            <w:r>
+              <w:rPr>
+                <w:rFonts w:ascii="Arial" w:hAnsi="Arial"/>
+                <w:sz w:val="18"/>
+              </w:rPr>
+              <w:t>A2: Cedar Table, Adelaide</w:t>
+            </w:r>
+          </w:p>
+        </w:tc>
+        <w:tc>
+          <w:tcPr>
+            <w:tcW w:type="dxa" w:w="3239"/>
+            <w:vAlign w:val="center"/>
+            <w:shd w:fill="F1F4EC"/>
+            <w:tcMar>
+              <w:top w:w="45" w:type="dxa"/>
+              <w:bottom w:w="45" w:type="dxa"/>
+              <w:left w:w="45" w:type="dxa"/>
+              <w:right w:w="45" w:type="dxa"/>
+            </w:tcMar>
+          </w:tcPr>
+          <w:p>
+            <w:pPr>
+              <w:spacing w:after="30" w:before="30" w:line="245" w:lineRule="auto"/>
+            </w:pPr>
+            <w:r>
+              <w:rPr>
+                <w:rFonts w:ascii="Arial" w:hAnsi="Arial"/>
+                <w:sz w:val="18"/>
+              </w:rPr>
+              <w:t>20 Oct 2027; six guests; after 8 pm, exact time open</w:t>
+            </w:r>
+          </w:p>
+        </w:tc>
+        <w:tc>
+          <w:tcPr>
+            <w:tcW w:type="dxa" w:w="3239"/>
+            <w:vAlign w:val="center"/>
+            <w:shd w:fill="F1F4EC"/>
+            <w:tcMar>
+              <w:top w:w="45" w:type="dxa"/>
+              <w:bottom w:w="45" w:type="dxa"/>
+              <w:left w:w="45" w:type="dxa"/>
+              <w:right w:w="45" w:type="dxa"/>
+            </w:tcMar>
+          </w:tcPr>
+          <w:p>
+            <w:pPr>
+              <w:spacing w:after="30" w:before="30" w:line="245" w:lineRule="auto"/>
+            </w:pPr>
+            <w:r>
+              <w:rPr>
+                <w:rFonts w:ascii="Arial" w:hAnsi="Arial"/>
+                <w:sz w:val="18"/>
+              </w:rPr>
+              <w:t>Correct; three time sources; approval disabled</w:t>
+            </w:r>
+          </w:p>
+        </w:tc>
+      </w:tr>
+      <w:tr>
+        <w:trPr>
+          <w:cantSplit/>
+        </w:trPr>
+        <w:tc>
+          <w:tcPr>
+            <w:tcW w:type="dxa" w:w="3239"/>
+            <w:vAlign w:val="center"/>
+            <w:shd w:fill="FFFFFF"/>
+            <w:tcMar>
+              <w:top w:w="45" w:type="dxa"/>
+              <w:bottom w:w="45" w:type="dxa"/>
+              <w:left w:w="45" w:type="dxa"/>
+              <w:right w:w="45" w:type="dxa"/>
+            </w:tcMar>
+          </w:tcPr>
+          <w:p>
+            <w:pPr>
+              <w:spacing w:after="30" w:before="30" w:line="245" w:lineRule="auto"/>
+            </w:pPr>
+            <w:r>
+              <w:rPr>
+                <w:rFonts w:ascii="Arial" w:hAnsi="Arial"/>
+                <w:sz w:val="18"/>
+              </w:rPr>
+              <w:t>B2: Olive &amp; Thyme, Brisbane</w:t>
+            </w:r>
+          </w:p>
+        </w:tc>
+        <w:tc>
+          <w:tcPr>
+            <w:tcW w:type="dxa" w:w="3239"/>
+            <w:vAlign w:val="center"/>
+            <w:shd w:fill="FFFFFF"/>
+            <w:tcMar>
+              <w:top w:w="45" w:type="dxa"/>
+              <w:bottom w:w="45" w:type="dxa"/>
+              <w:left w:w="45" w:type="dxa"/>
+              <w:right w:w="45" w:type="dxa"/>
+            </w:tcMar>
+          </w:tcPr>
+          <w:p>
+            <w:pPr>
+              <w:spacing w:after="30" w:before="30" w:line="245" w:lineRule="auto"/>
+            </w:pPr>
+            <w:r>
+              <w:rPr>
+                <w:rFonts w:ascii="Arial" w:hAnsi="Arial"/>
+                <w:sz w:val="18"/>
+              </w:rPr>
+              <w:t>21 Oct 2027; four guests; after 7 pm, exact time open</w:t>
+            </w:r>
+          </w:p>
+        </w:tc>
+        <w:tc>
+          <w:tcPr>
+            <w:tcW w:type="dxa" w:w="3239"/>
+            <w:vAlign w:val="center"/>
+            <w:shd w:fill="FFFFFF"/>
+            <w:tcMar>
+              <w:top w:w="45" w:type="dxa"/>
+              <w:bottom w:w="45" w:type="dxa"/>
+              <w:left w:w="45" w:type="dxa"/>
+              <w:right w:w="45" w:type="dxa"/>
+            </w:tcMar>
+          </w:tcPr>
+          <w:p>
+            <w:pPr>
+              <w:spacing w:after="30" w:before="30" w:line="245" w:lineRule="auto"/>
+            </w:pPr>
+            <w:r>
+              <w:rPr>
+                <w:rFonts w:ascii="Arial" w:hAnsi="Arial"/>
+                <w:sz w:val="18"/>
+              </w:rPr>
+              <w:t>Correct; three time sources; approval disabled</w:t>
+            </w:r>
+          </w:p>
+        </w:tc>
+      </w:tr>
+      <w:tr>
+        <w:trPr>
+          <w:cantSplit/>
+        </w:trPr>
+        <w:tc>
+          <w:tcPr>
+            <w:tcW w:type="dxa" w:w="3239"/>
+            <w:vAlign w:val="center"/>
+            <w:shd w:fill="F1F4EC"/>
+            <w:tcMar>
+              <w:top w:w="45" w:type="dxa"/>
+              <w:bottom w:w="45" w:type="dxa"/>
+              <w:left w:w="45" w:type="dxa"/>
+              <w:right w:w="45" w:type="dxa"/>
+            </w:tcMar>
+          </w:tcPr>
+          <w:p>
+            <w:pPr>
+              <w:spacing w:after="30" w:before="30" w:line="245" w:lineRule="auto"/>
+            </w:pPr>
+            <w:r>
+              <w:rPr>
+                <w:rFonts w:ascii="Arial" w:hAnsi="Arial"/>
+                <w:sz w:val="18"/>
+              </w:rPr>
+              <w:t>C1/C2: cancel, then courtesy reply</w:t>
+            </w:r>
+          </w:p>
+        </w:tc>
+        <w:tc>
+          <w:tcPr>
+            <w:tcW w:type="dxa" w:w="3239"/>
+            <w:vAlign w:val="center"/>
+            <w:shd w:fill="F1F4EC"/>
+            <w:tcMar>
+              <w:top w:w="45" w:type="dxa"/>
+              <w:bottom w:w="45" w:type="dxa"/>
+              <w:left w:w="45" w:type="dxa"/>
+              <w:right w:w="45" w:type="dxa"/>
+            </w:tcMar>
+          </w:tcPr>
+          <w:p>
+            <w:pPr>
+              <w:spacing w:after="30" w:before="30" w:line="245" w:lineRule="auto"/>
+            </w:pPr>
+            <w:r>
+              <w:rPr>
+                <w:rFonts w:ascii="Arial" w:hAnsi="Arial"/>
+                <w:sz w:val="18"/>
+              </w:rPr>
+              <w:t>Clear all five fields; acknowledge cancellation</w:t>
+            </w:r>
+          </w:p>
+        </w:tc>
+        <w:tc>
+          <w:tcPr>
+            <w:tcW w:type="dxa" w:w="3239"/>
+            <w:vAlign w:val="center"/>
+            <w:shd w:fill="F1F4EC"/>
+            <w:tcMar>
+              <w:top w:w="45" w:type="dxa"/>
+              <w:bottom w:w="45" w:type="dxa"/>
+              <w:left w:w="45" w:type="dxa"/>
+              <w:right w:w="45" w:type="dxa"/>
+            </w:tcMar>
+          </w:tcPr>
+          <w:p>
+            <w:pPr>
+              <w:spacing w:after="30" w:before="30" w:line="245" w:lineRule="auto"/>
+            </w:pPr>
+            <w:r>
+              <w:rPr>
+                <w:rFonts w:ascii="Arial" w:hAnsi="Arial"/>
+                <w:sz w:val="18"/>
+              </w:rPr>
+              <w:t>Both passed; no new-booking question</w:t>
+            </w:r>
+          </w:p>
+        </w:tc>
+      </w:tr>
+      <w:tr>
+        <w:trPr>
+          <w:cantSplit/>
+        </w:trPr>
+        <w:tc>
+          <w:tcPr>
+            <w:tcW w:type="dxa" w:w="3239"/>
+            <w:vAlign w:val="center"/>
+            <w:shd w:fill="FFFFFF"/>
+            <w:tcMar>
+              <w:top w:w="45" w:type="dxa"/>
+              <w:bottom w:w="45" w:type="dxa"/>
+              <w:left w:w="45" w:type="dxa"/>
+              <w:right w:w="45" w:type="dxa"/>
+            </w:tcMar>
+          </w:tcPr>
+          <w:p>
+            <w:pPr>
+              <w:spacing w:after="30" w:before="30" w:line="245" w:lineRule="auto"/>
+            </w:pPr>
+            <w:r>
+              <w:rPr>
+                <w:rFonts w:ascii="Arial" w:hAnsi="Arial"/>
+                <w:sz w:val="18"/>
+              </w:rPr>
+              <w:t>C3: new booking after cancellation</w:t>
+            </w:r>
+          </w:p>
+        </w:tc>
+        <w:tc>
+          <w:tcPr>
+            <w:tcW w:type="dxa" w:w="3239"/>
+            <w:vAlign w:val="center"/>
+            <w:shd w:fill="FFFFFF"/>
+            <w:tcMar>
+              <w:top w:w="45" w:type="dxa"/>
+              <w:bottom w:w="45" w:type="dxa"/>
+              <w:left w:w="45" w:type="dxa"/>
+              <w:right w:w="45" w:type="dxa"/>
+            </w:tcMar>
+          </w:tcPr>
+          <w:p>
+            <w:pPr>
+              <w:spacing w:after="30" w:before="30" w:line="245" w:lineRule="auto"/>
+            </w:pPr>
+            <w:r>
+              <w:rPr>
+                <w:rFonts w:ascii="Arial" w:hAnsi="Arial"/>
+                <w:sz w:val="18"/>
+              </w:rPr>
+              <w:t>Use five new values rather than cancelled details</w:t>
+            </w:r>
+          </w:p>
+        </w:tc>
+        <w:tc>
+          <w:tcPr>
+            <w:tcW w:type="dxa" w:w="3239"/>
+            <w:vAlign w:val="center"/>
+            <w:shd w:fill="FFFFFF"/>
+            <w:tcMar>
+              <w:top w:w="45" w:type="dxa"/>
+              <w:bottom w:w="45" w:type="dxa"/>
+              <w:left w:w="45" w:type="dxa"/>
+              <w:right w:w="45" w:type="dxa"/>
+            </w:tcMar>
+          </w:tcPr>
+          <w:p>
+            <w:pPr>
+              <w:spacing w:after="30" w:before="30" w:line="245" w:lineRule="auto"/>
+            </w:pPr>
+            <w:r>
+              <w:rPr>
+                <w:rFonts w:ascii="Arial" w:hAnsi="Arial"/>
+                <w:sz w:val="18"/>
+              </w:rPr>
+              <w:t>All five correct; approval available</w:t>
+            </w:r>
+          </w:p>
+        </w:tc>
+      </w:tr>
+      <w:tr>
+        <w:trPr>
+          <w:cantSplit/>
+        </w:trPr>
+        <w:tc>
+          <w:tcPr>
+            <w:tcW w:type="dxa" w:w="3239"/>
+            <w:vAlign w:val="center"/>
+            <w:shd w:fill="F1F4EC"/>
+            <w:tcMar>
+              <w:top w:w="45" w:type="dxa"/>
+              <w:bottom w:w="45" w:type="dxa"/>
+              <w:left w:w="45" w:type="dxa"/>
+              <w:right w:w="45" w:type="dxa"/>
+            </w:tcMar>
+          </w:tcPr>
+          <w:p>
+            <w:pPr>
+              <w:spacing w:after="30" w:before="30" w:line="245" w:lineRule="auto"/>
+            </w:pPr>
+            <w:r>
+              <w:rPr>
+                <w:rFonts w:ascii="Arial" w:hAnsi="Arial"/>
+                <w:sz w:val="18"/>
+              </w:rPr>
+              <w:t>E07: exact original cancellation case</w:t>
+            </w:r>
+          </w:p>
+        </w:tc>
+        <w:tc>
+          <w:tcPr>
+            <w:tcW w:type="dxa" w:w="3239"/>
+            <w:vAlign w:val="center"/>
+            <w:shd w:fill="F1F4EC"/>
+            <w:tcMar>
+              <w:top w:w="45" w:type="dxa"/>
+              <w:bottom w:w="45" w:type="dxa"/>
+              <w:left w:w="45" w:type="dxa"/>
+              <w:right w:w="45" w:type="dxa"/>
+            </w:tcMar>
+          </w:tcPr>
+          <w:p>
+            <w:pPr>
+              <w:spacing w:after="30" w:before="30" w:line="245" w:lineRule="auto"/>
+            </w:pPr>
+            <w:r>
+              <w:rPr>
+                <w:rFonts w:ascii="Arial" w:hAnsi="Arial"/>
+                <w:sz w:val="18"/>
+              </w:rPr>
+              <w:t>Replace the inappropriate restaurant question</w:t>
+            </w:r>
+          </w:p>
+        </w:tc>
+        <w:tc>
+          <w:tcPr>
+            <w:tcW w:type="dxa" w:w="3239"/>
+            <w:vAlign w:val="center"/>
+            <w:shd w:fill="F1F4EC"/>
+            <w:tcMar>
+              <w:top w:w="45" w:type="dxa"/>
+              <w:bottom w:w="45" w:type="dxa"/>
+              <w:left w:w="45" w:type="dxa"/>
+              <w:right w:w="45" w:type="dxa"/>
+            </w:tcMar>
+          </w:tcPr>
+          <w:p>
+            <w:pPr>
+              <w:spacing w:after="30" w:before="30" w:line="245" w:lineRule="auto"/>
+            </w:pPr>
+            <w:r>
+              <w:rPr>
+                <w:rFonts w:ascii="Arial" w:hAnsi="Arial"/>
+                <w:sz w:val="18"/>
+              </w:rPr>
+              <w:t>Passed; cancellation acknowledged; approval disabled</w:t>
+            </w:r>
+          </w:p>
+        </w:tc>
+      </w:tr>
+    </w:tbl>
+    <w:p>
+      <w:pPr>
+        <w:spacing w:after="20"/>
+      </w:pPr>
+    </w:p>
+    <w:p>
+      <w:r>
+        <w:t>The four repeated booking tasks had zero errors across 20 field positions and ten inspected time citations. All eight specified checks passed. This is functional verification using authored tasks, with no human participants, manual comparison, satisfaction ratings or task-time measure. It does not establish general usability or perfect accuracy.</w:t>
+      </w:r>
+    </w:p>
+    <w:p>
+      <w:pPr>
+        <w:pStyle w:val="Heading2"/>
+      </w:pPr>
+      <w:r>
+        <w:t>D.2 Correction and evidence</w:t>
+      </w:r>
+    </w:p>
+    <w:p>
+      <w:r>
+        <w:t>The original E07 result remains in Appendix C. When all five fields are cleared and linked to a whole-request cancellation, the response and interface acknowledge it without asking for a restaurant. Six added tests cover cancellation, courtesy replies, reopening, refusal to reopen, partial clearing and retained staff details. All 59 tests, TypeScript checks and the production build passed. Extraction and scoring were unchanged; dataset results remain the earlier runs.</w:t>
+      </w:r>
+    </w:p>
+    <w:p>
+      <w:pPr>
+        <w:keepNext/>
+        <w:spacing w:before="80" w:after="60"/>
+        <w:jc w:val="center"/>
+      </w:pPr>
+      <w:r>
+        <w:drawing>
+          <wp:inline xmlns:a="http://schemas.openxmlformats.org/drawingml/2006/main" xmlns:pic="http://schemas.openxmlformats.org/drawingml/2006/picture">
+            <wp:extent cx="3200400" cy="2591584"/>
+            <wp:docPr id="8" name="Picture 8"/>
+            <wp:cNvGraphicFramePr>
+              <a:graphicFrameLocks noChangeAspect="1"/>
+            </wp:cNvGraphicFramePr>
+            <a:graphic>
+              <a:graphicData uri="http://schemas.openxmlformats.org/drawingml/2006/picture">
+                <pic:pic>
+                  <pic:nvPicPr>
+                    <pic:cNvPr id="0" name="cancellation-fixed-detail.jpg"/>
+                    <pic:cNvPicPr/>
+                  </pic:nvPicPr>
+                  <pic:blipFill>
+                    <a:blip r:embed="rId27"/>
+                    <a:stretch>
+                      <a:fillRect/>
+                    </a:stretch>
+                  </pic:blipFill>
+                  <pic:spPr>
+                    <a:xfrm>
+                      <a:off x="0" y="0"/>
+                      <a:ext cx="3200400" cy="2591584"/>
+                    </a:xfrm>
+                    <a:prstGeom prst="rect"/>
+                  </pic:spPr>
+                </pic:pic>
+              </a:graphicData>
+            </a:graphic>
+          </wp:inline>
+        </w:drawing>
+      </w:r>
+    </w:p>
+    <w:p>
+      <w:pPr>
+        <w:pStyle w:val="Caption"/>
+      </w:pPr>
+      <w:r>
+        <w:t>Figure 7. Corrected live cancellation response, 11 October 2026. The original failing question and the successful replay are retained separately.</w:t>
+      </w:r>
+    </w:p>
+    <w:p>
+      <w:r>
+        <w:t>Transcripts and observed states are retained in browser-task-retest-20261011.json. Download delivery was not retested.</w:t>
       </w:r>
     </w:p>
     <w:sectPr>

</xml_diff>

<commit_message>
Correct report claims and add measured feature and validation results
</commit_message>
<xml_diff>
--- a/docs/assessment/FormBridge-AT2-Report.docx
+++ b/docs/assessment/FormBridge-AT2-Report.docx
@@ -137,7 +137,7 @@
           <w:b w:val="0"/>
           <w:i w:val="0"/>
         </w:rPr>
-        <w:t>Restaurant enquiries arrive as conversations, with details spread across messages and revised as guests make plans. FormBridge converts these conversations into booking briefs that staff can inspect, correct and share with their team. It tracks five booking fields, preserves uncertainty and links extracted values to supporting messages. The completed web application also provides a restaurant guest assistant, voice transcription, guest-care suggestions, private review links and a shared enquiry desk. Staff retain control of approval and follow-up actions. Messaging and reservation connections are simulated.</w:t>
+        <w:t>FormBridge turns changing restaurant conversations into booking briefs that staff can inspect, correct and share. It tracks five fields, preserves uncertainty and links values to supporting messages. The web application includes guest intake, voice transcription, guest-care suggestions, private review links and a team desk. Staff control approval; messaging and reservation connections are simulated.</w:t>
       </w:r>
     </w:p>
     <w:p>
@@ -146,7 +146,7 @@
           <w:b w:val="0"/>
           <w:i w:val="0"/>
         </w:rPr>
-        <w:t>The project compares regular-expression rules, direct contextual extraction and contextual extraction with evidence validation and state reconciliation. A fresh evaluation of the released extraction code used 20 previously selected development dialogues from the Schema-Guided Dialogue dataset. Rules, direct extraction and FormBridge achieved 35/100, 89/100 and 97/100 canonical field matches respectively. FormBridge matched all five values in 17/20 dialogues. A separate run on 20 inspected test dialogues achieved 100/100 field matches. These are development and regression results, not estimates of unseen performance. The higher development score required more provider calls and approximately twice the mean dialogue replay time of direct extraction.</w:t>
+        <w:t>On 20 inspected development dialogues from the Schema-Guided Dialogue dataset, rules, direct contextual extraction and FormBridge achieved 35/100, 89/100 and 97/100 canonical field matches. FormBridge completed 17/20 briefs and required approximately twice the direct method's mean replay time. Its separate regression run matched 100/100 fields on 20 inspected test dialogues. These results do not estimate unseen performance.</w:t>
       </w:r>
     </w:p>
     <w:p>
@@ -155,7 +155,7 @@
           <w:b w:val="0"/>
           <w:i w:val="0"/>
         </w:rPr>
-        <w:t>Verification includes 230 automated tests, 31 production API and database checks, and 22 recorded browser workflows for the restaurant workspace. The results demonstrate implemented behaviour and access controls. They do not establish staff time savings or ease of use in a restaurant; no recruited-user study was conducted.</w:t>
+        <w:t>Applying validation to identical proposals reduced matches from 88/100 to 85/100 in a controlled comparison, exposing overly restrictive checks. Twenty constructed cases passed checks for values, uncertainty, clarification and approval, including required sources for 93/93 populated fields. Verification also includes 230 automated tests, production checks and an eight-task live walkthrough. No recruited-user study or restaurant productivity measurement was conducted.</w:t>
       </w:r>
     </w:p>
     <w:p>
@@ -172,6 +172,14 @@
         <w:jc w:val="center"/>
         <w:tblLayout w:type="fixed"/>
         <w:tblLook w:firstColumn="1" w:firstRow="1" w:lastColumn="0" w:lastRow="0" w:noHBand="0" w:noVBand="1" w:val="04A0"/>
+        <w:tblBorders>
+          <w:top w:val="single" w:sz="4" w:color="D9D9D9"/>
+          <w:left w:val="single" w:sz="4" w:color="D9D9D9"/>
+          <w:bottom w:val="single" w:sz="4" w:color="D9D9D9"/>
+          <w:right w:val="single" w:sz="4" w:color="D9D9D9"/>
+          <w:insideH w:val="single" w:sz="4" w:color="D9D9D9"/>
+          <w:insideV w:val="single" w:sz="4" w:color="D9D9D9"/>
+        </w:tblBorders>
       </w:tblPr>
       <w:tblGrid>
         <w:gridCol w:w="8565"/>
@@ -1004,7 +1012,7 @@
                 <w:i w:val="0"/>
                 <w:sz w:val="20"/>
               </w:rPr>
-              <w:t>Appendices A to D</w:t>
+              <w:t>Appendices A to F</w:t>
             </w:r>
           </w:p>
         </w:tc>
@@ -1030,7 +1038,7 @@
                 <w:i w:val="0"/>
                 <w:sz w:val="20"/>
               </w:rPr>
-              <w:t>16–19</w:t>
+              <w:t>16–21</w:t>
             </w:r>
           </w:p>
         </w:tc>
@@ -1224,8 +1232,8 @@
       <w:r>
         <w:drawing>
           <wp:inline xmlns:a="http://schemas.openxmlformats.org/drawingml/2006/main" xmlns:pic="http://schemas.openxmlformats.org/drawingml/2006/picture">
-            <wp:extent cx="6170096" cy="3470679"/>
-            <wp:docPr id="2" name="Picture 2" descr="The restaurant team desk with enquiry stages and navigation"/>
+            <wp:extent cx="6170096" cy="2927751"/>
+            <wp:docPr id="2" name="Picture 2" descr="A customer conversation beside its five-field brief, showing six guests and an unresolved after-eight time"/>
             <wp:cNvGraphicFramePr>
               <a:graphicFrameLocks noChangeAspect="1"/>
             </wp:cNvGraphicFramePr>
@@ -1233,11 +1241,12 @@
               <a:graphicData uri="http://schemas.openxmlformats.org/drawingml/2006/picture">
                 <pic:pic>
                   <pic:nvPicPr>
-                    <pic:cNvPr id="0" name="FormBridge-team-desk.png"/>
+                    <pic:cNvPr id="0" name="FormBridge-core-workflow.jpg"/>
                     <pic:cNvPicPr/>
                   </pic:nvPicPr>
                   <pic:blipFill>
                     <a:blip r:embed="rId12"/>
+                    <a:srcRect l="2500" r="2500" t="30505" b="39459"/>
                     <a:stretch>
                       <a:fillRect/>
                     </a:stretch>
@@ -1245,7 +1254,7 @@
                   <pic:spPr>
                     <a:xfrm>
                       <a:off x="0" y="0"/>
-                      <a:ext cx="6170096" cy="3470679"/>
+                      <a:ext cx="6170096" cy="2927751"/>
                     </a:xfrm>
                     <a:prstGeom prst="rect"/>
                   </pic:spPr>
@@ -1265,7 +1274,7 @@
           <w:b w:val="0"/>
           <w:i w:val="0"/>
         </w:rPr>
-        <w:t>Figure 1. The deployed team desk for the fictional Juniper House restaurant. The overview separates enquiries needing a reply from those under review. Original product capture, 13 October 2026.</w:t>
+        <w:t>Figure 1. The live booking desk after a customer changes four guests to six and replaces 7 pm with “sometime after 8 pm”. The count is resolved; the exact time still needs an answer. Original product capture, 13 October 2026.</w:t>
       </w:r>
     </w:p>
     <w:p>
@@ -1282,7 +1291,7 @@
           <w:b w:val="0"/>
           <w:i w:val="0"/>
         </w:rPr>
-        <w:t>Alex requests a birthday dinner for five on 23 October 2027 at 8:30 pm, with a peanut allergy and a quiet-table preference. The guest page gathers contact details and sends the enquiry to the private inbox. Staff inspect the five-field brief and accept supported guest-care suggestions individually. They assign an owner, set a due time and approve the reviewed brief.</w:t>
+        <w:t>In Figure 1, the restaurant, city and date survive the correction. Staff can inspect the supporting messages and change history, then ask for an exact time. A proposed 8:30 pm becomes resolved only after the customer accepts it. Approval then applies to the reviewed brief.</w:t>
       </w:r>
     </w:p>
     <w:p>
@@ -1291,7 +1300,7 @@
           <w:b w:val="0"/>
           <w:i w:val="0"/>
         </w:rPr>
-        <w:t xml:space="preserve">Alex later uses a private link to change the count to six. The correction becomes a customer message, clears approval and returns the enquiry to </w:t>
+        <w:t xml:space="preserve">The shared workflow adds contact details, accepted guest-care requests, an owner and a due time. A private review link lets the guest request a correction. That change becomes a customer message, clears approval and returns the enquiry to </w:t>
       </w:r>
       <w:r>
         <w:rPr>
@@ -1305,7 +1314,7 @@
           <w:b w:val="0"/>
           <w:i w:val="0"/>
         </w:rPr>
-        <w:t>. After analysis and staff review, the updated brief can be handed off. A simulated reservation connection demonstrates the final transfer and failure handling without making a restaurant reservation.</w:t>
+        <w:t>. A simulated reservation connection demonstrates transfer and failure handling without reserving a table.</w:t>
       </w:r>
     </w:p>
     <w:p>
@@ -1402,7 +1411,7 @@
           <w:b w:val="0"/>
           <w:i w:val="0"/>
         </w:rPr>
-        <w:t>Figure 2. Application architecture. Model output is checked before it changes the brief. Guest-facing routes expose selected information, while staff actions require workspace membership. External messaging and reservations use simulations.</w:t>
+        <w:t>Figure 2. Application architecture. Model output is checked before it changes the brief. Shared workspace reads and changes require membership; the public booking desk works independently. External messaging and reservations use simulations.</w:t>
       </w:r>
     </w:p>
     <w:p>
@@ -1493,6 +1502,14 @@
         <w:jc w:val="center"/>
         <w:tblLayout w:type="fixed"/>
         <w:tblLook w:firstColumn="1" w:firstRow="1" w:lastColumn="0" w:lastRow="0" w:noHBand="0" w:noVBand="1" w:val="04A0"/>
+        <w:tblBorders>
+          <w:top w:val="single" w:sz="4" w:color="D9D9D9"/>
+          <w:left w:val="single" w:sz="4" w:color="D9D9D9"/>
+          <w:bottom w:val="single" w:sz="4" w:color="D9D9D9"/>
+          <w:right w:val="single" w:sz="4" w:color="D9D9D9"/>
+          <w:insideH w:val="single" w:sz="4" w:color="D9D9D9"/>
+          <w:insideV w:val="single" w:sz="4" w:color="D9D9D9"/>
+        </w:tblBorders>
       </w:tblPr>
       <w:tblGrid>
         <w:gridCol w:w="2304"/>
@@ -1852,7 +1869,7 @@
           <w:b w:val="0"/>
           <w:i w:val="0"/>
         </w:rPr>
-        <w:t>All approaches receive the same speaker-labelled prefixes. FormBridge accepts a staff-proposed field only when its checks find customer acceptance. FormBridge reconstructs the request from the visible conversation, then checks cited IDs, literal quotations, value support, acceptance and recency. It checks calendar validity, time constraints, guest-count expressions and explicit cancellation. Manual edits are preserved, and later conflicts require review.</w:t>
+        <w:t>All approaches receive the same speaker-labelled prefixes. FormBridge reconstructs the request, then checks message IDs, literal quotations, value support, customer acceptance and recency. It checks dates, time constraints, guest counts and cancellation. Manual edits are preserved; later conflicts require review.</w:t>
       </w:r>
     </w:p>
     <w:p>
@@ -1878,7 +1895,7 @@
           <w:b w:val="0"/>
           <w:i w:val="0"/>
         </w:rPr>
-        <w:t xml:space="preserve">The deployed extraction configuration uses </w:t>
+        <w:t xml:space="preserve">The deployed configuration uses </w:t>
       </w:r>
       <w:r>
         <w:rPr>
@@ -1894,7 +1911,7 @@
           <w:b w:val="0"/>
           <w:i w:val="0"/>
         </w:rPr>
-        <w:t xml:space="preserve"> and permits one </w:t>
+        <w:t xml:space="preserve"> with one </w:t>
       </w:r>
       <w:r>
         <w:rPr>
@@ -1910,7 +1927,7 @@
           <w:b w:val="0"/>
           <w:i w:val="0"/>
         </w:rPr>
-        <w:t xml:space="preserve"> repair or transient-failure recovery. Both use low reasoning effort. Primary and secondary timeouts are 12 and 14 seconds; SDK retries are disabled. The output budget is 2,400 tokens for evidence-bearing extraction and 900 for direct extraction. These limits bound waiting and token use within the analysis route's 30-second duration.</w:t>
+        <w:t xml:space="preserve"> repair or transient-failure recovery. Both use low reasoning effort; SDK retries are disabled. Output limits are 2,400 tokens for extraction with evidence and 900 for direct extraction.</w:t>
       </w:r>
     </w:p>
     <w:p>
@@ -1919,7 +1936,16 @@
           <w:b w:val="0"/>
           <w:i w:val="0"/>
         </w:rPr>
-        <w:t>A hosted model enabled work on state integrity and interaction without training or serving weights. The tradeoffs are external processing, network dependence and changing model aliases. Development trials informed the selected configuration, but did not establish an optimal model. FormBridge's extra model call is counted when comparing accuracy, latency and usage.</w:t>
+        <w:t>A ten-dialogue development trial with Luna matched 45/50 fields, with no failed dialogues and a mean replay time of 27.78 seconds. A later Sol-primary/Astra-repair trial on the same IDs matched 38/50, failed one dialogue and averaged 52.39 seconds over the nine completed dialogues. Prompts and validation also changed between trials, so this does not isolate model quality. It supports the practical choice of Luna for ordinary requests; Appendix E gives the trial records.</w:t>
+      </w:r>
+    </w:p>
+    <w:p>
+      <w:r>
+        <w:rPr>
+          <w:b w:val="0"/>
+          <w:i w:val="0"/>
+        </w:rPr>
+        <w:t>Sol is reserved for one further check or recovery when needed. Its benefit was not isolated in a controlled repair-model trial. The 12- and 14-second limits leave time for application work within the 30-second route limit. Hosted models avoid training and serving weights, at the cost of network dependence, external processing and model aliases that may change.</w:t>
       </w:r>
     </w:p>
     <w:p>
@@ -1952,7 +1978,7 @@
           <w:b w:val="0"/>
           <w:i w:val="0"/>
         </w:rPr>
-        <w:t>; staff review its text before adding it. Guest-care extraction requires literal customer quotations and explicit acceptance of each suggestion. The desk assistant uses structured output and a narrowly defined function for proposed notes or follow-ups. Its tools do not book tables or overwrite booking fields. Restaurant questions use category matching over approved facts, returning their text or acknowledging a missing answer. This is bounded retrieval, not a general-purpose restaurant knowledge model.</w:t>
+        <w:t>; staff review the transcript before adding it. Guest-care suggestions require customer quotations and individual staff acceptance. The desk assistant proposes notes or follow-ups without booking tables or overwriting fields. Restaurant questions retrieve matching categories of approved facts and acknowledge missing answers.</w:t>
       </w:r>
     </w:p>
     <w:p>
@@ -1978,23 +2004,7 @@
           <w:b w:val="0"/>
           <w:i w:val="0"/>
         </w:rPr>
-        <w:t xml:space="preserve">The evaluation uses Google's Schema-Guided Dialogue dataset at revision </w:t>
-      </w:r>
-      <w:r>
-        <w:rPr>
-          <w:rFonts w:ascii="Liberation Mono" w:hAnsi="Liberation Mono"/>
-          <w:b w:val="0"/>
-          <w:i w:val="0"/>
-          <w:sz w:val="19"/>
-        </w:rPr>
-        <w:t>e852981ae34990f4358979625854259302feaa78</w:t>
-      </w:r>
-      <w:r>
-        <w:rPr>
-          <w:b w:val="0"/>
-          <w:i w:val="0"/>
-        </w:rPr>
-        <w:t xml:space="preserve"> (Google Research, n.d.). Conversations are retained only when they concern one restaurant service and contain a customer frame with the </w:t>
+        <w:t xml:space="preserve">The evaluation uses Google's Schema-Guided Dialogue dataset (Google Research, n.d.). The exact corpus revision is specified in Appendix B. Conversations are retained only when they concern one restaurant service and contain a customer frame with the </w:t>
       </w:r>
       <w:r>
         <w:rPr>
@@ -2010,7 +2020,7 @@
           <w:b w:val="0"/>
           <w:i w:val="0"/>
         </w:rPr>
-        <w:t xml:space="preserve"> intent. The repository audit identifies the following subset before the evaluation runner's maximum-prefix-length filter.</w:t>
+        <w:t xml:space="preserve"> intent. The following subset was identified before applying the maximum-prefix-length filter.</w:t>
       </w:r>
     </w:p>
     <w:p>
@@ -2032,6 +2042,14 @@
         <w:jc w:val="center"/>
         <w:tblLayout w:type="fixed"/>
         <w:tblLook w:firstColumn="1" w:firstRow="1" w:lastColumn="0" w:lastRow="0" w:noHBand="0" w:noVBand="1" w:val="04A0"/>
+        <w:tblBorders>
+          <w:top w:val="single" w:sz="4" w:color="D9D9D9"/>
+          <w:left w:val="single" w:sz="4" w:color="D9D9D9"/>
+          <w:bottom w:val="single" w:sz="4" w:color="D9D9D9"/>
+          <w:right w:val="single" w:sz="4" w:color="D9D9D9"/>
+          <w:insideH w:val="single" w:sz="4" w:color="D9D9D9"/>
+          <w:insideV w:val="single" w:sz="4" w:color="D9D9D9"/>
+        </w:tblBorders>
       </w:tblPr>
       <w:tblGrid>
         <w:gridCol w:w="2808"/>
@@ -2639,7 +2657,7 @@
         <w:pStyle w:val="Heading2"/>
       </w:pPr>
       <w:r>
-        <w:t>Current code and fixed selections</w:t>
+        <w:t>Whole-system comparison</w:t>
       </w:r>
     </w:p>
     <w:p>
@@ -2648,57 +2666,16 @@
           <w:b w:val="0"/>
           <w:i w:val="0"/>
         </w:rPr>
-        <w:t xml:space="preserve">The evaluation uses extraction version </w:t>
-      </w:r>
-      <w:r>
-        <w:rPr>
-          <w:rFonts w:ascii="Liberation Mono" w:hAnsi="Liberation Mono"/>
-          <w:b w:val="0"/>
-          <w:i w:val="0"/>
-          <w:sz w:val="19"/>
-        </w:rPr>
-        <w:t>grounded-state-v18</w:t>
-      </w:r>
+        <w:t>The evaluation uses the released extraction code and two previously inspected samples: 20 development dialogues for all three methods and 20 test dialogues for FormBridge regression testing. Dialogue IDs were saved before the calls. Appendices A and B identify the source revision, configuration and selections.</w:t>
+      </w:r>
+    </w:p>
+    <w:p>
       <w:r>
         <w:rPr>
           <w:b w:val="0"/>
           <w:i w:val="0"/>
         </w:rPr>
-        <w:t xml:space="preserve"> at application revision </w:t>
-      </w:r>
-      <w:r>
-        <w:rPr>
-          <w:rFonts w:ascii="Liberation Mono" w:hAnsi="Liberation Mono"/>
-          <w:b w:val="0"/>
-          <w:i w:val="0"/>
-          <w:sz w:val="19"/>
-        </w:rPr>
-        <w:t>b0d389e</w:t>
-      </w:r>
-      <w:r>
-        <w:rPr>
-          <w:b w:val="0"/>
-          <w:i w:val="0"/>
-        </w:rPr>
-        <w:t>. Two previously selected samples are reused: 20 development dialogues for all three methods, and 20 inspected test dialogues for a FormBridge regression run. Their selection manifests were saved before provider calls. Both samples had been inspected during development.</w:t>
-      </w:r>
-    </w:p>
-    <w:p>
-      <w:r>
-        <w:rPr>
-          <w:b w:val="0"/>
-          <w:i w:val="0"/>
-        </w:rPr>
-        <w:t>Rules, direct extraction and FormBridge see identical ordered conversation prefixes and finish at the same customer turn. The direct baseline and FormBridge use the same primary model, GPT-6 Luna. FormBridge additionally permits a Sol repair or recovery and produces evidence quotations. This compares complete systems; it does not isolate the causal effect of validation or control total computation.</w:t>
-      </w:r>
-    </w:p>
-    <w:p>
-      <w:r>
-        <w:rPr>
-          <w:b w:val="0"/>
-          <w:i w:val="0"/>
-        </w:rPr>
-        <w:t>An earlier equal-model comparison used Luna for all contextual calls, including repair. It is retained as historical evidence in Appendix C. Its results are not presented as measurements of the current application.</w:t>
+        <w:t>All methods see identical ordered conversation prefixes and finish at the same customer turn. Direct extraction and FormBridge use GPT-6 Luna as the primary model. FormBridge also permits a Sol repair or recovery and requests quotations. This compares complete systems, with different prompts, output allowances and call counts.</w:t>
       </w:r>
     </w:p>
     <w:p>
@@ -2706,6 +2683,32 @@
         <w:pStyle w:val="Heading2"/>
       </w:pPr>
       <w:r>
+        <w:t>Controlled component and feature checks</w:t>
+      </w:r>
+    </w:p>
+    <w:p>
+      <w:r>
+        <w:rPr>
+          <w:b w:val="0"/>
+          <w:i w:val="0"/>
+        </w:rPr>
+        <w:t>A second comparison uses one primary-model proposal for the final visible prefix of each development dialogue. Each proposal is scored before and after deterministic validation. Both conditions therefore share the exact input, prompt, model, output allowance and response. Repair and earlier predicted state are excluded. This isolates postprocessing of these proposals, rather than the complete incremental application. The one timed-out request counts as a failure in both conditions.</w:t>
+      </w:r>
+    </w:p>
+    <w:p>
+      <w:r>
+        <w:rPr>
+          <w:b w:val="0"/>
+          <w:i w:val="0"/>
+        </w:rPr>
+        <w:t>Twenty constructed conversations separately test corrections, customer acceptance, cancellation, dates, guest counts and uncertainty. Expected values, statuses, supporting-message combinations and clarification targets were written before calls and kept out of model inputs. Each complete transcript is analysed from an empty brief. The checks measure source coverage, preservation of constraints, question targets and approval decisions; they do not rate conversational helpfulness.</w:t>
+      </w:r>
+    </w:p>
+    <w:p>
+      <w:pPr>
+        <w:pStyle w:val="Heading2"/>
+      </w:pPr>
+      <w:r>
         <w:t>Metrics</w:t>
       </w:r>
     </w:p>
@@ -2745,7 +2748,7 @@
           <w:b w:val="0"/>
           <w:i w:val="0"/>
         </w:rPr>
-        <w:t>The strict matcher applies the original text normalisation. The canonical matcher additionally accepts supported equivalent date and time forms. Both are reported. Canonicalisation does not supply a missing year or turn an uncertain range into an exact value. These scores measure the selected five-field task, not full SGD joint goal accuracy or approval readiness.</w:t>
+        <w:t>The strict matcher applies basic text normalisation. The canonical matcher also accepts equivalent date and time forms, without supplying missing years or treating a range as an exact time. Both are reported for the whole-system comparison. They measure five-field matching, not full SGD joint goal accuracy or readiness to approve.</w:t>
       </w:r>
     </w:p>
     <w:p>
@@ -2754,7 +2757,7 @@
           <w:b w:val="0"/>
           <w:i w:val="0"/>
         </w:rPr>
-        <w:t>Resource accounting includes analysis requests, provider attempts, observed input/output tokens and whole-dialogue replay time. Replay time includes multiple prefixes and cannot be read as one user-message response time. Failed calls may not return usage, so reported tokens are not complete billing records.</w:t>
+        <w:t>Resource accounting includes OpenAI requests, observed tokens and whole-dialogue replay time. Replay includes multiple prefixes, so it is not one-message response time. Failed requests may omit usage; token totals are not complete billing records.</w:t>
       </w:r>
     </w:p>
     <w:p>
@@ -2771,16 +2774,7 @@
           <w:b w:val="0"/>
           <w:i w:val="0"/>
         </w:rPr>
-        <w:t>The runner calls the same analysis functions directly with real provider requests. This binds evaluation to the selected source and configuration while avoiding public endpoint quotas. It does not test the deployed route. Separate browser and database checks address the application boundary.</w:t>
-      </w:r>
-    </w:p>
-    <w:p>
-      <w:r>
-        <w:rPr>
-          <w:b w:val="0"/>
-          <w:i w:val="0"/>
-        </w:rPr>
-        <w:t>The source fingerprint is checked before and after each run. Predictions, warnings, errors, selected IDs and settings are saved, with unique filenames that prevent replacement. The current run is reported once, including failures. Model aliases and provider variability prevent a guarantee of identical future outputs. Appendices A and B give the exact setup and evaluation commands.</w:t>
+        <w:t>The scripts call application functions with real provider requests; separate browser checks exercise the deployed interface. Saved outputs retain predictions, failures, settings and source checksums. The main runner rechecks the extraction checksum before saving. The component and feature runner rechecks its combined source checksum. Hosted-model variability prevents identical future outputs even with unchanged source. Appendix E documents the supplementary checks.</w:t>
       </w:r>
     </w:p>
     <w:p>
@@ -2828,6 +2822,14 @@
         <w:jc w:val="center"/>
         <w:tblLayout w:type="fixed"/>
         <w:tblLook w:firstColumn="1" w:firstRow="1" w:lastColumn="0" w:lastRow="0" w:noHBand="0" w:noVBand="1" w:val="04A0"/>
+        <w:tblBorders>
+          <w:top w:val="single" w:sz="4" w:color="D9D9D9"/>
+          <w:left w:val="single" w:sz="4" w:color="D9D9D9"/>
+          <w:bottom w:val="single" w:sz="4" w:color="D9D9D9"/>
+          <w:right w:val="single" w:sz="4" w:color="D9D9D9"/>
+          <w:insideH w:val="single" w:sz="4" w:color="D9D9D9"/>
+          <w:insideV w:val="single" w:sz="4" w:color="D9D9D9"/>
+        </w:tblBorders>
       </w:tblPr>
       <w:tblGrid>
         <w:gridCol w:w="2232"/>
@@ -2883,6 +2885,7 @@
           <w:p>
             <w:pPr>
               <w:spacing w:before="60" w:after="60" w:line="252" w:lineRule="auto"/>
+              <w:jc w:val="center"/>
             </w:pPr>
             <w:r>
               <w:rPr>
@@ -2910,6 +2913,7 @@
           <w:p>
             <w:pPr>
               <w:spacing w:before="60" w:after="60" w:line="252" w:lineRule="auto"/>
+              <w:jc w:val="center"/>
             </w:pPr>
             <w:r>
               <w:rPr>
@@ -2937,6 +2941,7 @@
           <w:p>
             <w:pPr>
               <w:spacing w:before="60" w:after="60" w:line="252" w:lineRule="auto"/>
+              <w:jc w:val="center"/>
             </w:pPr>
             <w:r>
               <w:rPr>
@@ -2964,6 +2969,7 @@
           <w:p>
             <w:pPr>
               <w:spacing w:before="60" w:after="60" w:line="252" w:lineRule="auto"/>
+              <w:jc w:val="center"/>
             </w:pPr>
             <w:r>
               <w:rPr>
@@ -3022,6 +3028,7 @@
           <w:p>
             <w:pPr>
               <w:spacing w:before="60" w:after="60" w:line="252" w:lineRule="auto"/>
+              <w:jc w:val="center"/>
             </w:pPr>
             <w:r>
               <w:rPr>
@@ -3048,6 +3055,7 @@
           <w:p>
             <w:pPr>
               <w:spacing w:before="60" w:after="60" w:line="252" w:lineRule="auto"/>
+              <w:jc w:val="center"/>
             </w:pPr>
             <w:r>
               <w:rPr>
@@ -3074,6 +3082,7 @@
           <w:p>
             <w:pPr>
               <w:spacing w:before="60" w:after="60" w:line="252" w:lineRule="auto"/>
+              <w:jc w:val="center"/>
             </w:pPr>
             <w:r>
               <w:rPr>
@@ -3100,6 +3109,7 @@
           <w:p>
             <w:pPr>
               <w:spacing w:before="60" w:after="60" w:line="252" w:lineRule="auto"/>
+              <w:jc w:val="center"/>
             </w:pPr>
             <w:r>
               <w:rPr>
@@ -3157,6 +3167,7 @@
           <w:p>
             <w:pPr>
               <w:spacing w:before="60" w:after="60" w:line="252" w:lineRule="auto"/>
+              <w:jc w:val="center"/>
             </w:pPr>
             <w:r>
               <w:rPr>
@@ -3183,6 +3194,7 @@
           <w:p>
             <w:pPr>
               <w:spacing w:before="60" w:after="60" w:line="252" w:lineRule="auto"/>
+              <w:jc w:val="center"/>
             </w:pPr>
             <w:r>
               <w:rPr>
@@ -3209,6 +3221,7 @@
           <w:p>
             <w:pPr>
               <w:spacing w:before="60" w:after="60" w:line="252" w:lineRule="auto"/>
+              <w:jc w:val="center"/>
             </w:pPr>
             <w:r>
               <w:rPr>
@@ -3235,6 +3248,7 @@
           <w:p>
             <w:pPr>
               <w:spacing w:before="60" w:after="60" w:line="252" w:lineRule="auto"/>
+              <w:jc w:val="center"/>
             </w:pPr>
             <w:r>
               <w:rPr>
@@ -3292,6 +3306,7 @@
           <w:p>
             <w:pPr>
               <w:spacing w:before="60" w:after="60" w:line="252" w:lineRule="auto"/>
+              <w:jc w:val="center"/>
             </w:pPr>
             <w:r>
               <w:rPr>
@@ -3318,6 +3333,7 @@
           <w:p>
             <w:pPr>
               <w:spacing w:before="60" w:after="60" w:line="252" w:lineRule="auto"/>
+              <w:jc w:val="center"/>
             </w:pPr>
             <w:r>
               <w:rPr>
@@ -3344,6 +3360,7 @@
           <w:p>
             <w:pPr>
               <w:spacing w:before="60" w:after="60" w:line="252" w:lineRule="auto"/>
+              <w:jc w:val="center"/>
             </w:pPr>
             <w:r>
               <w:rPr>
@@ -3370,6 +3387,7 @@
           <w:p>
             <w:pPr>
               <w:spacing w:before="60" w:after="60" w:line="252" w:lineRule="auto"/>
+              <w:jc w:val="center"/>
             </w:pPr>
             <w:r>
               <w:rPr>
@@ -3404,6 +3422,14 @@
     </w:p>
     <w:p>
       <w:pPr>
+        <w:pStyle w:val="Heading2"/>
+      </w:pPr>
+      <w:r>
+        <w:t>Effect of validation on identical proposals</w:t>
+      </w:r>
+    </w:p>
+    <w:p>
+      <w:pPr>
         <w:pStyle w:val="Caption"/>
         <w:keepNext/>
       </w:pPr>
@@ -3412,7 +3438,7 @@
           <w:b w:val="0"/>
           <w:i w:val="0"/>
         </w:rPr>
-        <w:t>Table 4. Development matches by field.</w:t>
+        <w:t>Table 4. Paired comparison using one proposal per final dialogue prefix.</w:t>
       </w:r>
     </w:p>
     <w:tbl>
@@ -3421,14 +3447,19 @@
         <w:jc w:val="center"/>
         <w:tblLayout w:type="fixed"/>
         <w:tblLook w:firstColumn="1" w:firstRow="1" w:lastColumn="0" w:lastRow="0" w:noHBand="0" w:noVBand="1" w:val="04A0"/>
+        <w:tblBorders>
+          <w:top w:val="single" w:sz="4" w:color="D9D9D9"/>
+          <w:left w:val="single" w:sz="4" w:color="D9D9D9"/>
+          <w:bottom w:val="single" w:sz="4" w:color="D9D9D9"/>
+          <w:right w:val="single" w:sz="4" w:color="D9D9D9"/>
+          <w:insideH w:val="single" w:sz="4" w:color="D9D9D9"/>
+          <w:insideV w:val="single" w:sz="4" w:color="D9D9D9"/>
+        </w:tblBorders>
       </w:tblPr>
       <w:tblGrid>
-        <w:gridCol w:w="2880"/>
-        <w:gridCol w:w="1368"/>
-        <w:gridCol w:w="1368"/>
-        <w:gridCol w:w="1368"/>
-        <w:gridCol w:w="1368"/>
-        <w:gridCol w:w="1365"/>
+        <w:gridCol w:w="5685"/>
+        <w:gridCol w:w="2016"/>
+        <w:gridCol w:w="2016"/>
       </w:tblGrid>
       <w:tr>
         <w:trPr>
@@ -3437,7 +3468,7 @@
         </w:trPr>
         <w:tc>
           <w:tcPr>
-            <w:tcW w:type="dxa" w:w="2880"/>
+            <w:tcW w:type="dxa" w:w="5685"/>
             <w:vAlign w:val="center"/>
             <w:shd w:fill="333333"/>
             <w:tcMar>
@@ -3456,15 +3487,15 @@
                 <w:b/>
                 <w:i w:val="0"/>
                 <w:color w:val="FFFFFF"/>
-                <w:sz w:val="19"/>
+                <w:sz w:val="20"/>
               </w:rPr>
-              <w:t>Correct canonical values</w:t>
+              <w:t>Condition</w:t>
             </w:r>
           </w:p>
         </w:tc>
         <w:tc>
           <w:tcPr>
-            <w:tcW w:type="dxa" w:w="1368"/>
+            <w:tcW w:type="dxa" w:w="2016"/>
             <w:vAlign w:val="center"/>
             <w:shd w:fill="333333"/>
             <w:tcMar>
@@ -3477,21 +3508,22 @@
           <w:p>
             <w:pPr>
               <w:spacing w:before="60" w:after="60" w:line="252" w:lineRule="auto"/>
+              <w:jc w:val="center"/>
             </w:pPr>
             <w:r>
               <w:rPr>
                 <w:b/>
                 <w:i w:val="0"/>
                 <w:color w:val="FFFFFF"/>
-                <w:sz w:val="19"/>
+                <w:sz w:val="20"/>
               </w:rPr>
-              <w:t>Restaurant</w:t>
+              <w:t>Canonical fields</w:t>
             </w:r>
           </w:p>
         </w:tc>
         <w:tc>
           <w:tcPr>
-            <w:tcW w:type="dxa" w:w="1368"/>
+            <w:tcW w:type="dxa" w:w="2016"/>
             <w:vAlign w:val="center"/>
             <w:shd w:fill="333333"/>
             <w:tcMar>
@@ -3504,96 +3536,16 @@
           <w:p>
             <w:pPr>
               <w:spacing w:before="60" w:after="60" w:line="252" w:lineRule="auto"/>
+              <w:jc w:val="center"/>
             </w:pPr>
             <w:r>
               <w:rPr>
                 <w:b/>
                 <w:i w:val="0"/>
                 <w:color w:val="FFFFFF"/>
-                <w:sz w:val="19"/>
+                <w:sz w:val="20"/>
               </w:rPr>
-              <w:t>City</w:t>
-            </w:r>
-          </w:p>
-        </w:tc>
-        <w:tc>
-          <w:tcPr>
-            <w:tcW w:type="dxa" w:w="1368"/>
-            <w:vAlign w:val="center"/>
-            <w:shd w:fill="333333"/>
-            <w:tcMar>
-              <w:top w:w="65" w:type="dxa"/>
-              <w:bottom w:w="65" w:type="dxa"/>
-              <w:left w:w="65" w:type="dxa"/>
-              <w:right w:w="65" w:type="dxa"/>
-            </w:tcMar>
-          </w:tcPr>
-          <w:p>
-            <w:pPr>
-              <w:spacing w:before="60" w:after="60" w:line="252" w:lineRule="auto"/>
-            </w:pPr>
-            <w:r>
-              <w:rPr>
-                <w:b/>
-                <w:i w:val="0"/>
-                <w:color w:val="FFFFFF"/>
-                <w:sz w:val="19"/>
-              </w:rPr>
-              <w:t>Date</w:t>
-            </w:r>
-          </w:p>
-        </w:tc>
-        <w:tc>
-          <w:tcPr>
-            <w:tcW w:type="dxa" w:w="1368"/>
-            <w:vAlign w:val="center"/>
-            <w:shd w:fill="333333"/>
-            <w:tcMar>
-              <w:top w:w="65" w:type="dxa"/>
-              <w:bottom w:w="65" w:type="dxa"/>
-              <w:left w:w="65" w:type="dxa"/>
-              <w:right w:w="65" w:type="dxa"/>
-            </w:tcMar>
-          </w:tcPr>
-          <w:p>
-            <w:pPr>
-              <w:spacing w:before="60" w:after="60" w:line="252" w:lineRule="auto"/>
-            </w:pPr>
-            <w:r>
-              <w:rPr>
-                <w:b/>
-                <w:i w:val="0"/>
-                <w:color w:val="FFFFFF"/>
-                <w:sz w:val="19"/>
-              </w:rPr>
-              <w:t>Time</w:t>
-            </w:r>
-          </w:p>
-        </w:tc>
-        <w:tc>
-          <w:tcPr>
-            <w:tcW w:type="dxa" w:w="1365"/>
-            <w:vAlign w:val="center"/>
-            <w:shd w:fill="333333"/>
-            <w:tcMar>
-              <w:top w:w="65" w:type="dxa"/>
-              <w:bottom w:w="65" w:type="dxa"/>
-              <w:left w:w="65" w:type="dxa"/>
-              <w:right w:w="65" w:type="dxa"/>
-            </w:tcMar>
-          </w:tcPr>
-          <w:p>
-            <w:pPr>
-              <w:spacing w:before="60" w:after="60" w:line="252" w:lineRule="auto"/>
-            </w:pPr>
-            <w:r>
-              <w:rPr>
-                <w:b/>
-                <w:i w:val="0"/>
-                <w:color w:val="FFFFFF"/>
-                <w:sz w:val="19"/>
-              </w:rPr>
-              <w:t>Guests</w:t>
+              <w:t>Complete briefs</w:t>
             </w:r>
           </w:p>
         </w:tc>
@@ -3604,7 +3556,7 @@
         </w:trPr>
         <w:tc>
           <w:tcPr>
-            <w:tcW w:type="dxa" w:w="2880"/>
+            <w:tcW w:type="dxa" w:w="5685"/>
             <w:vAlign w:val="center"/>
             <w:shd w:fill="F3F3F1"/>
             <w:tcMar>
@@ -3622,15 +3574,15 @@
               <w:rPr>
                 <w:b w:val="0"/>
                 <w:i w:val="0"/>
-                <w:sz w:val="19"/>
+                <w:sz w:val="20"/>
               </w:rPr>
-              <w:t>Rules</w:t>
+              <w:t>Original model proposal</w:t>
             </w:r>
           </w:p>
         </w:tc>
         <w:tc>
           <w:tcPr>
-            <w:tcW w:type="dxa" w:w="1368"/>
+            <w:tcW w:type="dxa" w:w="2016"/>
             <w:vAlign w:val="center"/>
             <w:shd w:fill="F3F3F1"/>
             <w:tcMar>
@@ -3643,20 +3595,21 @@
           <w:p>
             <w:pPr>
               <w:spacing w:before="60" w:after="60" w:line="252" w:lineRule="auto"/>
+              <w:jc w:val="center"/>
             </w:pPr>
             <w:r>
               <w:rPr>
                 <w:b w:val="0"/>
                 <w:i w:val="0"/>
-                <w:sz w:val="19"/>
+                <w:sz w:val="20"/>
               </w:rPr>
-              <w:t>3/20</w:t>
+              <w:t>88/100</w:t>
             </w:r>
           </w:p>
         </w:tc>
         <w:tc>
           <w:tcPr>
-            <w:tcW w:type="dxa" w:w="1368"/>
+            <w:tcW w:type="dxa" w:w="2016"/>
             <w:vAlign w:val="center"/>
             <w:shd w:fill="F3F3F1"/>
             <w:tcMar>
@@ -3669,92 +3622,15 @@
           <w:p>
             <w:pPr>
               <w:spacing w:before="60" w:after="60" w:line="252" w:lineRule="auto"/>
+              <w:jc w:val="center"/>
             </w:pPr>
             <w:r>
               <w:rPr>
                 <w:b w:val="0"/>
                 <w:i w:val="0"/>
-                <w:sz w:val="19"/>
+                <w:sz w:val="20"/>
               </w:rPr>
-              <w:t>8/20</w:t>
-            </w:r>
-          </w:p>
-        </w:tc>
-        <w:tc>
-          <w:tcPr>
-            <w:tcW w:type="dxa" w:w="1368"/>
-            <w:vAlign w:val="center"/>
-            <w:shd w:fill="F3F3F1"/>
-            <w:tcMar>
-              <w:top w:w="65" w:type="dxa"/>
-              <w:bottom w:w="65" w:type="dxa"/>
-              <w:left w:w="65" w:type="dxa"/>
-              <w:right w:w="65" w:type="dxa"/>
-            </w:tcMar>
-          </w:tcPr>
-          <w:p>
-            <w:pPr>
-              <w:spacing w:before="60" w:after="60" w:line="252" w:lineRule="auto"/>
-            </w:pPr>
-            <w:r>
-              <w:rPr>
-                <w:b w:val="0"/>
-                <w:i w:val="0"/>
-                <w:sz w:val="19"/>
-              </w:rPr>
-              <w:t>0/20</w:t>
-            </w:r>
-          </w:p>
-        </w:tc>
-        <w:tc>
-          <w:tcPr>
-            <w:tcW w:type="dxa" w:w="1368"/>
-            <w:vAlign w:val="center"/>
-            <w:shd w:fill="F3F3F1"/>
-            <w:tcMar>
-              <w:top w:w="65" w:type="dxa"/>
-              <w:bottom w:w="65" w:type="dxa"/>
-              <w:left w:w="65" w:type="dxa"/>
-              <w:right w:w="65" w:type="dxa"/>
-            </w:tcMar>
-          </w:tcPr>
-          <w:p>
-            <w:pPr>
-              <w:spacing w:before="60" w:after="60" w:line="252" w:lineRule="auto"/>
-            </w:pPr>
-            <w:r>
-              <w:rPr>
-                <w:b w:val="0"/>
-                <w:i w:val="0"/>
-                <w:sz w:val="19"/>
-              </w:rPr>
-              <w:t>12/20</w:t>
-            </w:r>
-          </w:p>
-        </w:tc>
-        <w:tc>
-          <w:tcPr>
-            <w:tcW w:type="dxa" w:w="1365"/>
-            <w:vAlign w:val="center"/>
-            <w:shd w:fill="F3F3F1"/>
-            <w:tcMar>
-              <w:top w:w="65" w:type="dxa"/>
-              <w:bottom w:w="65" w:type="dxa"/>
-              <w:left w:w="65" w:type="dxa"/>
-              <w:right w:w="65" w:type="dxa"/>
-            </w:tcMar>
-          </w:tcPr>
-          <w:p>
-            <w:pPr>
-              <w:spacing w:before="60" w:after="60" w:line="252" w:lineRule="auto"/>
-            </w:pPr>
-            <w:r>
-              <w:rPr>
-                <w:b w:val="0"/>
-                <w:i w:val="0"/>
-                <w:sz w:val="19"/>
-              </w:rPr>
-              <w:t>12/20</w:t>
+              <w:t>14/20</w:t>
             </w:r>
           </w:p>
         </w:tc>
@@ -3765,7 +3641,7 @@
         </w:trPr>
         <w:tc>
           <w:tcPr>
-            <w:tcW w:type="dxa" w:w="2880"/>
+            <w:tcW w:type="dxa" w:w="5685"/>
             <w:vAlign w:val="center"/>
             <w:shd w:fill="FFFFFF"/>
             <w:tcMar>
@@ -3783,15 +3659,15 @@
               <w:rPr>
                 <w:b w:val="0"/>
                 <w:i w:val="0"/>
-                <w:sz w:val="19"/>
+                <w:sz w:val="20"/>
               </w:rPr>
-              <w:t>Direct Luna</w:t>
+              <w:t>Same proposal after validation</w:t>
             </w:r>
           </w:p>
         </w:tc>
         <w:tc>
           <w:tcPr>
-            <w:tcW w:type="dxa" w:w="1368"/>
+            <w:tcW w:type="dxa" w:w="2016"/>
             <w:vAlign w:val="center"/>
             <w:shd w:fill="FFFFFF"/>
             <w:tcMar>
@@ -3804,20 +3680,21 @@
           <w:p>
             <w:pPr>
               <w:spacing w:before="60" w:after="60" w:line="252" w:lineRule="auto"/>
+              <w:jc w:val="center"/>
             </w:pPr>
             <w:r>
               <w:rPr>
                 <w:b w:val="0"/>
                 <w:i w:val="0"/>
-                <w:sz w:val="19"/>
+                <w:sz w:val="20"/>
               </w:rPr>
-              <w:t>20/20</w:t>
+              <w:t>85/100</w:t>
             </w:r>
           </w:p>
         </w:tc>
         <w:tc>
           <w:tcPr>
-            <w:tcW w:type="dxa" w:w="1368"/>
+            <w:tcW w:type="dxa" w:w="2016"/>
             <w:vAlign w:val="center"/>
             <w:shd w:fill="FFFFFF"/>
             <w:tcMar>
@@ -3830,253 +3707,15 @@
           <w:p>
             <w:pPr>
               <w:spacing w:before="60" w:after="60" w:line="252" w:lineRule="auto"/>
+              <w:jc w:val="center"/>
             </w:pPr>
             <w:r>
               <w:rPr>
                 <w:b w:val="0"/>
                 <w:i w:val="0"/>
-                <w:sz w:val="19"/>
-              </w:rPr>
-              <w:t>20/20</w:t>
-            </w:r>
-          </w:p>
-        </w:tc>
-        <w:tc>
-          <w:tcPr>
-            <w:tcW w:type="dxa" w:w="1368"/>
-            <w:vAlign w:val="center"/>
-            <w:shd w:fill="FFFFFF"/>
-            <w:tcMar>
-              <w:top w:w="65" w:type="dxa"/>
-              <w:bottom w:w="65" w:type="dxa"/>
-              <w:left w:w="65" w:type="dxa"/>
-              <w:right w:w="65" w:type="dxa"/>
-            </w:tcMar>
-          </w:tcPr>
-          <w:p>
-            <w:pPr>
-              <w:spacing w:before="60" w:after="60" w:line="252" w:lineRule="auto"/>
-            </w:pPr>
-            <w:r>
-              <w:rPr>
-                <w:b w:val="0"/>
-                <w:i w:val="0"/>
-                <w:sz w:val="19"/>
+                <w:sz w:val="20"/>
               </w:rPr>
               <w:t>12/20</w:t>
-            </w:r>
-          </w:p>
-        </w:tc>
-        <w:tc>
-          <w:tcPr>
-            <w:tcW w:type="dxa" w:w="1368"/>
-            <w:vAlign w:val="center"/>
-            <w:shd w:fill="FFFFFF"/>
-            <w:tcMar>
-              <w:top w:w="65" w:type="dxa"/>
-              <w:bottom w:w="65" w:type="dxa"/>
-              <w:left w:w="65" w:type="dxa"/>
-              <w:right w:w="65" w:type="dxa"/>
-            </w:tcMar>
-          </w:tcPr>
-          <w:p>
-            <w:pPr>
-              <w:spacing w:before="60" w:after="60" w:line="252" w:lineRule="auto"/>
-            </w:pPr>
-            <w:r>
-              <w:rPr>
-                <w:b w:val="0"/>
-                <w:i w:val="0"/>
-                <w:sz w:val="19"/>
-              </w:rPr>
-              <w:t>19/20</w:t>
-            </w:r>
-          </w:p>
-        </w:tc>
-        <w:tc>
-          <w:tcPr>
-            <w:tcW w:type="dxa" w:w="1365"/>
-            <w:vAlign w:val="center"/>
-            <w:shd w:fill="FFFFFF"/>
-            <w:tcMar>
-              <w:top w:w="65" w:type="dxa"/>
-              <w:bottom w:w="65" w:type="dxa"/>
-              <w:left w:w="65" w:type="dxa"/>
-              <w:right w:w="65" w:type="dxa"/>
-            </w:tcMar>
-          </w:tcPr>
-          <w:p>
-            <w:pPr>
-              <w:spacing w:before="60" w:after="60" w:line="252" w:lineRule="auto"/>
-            </w:pPr>
-            <w:r>
-              <w:rPr>
-                <w:b w:val="0"/>
-                <w:i w:val="0"/>
-                <w:sz w:val="19"/>
-              </w:rPr>
-              <w:t>18/20</w:t>
-            </w:r>
-          </w:p>
-        </w:tc>
-      </w:tr>
-      <w:tr>
-        <w:trPr>
-          <w:cantSplit/>
-        </w:trPr>
-        <w:tc>
-          <w:tcPr>
-            <w:tcW w:type="dxa" w:w="2880"/>
-            <w:vAlign w:val="center"/>
-            <w:shd w:fill="F3F3F1"/>
-            <w:tcMar>
-              <w:top w:w="65" w:type="dxa"/>
-              <w:bottom w:w="65" w:type="dxa"/>
-              <w:left w:w="65" w:type="dxa"/>
-              <w:right w:w="65" w:type="dxa"/>
-            </w:tcMar>
-          </w:tcPr>
-          <w:p>
-            <w:pPr>
-              <w:spacing w:before="60" w:after="60" w:line="252" w:lineRule="auto"/>
-            </w:pPr>
-            <w:r>
-              <w:rPr>
-                <w:b w:val="0"/>
-                <w:i w:val="0"/>
-                <w:sz w:val="19"/>
-              </w:rPr>
-              <w:t>FormBridge</w:t>
-            </w:r>
-          </w:p>
-        </w:tc>
-        <w:tc>
-          <w:tcPr>
-            <w:tcW w:type="dxa" w:w="1368"/>
-            <w:vAlign w:val="center"/>
-            <w:shd w:fill="F3F3F1"/>
-            <w:tcMar>
-              <w:top w:w="65" w:type="dxa"/>
-              <w:bottom w:w="65" w:type="dxa"/>
-              <w:left w:w="65" w:type="dxa"/>
-              <w:right w:w="65" w:type="dxa"/>
-            </w:tcMar>
-          </w:tcPr>
-          <w:p>
-            <w:pPr>
-              <w:spacing w:before="60" w:after="60" w:line="252" w:lineRule="auto"/>
-            </w:pPr>
-            <w:r>
-              <w:rPr>
-                <w:b w:val="0"/>
-                <w:i w:val="0"/>
-                <w:sz w:val="19"/>
-              </w:rPr>
-              <w:t>20/20</w:t>
-            </w:r>
-          </w:p>
-        </w:tc>
-        <w:tc>
-          <w:tcPr>
-            <w:tcW w:type="dxa" w:w="1368"/>
-            <w:vAlign w:val="center"/>
-            <w:shd w:fill="F3F3F1"/>
-            <w:tcMar>
-              <w:top w:w="65" w:type="dxa"/>
-              <w:bottom w:w="65" w:type="dxa"/>
-              <w:left w:w="65" w:type="dxa"/>
-              <w:right w:w="65" w:type="dxa"/>
-            </w:tcMar>
-          </w:tcPr>
-          <w:p>
-            <w:pPr>
-              <w:spacing w:before="60" w:after="60" w:line="252" w:lineRule="auto"/>
-            </w:pPr>
-            <w:r>
-              <w:rPr>
-                <w:b w:val="0"/>
-                <w:i w:val="0"/>
-                <w:sz w:val="19"/>
-              </w:rPr>
-              <w:t>20/20</w:t>
-            </w:r>
-          </w:p>
-        </w:tc>
-        <w:tc>
-          <w:tcPr>
-            <w:tcW w:type="dxa" w:w="1368"/>
-            <w:vAlign w:val="center"/>
-            <w:shd w:fill="F3F3F1"/>
-            <w:tcMar>
-              <w:top w:w="65" w:type="dxa"/>
-              <w:bottom w:w="65" w:type="dxa"/>
-              <w:left w:w="65" w:type="dxa"/>
-              <w:right w:w="65" w:type="dxa"/>
-            </w:tcMar>
-          </w:tcPr>
-          <w:p>
-            <w:pPr>
-              <w:spacing w:before="60" w:after="60" w:line="252" w:lineRule="auto"/>
-            </w:pPr>
-            <w:r>
-              <w:rPr>
-                <w:b w:val="0"/>
-                <w:i w:val="0"/>
-                <w:sz w:val="19"/>
-              </w:rPr>
-              <w:t>18/20</w:t>
-            </w:r>
-          </w:p>
-        </w:tc>
-        <w:tc>
-          <w:tcPr>
-            <w:tcW w:type="dxa" w:w="1368"/>
-            <w:vAlign w:val="center"/>
-            <w:shd w:fill="F3F3F1"/>
-            <w:tcMar>
-              <w:top w:w="65" w:type="dxa"/>
-              <w:bottom w:w="65" w:type="dxa"/>
-              <w:left w:w="65" w:type="dxa"/>
-              <w:right w:w="65" w:type="dxa"/>
-            </w:tcMar>
-          </w:tcPr>
-          <w:p>
-            <w:pPr>
-              <w:spacing w:before="60" w:after="60" w:line="252" w:lineRule="auto"/>
-            </w:pPr>
-            <w:r>
-              <w:rPr>
-                <w:b w:val="0"/>
-                <w:i w:val="0"/>
-                <w:sz w:val="19"/>
-              </w:rPr>
-              <w:t>20/20</w:t>
-            </w:r>
-          </w:p>
-        </w:tc>
-        <w:tc>
-          <w:tcPr>
-            <w:tcW w:type="dxa" w:w="1365"/>
-            <w:vAlign w:val="center"/>
-            <w:shd w:fill="F3F3F1"/>
-            <w:tcMar>
-              <w:top w:w="65" w:type="dxa"/>
-              <w:bottom w:w="65" w:type="dxa"/>
-              <w:left w:w="65" w:type="dxa"/>
-              <w:right w:w="65" w:type="dxa"/>
-            </w:tcMar>
-          </w:tcPr>
-          <w:p>
-            <w:pPr>
-              <w:spacing w:before="60" w:after="60" w:line="252" w:lineRule="auto"/>
-            </w:pPr>
-            <w:r>
-              <w:rPr>
-                <w:b w:val="0"/>
-                <w:i w:val="0"/>
-                <w:sz w:val="19"/>
-              </w:rPr>
-              <w:t>19/20</w:t>
             </w:r>
           </w:p>
         </w:tc>
@@ -4093,20 +3732,20 @@
       </w:r>
     </w:p>
     <w:p>
-      <w:pPr>
-        <w:pStyle w:val="Heading2"/>
-      </w:pPr>
-      <w:r>
-        <w:t>Additional computation</w:t>
-      </w:r>
-    </w:p>
-    <w:p>
       <w:r>
         <w:rPr>
           <w:b w:val="0"/>
           <w:i w:val="0"/>
         </w:rPr>
-        <w:t>Each method processed 166 customer prefixes. Direct extraction made 166 provider attempts; FormBridge made 196. Observed token totals were 93,947 input and 21,817 output for direct extraction, compared with 381,706 input and 61,309 output for FormBridge. Three FormBridge dialogues recovered from a failed primary request whose usage was unavailable. Its token totals are therefore lower bounds for those calls.</w:t>
+        <w:t>The 20 attempts include one timeout, counted as five wrong fields in each condition. Validation gained one field match but lost four correct values. This result shows that the deterministic checks alone did not improve value accuracy on these proposals. Section 8 examines why; it is not a repeat of the full-system experiment.</w:t>
+      </w:r>
+    </w:p>
+    <w:p>
+      <w:pPr>
+        <w:pStyle w:val="Heading2"/>
+      </w:pPr>
+      <w:r>
+        <w:t>Additional computation</w:t>
       </w:r>
     </w:p>
     <w:p>
@@ -4115,7 +3754,16 @@
           <w:b w:val="0"/>
           <w:i w:val="0"/>
         </w:rPr>
-        <w:t>Mean whole-dialogue replay time was 21.87 seconds for direct extraction and 45.11 seconds for FormBridge. The latter obtained more matching values at approximately twice the measured replay time. These are serial multi-turn replays with concurrent evaluation activity, not controlled production latency measurements. Rules required no provider calls; their sub-millisecond mean rounds to zero in the saved summary.</w:t>
+        <w:t>In the whole-system comparison, each method processed 166 customer prefixes. Direct extraction made 166 OpenAI requests; FormBridge made 196. Observed input/output tokens were 93,947/21,817 and 381,706/61,309 respectively. Three FormBridge dialogues recovered from failed primary requests without returned usage, so their token totals are lower bounds.</w:t>
+      </w:r>
+    </w:p>
+    <w:p>
+      <w:r>
+        <w:rPr>
+          <w:b w:val="0"/>
+          <w:i w:val="0"/>
+        </w:rPr>
+        <w:t>Mean dialogue replay time was 21.87 seconds for direct extraction and 45.11 seconds for FormBridge. The latter obtained more matching values at approximately twice the replay time. Concurrent evaluation activity limits latency comparisons. Rules required no provider calls.</w:t>
       </w:r>
     </w:p>
     <w:p>
@@ -4180,6 +3828,14 @@
         <w:jc w:val="center"/>
         <w:tblLayout w:type="fixed"/>
         <w:tblLook w:firstColumn="1" w:firstRow="1" w:lastColumn="0" w:lastRow="0" w:noHBand="0" w:noVBand="1" w:val="04A0"/>
+        <w:tblBorders>
+          <w:top w:val="single" w:sz="4" w:color="D9D9D9"/>
+          <w:left w:val="single" w:sz="4" w:color="D9D9D9"/>
+          <w:bottom w:val="single" w:sz="4" w:color="D9D9D9"/>
+          <w:right w:val="single" w:sz="4" w:color="D9D9D9"/>
+          <w:insideH w:val="single" w:sz="4" w:color="D9D9D9"/>
+          <w:insideV w:val="single" w:sz="4" w:color="D9D9D9"/>
+        </w:tblBorders>
       </w:tblPr>
       <w:tblGrid>
         <w:gridCol w:w="1843"/>
@@ -4351,7 +4007,7 @@
                 <w:i w:val="0"/>
                 <w:sz w:val="20"/>
               </w:rPr>
-              <w:t>Staff proposed today in an earlier summary. Later venue corrections were followed by acceptance of a shorter summary that omitted the date. FormBridge did not carry that earlier proposal into its final value.</w:t>
+              <w:t>Staff proposed today before venue corrections. The later accepted summary omitted the date; the earlier proposal was not retained.</w:t>
             </w:r>
           </w:p>
         </w:tc>
@@ -4434,7 +4090,7 @@
                 <w:i w:val="0"/>
                 <w:sz w:val="20"/>
               </w:rPr>
-              <w:t>Staff proposed two guests before the customer changed date and venue. The final accepted summary repeated only the new date and venue. The final state did not retain the earlier proposed count.</w:t>
+              <w:t>Staff proposed two guests before date and venue changes. The accepted final summary omitted the count; it was not retained.</w:t>
             </w:r>
           </w:p>
         </w:tc>
@@ -4491,7 +4147,7 @@
                 <w:i w:val="0"/>
                 <w:sz w:val="20"/>
               </w:rPr>
-              <w:t>“the 5th of this month”; label includes “5th of this month”</w:t>
+              <w:t>“the 5th of this month”; label is “5th of this month”</w:t>
             </w:r>
           </w:p>
         </w:tc>
@@ -4517,7 +4173,7 @@
                 <w:i w:val="0"/>
                 <w:sz w:val="20"/>
               </w:rPr>
-              <w:t>The requested date is retained with a clarification status. The canonical matcher does not remove this leading article from a relative date, so it remains a scored mismatch.</w:t>
+              <w:t>The date is retained as uncertain. The matcher does not remove the leading article from this relative phrase.</w:t>
             </w:r>
           </w:p>
         </w:tc>
@@ -4539,7 +4195,7 @@
           <w:b w:val="0"/>
           <w:i w:val="0"/>
         </w:rPr>
-        <w:t>The date-expression mismatch contributes one of the three errors under the current scoring rule. A broader relative-date normaliser could recognise this equivalence. Its rules should be developed separately and then applied consistently to all methods, alongside the existing metric.</w:t>
+        <w:t>One mismatch is a text-equivalence issue. A broader relative-date normaliser should be developed separately, then applied to all methods alongside the existing metric.</w:t>
       </w:r>
     </w:p>
     <w:p>
@@ -4548,7 +4204,7 @@
           <w:b w:val="0"/>
           <w:i w:val="0"/>
         </w:rPr>
-        <w:t>The first two cases expose tension between dataset dialogue-state labels and conservative customer confirmation. They count as errors against the selected labels. The absence of an original model candidate in the saved trace prevents a complete separation of extraction and guard effects. A targeted replay with candidate logging would be needed for that diagnosis.</w:t>
+        <w:t>The first two cases concern acceptance across intervening corrections. They count as errors against the dataset labels. Their full-system traces do not retain the original model proposals, so those runs alone cannot separate extraction from validation errors.</w:t>
       </w:r>
     </w:p>
     <w:p>
@@ -4556,7 +4212,7 @@
         <w:pStyle w:val="Heading2"/>
       </w:pPr>
       <w:r>
-        <w:t>Why the baselines differ</w:t>
+        <w:t>What the controlled comparison reveals</w:t>
       </w:r>
     </w:p>
     <w:p>
@@ -4565,7 +4221,7 @@
           <w:b w:val="0"/>
           <w:i w:val="0"/>
         </w:rPr>
-        <w:t>The rules recognise full calendar dates, while these dataset dates are yearless or relative. Their zero date matches show that this simple baseline lacks the date coverage required by the dataset. Broader date parsing and a trained slot tagger would provide stronger comparisons.</w:t>
+        <w:t>The paired run retains original proposals. In 4_00080, validation rejected San Francisco when the customer quotation said “San Fran”. In 4_00089, two correct values were rejected because their citations omitted earlier customer support. In 1_00005, the proposed date cited a staff summary without the required customer acceptance. These four losses show how strict matching and incomplete citations can discard correct values despite useful information elsewhere in the transcript.</w:t>
       </w:r>
     </w:p>
     <w:p>
@@ -4574,7 +4230,7 @@
           <w:b w:val="0"/>
           <w:i w:val="0"/>
         </w:rPr>
-        <w:t>All eight of the direct model's date mismatches involved a relative-date phrase. In six cases it retained that phrase as a constraint while leaving the value empty. FormBridge can retain a phrase in the value while still requiring clarification. The field metric therefore partly rewards representation choices. A separate metric for constraint retention and approval readiness would assess this distinction more fairly.</w:t>
+        <w:t>Validation gained one match by retaining “Wednesday next week” as a value while keeping its uncertainty. That is a representation change, not newly recovered information. The whole-system result also partly reflects representation: six direct-model date mismatches retained the relative phrase only as a constraint. The constructed-case checks therefore assess uncertainty and approval separately from values.</w:t>
       </w:r>
     </w:p>
     <w:p>
@@ -4582,7 +4238,7 @@
         <w:pStyle w:val="Heading2"/>
       </w:pPr>
       <w:r>
-        <w:t>Problems resolved during development</w:t>
+        <w:t>Development lessons</w:t>
       </w:r>
     </w:p>
     <w:p>
@@ -4591,7 +4247,7 @@
           <w:b w:val="0"/>
           <w:i w:val="0"/>
         </w:rPr>
-        <w:t>Testing exposed negated cancellations clearing valid details, unsupported guest-count evidence, invalid corrections leaving stale approval, and retry controls disappearing after an error was dismissed. State and evidence checks were tightened, and recovery remains available. Later shared-workflow checks found stale writes, late replies appearing in another case, and guest corrections retaining a handed-off status. Version checks, request scoping and approval invalidation addressed these failures.</w:t>
+        <w:t>The rule baseline matched no dates because it recognises full calendar dates while this selection contains relative or yearless forms. A broader date parser and trained slot tagger would make stronger baselines. For FormBridge, the next improvement is to recover missing supporting messages and recognise valid aliases without accepting unsupported values.</w:t>
       </w:r>
     </w:p>
     <w:p>
@@ -4600,7 +4256,7 @@
           <w:b w:val="0"/>
           <w:i w:val="0"/>
         </w:rPr>
-        <w:t>The release also fixed dinner-hours question routing, lost quotations after refresh and the valid “Guests: 6” correction format. These corrections are supported by targeted tests and deployed workflow retests; they do not establish a zero-error rate.</w:t>
+        <w:t>Earlier tests exposed negated cancellations, stale approvals after invalid corrections, disappearing retry controls and late replies appearing in another case. Cancellation checks, approval invalidation, persistent recovery controls and request scoping addressed those failures. Targeted tests and deployed retests support these fixes, without establishing a zero-error rate.</w:t>
       </w:r>
     </w:p>
     <w:p>
@@ -4630,8 +4286,8 @@
       <w:r>
         <w:drawing>
           <wp:inline xmlns:a="http://schemas.openxmlformats.org/drawingml/2006/main" xmlns:pic="http://schemas.openxmlformats.org/drawingml/2006/picture">
-            <wp:extent cx="5303520" cy="2684907"/>
-            <wp:docPr id="4" name="Picture 4" descr="Guest-care suggestions with the original customer quotation and a separate acceptance button"/>
+            <wp:extent cx="4846320" cy="3411063"/>
+            <wp:docPr id="4" name="Picture 4" descr="The six-guest value with the original and corrected customer messages, followed by a request for an exact time"/>
             <wp:cNvGraphicFramePr>
               <a:graphicFrameLocks noChangeAspect="1"/>
             </wp:cNvGraphicFramePr>
@@ -4639,12 +4295,12 @@
               <a:graphicData uri="http://schemas.openxmlformats.org/drawingml/2006/picture">
                 <pic:pic>
                   <pic:nvPicPr>
-                    <pic:cNvPr id="0" name="FormBridge-guest-care.png"/>
+                    <pic:cNvPr id="0" name="FormBridge-core-workflow.jpg"/>
                     <pic:cNvPicPr/>
                   </pic:nvPicPr>
                   <pic:blipFill>
-                    <a:blip r:embed="rId14"/>
-                    <a:srcRect l="25000" r="25000" t="20833" b="34167"/>
+                    <a:blip r:embed="rId12"/>
+                    <a:srcRect l="55469" r="3906" t="55075" b="25872"/>
                     <a:stretch>
                       <a:fillRect/>
                     </a:stretch>
@@ -4652,7 +4308,7 @@
                   <pic:spPr>
                     <a:xfrm>
                       <a:off x="0" y="0"/>
-                      <a:ext cx="5303520" cy="2684907"/>
+                      <a:ext cx="4846320" cy="3411063"/>
                     </a:xfrm>
                     <a:prstGeom prst="rect"/>
                   </pic:spPr>
@@ -4672,7 +4328,7 @@
           <w:b w:val="0"/>
           <w:i w:val="0"/>
         </w:rPr>
-        <w:t>Figure 3. Detail from the live guest-care panel. Each suggestion displays the original customer quotation and a separate “Keep this request” action.</w:t>
+        <w:t>Figure 3. Enlarged source panel from Figure 1. Staff can read the original request and correction beside the six-guest value. The separate time question preserves the customer's “after 8 pm” preference.</w:t>
       </w:r>
     </w:p>
     <w:p>
@@ -4680,7 +4336,7 @@
         <w:pStyle w:val="Heading2"/>
       </w:pPr>
       <w:r>
-        <w:t>Making review practical</w:t>
+        <w:t>Eight tasks completed on the live application</w:t>
       </w:r>
     </w:p>
     <w:p>
@@ -4689,7 +4345,7 @@
           <w:b w:val="0"/>
           <w:i w:val="0"/>
         </w:rPr>
-        <w:t>Suggestions are optional and accepted individually. An allergy is recorded as the guest's request, not as a promise that the kitchen can accommodate it. A private review link lets the guest correct booking details without seeing the transcript or staff discussion. Clear distinctions between enquiry received, brief approved and simulated reservation prevent a reassuring interface from implying a real booking.</w:t>
+        <w:t>One structured walkthrough completed eight tasks: open a blank desk, add a complete enquiry, correct guests and time, inspect sources and history, propose a time, accept it, approve the brief, and edit an earlier message. All eight produced the expected visible state. History showed four guests becoming six and 7 pm becoming unresolved. A staff offer of 8:30 pm left approval blocked until the customer accepted. Editing the approved request then removed approval and rebuilt the affected count. Appendix F records the steps and history view.</w:t>
       </w:r>
     </w:p>
     <w:p>
@@ -4698,24 +4354,7 @@
           <w:b w:val="0"/>
           <w:i w:val="0"/>
         </w:rPr>
-        <w:t>The restaurant style uses cream surfaces, dark green navigation and serif headings. Primary actions remain consistent across the booking desk and team workspace. Mobile layouts stack the conversation and brief, while the team navigation adapts to the smaller screen. Keyboard checks cover dialog closing and focus return, including the embedded assistant.</w:t>
-      </w:r>
-    </w:p>
-    <w:p>
-      <w:pPr>
-        <w:pStyle w:val="Heading2"/>
-      </w:pPr>
-      <w:r>
-        <w:t>What remains unmeasured</w:t>
-      </w:r>
-    </w:p>
-    <w:p>
-      <w:r>
-        <w:rPr>
-          <w:b w:val="0"/>
-          <w:i w:val="0"/>
-        </w:rPr>
-        <w:t>Browser workflows show that the paths can be completed and that selected failure states recover. They do not measure how quickly a new staff member learns the interface, whether controls are discoverable or whether users make fewer mistakes. No participant satisfaction scores, accessibility certification or restaurant productivity improvement is claimed. Those questions require a separate user study.</w:t>
+        <w:t>Source inspection, visible changes and reversible editing make errors reviewable. Cream surfaces, dark green navigation and serif headings give the restaurant workspace a consistent identity; status text accompanies colour. The walkthrough establishes that these controls and transitions worked. It does not measure a new user's learning time, discoverability, satisfaction or restaurant productivity. No recruited participants were involved.</w:t>
       </w:r>
     </w:p>
     <w:p>
@@ -4733,23 +4372,7 @@
           <w:b w:val="0"/>
           <w:i w:val="0"/>
         </w:rPr>
-        <w:t xml:space="preserve">Verification covers the language safeguards, application routes, shared records and complete browser workflows. The final email-preview release, revision </w:t>
-      </w:r>
-      <w:r>
-        <w:rPr>
-          <w:rFonts w:ascii="Liberation Mono" w:hAnsi="Liberation Mono"/>
-          <w:b w:val="0"/>
-          <w:i w:val="0"/>
-          <w:sz w:val="19"/>
-        </w:rPr>
-        <w:t>b0d389e</w:t>
-      </w:r>
-      <w:r>
-        <w:rPr>
-          <w:b w:val="0"/>
-          <w:i w:val="0"/>
-        </w:rPr>
-        <w:t>, passed 230 automated tests across 27 files, TypeScript checking and the production build. The associated GitHub Actions run succeeded, and Vercel served that revision on the production address.</w:t>
+        <w:t>The released application passed 230 automated tests across 27 files, TypeScript checking and the production build. Separate production and browser records cover shared access, concurrency and complete workflows. Their original revisions are listed in Appendix C.</w:t>
       </w:r>
     </w:p>
     <w:p>
@@ -4771,11 +4394,18 @@
         <w:jc w:val="center"/>
         <w:tblLayout w:type="fixed"/>
         <w:tblLook w:firstColumn="1" w:firstRow="1" w:lastColumn="0" w:lastRow="0" w:noHBand="0" w:noVBand="1" w:val="04A0"/>
+        <w:tblBorders>
+          <w:top w:val="single" w:sz="4" w:color="D9D9D9"/>
+          <w:left w:val="single" w:sz="4" w:color="D9D9D9"/>
+          <w:bottom w:val="single" w:sz="4" w:color="D9D9D9"/>
+          <w:right w:val="single" w:sz="4" w:color="D9D9D9"/>
+          <w:insideH w:val="single" w:sz="4" w:color="D9D9D9"/>
+          <w:insideV w:val="single" w:sz="4" w:color="D9D9D9"/>
+        </w:tblBorders>
       </w:tblPr>
       <w:tblGrid>
-        <w:gridCol w:w="1872"/>
-        <w:gridCol w:w="4147"/>
-        <w:gridCol w:w="3697"/>
+        <w:gridCol w:w="2520"/>
+        <w:gridCol w:w="7197"/>
       </w:tblGrid>
       <w:tr>
         <w:trPr>
@@ -4784,7 +4414,7 @@
         </w:trPr>
         <w:tc>
           <w:tcPr>
-            <w:tcW w:type="dxa" w:w="1872"/>
+            <w:tcW w:type="dxa" w:w="2520"/>
             <w:vAlign w:val="center"/>
             <w:shd w:fill="333333"/>
             <w:tcMar>
@@ -4811,7 +4441,7 @@
         </w:tc>
         <w:tc>
           <w:tcPr>
-            <w:tcW w:type="dxa" w:w="4147"/>
+            <w:tcW w:type="dxa" w:w="7197"/>
             <w:vAlign w:val="center"/>
             <w:shd w:fill="333333"/>
             <w:tcMar>
@@ -4832,34 +4462,7 @@
                 <w:color w:val="FFFFFF"/>
                 <w:sz w:val="20"/>
               </w:rPr>
-              <w:t>Scope and result</w:t>
-            </w:r>
-          </w:p>
-        </w:tc>
-        <w:tc>
-          <w:tcPr>
-            <w:tcW w:type="dxa" w:w="3697"/>
-            <w:vAlign w:val="center"/>
-            <w:shd w:fill="333333"/>
-            <w:tcMar>
-              <w:top w:w="65" w:type="dxa"/>
-              <w:bottom w:w="65" w:type="dxa"/>
-              <w:left w:w="65" w:type="dxa"/>
-              <w:right w:w="65" w:type="dxa"/>
-            </w:tcMar>
-          </w:tcPr>
-          <w:p>
-            <w:pPr>
-              <w:spacing w:before="60" w:after="60" w:line="252" w:lineRule="auto"/>
-            </w:pPr>
-            <w:r>
-              <w:rPr>
-                <w:b/>
-                <w:i w:val="0"/>
-                <w:color w:val="FFFFFF"/>
-                <w:sz w:val="20"/>
-              </w:rPr>
-              <w:t>What it establishes</w:t>
+              <w:t>Result and scope</w:t>
             </w:r>
           </w:p>
         </w:tc>
@@ -4870,7 +4473,7 @@
         </w:trPr>
         <w:tc>
           <w:tcPr>
-            <w:tcW w:type="dxa" w:w="1872"/>
+            <w:tcW w:type="dxa" w:w="2520"/>
             <w:vAlign w:val="center"/>
             <w:shd w:fill="F3F3F1"/>
             <w:tcMar>
@@ -4896,7 +4499,7 @@
         </w:tc>
         <w:tc>
           <w:tcPr>
-            <w:tcW w:type="dxa" w:w="4147"/>
+            <w:tcW w:type="dxa" w:w="7197"/>
             <w:vAlign w:val="center"/>
             <w:shd w:fill="F3F3F1"/>
             <w:tcMar>
@@ -4916,33 +4519,7 @@
                 <w:i w:val="0"/>
                 <w:sz w:val="20"/>
               </w:rPr>
-              <w:t>230 passed; state, evidence, dates, input limits, request scoping and email-preview transitions</w:t>
-            </w:r>
-          </w:p>
-        </w:tc>
-        <w:tc>
-          <w:tcPr>
-            <w:tcW w:type="dxa" w:w="3697"/>
-            <w:vAlign w:val="center"/>
-            <w:shd w:fill="F3F3F1"/>
-            <w:tcMar>
-              <w:top w:w="65" w:type="dxa"/>
-              <w:bottom w:w="65" w:type="dxa"/>
-              <w:left w:w="65" w:type="dxa"/>
-              <w:right w:w="65" w:type="dxa"/>
-            </w:tcMar>
-          </w:tcPr>
-          <w:p>
-            <w:pPr>
-              <w:spacing w:before="60" w:after="60" w:line="252" w:lineRule="auto"/>
-            </w:pPr>
-            <w:r>
-              <w:rPr>
-                <w:b w:val="0"/>
-                <w:i w:val="0"/>
-                <w:sz w:val="20"/>
-              </w:rPr>
-              <w:t>Expected behaviour for the tested inputs and mocks</w:t>
+              <w:t>230 passed: state, evidence, dates, input limits, request scoping and email-preview transitions</w:t>
             </w:r>
           </w:p>
         </w:tc>
@@ -4953,7 +4530,7 @@
         </w:trPr>
         <w:tc>
           <w:tcPr>
-            <w:tcW w:type="dxa" w:w="1872"/>
+            <w:tcW w:type="dxa" w:w="2520"/>
             <w:vAlign w:val="center"/>
             <w:shd w:fill="FFFFFF"/>
             <w:tcMar>
@@ -4979,7 +4556,7 @@
         </w:tc>
         <w:tc>
           <w:tcPr>
-            <w:tcW w:type="dxa" w:w="4147"/>
+            <w:tcW w:type="dxa" w:w="7197"/>
             <w:vAlign w:val="center"/>
             <w:shd w:fill="FFFFFF"/>
             <w:tcMar>
@@ -4999,33 +4576,7 @@
                 <w:i w:val="0"/>
                 <w:sz w:val="20"/>
               </w:rPr>
-              <w:t>31/31 passed using real Supabase identities, permissions, functions and application routes</w:t>
-            </w:r>
-          </w:p>
-        </w:tc>
-        <w:tc>
-          <w:tcPr>
-            <w:tcW w:type="dxa" w:w="3697"/>
-            <w:vAlign w:val="center"/>
-            <w:shd w:fill="FFFFFF"/>
-            <w:tcMar>
-              <w:top w:w="65" w:type="dxa"/>
-              <w:bottom w:w="65" w:type="dxa"/>
-              <w:left w:w="65" w:type="dxa"/>
-              <w:right w:w="65" w:type="dxa"/>
-            </w:tcMar>
-          </w:tcPr>
-          <w:p>
-            <w:pPr>
-              <w:spacing w:before="60" w:after="60" w:line="252" w:lineRule="auto"/>
-            </w:pPr>
-            <w:r>
-              <w:rPr>
-                <w:b w:val="0"/>
-                <w:i w:val="0"/>
-                <w:sz w:val="20"/>
-              </w:rPr>
-              <w:t>Selected access, concurrency and workflow boundaries work against the deployed backend</w:t>
+              <w:t>31/31 checks passed with real Supabase identities, permissions, shared records and routes</w:t>
             </w:r>
           </w:p>
         </w:tc>
@@ -5036,7 +4587,7 @@
         </w:trPr>
         <w:tc>
           <w:tcPr>
-            <w:tcW w:type="dxa" w:w="1872"/>
+            <w:tcW w:type="dxa" w:w="2520"/>
             <w:vAlign w:val="center"/>
             <w:shd w:fill="F3F3F1"/>
             <w:tcMar>
@@ -5062,7 +4613,7 @@
         </w:tc>
         <w:tc>
           <w:tcPr>
-            <w:tcW w:type="dxa" w:w="4147"/>
+            <w:tcW w:type="dxa" w:w="7197"/>
             <w:vAlign w:val="center"/>
             <w:shd w:fill="F3F3F1"/>
             <w:tcMar>
@@ -5082,33 +4633,7 @@
                 <w:i w:val="0"/>
                 <w:sz w:val="20"/>
               </w:rPr>
-              <w:t>22 recorded workflows, plus overlapping edge checks</w:t>
-            </w:r>
-          </w:p>
-        </w:tc>
-        <w:tc>
-          <w:tcPr>
-            <w:tcW w:type="dxa" w:w="3697"/>
-            <w:vAlign w:val="center"/>
-            <w:shd w:fill="F3F3F1"/>
-            <w:tcMar>
-              <w:top w:w="65" w:type="dxa"/>
-              <w:bottom w:w="65" w:type="dxa"/>
-              <w:left w:w="65" w:type="dxa"/>
-              <w:right w:w="65" w:type="dxa"/>
-            </w:tcMar>
-          </w:tcPr>
-          <w:p>
-            <w:pPr>
-              <w:spacing w:before="60" w:after="60" w:line="252" w:lineRule="auto"/>
-            </w:pPr>
-            <w:r>
-              <w:rPr>
-                <w:b w:val="0"/>
-                <w:i w:val="0"/>
-                <w:sz w:val="20"/>
-              </w:rPr>
-              <w:t>Intake, consent, care, review, corrections, team work, widget and simulated handoff paths can be completed</w:t>
+              <w:t>22 recorded workflows: intake, consent, care, review, team work, widget and simulated handoff</w:t>
             </w:r>
           </w:p>
         </w:tc>
@@ -5119,7 +4644,7 @@
         </w:trPr>
         <w:tc>
           <w:tcPr>
-            <w:tcW w:type="dxa" w:w="1872"/>
+            <w:tcW w:type="dxa" w:w="2520"/>
             <w:vAlign w:val="center"/>
             <w:shd w:fill="FFFFFF"/>
             <w:tcMar>
@@ -5145,7 +4670,7 @@
         </w:tc>
         <w:tc>
           <w:tcPr>
-            <w:tcW w:type="dxa" w:w="4147"/>
+            <w:tcW w:type="dxa" w:w="7197"/>
             <w:vAlign w:val="center"/>
             <w:shd w:fill="FFFFFF"/>
             <w:tcMar>
@@ -5165,13 +4690,260 @@
                 <w:i w:val="0"/>
                 <w:sz w:val="20"/>
               </w:rPr>
-              <w:t>Local full cycle and deployed signup, verification, sign-in, recovery and reset</w:t>
+              <w:t>Local and deployed account flows completed; no real mail or production account created</w:t>
+            </w:r>
+          </w:p>
+        </w:tc>
+      </w:tr>
+    </w:tbl>
+    <w:p>
+      <w:pPr>
+        <w:spacing w:after="0" w:line="240" w:lineRule="auto" w:before="0"/>
+      </w:pPr>
+      <w:r>
+        <w:rPr>
+          <w:sz w:val="4"/>
+        </w:rPr>
+      </w:r>
+    </w:p>
+    <w:p>
+      <w:r>
+        <w:rPr>
+          <w:b w:val="0"/>
+          <w:i w:val="0"/>
+        </w:rPr>
+        <w:t>The later email-preview release did not alter the previously checked restaurant extraction or backend paths. Counts are reported separately because the checks overlap.</w:t>
+      </w:r>
+    </w:p>
+    <w:p>
+      <w:pPr>
+        <w:pStyle w:val="Heading2"/>
+      </w:pPr>
+      <w:r>
+        <w:t>Source, uncertainty and clarification checks</w:t>
+      </w:r>
+    </w:p>
+    <w:p>
+      <w:r>
+        <w:rPr>
+          <w:b w:val="0"/>
+          <w:i w:val="0"/>
+        </w:rPr>
+        <w:t>All 20 constructed conversations completed with the expected field values and statuses: 100/100 checks for each. There were 20 OpenAI requests and no final failures. The feature-specific results were:</w:t>
+      </w:r>
+    </w:p>
+    <w:p>
+      <w:pPr>
+        <w:pStyle w:val="Caption"/>
+        <w:keepNext/>
+      </w:pPr>
+      <w:r>
+        <w:rPr>
+          <w:b w:val="0"/>
+          <w:i w:val="0"/>
+        </w:rPr>
+        <w:t>Table 7. Feature checks on constructed conversations.</w:t>
+      </w:r>
+    </w:p>
+    <w:tbl>
+      <w:tblPr>
+        <w:tblW w:type="auto" w:w="0"/>
+        <w:jc w:val="center"/>
+        <w:tblLayout w:type="fixed"/>
+        <w:tblLook w:firstColumn="1" w:firstRow="1" w:lastColumn="0" w:lastRow="0" w:noHBand="0" w:noVBand="1" w:val="04A0"/>
+        <w:tblBorders>
+          <w:top w:val="single" w:sz="4" w:color="D9D9D9"/>
+          <w:left w:val="single" w:sz="4" w:color="D9D9D9"/>
+          <w:bottom w:val="single" w:sz="4" w:color="D9D9D9"/>
+          <w:right w:val="single" w:sz="4" w:color="D9D9D9"/>
+          <w:insideH w:val="single" w:sz="4" w:color="D9D9D9"/>
+          <w:insideV w:val="single" w:sz="4" w:color="D9D9D9"/>
+        </w:tblBorders>
+      </w:tblPr>
+      <w:tblGrid>
+        <w:gridCol w:w="2304"/>
+        <w:gridCol w:w="2045"/>
+        <w:gridCol w:w="5368"/>
+      </w:tblGrid>
+      <w:tr>
+        <w:trPr>
+          <w:cantSplit/>
+          <w:tblHeader/>
+        </w:trPr>
+        <w:tc>
+          <w:tcPr>
+            <w:tcW w:type="dxa" w:w="2304"/>
+            <w:vAlign w:val="center"/>
+            <w:shd w:fill="333333"/>
+            <w:tcMar>
+              <w:top w:w="65" w:type="dxa"/>
+              <w:bottom w:w="65" w:type="dxa"/>
+              <w:left w:w="65" w:type="dxa"/>
+              <w:right w:w="65" w:type="dxa"/>
+            </w:tcMar>
+          </w:tcPr>
+          <w:p>
+            <w:pPr>
+              <w:spacing w:before="60" w:after="60" w:line="252" w:lineRule="auto"/>
+            </w:pPr>
+            <w:r>
+              <w:rPr>
+                <w:b/>
+                <w:i w:val="0"/>
+                <w:color w:val="FFFFFF"/>
+                <w:sz w:val="20"/>
+              </w:rPr>
+              <w:t>Check</w:t>
             </w:r>
           </w:p>
         </w:tc>
         <w:tc>
           <w:tcPr>
-            <w:tcW w:type="dxa" w:w="3697"/>
+            <w:tcW w:type="dxa" w:w="2045"/>
+            <w:vAlign w:val="center"/>
+            <w:shd w:fill="333333"/>
+            <w:tcMar>
+              <w:top w:w="65" w:type="dxa"/>
+              <w:bottom w:w="65" w:type="dxa"/>
+              <w:left w:w="65" w:type="dxa"/>
+              <w:right w:w="65" w:type="dxa"/>
+            </w:tcMar>
+          </w:tcPr>
+          <w:p>
+            <w:pPr>
+              <w:spacing w:before="60" w:after="60" w:line="252" w:lineRule="auto"/>
+              <w:jc w:val="center"/>
+            </w:pPr>
+            <w:r>
+              <w:rPr>
+                <w:b/>
+                <w:i w:val="0"/>
+                <w:color w:val="FFFFFF"/>
+                <w:sz w:val="20"/>
+              </w:rPr>
+              <w:t>Matched</w:t>
+            </w:r>
+          </w:p>
+        </w:tc>
+        <w:tc>
+          <w:tcPr>
+            <w:tcW w:type="dxa" w:w="5368"/>
+            <w:vAlign w:val="center"/>
+            <w:shd w:fill="333333"/>
+            <w:tcMar>
+              <w:top w:w="65" w:type="dxa"/>
+              <w:bottom w:w="65" w:type="dxa"/>
+              <w:left w:w="65" w:type="dxa"/>
+              <w:right w:w="65" w:type="dxa"/>
+            </w:tcMar>
+          </w:tcPr>
+          <w:p>
+            <w:pPr>
+              <w:spacing w:before="60" w:after="60" w:line="252" w:lineRule="auto"/>
+            </w:pPr>
+            <w:r>
+              <w:rPr>
+                <w:b/>
+                <w:i w:val="0"/>
+                <w:color w:val="FFFFFF"/>
+                <w:sz w:val="20"/>
+              </w:rPr>
+              <w:t>Meaning</w:t>
+            </w:r>
+          </w:p>
+        </w:tc>
+      </w:tr>
+      <w:tr>
+        <w:trPr>
+          <w:cantSplit/>
+        </w:trPr>
+        <w:tc>
+          <w:tcPr>
+            <w:tcW w:type="dxa" w:w="2304"/>
+            <w:vAlign w:val="center"/>
+            <w:shd w:fill="F3F3F1"/>
+            <w:tcMar>
+              <w:top w:w="65" w:type="dxa"/>
+              <w:bottom w:w="65" w:type="dxa"/>
+              <w:left w:w="65" w:type="dxa"/>
+              <w:right w:w="65" w:type="dxa"/>
+            </w:tcMar>
+          </w:tcPr>
+          <w:p>
+            <w:pPr>
+              <w:spacing w:before="60" w:after="60" w:line="252" w:lineRule="auto"/>
+            </w:pPr>
+            <w:r>
+              <w:rPr>
+                <w:b w:val="0"/>
+                <w:i w:val="0"/>
+                <w:sz w:val="20"/>
+              </w:rPr>
+              <w:t>Required source messages</w:t>
+            </w:r>
+          </w:p>
+        </w:tc>
+        <w:tc>
+          <w:tcPr>
+            <w:tcW w:type="dxa" w:w="2045"/>
+            <w:vAlign w:val="center"/>
+            <w:shd w:fill="F3F3F1"/>
+            <w:tcMar>
+              <w:top w:w="65" w:type="dxa"/>
+              <w:bottom w:w="65" w:type="dxa"/>
+              <w:left w:w="65" w:type="dxa"/>
+              <w:right w:w="65" w:type="dxa"/>
+            </w:tcMar>
+          </w:tcPr>
+          <w:p>
+            <w:pPr>
+              <w:spacing w:before="60" w:after="60" w:line="252" w:lineRule="auto"/>
+              <w:jc w:val="center"/>
+            </w:pPr>
+            <w:r>
+              <w:rPr>
+                <w:b w:val="0"/>
+                <w:i w:val="0"/>
+                <w:sz w:val="20"/>
+              </w:rPr>
+              <w:t>93/93 populated fields</w:t>
+            </w:r>
+          </w:p>
+        </w:tc>
+        <w:tc>
+          <w:tcPr>
+            <w:tcW w:type="dxa" w:w="5368"/>
+            <w:vAlign w:val="center"/>
+            <w:shd w:fill="F3F3F1"/>
+            <w:tcMar>
+              <w:top w:w="65" w:type="dxa"/>
+              <w:bottom w:w="65" w:type="dxa"/>
+              <w:left w:w="65" w:type="dxa"/>
+              <w:right w:w="65" w:type="dxa"/>
+            </w:tcMar>
+          </w:tcPr>
+          <w:p>
+            <w:pPr>
+              <w:spacing w:before="60" w:after="60" w:line="252" w:lineRule="auto"/>
+            </w:pPr>
+            <w:r>
+              <w:rPr>
+                <w:b w:val="0"/>
+                <w:i w:val="0"/>
+                <w:sz w:val="20"/>
+              </w:rPr>
+              <w:t>Correct content included its prelabelled supporting-message combination</w:t>
+            </w:r>
+          </w:p>
+        </w:tc>
+      </w:tr>
+      <w:tr>
+        <w:trPr>
+          <w:cantSplit/>
+        </w:trPr>
+        <w:tc>
+          <w:tcPr>
+            <w:tcW w:type="dxa" w:w="2304"/>
             <w:vAlign w:val="center"/>
             <w:shd w:fill="FFFFFF"/>
             <w:tcMar>
@@ -5191,7 +4963,312 @@
                 <w:i w:val="0"/>
                 <w:sz w:val="20"/>
               </w:rPr>
-              <w:t>The isolated simulation works; it does not send real mail or create a production account</w:t>
+              <w:t>Uncertainty retained</w:t>
+            </w:r>
+          </w:p>
+        </w:tc>
+        <w:tc>
+          <w:tcPr>
+            <w:tcW w:type="dxa" w:w="2045"/>
+            <w:vAlign w:val="center"/>
+            <w:shd w:fill="FFFFFF"/>
+            <w:tcMar>
+              <w:top w:w="65" w:type="dxa"/>
+              <w:bottom w:w="65" w:type="dxa"/>
+              <w:left w:w="65" w:type="dxa"/>
+              <w:right w:w="65" w:type="dxa"/>
+            </w:tcMar>
+          </w:tcPr>
+          <w:p>
+            <w:pPr>
+              <w:spacing w:before="60" w:after="60" w:line="252" w:lineRule="auto"/>
+              <w:jc w:val="center"/>
+            </w:pPr>
+            <w:r>
+              <w:rPr>
+                <w:b w:val="0"/>
+                <w:i w:val="0"/>
+                <w:sz w:val="20"/>
+              </w:rPr>
+              <w:t>7/7 uncertain fields</w:t>
+            </w:r>
+          </w:p>
+        </w:tc>
+        <w:tc>
+          <w:tcPr>
+            <w:tcW w:type="dxa" w:w="5368"/>
+            <w:vAlign w:val="center"/>
+            <w:shd w:fill="FFFFFF"/>
+            <w:tcMar>
+              <w:top w:w="65" w:type="dxa"/>
+              <w:bottom w:w="65" w:type="dxa"/>
+              <w:left w:w="65" w:type="dxa"/>
+              <w:right w:w="65" w:type="dxa"/>
+            </w:tcMar>
+          </w:tcPr>
+          <w:p>
+            <w:pPr>
+              <w:spacing w:before="60" w:after="60" w:line="252" w:lineRule="auto"/>
+            </w:pPr>
+            <w:r>
+              <w:rPr>
+                <w:b w:val="0"/>
+                <w:i w:val="0"/>
+                <w:sz w:val="20"/>
+              </w:rPr>
+              <w:t>Expected status, value and constraint were preserved</w:t>
+            </w:r>
+          </w:p>
+        </w:tc>
+      </w:tr>
+      <w:tr>
+        <w:trPr>
+          <w:cantSplit/>
+        </w:trPr>
+        <w:tc>
+          <w:tcPr>
+            <w:tcW w:type="dxa" w:w="2304"/>
+            <w:vAlign w:val="center"/>
+            <w:shd w:fill="F3F3F1"/>
+            <w:tcMar>
+              <w:top w:w="65" w:type="dxa"/>
+              <w:bottom w:w="65" w:type="dxa"/>
+              <w:left w:w="65" w:type="dxa"/>
+              <w:right w:w="65" w:type="dxa"/>
+            </w:tcMar>
+          </w:tcPr>
+          <w:p>
+            <w:pPr>
+              <w:spacing w:before="60" w:after="60" w:line="252" w:lineRule="auto"/>
+            </w:pPr>
+            <w:r>
+              <w:rPr>
+                <w:b w:val="0"/>
+                <w:i w:val="0"/>
+                <w:sz w:val="20"/>
+              </w:rPr>
+              <w:t>Clarification target</w:t>
+            </w:r>
+          </w:p>
+        </w:tc>
+        <w:tc>
+          <w:tcPr>
+            <w:tcW w:type="dxa" w:w="2045"/>
+            <w:vAlign w:val="center"/>
+            <w:shd w:fill="F3F3F1"/>
+            <w:tcMar>
+              <w:top w:w="65" w:type="dxa"/>
+              <w:bottom w:w="65" w:type="dxa"/>
+              <w:left w:w="65" w:type="dxa"/>
+              <w:right w:w="65" w:type="dxa"/>
+            </w:tcMar>
+          </w:tcPr>
+          <w:p>
+            <w:pPr>
+              <w:spacing w:before="60" w:after="60" w:line="252" w:lineRule="auto"/>
+              <w:jc w:val="center"/>
+            </w:pPr>
+            <w:r>
+              <w:rPr>
+                <w:b w:val="0"/>
+                <w:i w:val="0"/>
+                <w:sz w:val="20"/>
+              </w:rPr>
+              <w:t>9/9 required questions</w:t>
+            </w:r>
+          </w:p>
+        </w:tc>
+        <w:tc>
+          <w:tcPr>
+            <w:tcW w:type="dxa" w:w="5368"/>
+            <w:vAlign w:val="center"/>
+            <w:shd w:fill="F3F3F1"/>
+            <w:tcMar>
+              <w:top w:w="65" w:type="dxa"/>
+              <w:bottom w:w="65" w:type="dxa"/>
+              <w:left w:w="65" w:type="dxa"/>
+              <w:right w:w="65" w:type="dxa"/>
+            </w:tcMar>
+          </w:tcPr>
+          <w:p>
+            <w:pPr>
+              <w:spacing w:before="60" w:after="60" w:line="252" w:lineRule="auto"/>
+            </w:pPr>
+            <w:r>
+              <w:rPr>
+                <w:b w:val="0"/>
+                <w:i w:val="0"/>
+                <w:sz w:val="20"/>
+              </w:rPr>
+              <w:t>Each question addressed the expected unresolved detail</w:t>
+            </w:r>
+          </w:p>
+        </w:tc>
+      </w:tr>
+      <w:tr>
+        <w:trPr>
+          <w:cantSplit/>
+        </w:trPr>
+        <w:tc>
+          <w:tcPr>
+            <w:tcW w:type="dxa" w:w="2304"/>
+            <w:vAlign w:val="center"/>
+            <w:shd w:fill="FFFFFF"/>
+            <w:tcMar>
+              <w:top w:w="65" w:type="dxa"/>
+              <w:bottom w:w="65" w:type="dxa"/>
+              <w:left w:w="65" w:type="dxa"/>
+              <w:right w:w="65" w:type="dxa"/>
+            </w:tcMar>
+          </w:tcPr>
+          <w:p>
+            <w:pPr>
+              <w:spacing w:before="60" w:after="60" w:line="252" w:lineRule="auto"/>
+            </w:pPr>
+            <w:r>
+              <w:rPr>
+                <w:b w:val="0"/>
+                <w:i w:val="0"/>
+                <w:sz w:val="20"/>
+              </w:rPr>
+              <w:t>Ask or remain silent</w:t>
+            </w:r>
+          </w:p>
+        </w:tc>
+        <w:tc>
+          <w:tcPr>
+            <w:tcW w:type="dxa" w:w="2045"/>
+            <w:vAlign w:val="center"/>
+            <w:shd w:fill="FFFFFF"/>
+            <w:tcMar>
+              <w:top w:w="65" w:type="dxa"/>
+              <w:bottom w:w="65" w:type="dxa"/>
+              <w:left w:w="65" w:type="dxa"/>
+              <w:right w:w="65" w:type="dxa"/>
+            </w:tcMar>
+          </w:tcPr>
+          <w:p>
+            <w:pPr>
+              <w:spacing w:before="60" w:after="60" w:line="252" w:lineRule="auto"/>
+              <w:jc w:val="center"/>
+            </w:pPr>
+            <w:r>
+              <w:rPr>
+                <w:b w:val="0"/>
+                <w:i w:val="0"/>
+                <w:sz w:val="20"/>
+              </w:rPr>
+              <w:t>20/20 cases</w:t>
+            </w:r>
+          </w:p>
+        </w:tc>
+        <w:tc>
+          <w:tcPr>
+            <w:tcW w:type="dxa" w:w="5368"/>
+            <w:vAlign w:val="center"/>
+            <w:shd w:fill="FFFFFF"/>
+            <w:tcMar>
+              <w:top w:w="65" w:type="dxa"/>
+              <w:bottom w:w="65" w:type="dxa"/>
+              <w:left w:w="65" w:type="dxa"/>
+              <w:right w:w="65" w:type="dxa"/>
+            </w:tcMar>
+          </w:tcPr>
+          <w:p>
+            <w:pPr>
+              <w:spacing w:before="60" w:after="60" w:line="252" w:lineRule="auto"/>
+            </w:pPr>
+            <w:r>
+              <w:rPr>
+                <w:b w:val="0"/>
+                <w:i w:val="0"/>
+                <w:sz w:val="20"/>
+              </w:rPr>
+              <w:t>Missing details triggered questions; complete or cancelled requests did not</w:t>
+            </w:r>
+          </w:p>
+        </w:tc>
+      </w:tr>
+      <w:tr>
+        <w:trPr>
+          <w:cantSplit/>
+        </w:trPr>
+        <w:tc>
+          <w:tcPr>
+            <w:tcW w:type="dxa" w:w="2304"/>
+            <w:vAlign w:val="center"/>
+            <w:shd w:fill="F3F3F1"/>
+            <w:tcMar>
+              <w:top w:w="65" w:type="dxa"/>
+              <w:bottom w:w="65" w:type="dxa"/>
+              <w:left w:w="65" w:type="dxa"/>
+              <w:right w:w="65" w:type="dxa"/>
+            </w:tcMar>
+          </w:tcPr>
+          <w:p>
+            <w:pPr>
+              <w:spacing w:before="60" w:after="60" w:line="252" w:lineRule="auto"/>
+            </w:pPr>
+            <w:r>
+              <w:rPr>
+                <w:b w:val="0"/>
+                <w:i w:val="0"/>
+                <w:sz w:val="20"/>
+              </w:rPr>
+              <w:t>Approval eligibility</w:t>
+            </w:r>
+          </w:p>
+        </w:tc>
+        <w:tc>
+          <w:tcPr>
+            <w:tcW w:type="dxa" w:w="2045"/>
+            <w:vAlign w:val="center"/>
+            <w:shd w:fill="F3F3F1"/>
+            <w:tcMar>
+              <w:top w:w="65" w:type="dxa"/>
+              <w:bottom w:w="65" w:type="dxa"/>
+              <w:left w:w="65" w:type="dxa"/>
+              <w:right w:w="65" w:type="dxa"/>
+            </w:tcMar>
+          </w:tcPr>
+          <w:p>
+            <w:pPr>
+              <w:spacing w:before="60" w:after="60" w:line="252" w:lineRule="auto"/>
+              <w:jc w:val="center"/>
+            </w:pPr>
+            <w:r>
+              <w:rPr>
+                <w:b w:val="0"/>
+                <w:i w:val="0"/>
+                <w:sz w:val="20"/>
+              </w:rPr>
+              <w:t>20/20 cases</w:t>
+            </w:r>
+          </w:p>
+        </w:tc>
+        <w:tc>
+          <w:tcPr>
+            <w:tcW w:type="dxa" w:w="5368"/>
+            <w:vAlign w:val="center"/>
+            <w:shd w:fill="F3F3F1"/>
+            <w:tcMar>
+              <w:top w:w="65" w:type="dxa"/>
+              <w:bottom w:w="65" w:type="dxa"/>
+              <w:left w:w="65" w:type="dxa"/>
+              <w:right w:w="65" w:type="dxa"/>
+            </w:tcMar>
+          </w:tcPr>
+          <w:p>
+            <w:pPr>
+              <w:spacing w:before="60" w:after="60" w:line="252" w:lineRule="auto"/>
+            </w:pPr>
+            <w:r>
+              <w:rPr>
+                <w:b w:val="0"/>
+                <w:i w:val="0"/>
+                <w:sz w:val="20"/>
+              </w:rPr>
+              <w:t>Approval matched the expected complete, incomplete or cancelled state</w:t>
             </w:r>
           </w:p>
         </w:tc>
@@ -5213,88 +5290,16 @@
           <w:b w:val="0"/>
           <w:i w:val="0"/>
         </w:rPr>
-        <w:t xml:space="preserve">The backend checks were recorded on </w:t>
-      </w:r>
-      <w:r>
-        <w:rPr>
-          <w:rFonts w:ascii="Liberation Mono" w:hAnsi="Liberation Mono"/>
-          <w:b w:val="0"/>
-          <w:i w:val="0"/>
-          <w:sz w:val="19"/>
-        </w:rPr>
-        <w:t>0b25ba8</w:t>
-      </w:r>
+        <w:t>Source coverage does not score every extra quotation or independently judge wording. Clarification checks identify the requested field, not how helpful a person finds the question. These are constructed functional tests, separate from SGD accuracy and participant research.</w:t>
+      </w:r>
+    </w:p>
+    <w:p>
       <w:r>
         <w:rPr>
           <w:b w:val="0"/>
           <w:i w:val="0"/>
         </w:rPr>
-        <w:t xml:space="preserve">; the restaurant browser record identifies </w:t>
-      </w:r>
-      <w:r>
-        <w:rPr>
-          <w:rFonts w:ascii="Liberation Mono" w:hAnsi="Liberation Mono"/>
-          <w:b w:val="0"/>
-          <w:i w:val="0"/>
-          <w:sz w:val="19"/>
-        </w:rPr>
-        <w:t>ddf8acd</w:t>
-      </w:r>
-      <w:r>
-        <w:rPr>
-          <w:b w:val="0"/>
-          <w:i w:val="0"/>
-        </w:rPr>
-        <w:t>. The later email-preview release adds an isolated route and a team-dialog link. It does not change the backend or restaurant extraction code covered by those records. The checks are reported separately with their original revisions because their coverage overlaps.</w:t>
-      </w:r>
-    </w:p>
-    <w:p>
-      <w:pPr>
-        <w:pStyle w:val="Heading2"/>
-      </w:pPr>
-      <w:r>
-        <w:t>Checks that matter to the workflow</w:t>
-      </w:r>
-    </w:p>
-    <w:p>
-      <w:r>
-        <w:rPr>
-          <w:b w:val="0"/>
-          <w:i w:val="0"/>
-        </w:rPr>
-        <w:t>Unauthenticated and cross-workspace access was rejected. Staff could not publish restaurant facts, change connector settings or promote their own role. Stale edits returned conflicts, and assignment to a non-member was rejected. Guest review snapshots omitted contact details, internal comments and full transcripts; invalid and revoked links revealed no snapshot.</w:t>
-      </w:r>
-    </w:p>
-    <w:p>
-      <w:r>
-        <w:rPr>
-          <w:b w:val="0"/>
-          <w:i w:val="0"/>
-        </w:rPr>
-        <w:t xml:space="preserve">Duplicate incoming messages and reply retries did not create duplicate records. Simulated reservation handoff required a current approved brief, and provider failure preserved the enquiry. A correction after handoff removed approval, reopened </w:t>
-      </w:r>
-      <w:r>
-        <w:rPr>
-          <w:b/>
-          <w:i w:val="0"/>
-        </w:rPr>
-        <w:t>Needs reply</w:t>
-      </w:r>
-      <w:r>
-        <w:rPr>
-          <w:b w:val="0"/>
-          <w:i w:val="0"/>
-        </w:rPr>
-        <w:t>, and changed five guests to six without changing date or time. These checks cover the decisions and state changes within the workflow.</w:t>
-      </w:r>
-    </w:p>
-    <w:p>
-      <w:r>
-        <w:rPr>
-          <w:b w:val="0"/>
-          <w:i w:val="0"/>
-        </w:rPr>
-        <w:t>Desktop inspection used 1280 × 720; the restaurant desk also used 437 × 827 without horizontal overflow. The email preview was checked at 390 pixels wide. These observations cover selected layouts, not every browser or assistive technology. Voice input has automated format and duration checks; this report does not claim a multilingual speech-accuracy study.</w:t>
+        <w:t>Production checks also rejected cross-team access and stale edits, protected private review data and preserved enquiries after simulated provider failures. Selected desktop and mobile layouts showed no horizontal overflow. Keyboard checks covered dialog closing and focus return. These observations do not certify every browser or assistive technology.</w:t>
       </w:r>
     </w:p>
     <w:p>
@@ -5397,7 +5402,7 @@
           <w:b w:val="0"/>
           <w:i w:val="0"/>
         </w:rPr>
-        <w:t>The evaluated domain is English restaurant enquiries. Twenty inspected dialogues per selection, one current run and hosted model aliases do not support broad accuracy or statistical superiority claims. Field matching does not independently measure quotation relevance, clarification usefulness or safe approval. Public-data pretraining contamination is unknown.</w:t>
+        <w:t>The evaluated domain is English restaurant enquiries. Twenty inspected dialogues per selection, one current run and hosted model aliases do not support broad accuracy or statistical superiority claims. Constructed cases measure supporting-message coverage, uncertainty and approval decisions, but provide no independent rating of every quotation or of clarification usefulness. The paired experiment exposes validation losses on realistic dataset conversations. Public-data pretraining contamination is unknown.</w:t>
       </w:r>
     </w:p>
     <w:p>
@@ -5454,7 +5459,7 @@
           <w:b w:val="0"/>
           <w:i w:val="0"/>
         </w:rPr>
-        <w:t>Table 7. Project phases and outputs.</w:t>
+        <w:t>Table 8. Project phases and outputs.</w:t>
       </w:r>
     </w:p>
     <w:tbl>
@@ -5463,6 +5468,14 @@
         <w:jc w:val="center"/>
         <w:tblLayout w:type="fixed"/>
         <w:tblLook w:firstColumn="1" w:firstRow="1" w:lastColumn="0" w:lastRow="0" w:noHBand="0" w:noVBand="1" w:val="04A0"/>
+        <w:tblBorders>
+          <w:top w:val="single" w:sz="4" w:color="D9D9D9"/>
+          <w:left w:val="single" w:sz="4" w:color="D9D9D9"/>
+          <w:bottom w:val="single" w:sz="4" w:color="D9D9D9"/>
+          <w:right w:val="single" w:sz="4" w:color="D9D9D9"/>
+          <w:insideH w:val="single" w:sz="4" w:color="D9D9D9"/>
+          <w:insideV w:val="single" w:sz="4" w:color="D9D9D9"/>
+        </w:tblBorders>
       </w:tblPr>
       <w:tblGrid>
         <w:gridCol w:w="3168"/>
@@ -5883,14 +5896,14 @@
           <w:b/>
           <w:i w:val="0"/>
         </w:rPr>
-        <w:t>Strengthen evaluation.</w:t>
+        <w:t>Improve evidence handling and evaluation.</w:t>
       </w:r>
       <w:r>
         <w:rPr>
           <w:b w:val="0"/>
           <w:i w:val="0"/>
         </w:rPr>
-        <w:t xml:space="preserve"> Reserve an independent sample before tuning. Measure evidence, constraints, clarification and approval separately. Improve the rule baseline and compare systems with equal models and call budgets.</w:t>
+        <w:t xml:space="preserve"> Address the alias and missing-citation failures from the paired test. Reserve independent data before tuning, use a second annotator for source and clarification judgements, and strengthen the rule baseline. Isolate the contribution of repair in a further controlled comparison.</w:t>
       </w:r>
     </w:p>
     <w:p>
@@ -5968,7 +5981,7 @@
           <w:b w:val="0"/>
           <w:i w:val="0"/>
         </w:rPr>
-        <w:t>The product makes current details, corrections and unresolved questions available for staff review. Independent data and restaurant user studies should now test whether this workflow improves real enquiry handling.</w:t>
+        <w:t>The paired comparison shows that stricter validation can also discard correct values. Constructed cases and the live walkthrough demonstrate selected review behaviours; independent data and restaurant user studies should now test whether those behaviours improve enquiry handling.</w:t>
       </w:r>
     </w:p>
     <w:p>
@@ -6006,7 +6019,7 @@
         </w:rPr>
         <w:t xml:space="preserve"> (pp. 1–13). Association for Computing Machinery. </w:t>
       </w:r>
-      <w:hyperlink r:id="rId15">
+      <w:hyperlink r:id="rId14">
         <w:r>
           <w:rPr>
             <w:color w:val="173D68"/>
@@ -6041,7 +6054,7 @@
         </w:rPr>
         <w:t xml:space="preserve"> [Data set; revision e852981ae34990f4358979625854259302feaa78]. GitHub. </w:t>
       </w:r>
-      <w:hyperlink r:id="rId16">
+      <w:hyperlink r:id="rId15">
         <w:r>
           <w:rPr>
             <w:color w:val="173D68"/>
@@ -6076,7 +6089,7 @@
         </w:rPr>
         <w:t xml:space="preserve">. Retrieved October 13, 2026, from </w:t>
       </w:r>
-      <w:hyperlink r:id="rId17">
+      <w:hyperlink r:id="rId16">
         <w:r>
           <w:rPr>
             <w:color w:val="173D68"/>
@@ -6111,7 +6124,7 @@
         </w:rPr>
         <w:t xml:space="preserve">. Retrieved October 13, 2026, from </w:t>
       </w:r>
-      <w:hyperlink r:id="rId18">
+      <w:hyperlink r:id="rId17">
         <w:r>
           <w:rPr>
             <w:color w:val="173D68"/>
@@ -6146,7 +6159,7 @@
         </w:rPr>
         <w:t xml:space="preserve">(5), 8689–8696. </w:t>
       </w:r>
-      <w:hyperlink r:id="rId19">
+      <w:hyperlink r:id="rId18">
         <w:r>
           <w:rPr>
             <w:color w:val="173D68"/>
@@ -6181,7 +6194,7 @@
         </w:rPr>
         <w:t xml:space="preserve">. Retrieved October 13, 2026, from </w:t>
       </w:r>
-      <w:hyperlink r:id="rId20">
+      <w:hyperlink r:id="rId19">
         <w:r>
           <w:rPr>
             <w:color w:val="173D68"/>
@@ -6216,7 +6229,7 @@
         </w:rPr>
         <w:t xml:space="preserve"> (pp. 808–819). Association for Computational Linguistics. </w:t>
       </w:r>
-      <w:hyperlink r:id="rId21">
+      <w:hyperlink r:id="rId20">
         <w:r>
           <w:rPr>
             <w:color w:val="173D68"/>
@@ -6250,7 +6263,7 @@
         </w:rPr>
         <w:t xml:space="preserve">Source: </w:t>
       </w:r>
-      <w:hyperlink r:id="rId22">
+      <w:hyperlink r:id="rId21">
         <w:r>
           <w:rPr>
             <w:color w:val="173D68"/>
@@ -6267,7 +6280,7 @@
         </w:rPr>
         <w:t xml:space="preserve">Live application: </w:t>
       </w:r>
-      <w:hyperlink r:id="rId23">
+      <w:hyperlink r:id="rId22">
         <w:r>
           <w:rPr>
             <w:color w:val="173D68"/>
@@ -6855,7 +6868,7 @@
           <w:b w:val="0"/>
           <w:i w:val="0"/>
         </w:rPr>
-        <w:t xml:space="preserve">. The source fingerprint is </w:t>
+        <w:t xml:space="preserve">. Its source checksum is </w:t>
       </w:r>
       <w:r>
         <w:rPr>
@@ -6871,7 +6884,7 @@
           <w:b w:val="0"/>
           <w:i w:val="0"/>
         </w:rPr>
-        <w:t xml:space="preserve">; the runner fingerprint is </w:t>
+        <w:t xml:space="preserve">; the runner checksum is </w:t>
       </w:r>
       <w:r>
         <w:rPr>
@@ -6887,7 +6900,7 @@
           <w:b w:val="0"/>
           <w:i w:val="0"/>
         </w:rPr>
-        <w:t xml:space="preserve">. Matching is implemented in </w:t>
+        <w:t xml:space="preserve">. The runner records both but rechecks only the extraction checksum before saving results. Matching uses </w:t>
       </w:r>
       <w:r>
         <w:rPr>
@@ -6903,7 +6916,7 @@
           <w:b w:val="0"/>
           <w:i w:val="0"/>
         </w:rPr>
-        <w:t xml:space="preserve">; prefixes are replayed through </w:t>
+        <w:t xml:space="preserve">; prefix replay uses </w:t>
       </w:r>
       <w:r>
         <w:rPr>
@@ -6919,7 +6932,7 @@
           <w:b w:val="0"/>
           <w:i w:val="0"/>
         </w:rPr>
-        <w:t>. The runner checks fingerprints at both ends of a run. Results may vary even when those files do not change, because hosted model responses are not fully deterministic.</w:t>
+        <w:t>. Unchanged files do not guarantee identical hosted-model responses.</w:t>
       </w:r>
     </w:p>
     <w:p>
@@ -6967,6 +6980,14 @@
         <w:jc w:val="center"/>
         <w:tblLayout w:type="fixed"/>
         <w:tblLook w:firstColumn="1" w:firstRow="1" w:lastColumn="0" w:lastRow="0" w:noHBand="0" w:noVBand="1" w:val="04A0"/>
+        <w:tblBorders>
+          <w:top w:val="single" w:sz="4" w:color="D9D9D9"/>
+          <w:left w:val="single" w:sz="4" w:color="D9D9D9"/>
+          <w:bottom w:val="single" w:sz="4" w:color="D9D9D9"/>
+          <w:right w:val="single" w:sz="4" w:color="D9D9D9"/>
+          <w:insideH w:val="single" w:sz="4" w:color="D9D9D9"/>
+          <w:insideV w:val="single" w:sz="4" w:color="D9D9D9"/>
+        </w:tblBorders>
       </w:tblPr>
       <w:tblGrid>
         <w:gridCol w:w="5112"/>
@@ -7516,7 +7537,7 @@
           <w:b w:val="0"/>
           <w:i w:val="0"/>
         </w:rPr>
-        <w:t xml:space="preserve">Figures 1, 3 and 4 are actual captures of the deployed product using a fictional Juniper House workspace. The images are retained in </w:t>
+        <w:t xml:space="preserve">Figures 1 and 3 are different crops of the same unaltered live capture, </w:t>
       </w:r>
       <w:r>
         <w:rPr>
@@ -7525,14 +7546,14 @@
           <w:i w:val="0"/>
           <w:sz w:val="19"/>
         </w:rPr>
-        <w:t>docs/media/</w:t>
+        <w:t>docs/assessment/assets/FormBridge-core-workflow.jpg</w:t>
       </w:r>
       <w:r>
         <w:rPr>
           <w:b w:val="0"/>
           <w:i w:val="0"/>
         </w:rPr>
-        <w:t>. Figure 2 is an architecture diagram drawn from the implemented request and storage paths. The product captures illustrate the workflow described in the browser verification record.</w:t>
+        <w:t>. It shows the fictional enquiry used in the eight-task walkthrough. Figure 4 is the actual guest review capture retained in that asset directory. Figure 2 is drawn from the implemented request and storage paths.</w:t>
       </w:r>
     </w:p>
     <w:p>
@@ -7566,7 +7587,7 @@
                     <pic:cNvPicPr/>
                   </pic:nvPicPr>
                   <pic:blipFill>
-                    <a:blip r:embed="rId24"/>
+                    <a:blip r:embed="rId23"/>
                     <a:stretch>
                       <a:fillRect/>
                     </a:stretch>
@@ -7624,6 +7645,14 @@
         <w:jc w:val="center"/>
         <w:tblLayout w:type="fixed"/>
         <w:tblLook w:firstColumn="1" w:firstRow="1" w:lastColumn="0" w:lastRow="0" w:noHBand="0" w:noVBand="1" w:val="04A0"/>
+        <w:tblBorders>
+          <w:top w:val="single" w:sz="4" w:color="D9D9D9"/>
+          <w:left w:val="single" w:sz="4" w:color="D9D9D9"/>
+          <w:bottom w:val="single" w:sz="4" w:color="D9D9D9"/>
+          <w:right w:val="single" w:sz="4" w:color="D9D9D9"/>
+          <w:insideH w:val="single" w:sz="4" w:color="D9D9D9"/>
+          <w:insideV w:val="single" w:sz="4" w:color="D9D9D9"/>
+        </w:tblBorders>
       </w:tblPr>
       <w:tblGrid>
         <w:gridCol w:w="3168"/>
@@ -7943,7 +7972,7 @@
                 <w:i w:val="0"/>
                 <w:sz w:val="20"/>
               </w:rPr>
-              <w:t>Link is revoked, expired or stale</w:t>
+              <w:t>Link is revoked or expired</w:t>
             </w:r>
           </w:p>
         </w:tc>
@@ -7969,7 +7998,121 @@
                 <w:i w:val="0"/>
                 <w:sz w:val="20"/>
               </w:rPr>
-              <w:t>The page returns an unavailable state without showing the saved snapshot</w:t>
+              <w:t>The page is unavailable and reveals no saved snapshot</w:t>
+            </w:r>
+          </w:p>
+        </w:tc>
+      </w:tr>
+      <w:tr>
+        <w:trPr>
+          <w:cantSplit/>
+        </w:trPr>
+        <w:tc>
+          <w:tcPr>
+            <w:tcW w:type="dxa" w:w="3168"/>
+            <w:vAlign w:val="center"/>
+            <w:shd w:fill="FFFFFF"/>
+            <w:tcMar>
+              <w:top w:w="65" w:type="dxa"/>
+              <w:bottom w:w="65" w:type="dxa"/>
+              <w:left w:w="65" w:type="dxa"/>
+              <w:right w:w="65" w:type="dxa"/>
+            </w:tcMar>
+          </w:tcPr>
+          <w:p>
+            <w:pPr>
+              <w:spacing w:before="60" w:after="60" w:line="252" w:lineRule="auto"/>
+            </w:pPr>
+            <w:r>
+              <w:rPr>
+                <w:b w:val="0"/>
+                <w:i w:val="0"/>
+                <w:sz w:val="20"/>
+              </w:rPr>
+              <w:t>An unsubmitted link refers to an older case revision</w:t>
+            </w:r>
+          </w:p>
+        </w:tc>
+        <w:tc>
+          <w:tcPr>
+            <w:tcW w:type="dxa" w:w="6549"/>
+            <w:vAlign w:val="center"/>
+            <w:shd w:fill="FFFFFF"/>
+            <w:tcMar>
+              <w:top w:w="65" w:type="dxa"/>
+              <w:bottom w:w="65" w:type="dxa"/>
+              <w:left w:w="65" w:type="dxa"/>
+              <w:right w:w="65" w:type="dxa"/>
+            </w:tcMar>
+          </w:tcPr>
+          <w:p>
+            <w:pPr>
+              <w:spacing w:before="60" w:after="60" w:line="252" w:lineRule="auto"/>
+            </w:pPr>
+            <w:r>
+              <w:rPr>
+                <w:b w:val="0"/>
+                <w:i w:val="0"/>
+                <w:sz w:val="20"/>
+              </w:rPr>
+              <w:t>The page is unavailable; staff must issue a current link</w:t>
+            </w:r>
+          </w:p>
+        </w:tc>
+      </w:tr>
+      <w:tr>
+        <w:trPr>
+          <w:cantSplit/>
+        </w:trPr>
+        <w:tc>
+          <w:tcPr>
+            <w:tcW w:type="dxa" w:w="3168"/>
+            <w:vAlign w:val="center"/>
+            <w:shd w:fill="F3F3F1"/>
+            <w:tcMar>
+              <w:top w:w="65" w:type="dxa"/>
+              <w:bottom w:w="65" w:type="dxa"/>
+              <w:left w:w="65" w:type="dxa"/>
+              <w:right w:w="65" w:type="dxa"/>
+            </w:tcMar>
+          </w:tcPr>
+          <w:p>
+            <w:pPr>
+              <w:spacing w:before="60" w:after="60" w:line="252" w:lineRule="auto"/>
+            </w:pPr>
+            <w:r>
+              <w:rPr>
+                <w:b w:val="0"/>
+                <w:i w:val="0"/>
+                <w:sz w:val="20"/>
+              </w:rPr>
+              <w:t>A submitted review is reopened</w:t>
+            </w:r>
+          </w:p>
+        </w:tc>
+        <w:tc>
+          <w:tcPr>
+            <w:tcW w:type="dxa" w:w="6549"/>
+            <w:vAlign w:val="center"/>
+            <w:shd w:fill="F3F3F1"/>
+            <w:tcMar>
+              <w:top w:w="65" w:type="dxa"/>
+              <w:bottom w:w="65" w:type="dxa"/>
+              <w:left w:w="65" w:type="dxa"/>
+              <w:right w:w="65" w:type="dxa"/>
+            </w:tcMar>
+          </w:tcPr>
+          <w:p>
+            <w:pPr>
+              <w:spacing w:before="60" w:after="60" w:line="252" w:lineRule="auto"/>
+            </w:pPr>
+            <w:r>
+              <w:rPr>
+                <w:b w:val="0"/>
+                <w:i w:val="0"/>
+                <w:sz w:val="20"/>
+              </w:rPr>
+              <w:t>Its receipt remains accessible while the link and case remain valid</w:t>
             </w:r>
           </w:p>
         </w:tc>
@@ -8051,6 +8194,1335 @@
         <w:t>The review flow demonstrates how language input becomes an accountable change to a shared record. It also shows why a correct final value is only one part of the product: the change must reach the right enquiry, invalidate the right approval and remain understandable to staff and guest.</w:t>
       </w:r>
     </w:p>
+    <w:p>
+      <w:pPr>
+        <w:pStyle w:val="Heading1"/>
+        <w:pageBreakBefore/>
+      </w:pPr>
+      <w:r>
+        <w:t>Appendix E · Supplementary experiments</w:t>
+      </w:r>
+    </w:p>
+    <w:p>
+      <w:pPr>
+        <w:pStyle w:val="Heading2"/>
+      </w:pPr>
+      <w:r>
+        <w:t>Model-selection trials</w:t>
+      </w:r>
+    </w:p>
+    <w:p>
+      <w:pPr>
+        <w:pStyle w:val="Caption"/>
+        <w:keepNext/>
+      </w:pPr>
+      <w:r>
+        <w:rPr>
+          <w:b w:val="0"/>
+          <w:i w:val="0"/>
+        </w:rPr>
+        <w:t>Table E1. Historical trials on the same ten development dialogues.</w:t>
+      </w:r>
+    </w:p>
+    <w:tbl>
+      <w:tblPr>
+        <w:tblW w:type="auto" w:w="0"/>
+        <w:jc w:val="center"/>
+        <w:tblLayout w:type="fixed"/>
+        <w:tblLook w:firstColumn="1" w:firstRow="1" w:lastColumn="0" w:lastRow="0" w:noHBand="0" w:noVBand="1" w:val="04A0"/>
+        <w:tblBorders>
+          <w:top w:val="single" w:sz="4" w:color="D9D9D9"/>
+          <w:left w:val="single" w:sz="4" w:color="D9D9D9"/>
+          <w:bottom w:val="single" w:sz="4" w:color="D9D9D9"/>
+          <w:right w:val="single" w:sz="4" w:color="D9D9D9"/>
+          <w:insideH w:val="single" w:sz="4" w:color="D9D9D9"/>
+          <w:insideV w:val="single" w:sz="4" w:color="D9D9D9"/>
+        </w:tblBorders>
+      </w:tblPr>
+      <w:tblGrid>
+        <w:gridCol w:w="3888"/>
+        <w:gridCol w:w="1512"/>
+        <w:gridCol w:w="1224"/>
+        <w:gridCol w:w="1080"/>
+        <w:gridCol w:w="2013"/>
+      </w:tblGrid>
+      <w:tr>
+        <w:trPr>
+          <w:cantSplit/>
+          <w:tblHeader/>
+        </w:trPr>
+        <w:tc>
+          <w:tcPr>
+            <w:tcW w:type="dxa" w:w="3888"/>
+            <w:vAlign w:val="center"/>
+            <w:shd w:fill="333333"/>
+            <w:tcMar>
+              <w:top w:w="65" w:type="dxa"/>
+              <w:bottom w:w="65" w:type="dxa"/>
+              <w:left w:w="65" w:type="dxa"/>
+              <w:right w:w="65" w:type="dxa"/>
+            </w:tcMar>
+          </w:tcPr>
+          <w:p>
+            <w:pPr>
+              <w:spacing w:before="60" w:after="60" w:line="252" w:lineRule="auto"/>
+            </w:pPr>
+            <w:r>
+              <w:rPr>
+                <w:b/>
+                <w:i w:val="0"/>
+                <w:color w:val="FFFFFF"/>
+                <w:sz w:val="19"/>
+              </w:rPr>
+              <w:t>Configuration</w:t>
+            </w:r>
+          </w:p>
+        </w:tc>
+        <w:tc>
+          <w:tcPr>
+            <w:tcW w:type="dxa" w:w="1512"/>
+            <w:vAlign w:val="center"/>
+            <w:shd w:fill="333333"/>
+            <w:tcMar>
+              <w:top w:w="65" w:type="dxa"/>
+              <w:bottom w:w="65" w:type="dxa"/>
+              <w:left w:w="65" w:type="dxa"/>
+              <w:right w:w="65" w:type="dxa"/>
+            </w:tcMar>
+          </w:tcPr>
+          <w:p>
+            <w:pPr>
+              <w:spacing w:before="60" w:after="60" w:line="252" w:lineRule="auto"/>
+              <w:jc w:val="center"/>
+            </w:pPr>
+            <w:r>
+              <w:rPr>
+                <w:b/>
+                <w:i w:val="0"/>
+                <w:color w:val="FFFFFF"/>
+                <w:sz w:val="19"/>
+              </w:rPr>
+              <w:t>Strict fields</w:t>
+            </w:r>
+          </w:p>
+        </w:tc>
+        <w:tc>
+          <w:tcPr>
+            <w:tcW w:type="dxa" w:w="1224"/>
+            <w:vAlign w:val="center"/>
+            <w:shd w:fill="333333"/>
+            <w:tcMar>
+              <w:top w:w="65" w:type="dxa"/>
+              <w:bottom w:w="65" w:type="dxa"/>
+              <w:left w:w="65" w:type="dxa"/>
+              <w:right w:w="65" w:type="dxa"/>
+            </w:tcMar>
+          </w:tcPr>
+          <w:p>
+            <w:pPr>
+              <w:spacing w:before="60" w:after="60" w:line="252" w:lineRule="auto"/>
+              <w:jc w:val="center"/>
+            </w:pPr>
+            <w:r>
+              <w:rPr>
+                <w:b/>
+                <w:i w:val="0"/>
+                <w:color w:val="FFFFFF"/>
+                <w:sz w:val="19"/>
+              </w:rPr>
+              <w:t>Complete</w:t>
+            </w:r>
+          </w:p>
+        </w:tc>
+        <w:tc>
+          <w:tcPr>
+            <w:tcW w:type="dxa" w:w="1080"/>
+            <w:vAlign w:val="center"/>
+            <w:shd w:fill="333333"/>
+            <w:tcMar>
+              <w:top w:w="65" w:type="dxa"/>
+              <w:bottom w:w="65" w:type="dxa"/>
+              <w:left w:w="65" w:type="dxa"/>
+              <w:right w:w="65" w:type="dxa"/>
+            </w:tcMar>
+          </w:tcPr>
+          <w:p>
+            <w:pPr>
+              <w:spacing w:before="60" w:after="60" w:line="252" w:lineRule="auto"/>
+              <w:jc w:val="center"/>
+            </w:pPr>
+            <w:r>
+              <w:rPr>
+                <w:b/>
+                <w:i w:val="0"/>
+                <w:color w:val="FFFFFF"/>
+                <w:sz w:val="19"/>
+              </w:rPr>
+              <w:t>Failed</w:t>
+            </w:r>
+          </w:p>
+        </w:tc>
+        <w:tc>
+          <w:tcPr>
+            <w:tcW w:type="dxa" w:w="2013"/>
+            <w:vAlign w:val="center"/>
+            <w:shd w:fill="333333"/>
+            <w:tcMar>
+              <w:top w:w="65" w:type="dxa"/>
+              <w:bottom w:w="65" w:type="dxa"/>
+              <w:left w:w="65" w:type="dxa"/>
+              <w:right w:w="65" w:type="dxa"/>
+            </w:tcMar>
+          </w:tcPr>
+          <w:p>
+            <w:pPr>
+              <w:spacing w:before="60" w:after="60" w:line="252" w:lineRule="auto"/>
+              <w:jc w:val="center"/>
+            </w:pPr>
+            <w:r>
+              <w:rPr>
+                <w:b/>
+                <w:i w:val="0"/>
+                <w:color w:val="FFFFFF"/>
+                <w:sz w:val="19"/>
+              </w:rPr>
+              <w:t>Mean replay</w:t>
+            </w:r>
+          </w:p>
+        </w:tc>
+      </w:tr>
+      <w:tr>
+        <w:trPr>
+          <w:cantSplit/>
+        </w:trPr>
+        <w:tc>
+          <w:tcPr>
+            <w:tcW w:type="dxa" w:w="3888"/>
+            <w:vAlign w:val="center"/>
+            <w:shd w:fill="F3F3F1"/>
+            <w:tcMar>
+              <w:top w:w="65" w:type="dxa"/>
+              <w:bottom w:w="65" w:type="dxa"/>
+              <w:left w:w="65" w:type="dxa"/>
+              <w:right w:w="65" w:type="dxa"/>
+            </w:tcMar>
+          </w:tcPr>
+          <w:p>
+            <w:pPr>
+              <w:spacing w:before="60" w:after="60" w:line="252" w:lineRule="auto"/>
+            </w:pPr>
+            <w:r>
+              <w:rPr>
+                <w:b w:val="0"/>
+                <w:i w:val="0"/>
+                <w:sz w:val="19"/>
+              </w:rPr>
+              <w:t>Luna primary, version 2</w:t>
+            </w:r>
+          </w:p>
+        </w:tc>
+        <w:tc>
+          <w:tcPr>
+            <w:tcW w:type="dxa" w:w="1512"/>
+            <w:vAlign w:val="center"/>
+            <w:shd w:fill="F3F3F1"/>
+            <w:tcMar>
+              <w:top w:w="65" w:type="dxa"/>
+              <w:bottom w:w="65" w:type="dxa"/>
+              <w:left w:w="65" w:type="dxa"/>
+              <w:right w:w="65" w:type="dxa"/>
+            </w:tcMar>
+          </w:tcPr>
+          <w:p>
+            <w:pPr>
+              <w:spacing w:before="60" w:after="60" w:line="252" w:lineRule="auto"/>
+              <w:jc w:val="center"/>
+            </w:pPr>
+            <w:r>
+              <w:rPr>
+                <w:b w:val="0"/>
+                <w:i w:val="0"/>
+                <w:sz w:val="19"/>
+              </w:rPr>
+              <w:t>45/50</w:t>
+            </w:r>
+          </w:p>
+        </w:tc>
+        <w:tc>
+          <w:tcPr>
+            <w:tcW w:type="dxa" w:w="1224"/>
+            <w:vAlign w:val="center"/>
+            <w:shd w:fill="F3F3F1"/>
+            <w:tcMar>
+              <w:top w:w="65" w:type="dxa"/>
+              <w:bottom w:w="65" w:type="dxa"/>
+              <w:left w:w="65" w:type="dxa"/>
+              <w:right w:w="65" w:type="dxa"/>
+            </w:tcMar>
+          </w:tcPr>
+          <w:p>
+            <w:pPr>
+              <w:spacing w:before="60" w:after="60" w:line="252" w:lineRule="auto"/>
+              <w:jc w:val="center"/>
+            </w:pPr>
+            <w:r>
+              <w:rPr>
+                <w:b w:val="0"/>
+                <w:i w:val="0"/>
+                <w:sz w:val="19"/>
+              </w:rPr>
+              <w:t>5/10</w:t>
+            </w:r>
+          </w:p>
+        </w:tc>
+        <w:tc>
+          <w:tcPr>
+            <w:tcW w:type="dxa" w:w="1080"/>
+            <w:vAlign w:val="center"/>
+            <w:shd w:fill="F3F3F1"/>
+            <w:tcMar>
+              <w:top w:w="65" w:type="dxa"/>
+              <w:bottom w:w="65" w:type="dxa"/>
+              <w:left w:w="65" w:type="dxa"/>
+              <w:right w:w="65" w:type="dxa"/>
+            </w:tcMar>
+          </w:tcPr>
+          <w:p>
+            <w:pPr>
+              <w:spacing w:before="60" w:after="60" w:line="252" w:lineRule="auto"/>
+              <w:jc w:val="center"/>
+            </w:pPr>
+            <w:r>
+              <w:rPr>
+                <w:b w:val="0"/>
+                <w:i w:val="0"/>
+                <w:sz w:val="19"/>
+              </w:rPr>
+              <w:t>0/10</w:t>
+            </w:r>
+          </w:p>
+        </w:tc>
+        <w:tc>
+          <w:tcPr>
+            <w:tcW w:type="dxa" w:w="2013"/>
+            <w:vAlign w:val="center"/>
+            <w:shd w:fill="F3F3F1"/>
+            <w:tcMar>
+              <w:top w:w="65" w:type="dxa"/>
+              <w:bottom w:w="65" w:type="dxa"/>
+              <w:left w:w="65" w:type="dxa"/>
+              <w:right w:w="65" w:type="dxa"/>
+            </w:tcMar>
+          </w:tcPr>
+          <w:p>
+            <w:pPr>
+              <w:spacing w:before="60" w:after="60" w:line="252" w:lineRule="auto"/>
+              <w:jc w:val="center"/>
+            </w:pPr>
+            <w:r>
+              <w:rPr>
+                <w:b w:val="0"/>
+                <w:i w:val="0"/>
+                <w:sz w:val="19"/>
+              </w:rPr>
+              <w:t>27.78 s</w:t>
+            </w:r>
+          </w:p>
+        </w:tc>
+      </w:tr>
+      <w:tr>
+        <w:trPr>
+          <w:cantSplit/>
+        </w:trPr>
+        <w:tc>
+          <w:tcPr>
+            <w:tcW w:type="dxa" w:w="3888"/>
+            <w:vAlign w:val="center"/>
+            <w:shd w:fill="FFFFFF"/>
+            <w:tcMar>
+              <w:top w:w="65" w:type="dxa"/>
+              <w:bottom w:w="65" w:type="dxa"/>
+              <w:left w:w="65" w:type="dxa"/>
+              <w:right w:w="65" w:type="dxa"/>
+            </w:tcMar>
+          </w:tcPr>
+          <w:p>
+            <w:pPr>
+              <w:spacing w:before="60" w:after="60" w:line="252" w:lineRule="auto"/>
+            </w:pPr>
+            <w:r>
+              <w:rPr>
+                <w:b w:val="0"/>
+                <w:i w:val="0"/>
+                <w:sz w:val="19"/>
+              </w:rPr>
+              <w:t>Sol primary, Astra repair, version 3</w:t>
+            </w:r>
+          </w:p>
+        </w:tc>
+        <w:tc>
+          <w:tcPr>
+            <w:tcW w:type="dxa" w:w="1512"/>
+            <w:vAlign w:val="center"/>
+            <w:shd w:fill="FFFFFF"/>
+            <w:tcMar>
+              <w:top w:w="65" w:type="dxa"/>
+              <w:bottom w:w="65" w:type="dxa"/>
+              <w:left w:w="65" w:type="dxa"/>
+              <w:right w:w="65" w:type="dxa"/>
+            </w:tcMar>
+          </w:tcPr>
+          <w:p>
+            <w:pPr>
+              <w:spacing w:before="60" w:after="60" w:line="252" w:lineRule="auto"/>
+              <w:jc w:val="center"/>
+            </w:pPr>
+            <w:r>
+              <w:rPr>
+                <w:b w:val="0"/>
+                <w:i w:val="0"/>
+                <w:sz w:val="19"/>
+              </w:rPr>
+              <w:t>38/50</w:t>
+            </w:r>
+          </w:p>
+        </w:tc>
+        <w:tc>
+          <w:tcPr>
+            <w:tcW w:type="dxa" w:w="1224"/>
+            <w:vAlign w:val="center"/>
+            <w:shd w:fill="FFFFFF"/>
+            <w:tcMar>
+              <w:top w:w="65" w:type="dxa"/>
+              <w:bottom w:w="65" w:type="dxa"/>
+              <w:left w:w="65" w:type="dxa"/>
+              <w:right w:w="65" w:type="dxa"/>
+            </w:tcMar>
+          </w:tcPr>
+          <w:p>
+            <w:pPr>
+              <w:spacing w:before="60" w:after="60" w:line="252" w:lineRule="auto"/>
+              <w:jc w:val="center"/>
+            </w:pPr>
+            <w:r>
+              <w:rPr>
+                <w:b w:val="0"/>
+                <w:i w:val="0"/>
+                <w:sz w:val="19"/>
+              </w:rPr>
+              <w:t>4/10</w:t>
+            </w:r>
+          </w:p>
+        </w:tc>
+        <w:tc>
+          <w:tcPr>
+            <w:tcW w:type="dxa" w:w="1080"/>
+            <w:vAlign w:val="center"/>
+            <w:shd w:fill="FFFFFF"/>
+            <w:tcMar>
+              <w:top w:w="65" w:type="dxa"/>
+              <w:bottom w:w="65" w:type="dxa"/>
+              <w:left w:w="65" w:type="dxa"/>
+              <w:right w:w="65" w:type="dxa"/>
+            </w:tcMar>
+          </w:tcPr>
+          <w:p>
+            <w:pPr>
+              <w:spacing w:before="60" w:after="60" w:line="252" w:lineRule="auto"/>
+              <w:jc w:val="center"/>
+            </w:pPr>
+            <w:r>
+              <w:rPr>
+                <w:b w:val="0"/>
+                <w:i w:val="0"/>
+                <w:sz w:val="19"/>
+              </w:rPr>
+              <w:t>1/10</w:t>
+            </w:r>
+          </w:p>
+        </w:tc>
+        <w:tc>
+          <w:tcPr>
+            <w:tcW w:type="dxa" w:w="2013"/>
+            <w:vAlign w:val="center"/>
+            <w:shd w:fill="FFFFFF"/>
+            <w:tcMar>
+              <w:top w:w="65" w:type="dxa"/>
+              <w:bottom w:w="65" w:type="dxa"/>
+              <w:left w:w="65" w:type="dxa"/>
+              <w:right w:w="65" w:type="dxa"/>
+            </w:tcMar>
+          </w:tcPr>
+          <w:p>
+            <w:pPr>
+              <w:spacing w:before="60" w:after="60" w:line="252" w:lineRule="auto"/>
+              <w:jc w:val="center"/>
+            </w:pPr>
+            <w:r>
+              <w:rPr>
+                <w:b w:val="0"/>
+                <w:i w:val="0"/>
+                <w:sz w:val="19"/>
+              </w:rPr>
+              <w:t>52.39 s</w:t>
+            </w:r>
+          </w:p>
+        </w:tc>
+      </w:tr>
+    </w:tbl>
+    <w:p>
+      <w:pPr>
+        <w:spacing w:after="0" w:line="240" w:lineRule="auto" w:before="0"/>
+      </w:pPr>
+      <w:r>
+        <w:rPr>
+          <w:sz w:val="4"/>
+        </w:rPr>
+      </w:r>
+    </w:p>
+    <w:p>
+      <w:r>
+        <w:rPr>
+          <w:b w:val="0"/>
+          <w:i w:val="0"/>
+        </w:rPr>
+        <w:t xml:space="preserve">The second mean covers nine completed dialogues. Its failed request returned HTTP 503. The files are </w:t>
+      </w:r>
+      <w:r>
+        <w:rPr>
+          <w:rFonts w:ascii="Liberation Mono" w:hAnsi="Liberation Mono"/>
+          <w:b w:val="0"/>
+          <w:i w:val="0"/>
+          <w:sz w:val="19"/>
+        </w:rPr>
+        <w:t>sgd-dev-10-grounded-luna-pilot.json</w:t>
+      </w:r>
+      <w:r>
+        <w:rPr>
+          <w:b w:val="0"/>
+          <w:i w:val="0"/>
+        </w:rPr>
+        <w:t xml:space="preserve"> and </w:t>
+      </w:r>
+      <w:r>
+        <w:rPr>
+          <w:rFonts w:ascii="Liberation Mono" w:hAnsi="Liberation Mono"/>
+          <w:b w:val="0"/>
+          <w:i w:val="0"/>
+          <w:sz w:val="19"/>
+        </w:rPr>
+        <w:t>sgd-dev-10-grounded-v3-development.json</w:t>
+      </w:r>
+      <w:r>
+        <w:rPr>
+          <w:b w:val="0"/>
+          <w:i w:val="0"/>
+        </w:rPr>
+        <w:t xml:space="preserve"> in </w:t>
+      </w:r>
+      <w:r>
+        <w:rPr>
+          <w:rFonts w:ascii="Liberation Mono" w:hAnsi="Liberation Mono"/>
+          <w:b w:val="0"/>
+          <w:i w:val="0"/>
+          <w:sz w:val="19"/>
+        </w:rPr>
+        <w:t>evaluation/results/</w:t>
+      </w:r>
+      <w:r>
+        <w:rPr>
+          <w:b w:val="0"/>
+          <w:i w:val="0"/>
+        </w:rPr>
+        <w:t>. Prompt and validation changes prevent a causal comparison of models alone; these trials inform a practical configuration choice.</w:t>
+      </w:r>
+    </w:p>
+    <w:p>
+      <w:pPr>
+        <w:pStyle w:val="Heading2"/>
+      </w:pPr>
+      <w:r>
+        <w:t>Reproduce the paired and feature checks</w:t>
+      </w:r>
+    </w:p>
+    <w:p>
+      <w:r>
+        <w:rPr>
+          <w:b w:val="0"/>
+          <w:i w:val="0"/>
+        </w:rPr>
+        <w:t>After the setup in Appendix A, select the revision containing the supplementary scripts. The application code is unchanged from the evaluated release. Keep the same model variables and dataset checkout. Run each command with a new tag to preserve earlier results.</w:t>
+      </w:r>
+    </w:p>
+    <w:p>
+      <w:pPr>
+        <w:spacing w:line="247" w:lineRule="auto" w:after="160"/>
+      </w:pPr>
+      <w:r>
+        <w:rPr>
+          <w:rFonts w:ascii="Liberation Mono" w:hAnsi="Liberation Mono"/>
+          <w:sz w:val="17"/>
+        </w:rPr>
+        <w:t>git checkout 470c81f883065eb0a98dba7bfb7d9e05511043b5</w:t>
+        <w:br/>
+        <w:t>pnpm install --frozen-lockfile</w:t>
+        <w:br/>
+        <w:t>pnpm exec tsx --env-file=.env.local scripts/report-evidence.ts \</w:t>
+        <w:br/>
+        <w:t xml:space="preserve">  component ../formbridge-sgd --tag=reproduce-component</w:t>
+        <w:br/>
+        <w:t>pnpm exec tsx --env-file=.env.local scripts/report-evidence.ts \</w:t>
+        <w:br/>
+        <w:t xml:space="preserve">  features --tag=reproduce-features</w:t>
+      </w:r>
+    </w:p>
+    <w:p>
+      <w:r>
+        <w:rPr>
+          <w:b w:val="0"/>
+          <w:i w:val="0"/>
+        </w:rPr>
+        <w:t xml:space="preserve">The paired test reuses the main development selection, makes one primary call for each final prefix and compares that proposal with its validated state. It excludes repair and previous predictions. Failed requests stay in the denominator. The feature test uses the 20 transcripts and expected states in </w:t>
+      </w:r>
+      <w:r>
+        <w:rPr>
+          <w:rFonts w:ascii="Liberation Mono" w:hAnsi="Liberation Mono"/>
+          <w:b w:val="0"/>
+          <w:i w:val="0"/>
+          <w:sz w:val="19"/>
+        </w:rPr>
+        <w:t>evaluation/report-feature-cases.ts</w:t>
+      </w:r>
+      <w:r>
+        <w:rPr>
+          <w:b w:val="0"/>
+          <w:i w:val="0"/>
+        </w:rPr>
+        <w:t>. Source coverage requires a correct populated field and one complete prelabelled combination of supporting messages. The question check matches the expected target; approval calls the application's approval function.</w:t>
+      </w:r>
+    </w:p>
+    <w:p>
+      <w:r>
+        <w:rPr>
+          <w:b w:val="0"/>
+          <w:i w:val="0"/>
+        </w:rPr>
+        <w:t xml:space="preserve">Outputs beginning </w:t>
+      </w:r>
+      <w:r>
+        <w:rPr>
+          <w:rFonts w:ascii="Liberation Mono" w:hAnsi="Liberation Mono"/>
+          <w:b w:val="0"/>
+          <w:i w:val="0"/>
+          <w:sz w:val="19"/>
+        </w:rPr>
+        <w:t>report-component-20261013-audit-followup</w:t>
+      </w:r>
+      <w:r>
+        <w:rPr>
+          <w:b w:val="0"/>
+          <w:i w:val="0"/>
+        </w:rPr>
+        <w:t xml:space="preserve"> and </w:t>
+      </w:r>
+      <w:r>
+        <w:rPr>
+          <w:rFonts w:ascii="Liberation Mono" w:hAnsi="Liberation Mono"/>
+          <w:b w:val="0"/>
+          <w:i w:val="0"/>
+          <w:sz w:val="19"/>
+        </w:rPr>
+        <w:t>report-features-20261013-audit-followup</w:t>
+      </w:r>
+      <w:r>
+        <w:rPr>
+          <w:b w:val="0"/>
+          <w:i w:val="0"/>
+        </w:rPr>
+        <w:t xml:space="preserve"> contain the saved protocols, progress and final predictions in </w:t>
+      </w:r>
+      <w:r>
+        <w:rPr>
+          <w:rFonts w:ascii="Liberation Mono" w:hAnsi="Liberation Mono"/>
+          <w:b w:val="0"/>
+          <w:i w:val="0"/>
+          <w:sz w:val="19"/>
+        </w:rPr>
+        <w:t>evaluation/results/</w:t>
+      </w:r>
+      <w:r>
+        <w:rPr>
+          <w:b w:val="0"/>
+          <w:i w:val="0"/>
+        </w:rPr>
+        <w:t>. Both runs checked the combined source checksum before and after execution. The script records the pre-commit revision; the command above selects the committed script and unchanged application sources.</w:t>
+      </w:r>
+    </w:p>
+    <w:p>
+      <w:r>
+        <w:rPr>
+          <w:b w:val="0"/>
+          <w:i w:val="0"/>
+        </w:rPr>
+        <w:t xml:space="preserve">The live walkthrough is recorded in </w:t>
+      </w:r>
+      <w:r>
+        <w:rPr>
+          <w:rFonts w:ascii="Liberation Mono" w:hAnsi="Liberation Mono"/>
+          <w:b w:val="0"/>
+          <w:i w:val="0"/>
+          <w:sz w:val="19"/>
+        </w:rPr>
+        <w:t>evaluation/results/report-interface-walkthrough-20261013.json</w:t>
+      </w:r>
+      <w:r>
+        <w:rPr>
+          <w:b w:val="0"/>
+          <w:i w:val="0"/>
+        </w:rPr>
+        <w:t>. It documents eight observable tasks in one fictional enquiry, with the screenshot used for Figures 1 and 3. It contains no participant ratings or time-saving estimates.</w:t>
+      </w:r>
+    </w:p>
+    <w:p>
+      <w:pPr>
+        <w:pStyle w:val="Heading1"/>
+        <w:pageBreakBefore/>
+      </w:pPr>
+      <w:r>
+        <w:t>Appendix F · Booking-desk walkthrough</w:t>
+      </w:r>
+    </w:p>
+    <w:p>
+      <w:r>
+        <w:rPr>
+          <w:b w:val="0"/>
+          <w:i w:val="0"/>
+        </w:rPr>
+        <w:t>The deployed booking desk was exercised with a fictional enquiry for Juniper House in Sydney on 6 November 2026. Figure 5 shows the correction history from the same capture as Figures 1 and 3.</w:t>
+      </w:r>
+    </w:p>
+    <w:p>
+      <w:pPr>
+        <w:keepNext/>
+        <w:spacing w:before="60" w:after="60"/>
+        <w:jc w:val="center"/>
+      </w:pPr>
+      <w:r>
+        <w:drawing>
+          <wp:inline xmlns:a="http://schemas.openxmlformats.org/drawingml/2006/main" xmlns:pic="http://schemas.openxmlformats.org/drawingml/2006/picture">
+            <wp:extent cx="5486400" cy="2289600"/>
+            <wp:docPr id="6" name="Picture 6" descr="Change history showing four guests replaced by six and 7 pm replaced by an unresolved time"/>
+            <wp:cNvGraphicFramePr>
+              <a:graphicFrameLocks noChangeAspect="1"/>
+            </wp:cNvGraphicFramePr>
+            <a:graphic>
+              <a:graphicData uri="http://schemas.openxmlformats.org/drawingml/2006/picture">
+                <pic:pic>
+                  <pic:nvPicPr>
+                    <pic:cNvPr id="0" name="FormBridge-core-workflow.jpg"/>
+                    <pic:cNvPicPr/>
+                  </pic:nvPicPr>
+                  <pic:blipFill>
+                    <a:blip r:embed="rId12"/>
+                    <a:srcRect l="2500" r="47891" t="73607" b="12598"/>
+                    <a:stretch>
+                      <a:fillRect/>
+                    </a:stretch>
+                  </pic:blipFill>
+                  <pic:spPr>
+                    <a:xfrm>
+                      <a:off x="0" y="0"/>
+                      <a:ext cx="5486400" cy="2289600"/>
+                    </a:xfrm>
+                    <a:prstGeom prst="rect"/>
+                  </pic:spPr>
+                </pic:pic>
+              </a:graphicData>
+            </a:graphic>
+          </wp:inline>
+        </w:drawing>
+      </w:r>
+    </w:p>
+    <w:p>
+      <w:pPr>
+        <w:pStyle w:val="Caption"/>
+      </w:pPr>
+      <w:r>
+        <w:rPr>
+          <w:b w:val="0"/>
+          <w:i w:val="0"/>
+        </w:rPr>
+        <w:t>Figure 5. The expanded history keeps the previous values visible. A revised preference removes the exact time without erasing the other booking details.</w:t>
+      </w:r>
+    </w:p>
+    <w:p>
+      <w:pPr>
+        <w:pStyle w:val="Caption"/>
+        <w:keepNext/>
+      </w:pPr>
+      <w:r>
+        <w:rPr>
+          <w:b w:val="0"/>
+          <w:i w:val="0"/>
+        </w:rPr>
+        <w:t>Table F1. Observed tasks in one live enquiry.</w:t>
+      </w:r>
+    </w:p>
+    <w:tbl>
+      <w:tblPr>
+        <w:tblW w:type="auto" w:w="0"/>
+        <w:jc w:val="center"/>
+        <w:tblLayout w:type="fixed"/>
+        <w:tblLook w:firstColumn="1" w:firstRow="1" w:lastColumn="0" w:lastRow="0" w:noHBand="0" w:noVBand="1" w:val="04A0"/>
+        <w:tblBorders>
+          <w:top w:val="single" w:sz="4" w:color="D9D9D9"/>
+          <w:left w:val="single" w:sz="4" w:color="D9D9D9"/>
+          <w:bottom w:val="single" w:sz="4" w:color="D9D9D9"/>
+          <w:right w:val="single" w:sz="4" w:color="D9D9D9"/>
+          <w:insideH w:val="single" w:sz="4" w:color="D9D9D9"/>
+          <w:insideV w:val="single" w:sz="4" w:color="D9D9D9"/>
+        </w:tblBorders>
+      </w:tblPr>
+      <w:tblGrid>
+        <w:gridCol w:w="3168"/>
+        <w:gridCol w:w="6549"/>
+      </w:tblGrid>
+      <w:tr>
+        <w:trPr>
+          <w:cantSplit/>
+          <w:tblHeader/>
+        </w:trPr>
+        <w:tc>
+          <w:tcPr>
+            <w:tcW w:type="dxa" w:w="3168"/>
+            <w:vAlign w:val="center"/>
+            <w:shd w:fill="333333"/>
+            <w:tcMar>
+              <w:top w:w="65" w:type="dxa"/>
+              <w:bottom w:w="65" w:type="dxa"/>
+              <w:left w:w="65" w:type="dxa"/>
+              <w:right w:w="65" w:type="dxa"/>
+            </w:tcMar>
+          </w:tcPr>
+          <w:p>
+            <w:pPr>
+              <w:spacing w:before="60" w:after="60" w:line="252" w:lineRule="auto"/>
+            </w:pPr>
+            <w:r>
+              <w:rPr>
+                <w:b/>
+                <w:i w:val="0"/>
+                <w:color w:val="FFFFFF"/>
+                <w:sz w:val="20"/>
+              </w:rPr>
+              <w:t>Task</w:t>
+            </w:r>
+          </w:p>
+        </w:tc>
+        <w:tc>
+          <w:tcPr>
+            <w:tcW w:type="dxa" w:w="6549"/>
+            <w:vAlign w:val="center"/>
+            <w:shd w:fill="333333"/>
+            <w:tcMar>
+              <w:top w:w="65" w:type="dxa"/>
+              <w:bottom w:w="65" w:type="dxa"/>
+              <w:left w:w="65" w:type="dxa"/>
+              <w:right w:w="65" w:type="dxa"/>
+            </w:tcMar>
+          </w:tcPr>
+          <w:p>
+            <w:pPr>
+              <w:spacing w:before="60" w:after="60" w:line="252" w:lineRule="auto"/>
+            </w:pPr>
+            <w:r>
+              <w:rPr>
+                <w:b/>
+                <w:i w:val="0"/>
+                <w:color w:val="FFFFFF"/>
+                <w:sz w:val="20"/>
+              </w:rPr>
+              <w:t>Observed result</w:t>
+            </w:r>
+          </w:p>
+        </w:tc>
+      </w:tr>
+      <w:tr>
+        <w:trPr>
+          <w:cantSplit/>
+        </w:trPr>
+        <w:tc>
+          <w:tcPr>
+            <w:tcW w:type="dxa" w:w="3168"/>
+            <w:vAlign w:val="center"/>
+            <w:shd w:fill="F3F3F1"/>
+            <w:tcMar>
+              <w:top w:w="65" w:type="dxa"/>
+              <w:bottom w:w="65" w:type="dxa"/>
+              <w:left w:w="65" w:type="dxa"/>
+              <w:right w:w="65" w:type="dxa"/>
+            </w:tcMar>
+          </w:tcPr>
+          <w:p>
+            <w:pPr>
+              <w:spacing w:before="60" w:after="60" w:line="252" w:lineRule="auto"/>
+            </w:pPr>
+            <w:r>
+              <w:rPr>
+                <w:b w:val="0"/>
+                <w:i w:val="0"/>
+                <w:sz w:val="20"/>
+              </w:rPr>
+              <w:t>1. Open a blank desk</w:t>
+            </w:r>
+          </w:p>
+        </w:tc>
+        <w:tc>
+          <w:tcPr>
+            <w:tcW w:type="dxa" w:w="6549"/>
+            <w:vAlign w:val="center"/>
+            <w:shd w:fill="F3F3F1"/>
+            <w:tcMar>
+              <w:top w:w="65" w:type="dxa"/>
+              <w:bottom w:w="65" w:type="dxa"/>
+              <w:left w:w="65" w:type="dxa"/>
+              <w:right w:w="65" w:type="dxa"/>
+            </w:tcMar>
+          </w:tcPr>
+          <w:p>
+            <w:pPr>
+              <w:spacing w:before="60" w:after="60" w:line="252" w:lineRule="auto"/>
+            </w:pPr>
+            <w:r>
+              <w:rPr>
+                <w:b w:val="0"/>
+                <w:i w:val="0"/>
+                <w:sz w:val="20"/>
+              </w:rPr>
+              <w:t>No sample loaded; zero of five details ready and approval disabled</w:t>
+            </w:r>
+          </w:p>
+        </w:tc>
+      </w:tr>
+      <w:tr>
+        <w:trPr>
+          <w:cantSplit/>
+        </w:trPr>
+        <w:tc>
+          <w:tcPr>
+            <w:tcW w:type="dxa" w:w="3168"/>
+            <w:vAlign w:val="center"/>
+            <w:shd w:fill="FFFFFF"/>
+            <w:tcMar>
+              <w:top w:w="65" w:type="dxa"/>
+              <w:bottom w:w="65" w:type="dxa"/>
+              <w:left w:w="65" w:type="dxa"/>
+              <w:right w:w="65" w:type="dxa"/>
+            </w:tcMar>
+          </w:tcPr>
+          <w:p>
+            <w:pPr>
+              <w:spacing w:before="60" w:after="60" w:line="252" w:lineRule="auto"/>
+            </w:pPr>
+            <w:r>
+              <w:rPr>
+                <w:b w:val="0"/>
+                <w:i w:val="0"/>
+                <w:sz w:val="20"/>
+              </w:rPr>
+              <w:t>2. Add a complete request</w:t>
+            </w:r>
+          </w:p>
+        </w:tc>
+        <w:tc>
+          <w:tcPr>
+            <w:tcW w:type="dxa" w:w="6549"/>
+            <w:vAlign w:val="center"/>
+            <w:shd w:fill="FFFFFF"/>
+            <w:tcMar>
+              <w:top w:w="65" w:type="dxa"/>
+              <w:bottom w:w="65" w:type="dxa"/>
+              <w:left w:w="65" w:type="dxa"/>
+              <w:right w:w="65" w:type="dxa"/>
+            </w:tcMar>
+          </w:tcPr>
+          <w:p>
+            <w:pPr>
+              <w:spacing w:before="60" w:after="60" w:line="252" w:lineRule="auto"/>
+            </w:pPr>
+            <w:r>
+              <w:rPr>
+                <w:b w:val="0"/>
+                <w:i w:val="0"/>
+                <w:sz w:val="20"/>
+              </w:rPr>
+              <w:t>Restaurant, city, date, 7 pm and four guests shown with sources</w:t>
+            </w:r>
+          </w:p>
+        </w:tc>
+      </w:tr>
+      <w:tr>
+        <w:trPr>
+          <w:cantSplit/>
+        </w:trPr>
+        <w:tc>
+          <w:tcPr>
+            <w:tcW w:type="dxa" w:w="3168"/>
+            <w:vAlign w:val="center"/>
+            <w:shd w:fill="F3F3F1"/>
+            <w:tcMar>
+              <w:top w:w="65" w:type="dxa"/>
+              <w:bottom w:w="65" w:type="dxa"/>
+              <w:left w:w="65" w:type="dxa"/>
+              <w:right w:w="65" w:type="dxa"/>
+            </w:tcMar>
+          </w:tcPr>
+          <w:p>
+            <w:pPr>
+              <w:spacing w:before="60" w:after="60" w:line="252" w:lineRule="auto"/>
+            </w:pPr>
+            <w:r>
+              <w:rPr>
+                <w:b w:val="0"/>
+                <w:i w:val="0"/>
+                <w:sz w:val="20"/>
+              </w:rPr>
+              <w:t>3. Change guests and time</w:t>
+            </w:r>
+          </w:p>
+        </w:tc>
+        <w:tc>
+          <w:tcPr>
+            <w:tcW w:type="dxa" w:w="6549"/>
+            <w:vAlign w:val="center"/>
+            <w:shd w:fill="F3F3F1"/>
+            <w:tcMar>
+              <w:top w:w="65" w:type="dxa"/>
+              <w:bottom w:w="65" w:type="dxa"/>
+              <w:left w:w="65" w:type="dxa"/>
+              <w:right w:w="65" w:type="dxa"/>
+            </w:tcMar>
+          </w:tcPr>
+          <w:p>
+            <w:pPr>
+              <w:spacing w:before="60" w:after="60" w:line="252" w:lineRule="auto"/>
+            </w:pPr>
+            <w:r>
+              <w:rPr>
+                <w:b w:val="0"/>
+                <w:i w:val="0"/>
+                <w:sz w:val="20"/>
+              </w:rPr>
+              <w:t>Six guests retained; “after 8 pm” left unresolved; approval disabled</w:t>
+            </w:r>
+          </w:p>
+        </w:tc>
+      </w:tr>
+      <w:tr>
+        <w:trPr>
+          <w:cantSplit/>
+        </w:trPr>
+        <w:tc>
+          <w:tcPr>
+            <w:tcW w:type="dxa" w:w="3168"/>
+            <w:vAlign w:val="center"/>
+            <w:shd w:fill="FFFFFF"/>
+            <w:tcMar>
+              <w:top w:w="65" w:type="dxa"/>
+              <w:bottom w:w="65" w:type="dxa"/>
+              <w:left w:w="65" w:type="dxa"/>
+              <w:right w:w="65" w:type="dxa"/>
+            </w:tcMar>
+          </w:tcPr>
+          <w:p>
+            <w:pPr>
+              <w:spacing w:before="60" w:after="60" w:line="252" w:lineRule="auto"/>
+            </w:pPr>
+            <w:r>
+              <w:rPr>
+                <w:b w:val="0"/>
+                <w:i w:val="0"/>
+                <w:sz w:val="20"/>
+              </w:rPr>
+              <w:t>4. Inspect sources and history</w:t>
+            </w:r>
+          </w:p>
+        </w:tc>
+        <w:tc>
+          <w:tcPr>
+            <w:tcW w:type="dxa" w:w="6549"/>
+            <w:vAlign w:val="center"/>
+            <w:shd w:fill="FFFFFF"/>
+            <w:tcMar>
+              <w:top w:w="65" w:type="dxa"/>
+              <w:bottom w:w="65" w:type="dxa"/>
+              <w:left w:w="65" w:type="dxa"/>
+              <w:right w:w="65" w:type="dxa"/>
+            </w:tcMar>
+          </w:tcPr>
+          <w:p>
+            <w:pPr>
+              <w:spacing w:before="60" w:after="60" w:line="252" w:lineRule="auto"/>
+            </w:pPr>
+            <w:r>
+              <w:rPr>
+                <w:b w:val="0"/>
+                <w:i w:val="0"/>
+                <w:sz w:val="20"/>
+              </w:rPr>
+              <w:t>Original and correction messages visible; superseded values shown</w:t>
+            </w:r>
+          </w:p>
+        </w:tc>
+      </w:tr>
+      <w:tr>
+        <w:trPr>
+          <w:cantSplit/>
+        </w:trPr>
+        <w:tc>
+          <w:tcPr>
+            <w:tcW w:type="dxa" w:w="3168"/>
+            <w:vAlign w:val="center"/>
+            <w:shd w:fill="F3F3F1"/>
+            <w:tcMar>
+              <w:top w:w="65" w:type="dxa"/>
+              <w:bottom w:w="65" w:type="dxa"/>
+              <w:left w:w="65" w:type="dxa"/>
+              <w:right w:w="65" w:type="dxa"/>
+            </w:tcMar>
+          </w:tcPr>
+          <w:p>
+            <w:pPr>
+              <w:spacing w:before="60" w:after="60" w:line="252" w:lineRule="auto"/>
+            </w:pPr>
+            <w:r>
+              <w:rPr>
+                <w:b w:val="0"/>
+                <w:i w:val="0"/>
+                <w:sz w:val="20"/>
+              </w:rPr>
+              <w:t>5. Propose 8:30 pm as staff</w:t>
+            </w:r>
+          </w:p>
+        </w:tc>
+        <w:tc>
+          <w:tcPr>
+            <w:tcW w:type="dxa" w:w="6549"/>
+            <w:vAlign w:val="center"/>
+            <w:shd w:fill="F3F3F1"/>
+            <w:tcMar>
+              <w:top w:w="65" w:type="dxa"/>
+              <w:bottom w:w="65" w:type="dxa"/>
+              <w:left w:w="65" w:type="dxa"/>
+              <w:right w:w="65" w:type="dxa"/>
+            </w:tcMar>
+          </w:tcPr>
+          <w:p>
+            <w:pPr>
+              <w:spacing w:before="60" w:after="60" w:line="252" w:lineRule="auto"/>
+            </w:pPr>
+            <w:r>
+              <w:rPr>
+                <w:b w:val="0"/>
+                <w:i w:val="0"/>
+                <w:sz w:val="20"/>
+              </w:rPr>
+              <w:t>The offer alone did not resolve the time or enable approval</w:t>
+            </w:r>
+          </w:p>
+        </w:tc>
+      </w:tr>
+      <w:tr>
+        <w:trPr>
+          <w:cantSplit/>
+        </w:trPr>
+        <w:tc>
+          <w:tcPr>
+            <w:tcW w:type="dxa" w:w="3168"/>
+            <w:vAlign w:val="center"/>
+            <w:shd w:fill="FFFFFF"/>
+            <w:tcMar>
+              <w:top w:w="65" w:type="dxa"/>
+              <w:bottom w:w="65" w:type="dxa"/>
+              <w:left w:w="65" w:type="dxa"/>
+              <w:right w:w="65" w:type="dxa"/>
+            </w:tcMar>
+          </w:tcPr>
+          <w:p>
+            <w:pPr>
+              <w:spacing w:before="60" w:after="60" w:line="252" w:lineRule="auto"/>
+            </w:pPr>
+            <w:r>
+              <w:rPr>
+                <w:b w:val="0"/>
+                <w:i w:val="0"/>
+                <w:sz w:val="20"/>
+              </w:rPr>
+              <w:t>6. Accept 8:30 pm as customer</w:t>
+            </w:r>
+          </w:p>
+        </w:tc>
+        <w:tc>
+          <w:tcPr>
+            <w:tcW w:type="dxa" w:w="6549"/>
+            <w:vAlign w:val="center"/>
+            <w:shd w:fill="FFFFFF"/>
+            <w:tcMar>
+              <w:top w:w="65" w:type="dxa"/>
+              <w:bottom w:w="65" w:type="dxa"/>
+              <w:left w:w="65" w:type="dxa"/>
+              <w:right w:w="65" w:type="dxa"/>
+            </w:tcMar>
+          </w:tcPr>
+          <w:p>
+            <w:pPr>
+              <w:spacing w:before="60" w:after="60" w:line="252" w:lineRule="auto"/>
+            </w:pPr>
+            <w:r>
+              <w:rPr>
+                <w:b w:val="0"/>
+                <w:i w:val="0"/>
+                <w:sz w:val="20"/>
+              </w:rPr>
+              <w:t>Five details ready; time resolved with acceptance evidence</w:t>
+            </w:r>
+          </w:p>
+        </w:tc>
+      </w:tr>
+      <w:tr>
+        <w:trPr>
+          <w:cantSplit/>
+        </w:trPr>
+        <w:tc>
+          <w:tcPr>
+            <w:tcW w:type="dxa" w:w="3168"/>
+            <w:vAlign w:val="center"/>
+            <w:shd w:fill="F3F3F1"/>
+            <w:tcMar>
+              <w:top w:w="65" w:type="dxa"/>
+              <w:bottom w:w="65" w:type="dxa"/>
+              <w:left w:w="65" w:type="dxa"/>
+              <w:right w:w="65" w:type="dxa"/>
+            </w:tcMar>
+          </w:tcPr>
+          <w:p>
+            <w:pPr>
+              <w:spacing w:before="60" w:after="60" w:line="252" w:lineRule="auto"/>
+            </w:pPr>
+            <w:r>
+              <w:rPr>
+                <w:b w:val="0"/>
+                <w:i w:val="0"/>
+                <w:sz w:val="20"/>
+              </w:rPr>
+              <w:t>7. Approve the brief</w:t>
+            </w:r>
+          </w:p>
+        </w:tc>
+        <w:tc>
+          <w:tcPr>
+            <w:tcW w:type="dxa" w:w="6549"/>
+            <w:vAlign w:val="center"/>
+            <w:shd w:fill="F3F3F1"/>
+            <w:tcMar>
+              <w:top w:w="65" w:type="dxa"/>
+              <w:bottom w:w="65" w:type="dxa"/>
+              <w:left w:w="65" w:type="dxa"/>
+              <w:right w:w="65" w:type="dxa"/>
+            </w:tcMar>
+          </w:tcPr>
+          <w:p>
+            <w:pPr>
+              <w:spacing w:before="60" w:after="60" w:line="252" w:lineRule="auto"/>
+            </w:pPr>
+            <w:r>
+              <w:rPr>
+                <w:b w:val="0"/>
+                <w:i w:val="0"/>
+                <w:sz w:val="20"/>
+              </w:rPr>
+              <w:t>Approved state and download control shown; no reservation claimed</w:t>
+            </w:r>
+          </w:p>
+        </w:tc>
+      </w:tr>
+      <w:tr>
+        <w:trPr>
+          <w:cantSplit/>
+        </w:trPr>
+        <w:tc>
+          <w:tcPr>
+            <w:tcW w:type="dxa" w:w="3168"/>
+            <w:vAlign w:val="center"/>
+            <w:shd w:fill="FFFFFF"/>
+            <w:tcMar>
+              <w:top w:w="65" w:type="dxa"/>
+              <w:bottom w:w="65" w:type="dxa"/>
+              <w:left w:w="65" w:type="dxa"/>
+              <w:right w:w="65" w:type="dxa"/>
+            </w:tcMar>
+          </w:tcPr>
+          <w:p>
+            <w:pPr>
+              <w:spacing w:before="60" w:after="60" w:line="252" w:lineRule="auto"/>
+            </w:pPr>
+            <w:r>
+              <w:rPr>
+                <w:b w:val="0"/>
+                <w:i w:val="0"/>
+                <w:sz w:val="20"/>
+              </w:rPr>
+              <w:t>8. Edit the earlier guest count</w:t>
+            </w:r>
+          </w:p>
+        </w:tc>
+        <w:tc>
+          <w:tcPr>
+            <w:tcW w:type="dxa" w:w="6549"/>
+            <w:vAlign w:val="center"/>
+            <w:shd w:fill="FFFFFF"/>
+            <w:tcMar>
+              <w:top w:w="65" w:type="dxa"/>
+              <w:bottom w:w="65" w:type="dxa"/>
+              <w:left w:w="65" w:type="dxa"/>
+              <w:right w:w="65" w:type="dxa"/>
+            </w:tcMar>
+          </w:tcPr>
+          <w:p>
+            <w:pPr>
+              <w:spacing w:before="60" w:after="60" w:line="252" w:lineRule="auto"/>
+            </w:pPr>
+            <w:r>
+              <w:rPr>
+                <w:b w:val="0"/>
+                <w:i w:val="0"/>
+                <w:sz w:val="20"/>
+              </w:rPr>
+              <w:t>Count rebuilt as five; other details retained and approval removed</w:t>
+            </w:r>
+          </w:p>
+        </w:tc>
+      </w:tr>
+    </w:tbl>
+    <w:p>
+      <w:pPr>
+        <w:spacing w:after="0" w:line="240" w:lineRule="auto" w:before="0"/>
+      </w:pPr>
+      <w:r>
+        <w:rPr>
+          <w:sz w:val="4"/>
+        </w:rPr>
+      </w:r>
+    </w:p>
+    <w:p>
+      <w:r>
+        <w:rPr>
+          <w:b w:val="0"/>
+          <w:i w:val="0"/>
+        </w:rPr>
+        <w:t>All eight tasks reached the expected state. This is a functional walkthrough of one conversation, not eight participants or a usability study. It demonstrates the correction and review path; a participant study would need separate measures of discoverability, completion time, mistakes and feedback.</w:t>
+      </w:r>
+    </w:p>
     <w:sectPr>
       <w:headerReference w:type="default" r:id="rId9"/>
       <w:footerReference w:type="default" r:id="rId10"/>
@@ -8089,7 +9561,7 @@
     </w:pPr>
     <w:r>
       <w:rPr>
-        <w:color w:val="666666"/>
+        <w:color w:val="000000"/>
         <w:sz w:val="16"/>
       </w:rPr>
       <w:t>FormBridge  |  36118 Applied Natural Language Processing</w:t>
@@ -8537,7 +10009,7 @@
       <w:rFonts w:asciiTheme="majorHAnsi" w:eastAsiaTheme="majorEastAsia" w:hAnsiTheme="majorHAnsi" w:cstheme="majorBidi" w:ascii="Georgia" w:hAnsi="Georgia"/>
       <w:b/>
       <w:bCs/>
-      <w:color w:val="111111"/>
+      <w:color w:val="000000"/>
       <w:sz w:val="36"/>
       <w:szCs w:val="28"/>
     </w:rPr>
@@ -8561,7 +10033,7 @@
       <w:rFonts w:asciiTheme="majorHAnsi" w:eastAsiaTheme="majorEastAsia" w:hAnsiTheme="majorHAnsi" w:cstheme="majorBidi" w:ascii="Arial" w:hAnsi="Arial"/>
       <w:b/>
       <w:bCs/>
-      <w:color w:val="111111"/>
+      <w:color w:val="000000"/>
       <w:sz w:val="24"/>
       <w:szCs w:val="26"/>
     </w:rPr>

</xml_diff>

<commit_message>
Polish report prose and present the group project consistently
</commit_message>
<xml_diff>
--- a/docs/assessment/FormBridge-AT2-Report.docx
+++ b/docs/assessment/FormBridge-AT2-Report.docx
@@ -44,6 +44,7 @@
     </w:p>
     <w:p>
       <w:pPr>
+        <w:pStyle w:val="Title"/>
         <w:keepNext/>
         <w:spacing w:after="200" w:line="240" w:lineRule="auto"/>
         <w:jc w:val="center"/>
@@ -61,7 +62,7 @@
     <w:p>
       <w:pPr>
         <w:keepNext/>
-        <w:spacing w:after="440" w:line="240" w:lineRule="auto"/>
+        <w:spacing w:after="280" w:line="240" w:lineRule="auto"/>
         <w:jc w:val="center"/>
       </w:pPr>
       <w:r>
@@ -77,6 +78,22 @@
     <w:p>
       <w:pPr>
         <w:keepNext/>
+        <w:spacing w:after="280" w:line="240" w:lineRule="auto"/>
+        <w:jc w:val="center"/>
+      </w:pPr>
+      <w:r>
+        <w:rPr>
+          <w:rFonts w:ascii="Liberation Serif" w:hAnsi="Liberation Serif"/>
+          <w:b/>
+          <w:color w:val="202932"/>
+          <w:sz w:val="26"/>
+        </w:rPr>
+        <w:t>Group project technical report</w:t>
+      </w:r>
+    </w:p>
+    <w:p>
+      <w:pPr>
+        <w:keepNext/>
         <w:spacing w:after="2800" w:line="240" w:lineRule="auto"/>
         <w:jc w:val="center"/>
       </w:pPr>
@@ -103,7 +120,7 @@
           <w:color w:val="202932"/>
           <w:sz w:val="24"/>
         </w:rPr>
-        <w:t>Student Name: Karthik Ramesh</w:t>
+        <w:t>Submitted by: Karthik Ramesh</w:t>
       </w:r>
     </w:p>
     <w:p>
@@ -137,7 +154,7 @@
           <w:b w:val="0"/>
           <w:i w:val="0"/>
         </w:rPr>
-        <w:t>FormBridge turns changing restaurant conversations into booking briefs that staff can inspect, correct and share. It tracks five fields, preserves uncertainty and links values to supporting messages. The web application includes guest intake, voice transcription, guest-care suggestions, private review links and a team desk. Staff control approval; messaging and reservation connections are simulated.</w:t>
+        <w:t>Our group developed FormBridge to help restaurant staff turn changing customer conversations into booking briefs. The application tracks five booking details, links them to their source messages and asks for clarification when a request is incomplete. Staff can review corrections, share an enquiry with teammates and send a private review link to the guest. Voice input and guest-care suggestions extend the workflow. External messaging and reservation connections are simulated.</w:t>
       </w:r>
     </w:p>
     <w:p>
@@ -146,7 +163,7 @@
           <w:b w:val="0"/>
           <w:i w:val="0"/>
         </w:rPr>
-        <w:t>On 20 inspected development dialogues from the Schema-Guided Dialogue dataset, rules, direct contextual extraction and FormBridge achieved 35/100, 89/100 and 97/100 canonical field matches. FormBridge completed 17/20 briefs and required approximately twice the direct method's mean replay time. Its separate regression run matched 100/100 fields on 20 inspected test dialogues. These results do not estimate unseen performance.</w:t>
+        <w:t>We compared rules, direct model extraction and FormBridge on 20 previously examined development dialogues from the Schema-Guided Dialogue dataset. Allowing equivalent date and time formats, the methods matched 35/100, 89/100 and 97/100 fields respectively. FormBridge matched all five fields in 17/20 dialogues, taking approximately twice as long as direct extraction to process each conversation. A separate regression check matched 100/100 fields on 20 previously examined test dialogues. Neither sample measures performance on unseen enquiries.</w:t>
       </w:r>
     </w:p>
     <w:p>
@@ -155,7 +172,7 @@
           <w:b w:val="0"/>
           <w:i w:val="0"/>
         </w:rPr>
-        <w:t>Applying validation to identical proposals reduced matches from 88/100 to 85/100 in a controlled comparison, exposing overly restrictive checks. Twenty constructed cases passed checks for values, uncertainty, clarification and approval, including required sources for 93/93 populated fields. Verification also includes 230 automated tests, production checks and an eight-task live walkthrough. No recruited-user study or restaurant productivity measurement was conducted.</w:t>
+        <w:t>A controlled comparison exposed a weakness: applying validation to the same model responses reduced correct fields from 88/100 to 85/100. Twenty constructed cases passed the checks for uncertainty, clarification and approval, with the required source messages attached to all 93 populated fields. Automated tests and a live walkthrough confirmed selected workflows. These results establish functional behaviour; a study with restaurant staff is still needed to assess ease of use and time savings.</w:t>
       </w:r>
     </w:p>
     <w:p>
@@ -1086,7 +1103,7 @@
           <w:b w:val="0"/>
           <w:i w:val="0"/>
         </w:rPr>
-        <w:t>This is a dialogue state tracking problem: maintaining the current values and constraints across a changing conversation. Earlier research, including TRADE, predicts state values from utterances rather than relying entirely on a fixed list of possible values (Wu et al., 2019). The Schema-Guided Dialogue dataset supplies service descriptions, task-oriented conversations and annotated states for this problem (Rastogi et al., 2020).</w:t>
+        <w:t>This is a dialogue state tracking problem: keeping track of what a customer currently wants as a conversation develops. TRADE, for example, generates state values from the conversation instead of relying entirely on a fixed list of answers (Wu et al., 2019). The Schema-Guided Dialogue dataset provides service descriptions, conversations and annotated states for evaluating this task (Rastogi et al., 2020).</w:t>
       </w:r>
     </w:p>
     <w:p>
@@ -1095,7 +1112,7 @@
           <w:b w:val="0"/>
           <w:i w:val="0"/>
         </w:rPr>
-        <w:t>FormBridge applies this task to small restaurant teams. Front-of-house staff need to understand an enquiry, ask for missing details and hand it to the next person without losing a revision or special request. Guests need a clear way to describe their plans and correct them. The project defines these needs through enquiry scenarios; it has not established market demand through restaurant interviews.</w:t>
+        <w:t>We chose restaurant enquiries because they make the consequences of a missed correction easy to see. Front-of-house staff must understand the current request and pass it to a colleague without losing a change or special requirement. Guests need a way to check that their plans have been understood. Our design is based on these enquiry scenarios; we have not yet interviewed restaurant staff to validate the needs or demand.</w:t>
       </w:r>
     </w:p>
     <w:p>
@@ -1112,7 +1129,7 @@
           <w:b w:val="0"/>
           <w:i w:val="0"/>
         </w:rPr>
-        <w:t>The principal objective was to build a usable web application around accurate, inspectable booking information. Four technical objectives guided implementation:</w:t>
+        <w:t>We aimed to build a web application that gives staff accurate booking information and lets them check it against the conversation. The project had four objectives:</w:t>
       </w:r>
     </w:p>
     <w:p>
@@ -1136,7 +1153,7 @@
           <w:b w:val="0"/>
           <w:i w:val="0"/>
         </w:rPr>
-        <w:t>2. Explain extracted values through source quotations, preserve uncertainty and require staff review.</w:t>
+        <w:t>2. Show the messages supporting each value and ask for clarification where details remain uncertain.</w:t>
       </w:r>
     </w:p>
     <w:p>
@@ -1148,7 +1165,7 @@
           <w:b w:val="0"/>
           <w:i w:val="0"/>
         </w:rPr>
-        <w:t>3. Compare a traditional rule baseline with contextual extraction under a documented evaluation procedure.</w:t>
+        <w:t>3. Compare rules with contextual extraction using a reproducible evaluation.</w:t>
       </w:r>
     </w:p>
     <w:p>
@@ -1160,7 +1177,7 @@
           <w:b w:val="0"/>
           <w:i w:val="0"/>
         </w:rPr>
-        <w:t>4. Carry an enquiry through intake, review and team handoff, with protected records and recoverable errors.</w:t>
+        <w:t>4. Support intake, staff review and team handoff, with private records and recovery from failed updates.</w:t>
       </w:r>
     </w:p>
     <w:p>
@@ -1176,7 +1193,7 @@
           <w:b w:val="0"/>
           <w:i w:val="0"/>
         </w:rPr>
-        <w:t xml:space="preserve"> How does contextual extraction with evidence validation and state reconciliation compare with rules and direct extraction, and how can its output support staff review of restaurant enquiries?</w:t>
+        <w:t xml:space="preserve"> How accurately does FormBridge maintain booking details compared with rules and direct model extraction, and how can those details support staff review?</w:t>
       </w:r>
     </w:p>
     <w:p>
@@ -1193,7 +1210,7 @@
           <w:b w:val="0"/>
           <w:i w:val="0"/>
         </w:rPr>
-        <w:t>The implemented product accepts English text and short voice messages, with a maximum of 30 transcript messages of 1,000 characters each. Optional guest-care details sit alongside the five booking fields. Staff can save cases locally or in a private team, assign work, return a review link and prepare a handoff.</w:t>
+        <w:t>FormBridge accepts English text and short voice messages. A transcript can contain up to 30 messages of 1,000 characters each. Optional guest-care details sit alongside the five booking fields. Staff can save enquiries on their device or in a private team, assign them to a colleague and request a guest review.</w:t>
       </w:r>
     </w:p>
     <w:p>
@@ -1202,7 +1219,7 @@
           <w:b w:val="0"/>
           <w:i w:val="0"/>
         </w:rPr>
-        <w:t>A successful workflow produces a brief whose current values, unresolved questions and staff decisions are visible. Approval means that the brief has been reviewed. External email, WhatsApp and reservation actions run through mock connectors; no real booking, payment or availability guarantee is made. The product scope is broader than the five-field benchmark, so workflow verification is reported separately from extraction accuracy.</w:t>
+        <w:t>A completed workflow leaves staff with a brief that shows the current request, unanswered questions and review decisions. Approval records that the brief has been checked; it does not reserve a table. Email, WhatsApp and reservation connections are simulated. Because these workflows extend beyond the five fields in the dataset, we evaluate them separately from extraction accuracy.</w:t>
       </w:r>
     </w:p>
     <w:p>
@@ -1220,7 +1237,7 @@
           <w:b w:val="0"/>
           <w:i w:val="0"/>
         </w:rPr>
-        <w:t>FormBridge has two connected entry points. Staff start with an empty booking desk and enter their own transcript, import a saved enquiry or review a voice transcription. Restaurants can publish a branded guest page or embed its assistant on their website. The assistant uses approved restaurant information and gathers the request before the guest consents to share contact details with the team.</w:t>
+        <w:t>Staff start with an empty booking desk. They can enter a conversation, import a saved enquiry or review a voice transcription. Restaurants can also publish a branded guest page or embed its assistant on their website. The assistant answers questions using approved restaurant information and collects the request. Contact details are shared with the team only after the guest consents.</w:t>
       </w:r>
     </w:p>
     <w:p>
@@ -1274,7 +1291,7 @@
           <w:b w:val="0"/>
           <w:i w:val="0"/>
         </w:rPr>
-        <w:t>Figure 1. The live booking desk after a customer changes four guests to six and replaces 7 pm with “sometime after 8 pm”. The count is resolved; the exact time still needs an answer. Original product capture, 13 October 2026.</w:t>
+        <w:t>Figure 1. The booking desk after a customer changes four guests to six and replaces 7 pm with “sometime after 8 pm”. The guest count updates while the exact time remains unresolved. Screenshot of the live application, 13 October 2026.</w:t>
       </w:r>
     </w:p>
     <w:p>
@@ -1291,7 +1308,7 @@
           <w:b w:val="0"/>
           <w:i w:val="0"/>
         </w:rPr>
-        <w:t>In Figure 1, the restaurant, city and date survive the correction. Staff can inspect the supporting messages and change history, then ask for an exact time. A proposed 8:30 pm becomes resolved only after the customer accepts it. Approval then applies to the reviewed brief.</w:t>
+        <w:t>In Figure 1, the restaurant, city and date remain unchanged. Staff can inspect the source messages and change history before asking for an exact time. If a staff member offers 8:30 pm, that time is recorded as agreed only after the customer accepts it. The completed brief can then be approved.</w:t>
       </w:r>
     </w:p>
     <w:p>
@@ -1300,7 +1317,7 @@
           <w:b w:val="0"/>
           <w:i w:val="0"/>
         </w:rPr>
-        <w:t xml:space="preserve">The shared workflow adds contact details, accepted guest-care requests, an owner and a due time. A private review link lets the guest request a correction. That change becomes a customer message, clears approval and returns the enquiry to </w:t>
+        <w:t xml:space="preserve">When an enquiry is shared with the team, staff can add contact details, accepted guest-care requests, an owner and a due time. The guest can request a correction through a private review link. Their change becomes a new customer message and returns the enquiry to </w:t>
       </w:r>
       <w:r>
         <w:rPr>
@@ -1314,7 +1331,7 @@
           <w:b w:val="0"/>
           <w:i w:val="0"/>
         </w:rPr>
-        <w:t>. A simulated reservation connection demonstrates transfer and failure handling without reserving a table.</w:t>
+        <w:t>, removing the previous approval. The simulated reservation connection demonstrates how the reviewed request would be handed over and how a failed transfer would be handled.</w:t>
       </w:r>
     </w:p>
     <w:p>
@@ -1331,7 +1348,7 @@
           <w:b w:val="0"/>
           <w:i w:val="0"/>
         </w:rPr>
-        <w:t>The desk supports comments, priority, ownership, returning-guest history and exact reminders. Staff explicitly link or merge guest records; the system does not assume that matching names identify the same person. A service planner organises saved enquiries with resolved dates. The desk assistant can draft replies, suggest a follow-up and prepare a handoff note, all subject to staff acceptance.</w:t>
+        <w:t>The team desk keeps comments, priorities, assignments and reminders beside each enquiry. Staff decide whether to link or merge returning-guest records, since two people can share a name. A service planner organises enquiries with known dates. The desk assistant drafts replies and handoff notes for staff to review before use.</w:t>
       </w:r>
     </w:p>
     <w:p>
@@ -1340,7 +1357,7 @@
           <w:b w:val="0"/>
           <w:i w:val="0"/>
         </w:rPr>
-        <w:t>Device sign-in and private team invitations work in the deployed product. Email signup and password recovery can be explored in a separate, labelled simulation. Real email delivery remains disabled until a sender is configured and tested.</w:t>
+        <w:t>The deployed application supports device sign-in and private team invitations. A separate simulation demonstrates email signup and password recovery. Real email delivery requires a configured and tested sender.</w:t>
       </w:r>
     </w:p>
     <w:p>
@@ -1358,7 +1375,7 @@
           <w:b w:val="0"/>
           <w:i w:val="0"/>
         </w:rPr>
-        <w:t>The application uses Next.js 16.3.6, React 19.3.0 and TypeScript 5.9.3 on Vercel. OpenAI SDK 7.23.0 provides language and transcription requests; Zod 4.6.5 validates inputs and structured outputs. Supabase provides authentication, PostgreSQL storage and row-level security. A locked dependency file records the installed versions.</w:t>
+        <w:t>We used Next.js 16.3.6, React 19.3.0 and TypeScript 5.9.3 to build the application, deployed on Vercel. OpenAI SDK 7.23.0 handles language and transcription requests, while Zod 4.6.5 checks input and response formats. Supabase provides sign-in and PostgreSQL storage, with access rules applied to individual records. The dependency lockfile records the installed versions.</w:t>
       </w:r>
     </w:p>
     <w:p>
@@ -1419,7 +1436,7 @@
         <w:pStyle w:val="Heading2"/>
       </w:pPr>
       <w:r>
-        <w:t>State ownership</w:t>
+        <w:t>Keeping the brief consistent</w:t>
       </w:r>
     </w:p>
     <w:p>
@@ -1428,7 +1445,7 @@
           <w:b w:val="0"/>
           <w:i w:val="0"/>
         </w:rPr>
-        <w:t>The model proposes a current value, status, constraint and evidence for each field. Application code decides what enters the brief. A field may be missing, resolved or awaiting clarification, and may originate from the model or a staff edit. Source IDs connect it to transcript messages. Revision history records changes; approval refers to one particular revision. A changed request therefore cannot retain an earlier approval silently.</w:t>
+        <w:t>The model proposes a value for each field, any remaining uncertainty and the messages that support it. Application code checks these proposals before updating the brief. Each field is marked missing, resolved or awaiting clarification. The brief also records whether a value came from the model or a staff edit. Approval belongs to a particular version, so changing the request removes its earlier approval.</w:t>
       </w:r>
     </w:p>
     <w:p>
@@ -1437,7 +1454,7 @@
           <w:b w:val="0"/>
           <w:i w:val="0"/>
         </w:rPr>
-        <w:t>The active draft uses browser session storage. The device library uses local storage and holds up to 50 cases. Shared cases are saved in Supabase with workspace membership checks. Guest preferences, comments and follow-up actions remain distinct from the five extracted booking fields. Reimported JSON and older model-derived drafts require renewed checking before approval.</w:t>
+        <w:t>The active draft is kept in browser session storage. A local library holds up to 50 saved enquiries, while shared enquiries are stored in Supabase and restricted to team members. Guest preferences and comments are stored separately from the five extracted fields. Imported JSON and older drafts containing model predictions must be checked again before approval.</w:t>
       </w:r>
     </w:p>
     <w:p>
@@ -1445,7 +1462,7 @@
         <w:pStyle w:val="Heading2"/>
       </w:pPr>
       <w:r>
-        <w:t>Shared edits and request boundaries</w:t>
+        <w:t>Handling shared edits and failed requests</w:t>
       </w:r>
     </w:p>
     <w:p>
@@ -1454,7 +1471,7 @@
           <w:b w:val="0"/>
           <w:i w:val="0"/>
         </w:rPr>
-        <w:t>Writes carry a saved version. A stale write returns a conflict rather than overwriting a teammate's changes. Where possible, the interface preserves unrelated edits and asks which version to keep when the same field changed. In-flight reply requests are tied to the selected case, preventing a late response from appearing in another enquiry.</w:t>
+        <w:t>Each save identifies the version being edited. If a teammate has already changed that version, the application reports a conflict. It preserves unrelated edits where possible and asks which value to keep when both people changed the same field. Reply requests remain linked to their original enquiry, so a delayed response cannot appear in a different case.</w:t>
       </w:r>
     </w:p>
     <w:p>
@@ -1463,7 +1480,7 @@
           <w:b w:val="0"/>
           <w:i w:val="0"/>
         </w:rPr>
-        <w:t>Server routes validate body size and field schemas before provider calls. A shared database allowance reserves estimated usage, then settles known usage; uncertain failed requests retain their reservation. If the allowance service is unavailable in production, AI requests stop while manual review and saved work remain available. This is an application spending control, not an account-wide billing guarantee.</w:t>
+        <w:t>Before calling OpenAI, the server checks the input and sets aside an estimated amount from a shared usage allowance. It then records the reported usage. If a failed request returns no usage information, the estimate remains charged against the allowance. AI requests stop if the allowance database is unavailable, while manual review and saved work remain accessible. This controls the application's usage, not all spending on the OpenAI account.</w:t>
       </w:r>
     </w:p>
     <w:p>
@@ -1738,7 +1755,7 @@
                 <w:i w:val="0"/>
                 <w:sz w:val="20"/>
               </w:rPr>
-              <w:t>A structured five-field prediction from each visible conversation prefix</w:t>
+              <w:t>The model predicts five values from the conversation so far</w:t>
             </w:r>
           </w:p>
         </w:tc>
@@ -1764,7 +1781,7 @@
                 <w:i w:val="0"/>
                 <w:sz w:val="20"/>
               </w:rPr>
-              <w:t>Measures contextual extraction with minimal application reconciliation</w:t>
+              <w:t>Tests contextual extraction with minimal processing after the model response</w:t>
             </w:r>
           </w:p>
         </w:tc>
@@ -1821,7 +1838,7 @@
                 <w:i w:val="0"/>
                 <w:sz w:val="20"/>
               </w:rPr>
-              <w:t>Contextual candidates with quotations, deterministic validation and revision-aware reconciliation</w:t>
+              <w:t>The model proposes values and quotations; code checks them before updating the brief</w:t>
             </w:r>
           </w:p>
         </w:tc>
@@ -1847,7 +1864,7 @@
                 <w:i w:val="0"/>
                 <w:sz w:val="20"/>
               </w:rPr>
-              <w:t>Produces a state that staff can inspect and review</w:t>
+              <w:t>Adds sources, uncertainty and controlled updates for staff review</w:t>
             </w:r>
           </w:p>
         </w:tc>
@@ -1869,7 +1886,7 @@
           <w:b w:val="0"/>
           <w:i w:val="0"/>
         </w:rPr>
-        <w:t>All approaches receive the same speaker-labelled prefixes. FormBridge reconstructs the request, then checks message IDs, literal quotations, value support, customer acceptance and recency. It checks dates, time constraints, guest counts and cancellation. Manual edits are preserved; later conflicts require review.</w:t>
+        <w:t>All three approaches receive the same messages with customer and staff labels. FormBridge checks whether quoted messages exist, whether their wording supports the proposed value and whether a later message changes it. It also checks customer acceptance, dates, time constraints, guest counts and cancellation. Manual edits are preserved, with later conflicts referred to staff.</w:t>
       </w:r>
     </w:p>
     <w:p>
@@ -1878,7 +1895,7 @@
           <w:b w:val="0"/>
           <w:i w:val="0"/>
         </w:rPr>
-        <w:t>Structured output makes the response shape predictable; it does not make the content correct (OpenAI, n.d.-b). A phrase such as “after 7 pm” must remain a constraint, and a time's numeral must not become a guest count. Validation addresses these task-specific errors. Its pattern-based checks can still reject a valid paraphrase or misunderstand acceptance, so human inspection remains necessary.</w:t>
+        <w:t>Structured output gives the model response a predictable format, but its content can still be wrong (OpenAI, n.d.-b). For example, “after 7 pm” must remain a time preference, and the numeral in a time must not become a guest count. Validation checks for these errors. The checks can also reject a valid paraphrase or miss an acceptance, which makes their own effect worth evaluating.</w:t>
       </w:r>
     </w:p>
     <w:p>
@@ -1911,7 +1928,7 @@
           <w:b w:val="0"/>
           <w:i w:val="0"/>
         </w:rPr>
-        <w:t xml:space="preserve"> with one </w:t>
+        <w:t xml:space="preserve"> for the first extraction. It can make one further call to </w:t>
       </w:r>
       <w:r>
         <w:rPr>
@@ -1927,7 +1944,7 @@
           <w:b w:val="0"/>
           <w:i w:val="0"/>
         </w:rPr>
-        <w:t xml:space="preserve"> repair or transient-failure recovery. Both use low reasoning effort; SDK retries are disabled. Output limits are 2,400 tokens for extraction with evidence and 900 for direct extraction.</w:t>
+        <w:t xml:space="preserve"> to repair a response or recover from a temporary failure. Both use low reasoning effort, with automatic SDK retries disabled. Output limits are 2,400 tokens for FormBridge and 900 for direct extraction.</w:t>
       </w:r>
     </w:p>
     <w:p>
@@ -1936,7 +1953,7 @@
           <w:b w:val="0"/>
           <w:i w:val="0"/>
         </w:rPr>
-        <w:t>A ten-dialogue development trial with Luna matched 45/50 fields, with no failed dialogues and a mean replay time of 27.78 seconds. A later Sol-primary/Astra-repair trial on the same IDs matched 38/50, failed one dialogue and averaged 52.39 seconds over the nine completed dialogues. Prompts and validation also changed between trials, so this does not isolate model quality. It supports the practical choice of Luna for ordinary requests; Appendix E gives the trial records.</w:t>
+        <w:t>A ten-dialogue trial with Luna matched 45/50 fields without a failed dialogue, averaging 27.78 seconds per conversation. A later trial using Sol first and Astra for repair matched 38/50 on the same dialogues. One failed, and the nine completed dialogues averaged 52.39 seconds. We retained Luna as the practical starting model. Because the prompts and validation also changed between trials, the results do not establish which model is intrinsically better. Appendix E records both configurations.</w:t>
       </w:r>
     </w:p>
     <w:p>
@@ -1945,7 +1962,7 @@
           <w:b w:val="0"/>
           <w:i w:val="0"/>
         </w:rPr>
-        <w:t>Sol is reserved for one further check or recovery when needed. Its benefit was not isolated in a controlled repair-model trial. The 12- and 14-second limits leave time for application work within the 30-second route limit. Hosted models avoid training and serving weights, at the cost of network dependence, external processing and model aliases that may change.</w:t>
+        <w:t>The first call has a 12-second limit and the additional call has 14 seconds, leaving time for application processing within the 30-second request limit. The separate benefit of Sol repair has not yet been measured. Using hosted models avoids training and hosting model weights, but adds network dependence and external data processing. The model names are aliases, so their behaviour may change over time.</w:t>
       </w:r>
     </w:p>
     <w:p>
@@ -1978,7 +1995,7 @@
           <w:b w:val="0"/>
           <w:i w:val="0"/>
         </w:rPr>
-        <w:t>; staff review the transcript before adding it. Guest-care suggestions require customer quotations and individual staff acceptance. The desk assistant proposes notes or follow-ups without booking tables or overwriting fields. Restaurant questions retrieve matching categories of approved facts and acknowledge missing answers.</w:t>
+        <w:t>, and staff review its transcript before adding it to the conversation. Guest-care suggestions include customer quotations and require individual acceptance. The desk assistant proposes notes and follow-ups for review. Answers to restaurant questions use matching categories of approved information and acknowledge when an answer is unavailable.</w:t>
       </w:r>
     </w:p>
     <w:p>
@@ -2004,7 +2021,7 @@
           <w:b w:val="0"/>
           <w:i w:val="0"/>
         </w:rPr>
-        <w:t xml:space="preserve">The evaluation uses Google's Schema-Guided Dialogue dataset (Google Research, n.d.). The exact corpus revision is specified in Appendix B. Conversations are retained only when they concern one restaurant service and contain a customer frame with the </w:t>
+        <w:t xml:space="preserve">We evaluated extraction using Google's Schema-Guided Dialogue dataset (Google Research, n.d.). We retained conversations about one restaurant service that included a customer turn labelled </w:t>
       </w:r>
       <w:r>
         <w:rPr>
@@ -2020,7 +2037,7 @@
           <w:b w:val="0"/>
           <w:i w:val="0"/>
         </w:rPr>
-        <w:t xml:space="preserve"> intent. The following subset was identified before applying the maximum-prefix-length filter.</w:t>
+        <w:t>. Table 2 shows the eligible subset before applying the application's 30-message limit. Appendix B identifies the exact dataset revision.</w:t>
       </w:r>
     </w:p>
     <w:p>
@@ -2033,7 +2050,7 @@
           <w:b w:val="0"/>
           <w:i w:val="0"/>
         </w:rPr>
-        <w:t>Table 2. Audited restaurant subset before prefix-length filtering.</w:t>
+        <w:t>Table 2. Eligible restaurant conversations before applying the message limit.</w:t>
       </w:r>
     </w:p>
     <w:tbl>
@@ -2596,7 +2613,7 @@
           <w:b w:val="0"/>
           <w:i w:val="0"/>
         </w:rPr>
-        <w:t>Files are read in a stable order. The input ends at the final reservation customer turn and is restricted to at most 30 messages. USER and SYSTEM become customer and staff, with stable message IDs. The final annotated slot values supply acceptable answers for scoring. Each system processes every customer prefix in chronological order, so later messages are unavailable at earlier steps.</w:t>
+        <w:t>The loader reads files in a fixed order and stops each conversation at its final customer turn about a reservation. It maps USER and SYSTEM to customer and staff and assigns message identifiers. The dataset's final annotated values provide the answers used for scoring. Each method processes the conversation again after every customer message, using only the messages available at that point. We refer to each of these partial conversations as a prefix.</w:t>
       </w:r>
     </w:p>
     <w:p>
@@ -2605,7 +2622,7 @@
           <w:b w:val="0"/>
           <w:i w:val="0"/>
         </w:rPr>
-        <w:t>Gold labels, schema defaults and future turns are excluded from model input. Historical conversations have no reference date. Consequently, “tomorrow” is not interpreted using the date of the experiment. A yearless date can remain a recognised value while still requiring clarification before staff approval.</w:t>
+        <w:t>Expected answers, default values from the service schema and future messages are excluded from model input. Historical conversations are supplied without a reference date, so “tomorrow” is not interpreted using the day we run the experiment. A date without a year can be retained as a value while still requiring clarification before approval.</w:t>
       </w:r>
     </w:p>
     <w:p>
@@ -2622,7 +2639,7 @@
           <w:b w:val="0"/>
           <w:i w:val="0"/>
         </w:rPr>
-        <w:t>Live inputs are user-provided conversations, approved restaurant facts and reviewed voice transcripts. Product screenshots and functional tests use fictional restaurants and guests. These are separate from SGD and are not collected restaurant traffic. Guest-care and workflow features are outside the dataset's five-field labels.</w:t>
+        <w:t>The live application accepts users' conversations, approved restaurant information and reviewed voice transcripts. Screenshots and functional tests use fictional restaurants and guests, separately from the dataset evaluation. SGD's five-field labels do not cover guest-care or team workflow features.</w:t>
       </w:r>
     </w:p>
     <w:p>
@@ -2631,7 +2648,7 @@
           <w:b w:val="0"/>
           <w:i w:val="0"/>
         </w:rPr>
-        <w:t>SGD provides useful task-oriented state labels, but does not fully label evidence quality, clarification wording, staff workload or operational readiness. Its public availability also means absence from a hosted model's pretraining cannot be established. Repeatedly inspected selections support regression testing; they cannot become unseen tests through rerunning.</w:t>
+        <w:t>SGD supports evaluation of booking values, but does not fully label supporting quotations, clarification wording or staff workload. It is publicly available, so we cannot establish whether it was included in a hosted model's training data. The selected conversations had already been examined during development. Rerunning them checks for regressions but cannot measure performance on unfamiliar data.</w:t>
       </w:r>
     </w:p>
     <w:p>
@@ -2657,7 +2674,7 @@
         <w:pStyle w:val="Heading2"/>
       </w:pPr>
       <w:r>
-        <w:t>Whole-system comparison</w:t>
+        <w:t>Comparing the three systems</w:t>
       </w:r>
     </w:p>
     <w:p>
@@ -2666,7 +2683,7 @@
           <w:b w:val="0"/>
           <w:i w:val="0"/>
         </w:rPr>
-        <w:t>The evaluation uses the released extraction code and two previously inspected samples: 20 development dialogues for all three methods and 20 test dialogues for FormBridge regression testing. Dialogue IDs were saved before the calls. Appendices A and B identify the source revision, configuration and selections.</w:t>
+        <w:t>We ran the released extraction code on two previously examined samples: 20 development dialogues for all three methods and 20 test dialogues for FormBridge regression testing. The dialogue selections were saved before making API calls. Appendices A and B provide the code version, configuration and selected conversations.</w:t>
       </w:r>
     </w:p>
     <w:p>
@@ -2692,7 +2709,7 @@
           <w:b w:val="0"/>
           <w:i w:val="0"/>
         </w:rPr>
-        <w:t>A second comparison uses one primary-model proposal for the final visible prefix of each development dialogue. Each proposal is scored before and after deterministic validation. Both conditions therefore share the exact input, prompt, model, output allowance and response. Repair and earlier predicted state are excluded. This isolates postprocessing of these proposals, rather than the complete incremental application. The one timed-out request counts as a failure in both conditions.</w:t>
+        <w:t>To measure the effect of validation, we requested one model response at the end of each development conversation. We scored that same response before and after applying the checks. The input, prompt, model and output allowance were therefore identical in both conditions. This experiment excludes repair calls and previously predicted states, isolating validation from the rest of the application. One request timed out and counts as a failure in both conditions.</w:t>
       </w:r>
     </w:p>
     <w:p>
@@ -2701,7 +2718,7 @@
           <w:b w:val="0"/>
           <w:i w:val="0"/>
         </w:rPr>
-        <w:t>Twenty constructed conversations separately test corrections, customer acceptance, cancellation, dates, guest counts and uncertainty. Expected values, statuses, supporting-message combinations and clarification targets were written before calls and kept out of model inputs. Each complete transcript is analysed from an empty brief. The checks measure source coverage, preservation of constraints, question targets and approval decisions; they do not rate conversational helpfulness.</w:t>
+        <w:t>We also used 20 constructed conversations to test corrections, customer acceptance, cancellation, dates, guest counts and uncertainty. The expected values, statuses, supporting messages and clarification targets were recorded before the calls and withheld from the model. Each transcript was analysed from an empty brief. These checks test whether the required sources and questions appear and whether approval is allowed at the right point.</w:t>
       </w:r>
     </w:p>
     <w:p>
@@ -2748,7 +2765,35 @@
           <w:b w:val="0"/>
           <w:i w:val="0"/>
         </w:rPr>
-        <w:t>The strict matcher applies basic text normalisation. The canonical matcher also accepts equivalent date and time forms, without supplying missing years or treating a range as an exact time. Both are reported for the whole-system comparison. They measure five-field matching, not full SGD joint goal accuracy or readiness to approve.</w:t>
+        <w:t xml:space="preserve">The </w:t>
+      </w:r>
+      <w:r>
+        <w:rPr>
+          <w:b/>
+          <w:i w:val="0"/>
+        </w:rPr>
+        <w:t>strict matcher</w:t>
+      </w:r>
+      <w:r>
+        <w:rPr>
+          <w:b w:val="0"/>
+          <w:i w:val="0"/>
+        </w:rPr>
+        <w:t xml:space="preserve"> applies basic text normalisation. The </w:t>
+      </w:r>
+      <w:r>
+        <w:rPr>
+          <w:b/>
+          <w:i w:val="0"/>
+        </w:rPr>
+        <w:t>canonical matcher</w:t>
+      </w:r>
+      <w:r>
+        <w:rPr>
+          <w:b w:val="0"/>
+          <w:i w:val="0"/>
+        </w:rPr>
+        <w:t xml:space="preserve"> also accepts equivalent date and time formats, while preserving missing years and the distinction between a range and an exact time. We report both. These scores cover our five selected fields; they do not measure the full SGD task or whether a brief is ready for approval.</w:t>
       </w:r>
     </w:p>
     <w:p>
@@ -2774,7 +2819,7 @@
           <w:b w:val="0"/>
           <w:i w:val="0"/>
         </w:rPr>
-        <w:t>The scripts call application functions with real provider requests; separate browser checks exercise the deployed interface. Saved outputs retain predictions, failures, settings and source checksums. The main runner rechecks the extraction checksum before saving. The component and feature runner rechecks its combined source checksum. Hosted-model variability prevents identical future outputs even with unchanged source. Appendix E documents the supplementary checks.</w:t>
+        <w:t>The evaluation calls the application's extraction functions with real OpenAI requests. Separate browser checks test the deployed interface. Saved results include predictions, failures and settings, with code checksums to identify the tested version. Appendices B and E explain how to repeat the experiments and which files are checked for changes. Hosted models can return different answers on a later run even when the code is unchanged.</w:t>
       </w:r>
     </w:p>
     <w:p>
@@ -2800,7 +2845,7 @@
           <w:b w:val="0"/>
           <w:i w:val="0"/>
         </w:rPr>
-        <w:t>Table 3 reports the 20 development dialogues evaluated on 13 October 2026. Each method completed all 20; the field denominator is 100. Complete-brief scores require all five values to match within the same dialogue.</w:t>
+        <w:t>All three methods completed the 20 development dialogues on 13 October 2026. Table 3 reports 100 field checks per method; a complete brief requires all five values to match.</w:t>
       </w:r>
     </w:p>
     <w:p>
@@ -3417,7 +3462,7 @@
           <w:b w:val="0"/>
           <w:i w:val="0"/>
         </w:rPr>
-        <w:t>FormBridge exceeded direct extraction by eight canonical field matches and six complete briefs on this selection. This is a difference between the configured systems, including prompts, output representation, reconciliation and additional repair calls. It cannot be attributed to validation alone. Both models found every restaurant and city; dates and guest counts account for most remaining differences.</w:t>
+        <w:t>FormBridge matched eight more fields and six more complete briefs than direct extraction under canonical scoring. Both found every restaurant and city; dates and guest counts accounted for most differences. The result includes differences in prompts, response formats and additional calls. Validation is examined separately below.</w:t>
       </w:r>
     </w:p>
     <w:p>
@@ -3438,7 +3483,7 @@
           <w:b w:val="0"/>
           <w:i w:val="0"/>
         </w:rPr>
-        <w:t>Table 4. Paired comparison using one proposal per final dialogue prefix.</w:t>
+        <w:t>Table 4. The same model responses scored before and after validation.</w:t>
       </w:r>
     </w:p>
     <w:tbl>
@@ -3737,7 +3782,7 @@
           <w:b w:val="0"/>
           <w:i w:val="0"/>
         </w:rPr>
-        <w:t>The 20 attempts include one timeout, counted as five wrong fields in each condition. Validation gained one field match but lost four correct values. This result shows that the deterministic checks alone did not improve value accuracy on these proposals. Section 8 examines why; it is not a repeat of the full-system experiment.</w:t>
+        <w:t>One request timed out, counting as five wrong fields in each condition. Validation gained one match but rejected four correct values, reducing accuracy. Section 8 examines these losses.</w:t>
       </w:r>
     </w:p>
     <w:p>
@@ -3745,7 +3790,7 @@
         <w:pStyle w:val="Heading2"/>
       </w:pPr>
       <w:r>
-        <w:t>Additional computation</w:t>
+        <w:t>Processing time and API usage</w:t>
       </w:r>
     </w:p>
     <w:p>
@@ -3754,7 +3799,7 @@
           <w:b w:val="0"/>
           <w:i w:val="0"/>
         </w:rPr>
-        <w:t>In the whole-system comparison, each method processed 166 customer prefixes. Direct extraction made 166 OpenAI requests; FormBridge made 196. Observed input/output tokens were 93,947/21,817 and 381,706/61,309 respectively. Three FormBridge dialogues recovered from failed primary requests without returned usage, so their token totals are lower bounds.</w:t>
+        <w:t>Each method processed 166 partial conversations. Direct extraction made 166 OpenAI requests, using 93,947 input and 21,817 output tokens. FormBridge made 196 requests and recorded 381,706 input and 61,309 output tokens. Three dialogues recovered after failed requests without usage information, so FormBridge's recorded tokens understate the total.</w:t>
       </w:r>
     </w:p>
     <w:p>
@@ -3763,7 +3808,7 @@
           <w:b w:val="0"/>
           <w:i w:val="0"/>
         </w:rPr>
-        <w:t>Mean dialogue replay time was 21.87 seconds for direct extraction and 45.11 seconds for FormBridge. The latter obtained more matching values at approximately twice the replay time. Concurrent evaluation activity limits latency comparisons. Rules required no provider calls.</w:t>
+        <w:t>Processing a whole dialogue averaged 21.87 seconds for direct extraction and 45.11 seconds for FormBridge, approximately twice as long. These measurements cover all steps, not one message. Concurrent evaluation activity also limits the timing comparison. Rules required no API calls.</w:t>
       </w:r>
     </w:p>
     <w:p>
@@ -3771,7 +3816,7 @@
         <w:pStyle w:val="Heading2"/>
       </w:pPr>
       <w:r>
-        <w:t>Inspected regression sample</w:t>
+        <w:t>Regression results</w:t>
       </w:r>
     </w:p>
     <w:p>
@@ -3780,7 +3825,7 @@
           <w:b w:val="0"/>
           <w:i w:val="0"/>
         </w:rPr>
-        <w:t>On the inspected test selection, FormBridge matched 100/100 fields and 20/20 complete briefs under both matchers. It processed 137 prefixes with 149 provider attempts, 289,466 input and 50,732 output tokens. Mean replay time was 32.93 seconds, with no failed dialogues or incomplete usage records. This is regression evidence for the selected cases.</w:t>
+        <w:t>The previously examined test selection matched 100/100 fields and 20/20 complete briefs under both matchers. FormBridge made 149 calls across 137 partial conversations, recording 289,466 input and 50,732 output tokens. Processing averaged 32.93 seconds per dialogue, with no failures or missing usage records.</w:t>
       </w:r>
     </w:p>
     <w:p>
@@ -3797,7 +3842,7 @@
         <w:pStyle w:val="Heading2"/>
       </w:pPr>
       <w:r>
-        <w:t>What the three remaining field mismatches mean</w:t>
+        <w:t>The three remaining field errors</w:t>
       </w:r>
     </w:p>
     <w:p>
@@ -3806,7 +3851,7 @@
           <w:b w:val="0"/>
           <w:i w:val="0"/>
         </w:rPr>
-        <w:t>The saved development predictions were compared with their source conversations. Two failures concern how far a short acceptance should extend across earlier staff proposals. The third concerns the matcher rather than a different requested date.</w:t>
+        <w:t>Comparing the incorrect predictions with their conversations revealed two cases of missed acceptance across earlier messages. The third was a wording difference that the scoring code did not recognise as equivalent.</w:t>
       </w:r>
     </w:p>
     <w:p>
@@ -4195,7 +4240,7 @@
           <w:b w:val="0"/>
           <w:i w:val="0"/>
         </w:rPr>
-        <w:t>One mismatch is a text-equivalence issue. A broader relative-date normaliser should be developed separately, then applied to all methods alongside the existing metric.</w:t>
+        <w:t>The last case expresses the expected date. A revised matcher should recognise this equivalence and be applied to every method alongside the existing score.</w:t>
       </w:r>
     </w:p>
     <w:p>
@@ -4204,7 +4249,7 @@
           <w:b w:val="0"/>
           <w:i w:val="0"/>
         </w:rPr>
-        <w:t>The first two cases concern acceptance across intervening corrections. They count as errors against the dataset labels. Their full-system traces do not retain the original model proposals, so those runs alone cannot separate extraction from validation errors.</w:t>
+        <w:t>The first two cases count as errors against the dataset labels. These runs saved final states without the original proposals, so they cannot establish whether extraction omitted the values or validation rejected them.</w:t>
       </w:r>
     </w:p>
     <w:p>
@@ -4212,7 +4257,7 @@
         <w:pStyle w:val="Heading2"/>
       </w:pPr>
       <w:r>
-        <w:t>What the controlled comparison reveals</w:t>
+        <w:t>Why validation rejected correct values</w:t>
       </w:r>
     </w:p>
     <w:p>
@@ -4221,7 +4266,7 @@
           <w:b w:val="0"/>
           <w:i w:val="0"/>
         </w:rPr>
-        <w:t>The paired run retains original proposals. In 4_00080, validation rejected San Francisco when the customer quotation said “San Fran”. In 4_00089, two correct values were rejected because their citations omitted earlier customer support. In 1_00005, the proposed date cited a staff summary without the required customer acceptance. These four losses show how strict matching and incomplete citations can discard correct values despite useful information elsewhere in the transcript.</w:t>
+        <w:t>The controlled experiment retained the original responses. Validation rejected San Francisco in 4_00080 because the customer said “San Fran”. In 4_00089, quotations omitted earlier customer support for two correct values. In 1_00005, the date cited a staff summary without the required acceptance. These account for all four losses: the information was present, but the checks could not establish the necessary link.</w:t>
       </w:r>
     </w:p>
     <w:p>
@@ -4230,7 +4275,7 @@
           <w:b w:val="0"/>
           <w:i w:val="0"/>
         </w:rPr>
-        <w:t>Validation gained one match by retaining “Wednesday next week” as a value while keeping its uncertainty. That is a representation change, not newly recovered information. The whole-system result also partly reflects representation: six direct-model date mismatches retained the relative phrase only as a constraint. The constructed-case checks therefore assess uncertainty and approval separately from values.</w:t>
+        <w:t>The gained match moved “Wednesday next week” from a constraint into the value field while retaining uncertainty. Six date mismatches in the full direct-model comparison similarly kept the phrase only as a constraint. A value score can overlook information preserved elsewhere, which is why we test uncertainty and approval separately.</w:t>
       </w:r>
     </w:p>
     <w:p>
@@ -4247,7 +4292,7 @@
           <w:b w:val="0"/>
           <w:i w:val="0"/>
         </w:rPr>
-        <w:t>The rule baseline matched no dates because it recognises full calendar dates while this selection contains relative or yearless forms. A broader date parser and trained slot tagger would make stronger baselines. For FormBridge, the next improvement is to recover missing supporting messages and recognise valid aliases without accepting unsupported values.</w:t>
+        <w:t>The rule baseline matched no dates because its patterns recognise full dates, while this sample uses relative or yearless dates. A broader date parser and trained slot tagger would strengthen the comparison. FormBridge needs to recover missing sources and recognise valid aliases without accepting unsupported values.</w:t>
       </w:r>
     </w:p>
     <w:p>
@@ -4256,7 +4301,7 @@
           <w:b w:val="0"/>
           <w:i w:val="0"/>
         </w:rPr>
-        <w:t>Earlier tests exposed negated cancellations, stale approvals after invalid corrections, disappearing retry controls and late replies appearing in another case. Cancellation checks, approval invalidation, persistent recovery controls and request scoping addressed those failures. Targeted tests and deployed retests support these fixes, without establishing a zero-error rate.</w:t>
+        <w:t>Earlier testing found negated cancellations being misread, rejected corrections leaving old approvals active and dismissed errors removing the retry control. Changes to cancellation, approval and recovery handling addressed these cases. Linking delayed replies to their original enquiry also fixed replies appearing in the wrong case. Targeted tests and deployed checks verified these corrections.</w:t>
       </w:r>
     </w:p>
     <w:p>
@@ -4274,7 +4319,7 @@
           <w:b w:val="0"/>
           <w:i w:val="0"/>
         </w:rPr>
-        <w:t>The main interaction is a conversation beside a booking card. Staff can inspect a field's source, revise a message or speaker, compare a changed value and ask for the unresolved detail. Status text accompanies colour. Approval is a separate action and is removed when the underlying request changes. This approach follows human–AI interaction guidance on explaining behaviour and supporting correction (Amershi et al., 2019).</w:t>
+        <w:t>We placed the conversation beside the booking card so staff can check a detail without leaving the enquiry. Each field opens its source messages. Staff can edit a message, correct its speaker or inspect a previous value. Unresolved details produce a question, and a changed request removes its earlier approval. These choices follow guidance on explaining system behaviour and supporting correction (Amershi et al., 2019).</w:t>
       </w:r>
     </w:p>
     <w:p>
@@ -4345,7 +4390,7 @@
           <w:b w:val="0"/>
           <w:i w:val="0"/>
         </w:rPr>
-        <w:t>One structured walkthrough completed eight tasks: open a blank desk, add a complete enquiry, correct guests and time, inspect sources and history, propose a time, accept it, approve the brief, and edit an earlier message. All eight produced the expected visible state. History showed four guests becoming six and 7 pm becoming unresolved. A staff offer of 8:30 pm left approval blocked until the customer accepted. Editing the approved request then removed approval and rebuilt the affected count. Appendix F records the steps and history view.</w:t>
+        <w:t>A structured walkthrough covered eight tasks, from opening an empty desk to editing an approved enquiry. All eight produced the expected visible result. The history showed four guests changing to six and 7 pm becoming unresolved. An offer of 8:30 pm left approval disabled until the customer accepted. Editing the earlier guest count then updated the brief and removed approval. Appendix F records each step.</w:t>
       </w:r>
     </w:p>
     <w:p>
@@ -4354,7 +4399,7 @@
           <w:b w:val="0"/>
           <w:i w:val="0"/>
         </w:rPr>
-        <w:t>Source inspection, visible changes and reversible editing make errors reviewable. Cream surfaces, dark green navigation and serif headings give the restaurant workspace a consistent identity; status text accompanies colour. The walkthrough establishes that these controls and transitions worked. It does not measure a new user's learning time, discoverability, satisfaction or restaurant productivity. No recruited participants were involved.</w:t>
+        <w:t>Cream backgrounds, dark green navigation and serif headings give the interface a consistent restaurant setting. Status labels communicate meaning alongside colour, and source panels keep corrections close to the detail being checked. The walkthrough confirms that these interactions worked in the tested enquiry. It involved no recruited participants, so it cannot establish how easily new users would find the controls or complete their work.</w:t>
       </w:r>
     </w:p>
     <w:p>
@@ -4372,7 +4417,7 @@
           <w:b w:val="0"/>
           <w:i w:val="0"/>
         </w:rPr>
-        <w:t>The released application passed 230 automated tests across 27 files, TypeScript checking and the production build. Separate production and browser records cover shared access, concurrency and complete workflows. Their original revisions are listed in Appendix C.</w:t>
+        <w:t>The released application passed 230 automated tests across 27 files, TypeScript checking and the production build. Additional checks on the deployed application covered team permissions, simultaneous edits and complete workflows. Appendix C links the results to the code versions tested.</w:t>
       </w:r>
     </w:p>
     <w:p>
@@ -4712,7 +4757,7 @@
           <w:b w:val="0"/>
           <w:i w:val="0"/>
         </w:rPr>
-        <w:t>The later email-preview release did not alter the previously checked restaurant extraction or backend paths. Counts are reported separately because the checks overlap.</w:t>
+        <w:t>The email-preview release left the tested restaurant extraction and shared-workspace code unchanged. The counts above are kept separate because some checks cover the same behaviour.</w:t>
       </w:r>
     </w:p>
     <w:p>
@@ -4729,7 +4774,7 @@
           <w:b w:val="0"/>
           <w:i w:val="0"/>
         </w:rPr>
-        <w:t>All 20 constructed conversations completed with the expected field values and statuses: 100/100 checks for each. There were 20 OpenAI requests and no final failures. The feature-specific results were:</w:t>
+        <w:t>All 20 constructed conversations returned the expected field values and statuses, giving 100/100 correct checks for each. They required 20 OpenAI requests, with no final failures. Table 7 examines the features that field accuracy alone does not measure.</w:t>
       </w:r>
     </w:p>
     <w:p>
@@ -4932,7 +4977,7 @@
                 <w:i w:val="0"/>
                 <w:sz w:val="20"/>
               </w:rPr>
-              <w:t>Correct content included its prelabelled supporting-message combination</w:t>
+              <w:t>Each correct value included the supporting messages specified before testing</w:t>
             </w:r>
           </w:p>
         </w:tc>
@@ -5290,7 +5335,7 @@
           <w:b w:val="0"/>
           <w:i w:val="0"/>
         </w:rPr>
-        <w:t>Source coverage does not score every extra quotation or independently judge wording. Clarification checks identify the requested field, not how helpful a person finds the question. These are constructed functional tests, separate from SGD accuracy and participant research.</w:t>
+        <w:t>The source check verifies that the required messages are present; it does not independently assess every additional quotation. The clarification check verifies which detail a question asks about. Assessing the usefulness of its wording would require feedback from users.</w:t>
       </w:r>
     </w:p>
     <w:p>
@@ -5299,7 +5344,7 @@
           <w:b w:val="0"/>
           <w:i w:val="0"/>
         </w:rPr>
-        <w:t>Production checks also rejected cross-team access and stale edits, protected private review data and preserved enquiries after simulated provider failures. Selected desktop and mobile layouts showed no horizontal overflow. Keyboard checks covered dialog closing and focus return. These observations do not certify every browser or assistive technology.</w:t>
+        <w:t>Checks on the deployed application rejected access from another team, detected outdated edits and preserved enquiries after simulated provider failures. The selected desktop and mobile layouts fitted their viewports without horizontal scrolling. Keyboard checks covered closing dialogs and returning focus. Broader browser and assistive-technology testing remains necessary.</w:t>
       </w:r>
     </w:p>
     <w:p>
@@ -5325,7 +5370,7 @@
           <w:b w:val="0"/>
           <w:i w:val="0"/>
         </w:rPr>
-        <w:t>Conversations can contain names, contact details and dietary requirements. Public intake asks the guest to consent before sharing contact details with the restaurant. Team membership restricts access to private records. PostgreSQL row-level security protects reads, and authorised mutations check the caller and record version (Supabase, n.d.). Private review links expire after 72 hours and expose only the information needed for guest review; anyone possessing an active link can use it.</w:t>
+        <w:t>Conversations can contain names, contact details and dietary requirements. The guest page asks for consent before sharing contact details with the restaurant. Private team records use PostgreSQL row-level security to restrict reads; updates also check the staff member's permission and the record version (Supabase, n.d.). Review links expire after 72 hours and expose only the details needed for review. Anyone holding an active link can use it, so it should be treated as private.</w:t>
       </w:r>
     </w:p>
     <w:p>
@@ -5359,7 +5404,7 @@
           <w:b w:val="0"/>
           <w:i w:val="0"/>
         </w:rPr>
-        <w:t>The current product has no automated retention schedule for all shared enquiries or a complete data-subject request workflow. A restaurant deployment would need an agreed retention policy, deletion procedures and an explanation of external processing. Free-plan service limits and dependency availability also constrain operation.</w:t>
+        <w:t>Shared enquiries do not yet have an automatic deletion schedule or a complete process for handling requests to access or delete personal information. Before use in a restaurant, these procedures need to be agreed and explained to guests, including how external services process their information. Service-plan limits and outages also affect availability.</w:t>
       </w:r>
     </w:p>
     <w:p>
@@ -5376,7 +5421,7 @@
           <w:b w:val="0"/>
           <w:i w:val="0"/>
         </w:rPr>
-        <w:t>An extracted allergy or accessibility request can be incomplete. Staff should confirm practical arrangements with the guest and restaurant; extraction does not establish medical or operational suitability. Returning-guest records are linked deliberately to avoid combining different people with the same name. Staff can reject suggestions, correct fields and inspect their sources.</w:t>
+        <w:t>An allergy or accessibility request may be incomplete even when extracted correctly. Staff still need to confirm suitable arrangements with the guest and restaurant. The interface lets staff reject suggestions and inspect their sources. It also requires an explicit decision to link returning-guest records, reducing the risk of combining different people with the same name.</w:t>
       </w:r>
     </w:p>
     <w:p>
@@ -5385,7 +5430,7 @@
           <w:b w:val="0"/>
           <w:i w:val="0"/>
         </w:rPr>
-        <w:t>Prompts and validation reduce the effect of instructions embedded in a conversation, but do not prove immunity to prompt injection. Rate limits and reserved usage reduce uncontrolled model spending, while failed requests preserve the last valid brief. These controls have bounded test evidence rather than an assurance against every malicious input or outage.</w:t>
+        <w:t>Prompts and validation help prevent instructions inside a conversation from changing the model's task, although prompt injection remains a risk. Shared usage limits control API consumption, and a failed update preserves the last valid brief. Testing covered selected failures and hostile inputs; it cannot cover every possible attack or outage.</w:t>
       </w:r>
     </w:p>
     <w:p>
@@ -5402,7 +5447,7 @@
           <w:b w:val="0"/>
           <w:i w:val="0"/>
         </w:rPr>
-        <w:t>The evaluated domain is English restaurant enquiries. Twenty inspected dialogues per selection, one current run and hosted model aliases do not support broad accuracy or statistical superiority claims. Constructed cases measure supporting-message coverage, uncertainty and approval decisions, but provide no independent rating of every quotation or of clarification usefulness. The paired experiment exposes validation losses on realistic dataset conversations. Public-data pretraining contamination is unknown.</w:t>
+        <w:t>The evaluation is limited to English restaurant enquiries and small samples already examined during development. The model aliases may change, and we cannot rule out the public dataset having appeared in model training. The results therefore support conclusions about the tested cases rather than general accuracy. Independent data, separate judgements of quotation quality and observation of restaurant staff would strengthen the evidence.</w:t>
       </w:r>
     </w:p>
     <w:p>
@@ -5411,7 +5456,7 @@
           <w:b w:val="0"/>
           <w:i w:val="0"/>
         </w:rPr>
-        <w:t>The guest endpoint currently uses Australia/Sydney as its reference-date timezone; reminder times follow the staff device. Restaurant-specific timezone configuration is needed before wider geographic deployment. Reminders update while the application is open; background notification delivery is absent. Device identities are tied to their browser and do not offer email recovery.</w:t>
+        <w:t>Guest requests use the Australia/Sydney timezone to interpret dates, while reminders follow the staff device. Wider use would require a timezone setting for each restaurant. Reminders update only while the application is open. Device sign-in is tied to the browser and currently offers no email recovery.</w:t>
       </w:r>
     </w:p>
     <w:p>
@@ -5420,7 +5465,7 @@
           <w:b w:val="0"/>
           <w:i w:val="0"/>
         </w:rPr>
-        <w:t>Messaging and reservation connectors are explicit simulations. Email registration and recovery have a separate simulation, while real delivery awaits a configured sender. There is no live reservation-provider integration, restaurant availability verification or payment processing. The application is a tested enquiry workflow with these stated operating boundaries.</w:t>
+        <w:t>Messaging, reservation transfer and email account recovery remain simulations. Real email delivery requires a configured sender. FormBridge does not check live restaurant availability, make reservations or process payments.</w:t>
       </w:r>
     </w:p>
     <w:p>
@@ -5437,7 +5482,7 @@
         <w:pStyle w:val="Heading2"/>
       </w:pPr>
       <w:r>
-        <w:t>Project phases and contribution</w:t>
+        <w:t>Project phases and responsibilities</w:t>
       </w:r>
     </w:p>
     <w:p>
@@ -5446,7 +5491,7 @@
           <w:b w:val="0"/>
           <w:i w:val="0"/>
         </w:rPr>
-        <w:t>The project progressed through five phases, extending the initial booking brief into a shared restaurant enquiry workflow.</w:t>
+        <w:t>Our project began with five booking fields and expanded into a shared enquiry workflow. Table 8 summarises the main phases and their outputs.</w:t>
       </w:r>
     </w:p>
     <w:p>
@@ -5593,7 +5638,7 @@
                 <w:i w:val="0"/>
                 <w:sz w:val="20"/>
               </w:rPr>
-              <w:t>Restaurant enquiry scope, current-state fields and a review-first workflow</w:t>
+              <w:t>Restaurant enquiry scope, five booking fields and staff review requirements</w:t>
             </w:r>
           </w:p>
         </w:tc>
@@ -5650,7 +5695,7 @@
                 <w:i w:val="0"/>
                 <w:sz w:val="20"/>
               </w:rPr>
-              <w:t>Rules, direct extraction, evidence validation, state reconciliation and repair limits</w:t>
+              <w:t>Rules, model extraction, source checks, controlled updates and limited repair calls</w:t>
             </w:r>
           </w:p>
         </w:tc>
@@ -5707,7 +5752,7 @@
                 <w:i w:val="0"/>
                 <w:sz w:val="20"/>
               </w:rPr>
-              <w:t>SGD mapping, repeatable selections, strict and canonical scoring, error investigation and regression tests</w:t>
+              <w:t>Dataset preparation, scoring, investigation of errors and regression tests</w:t>
             </w:r>
           </w:p>
         </w:tc>
@@ -5764,7 +5809,7 @@
                 <w:i w:val="0"/>
                 <w:sz w:val="20"/>
               </w:rPr>
-              <w:t>Restaurant-styled interface, voice input, saved cases, team access, guest intake, care and review links</w:t>
+              <w:t>Restaurant interface, voice input, saved enquiries, team access and guest review</w:t>
             </w:r>
           </w:p>
         </w:tc>
@@ -5821,7 +5866,7 @@
                 <w:i w:val="0"/>
                 <w:sz w:val="20"/>
               </w:rPr>
-              <w:t>Deployed checks, reproducibility instructions, product films and technical findings</w:t>
+              <w:t>Deployment checks, setup instructions, product videos and analysis of results</w:t>
             </w:r>
           </w:p>
         </w:tc>
@@ -5843,7 +5888,7 @@
           <w:b w:val="0"/>
           <w:i w:val="0"/>
         </w:rPr>
-        <w:t>Karthik Ramesh (26043455) is responsible for technical implementation. This includes the application, NLP integration, evaluation tooling, deployment and technical verification.</w:t>
+        <w:t>Within the group, Karthik Ramesh (26043455) took responsibility for technical implementation, including the application, NLP integration, evaluation tooling, deployment and technical verification.</w:t>
       </w:r>
     </w:p>
     <w:p>
@@ -5877,7 +5922,7 @@
           <w:b w:val="0"/>
           <w:i w:val="0"/>
         </w:rPr>
-        <w:t xml:space="preserve"> Use paired tasks with and without FormBridge, vary task order and measure errors, completion time and reasons for corrections. Obtain consent and use fictional guest data.</w:t>
+        <w:t xml:space="preserve"> Compare similar tasks with and without FormBridge, vary their order and measure completion time, errors and reasons for corrections. Use fictional guest data and obtain consent.</w:t>
       </w:r>
     </w:p>
     <w:p>
@@ -5896,14 +5941,14 @@
           <w:b/>
           <w:i w:val="0"/>
         </w:rPr>
-        <w:t>Improve evidence handling and evaluation.</w:t>
+        <w:t>Improve source checks.</w:t>
       </w:r>
       <w:r>
         <w:rPr>
           <w:b w:val="0"/>
           <w:i w:val="0"/>
         </w:rPr>
-        <w:t xml:space="preserve"> Address the alias and missing-citation failures from the paired test. Reserve independent data before tuning, use a second annotator for source and clarification judgements, and strengthen the rule baseline. Isolate the contribution of repair in a further controlled comparison.</w:t>
+        <w:t xml:space="preserve"> Address the aliases and missing citations found in the controlled experiment. Set aside independent data before further tuning and use a second annotator to assess sources and clarification. Strengthen the rule baseline and measure repair separately.</w:t>
       </w:r>
     </w:p>
     <w:p>
@@ -5922,14 +5967,14 @@
           <w:b/>
           <w:i w:val="0"/>
         </w:rPr>
-        <w:t>Complete operational setup.</w:t>
+        <w:t>Prepare for restaurant use.</w:t>
       </w:r>
       <w:r>
         <w:rPr>
           <w:b w:val="0"/>
           <w:i w:val="0"/>
         </w:rPr>
-        <w:t xml:space="preserve"> Configure and verify real account email delivery, recoverable staff access, restaurant timezones, retention and background reminders. Replace mock connectors only after provider authorisation and sandbox testing.</w:t>
+        <w:t xml:space="preserve"> Add recoverable staff accounts, restaurant timezones, retention controls and background reminders. Verify email delivery and replace simulated connectors only after provider authorisation and testing.</w:t>
       </w:r>
     </w:p>
     <w:p>
@@ -5955,7 +6000,7 @@
           <w:b w:val="0"/>
           <w:i w:val="0"/>
         </w:rPr>
-        <w:t xml:space="preserve"> Investigate when repair is needed and whether shorter evidence outputs preserve accuracy. Test both quality and latency before release.</w:t>
+        <w:t xml:space="preserve"> Test whether fewer repair calls or shorter evidence responses can preserve accuracy while reducing processing time.</w:t>
       </w:r>
     </w:p>
     <w:p>
@@ -5972,7 +6017,7 @@
           <w:b w:val="0"/>
           <w:i w:val="0"/>
         </w:rPr>
-        <w:t>FormBridge demonstrates an end-to-end NLP application for a defined user group. It connects contextual extraction to inspectable evidence, revision-aware approval and a shared restaurant enquiry process. On the current development selection it matched 97 of 100 fields and 17 of 20 complete briefs, exceeding the configured direct baseline while using more computation. The inspected regression selection matched all 100 fields.</w:t>
+        <w:t>We built FormBridge to keep a restaurant enquiry understandable as a customer's plans change. Staff can inspect the messages behind each detail, resolve missing information and pass a reviewed brief to a colleague. In the development comparison, FormBridge matched 97 of 100 fields and all five fields in 17 of 20 dialogues, exceeding direct extraction at the cost of more API usage and processing time.</w:t>
       </w:r>
     </w:p>
     <w:p>
@@ -5981,7 +6026,7 @@
           <w:b w:val="0"/>
           <w:i w:val="0"/>
         </w:rPr>
-        <w:t>The paired comparison shows that stricter validation can also discard correct values. Constructed cases and the live walkthrough demonstrate selected review behaviours; independent data and restaurant user studies should now test whether those behaviours improve enquiry handling.</w:t>
+        <w:t>The controlled comparison showed where the approach still falls short: strict source checks sometimes discard correct values. Improving those checks, evaluating unfamiliar enquiries and observing restaurant staff are the next steps towards establishing whether FormBridge improves everyday enquiry handling.</w:t>
       </w:r>
     </w:p>
     <w:p>
@@ -6244,7 +6289,7 @@
         <w:pageBreakBefore/>
       </w:pPr>
       <w:r>
-        <w:t>Appendix A · Run the application</w:t>
+        <w:t>Appendix A Run the application</w:t>
       </w:r>
     </w:p>
     <w:p>
@@ -6295,7 +6340,7 @@
           <w:b w:val="0"/>
           <w:i w:val="0"/>
         </w:rPr>
-        <w:t>Use Node.js 24, pnpm 11.24.0 and Git. The commands below select the exact application revision evaluated in this report. The public repository's later documentation commits contain this report and its saved results.</w:t>
+        <w:t>Use Node.js 24, pnpm 11.24.0 and Git. The commands below select the application version evaluated in this report. The report and saved results are included in later commits on the repository's main branch.</w:t>
       </w:r>
     </w:p>
     <w:p>
@@ -6544,7 +6589,7 @@
         <w:pStyle w:val="Heading2"/>
       </w:pPr>
       <w:r>
-        <w:t>Verification and provider boundaries</w:t>
+        <w:t>Testing the application</w:t>
       </w:r>
     </w:p>
     <w:p>
@@ -6569,7 +6614,7 @@
           <w:b w:val="0"/>
           <w:i w:val="0"/>
         </w:rPr>
-        <w:t xml:space="preserve"> describes workspace setup, permissions, usage allowances and connector simulations. </w:t>
+        <w:t xml:space="preserve"> describes workspace setup, permissions, usage limits and connector simulations. </w:t>
       </w:r>
       <w:r>
         <w:rPr>
@@ -6585,7 +6630,7 @@
           <w:b w:val="0"/>
           <w:i w:val="0"/>
         </w:rPr>
-        <w:t xml:space="preserve"> creates synthetic accounts and cases against a configured test project. It needs the Supabase variables; use a dedicated project and retain its output to identify test records. Real API runs consume provider usage.</w:t>
+        <w:t xml:space="preserve"> creates test accounts and enquiries in a configured Supabase project. It requires the Supabase variables above. Use a dedicated test project and retain the output so the test records can be identified. Calls to OpenAI consume API usage.</w:t>
       </w:r>
     </w:p>
     <w:p>
@@ -6635,7 +6680,7 @@
         <w:pageBreakBefore/>
       </w:pPr>
       <w:r>
-        <w:t>Appendix B · Reproduce the evaluation</w:t>
+        <w:t>Appendix B Reproduce the evaluation</w:t>
       </w:r>
     </w:p>
     <w:p>
@@ -6688,7 +6733,7 @@
           <w:b w:val="0"/>
           <w:i w:val="0"/>
         </w:rPr>
-        <w:t xml:space="preserve">The two selection files below already exist at application revision </w:t>
+        <w:t xml:space="preserve">The two selection files below exist at application revision </w:t>
       </w:r>
       <w:r>
         <w:rPr>
@@ -6704,7 +6749,7 @@
           <w:b w:val="0"/>
           <w:i w:val="0"/>
         </w:rPr>
-        <w:t xml:space="preserve"> and contain exactly the IDs used by the refreshed runs. The runner copies them into new selection records before making provider calls. Gold values are only used for scoring.</w:t>
+        <w:t xml:space="preserve"> and contain the dialogue IDs used in this report. The script copies them into a new record before making API calls. Expected answers are used only for scoring.</w:t>
       </w:r>
     </w:p>
     <w:p>
@@ -6754,7 +6799,7 @@
           <w:b w:val="0"/>
           <w:i w:val="0"/>
         </w:rPr>
-        <w:t xml:space="preserve">The report uses </w:t>
+        <w:t xml:space="preserve">The main results are saved in </w:t>
       </w:r>
       <w:r>
         <w:rPr>
@@ -6786,7 +6831,7 @@
           <w:b w:val="0"/>
           <w:i w:val="0"/>
         </w:rPr>
-        <w:t xml:space="preserve">, under </w:t>
+        <w:t xml:space="preserve"> under </w:t>
       </w:r>
       <w:r>
         <w:rPr>
@@ -6802,7 +6847,7 @@
           <w:b w:val="0"/>
           <w:i w:val="0"/>
         </w:rPr>
-        <w:t xml:space="preserve"> on the report revision. Each includes selected IDs, model settings, per-field predictions, final states, per-turn usage and summary metrics. Corresponding </w:t>
+        <w:t xml:space="preserve">. Each includes the selected dialogues, model settings, predictions, final states, usage and summary scores. Corresponding </w:t>
       </w:r>
       <w:r>
         <w:rPr>
@@ -6834,7 +6879,7 @@
           <w:b w:val="0"/>
           <w:i w:val="0"/>
         </w:rPr>
-        <w:t xml:space="preserve"> files preserve selection and progress.</w:t>
+        <w:t xml:space="preserve"> files record the selection and progress of each run.</w:t>
       </w:r>
     </w:p>
     <w:p>
@@ -6843,7 +6888,7 @@
           <w:b w:val="0"/>
           <w:i w:val="0"/>
         </w:rPr>
-        <w:t>Use a new tag for another run: the runner refuses to overwrite selections or final results. Keep all attempts, including provider failures and lower scores. A rerun of these samples remains development or regression evidence.</w:t>
+        <w:t>Use a new tag for each run because the script refuses to overwrite a selection or result. Retain all attempts, including failures, to keep an accurate account of the experiment.</w:t>
       </w:r>
     </w:p>
     <w:p>
@@ -6941,7 +6986,7 @@
         <w:pageBreakBefore/>
       </w:pPr>
       <w:r>
-        <w:t>Appendix C · Evidence and comparisons</w:t>
+        <w:t>Appendix C Evidence and comparisons</w:t>
       </w:r>
     </w:p>
     <w:p>
@@ -6958,7 +7003,7 @@
           <w:b w:val="0"/>
           <w:i w:val="0"/>
         </w:rPr>
-        <w:t>All paths below are relative to the public repository. Saved results identify their original source version and scope. Each record preserves the inputs, observations or instructions needed to audit the reported findings.</w:t>
+        <w:t>Table C1 lists the files supporting the reported results. Paths are relative to the repository, and each record identifies the code version and behaviour tested.</w:t>
       </w:r>
     </w:p>
     <w:p>
@@ -7495,7 +7540,7 @@
           <w:b w:val="0"/>
           <w:i w:val="0"/>
         </w:rPr>
-        <w:t>These results qualify the interpretation of the new comparison. The earlier system did not obtain a canonical field advantage under that equal-model configuration. The current application, prompts and repair model differ, so comparing the two releases cannot attribute improvement to a single component. Even equal-model runs may have different numbers of calls and output budgets.</w:t>
+        <w:t>In that earlier configuration, FormBridge did not improve canonical field accuracy over direct extraction. The current release changes the application, prompts and repair model, so the difference between releases cannot be assigned to one component. Using the same model also does not guarantee equal numbers of calls or equal output limits.</w:t>
       </w:r>
     </w:p>
     <w:p>
@@ -7504,7 +7549,7 @@
           <w:b w:val="0"/>
           <w:i w:val="0"/>
         </w:rPr>
-        <w:t xml:space="preserve">The historical files and commands remain in </w:t>
+        <w:t xml:space="preserve">The historical files and commands are documented in </w:t>
       </w:r>
       <w:r>
         <w:rPr>
@@ -7520,7 +7565,7 @@
           <w:b w:val="0"/>
           <w:i w:val="0"/>
         </w:rPr>
-        <w:t xml:space="preserve"> with their source revision. They are not pooled with the current 20-dialogue results and are not described as current unseen performance.</w:t>
+        <w:t>. They are reported separately from the current results.</w:t>
       </w:r>
     </w:p>
     <w:p>
@@ -7528,7 +7573,7 @@
         <w:pStyle w:val="Heading2"/>
       </w:pPr>
       <w:r>
-        <w:t>Traceability of figures</w:t>
+        <w:t>Figure sources</w:t>
       </w:r>
     </w:p>
     <w:p>
@@ -7562,7 +7607,7 @@
         <w:pageBreakBefore/>
       </w:pPr>
       <w:r>
-        <w:t>Appendix D · Guest review workflow</w:t>
+        <w:t>Appendix D Guest review workflow</w:t>
       </w:r>
     </w:p>
     <w:p>
@@ -8191,7 +8236,7 @@
           <w:b w:val="0"/>
           <w:i w:val="0"/>
         </w:rPr>
-        <w:t>The review flow demonstrates how language input becomes an accountable change to a shared record. It also shows why a correct final value is only one part of the product: the change must reach the right enquiry, invalidate the right approval and remain understandable to staff and guest.</w:t>
+        <w:t>A guest correction must reach the correct enquiry and remove the earlier approval before staff act on it. The review workflow makes these steps visible to both the guest and the team.</w:t>
       </w:r>
     </w:p>
     <w:p>
@@ -8200,7 +8245,7 @@
         <w:pageBreakBefore/>
       </w:pPr>
       <w:r>
-        <w:t>Appendix E · Supplementary experiments</w:t>
+        <w:t>Appendix E Supplementary experiments</w:t>
       </w:r>
     </w:p>
     <w:p>
@@ -8686,7 +8731,7 @@
           <w:b w:val="0"/>
           <w:i w:val="0"/>
         </w:rPr>
-        <w:t xml:space="preserve">The second mean covers nine completed dialogues. Its failed request returned HTTP 503. The files are </w:t>
+        <w:t xml:space="preserve">The second mean covers nine completed dialogues; the failed request returned HTTP 503. The files are </w:t>
       </w:r>
       <w:r>
         <w:rPr>
@@ -8734,7 +8779,7 @@
           <w:b w:val="0"/>
           <w:i w:val="0"/>
         </w:rPr>
-        <w:t>. Prompt and validation changes prevent a causal comparison of models alone; these trials inform a practical configuration choice.</w:t>
+        <w:t>. Because prompts and validation changed between trials, the difference cannot be attributed solely to the models.</w:t>
       </w:r>
     </w:p>
     <w:p>
@@ -8782,7 +8827,7 @@
           <w:b w:val="0"/>
           <w:i w:val="0"/>
         </w:rPr>
-        <w:t xml:space="preserve">The paired test reuses the main development selection, makes one primary call for each final prefix and compares that proposal with its validated state. It excludes repair and previous predictions. Failed requests stay in the denominator. The feature test uses the 20 transcripts and expected states in </w:t>
+        <w:t xml:space="preserve">The paired test uses the main development selection and makes one primary call at the end of each conversation. It compares that response before and after validation, without repair or previous predictions. Failed requests remain in the denominator. The feature test uses the 20 transcripts and expected answers in </w:t>
       </w:r>
       <w:r>
         <w:rPr>
@@ -8798,7 +8843,7 @@
           <w:b w:val="0"/>
           <w:i w:val="0"/>
         </w:rPr>
-        <w:t>. Source coverage requires a correct populated field and one complete prelabelled combination of supporting messages. The question check matches the expected target; approval calls the application's approval function.</w:t>
+        <w:t>. A source check passes when a correct populated field includes a complete set of the supporting messages specified in advance. The question check tests which field is requested, and the approval check uses the application's approval function.</w:t>
       </w:r>
     </w:p>
     <w:p>
@@ -8807,7 +8852,7 @@
           <w:b w:val="0"/>
           <w:i w:val="0"/>
         </w:rPr>
-        <w:t xml:space="preserve">Outputs beginning </w:t>
+        <w:t xml:space="preserve">Files beginning </w:t>
       </w:r>
       <w:r>
         <w:rPr>
@@ -8839,7 +8884,7 @@
           <w:b w:val="0"/>
           <w:i w:val="0"/>
         </w:rPr>
-        <w:t xml:space="preserve"> contain the saved protocols, progress and final predictions in </w:t>
+        <w:t xml:space="preserve"> contain the procedures, progress and predictions in </w:t>
       </w:r>
       <w:r>
         <w:rPr>
@@ -8855,7 +8900,7 @@
           <w:b w:val="0"/>
           <w:i w:val="0"/>
         </w:rPr>
-        <w:t>. Both runs checked the combined source checksum before and after execution. The script records the pre-commit revision; the command above selects the committed script and unchanged application sources.</w:t>
+        <w:t>. Both runs checked the combined source checksum before and after execution.</w:t>
       </w:r>
     </w:p>
     <w:p>
@@ -8864,7 +8909,7 @@
           <w:b w:val="0"/>
           <w:i w:val="0"/>
         </w:rPr>
-        <w:t xml:space="preserve">The live walkthrough is recorded in </w:t>
+        <w:t xml:space="preserve">The eight-task live walkthrough is recorded in </w:t>
       </w:r>
       <w:r>
         <w:rPr>
@@ -8880,7 +8925,7 @@
           <w:b w:val="0"/>
           <w:i w:val="0"/>
         </w:rPr>
-        <w:t>. It documents eight observable tasks in one fictional enquiry, with the screenshot used for Figures 1 and 3. It contains no participant ratings or time-saving estimates.</w:t>
+        <w:t>, with the screenshot used for Figures 1 and 3.</w:t>
       </w:r>
     </w:p>
     <w:p>
@@ -8889,7 +8934,7 @@
         <w:pageBreakBefore/>
       </w:pPr>
       <w:r>
-        <w:t>Appendix F · Booking-desk walkthrough</w:t>
+        <w:t>Appendix F Booking desk walkthrough</w:t>
       </w:r>
     </w:p>
     <w:p>
@@ -9520,7 +9565,7 @@
           <w:b w:val="0"/>
           <w:i w:val="0"/>
         </w:rPr>
-        <w:t>All eight tasks reached the expected state. This is a functional walkthrough of one conversation, not eight participants or a usability study. It demonstrates the correction and review path; a participant study would need separate measures of discoverability, completion time, mistakes and feedback.</w:t>
+        <w:t>All eight tasks reached the expected state within this one conversation. The walkthrough tested the correction and review controls. A future participant study should measure whether users can find those controls, how long tasks take and where mistakes occur.</w:t>
       </w:r>
     </w:p>
     <w:sectPr>

</xml_diff>

<commit_message>
Add all five group members to the report cover
</commit_message>
<xml_diff>
--- a/docs/assessment/FormBridge-AT2-Report.docx
+++ b/docs/assessment/FormBridge-AT2-Report.docx
@@ -94,7 +94,7 @@
     <w:p>
       <w:pPr>
         <w:keepNext/>
-        <w:spacing w:after="2800" w:line="240" w:lineRule="auto"/>
+        <w:spacing w:after="1160" w:line="240" w:lineRule="auto"/>
         <w:jc w:val="center"/>
       </w:pPr>
       <w:r>
@@ -107,10 +107,296 @@
         <w:t>36118 Applied Natural Language Processing</w:t>
       </w:r>
     </w:p>
+    <w:tbl>
+      <w:tblPr>
+        <w:tblW w:type="auto" w:w="0"/>
+        <w:jc w:val="left"/>
+        <w:tblLayout w:type="fixed"/>
+        <w:tblLook w:firstColumn="1" w:firstRow="1" w:lastColumn="0" w:lastRow="0" w:noHBand="0" w:noVBand="1" w:val="04A0"/>
+        <w:tblBorders>
+          <w:top w:val="nil"/>
+          <w:left w:val="nil"/>
+          <w:bottom w:val="nil"/>
+          <w:right w:val="nil"/>
+          <w:insideH w:val="nil"/>
+          <w:insideV w:val="nil"/>
+        </w:tblBorders>
+      </w:tblPr>
+      <w:tblGrid>
+        <w:gridCol w:w="5184"/>
+        <w:gridCol w:w="2880"/>
+      </w:tblGrid>
+      <w:tr>
+        <w:trPr>
+          <w:cantSplit/>
+        </w:trPr>
+        <w:tc>
+          <w:tcPr>
+            <w:tcW w:type="dxa" w:w="5184"/>
+          </w:tcPr>
+          <w:p>
+            <w:pPr>
+              <w:keepNext/>
+              <w:spacing w:line="240" w:lineRule="auto" w:before="60" w:after="100"/>
+            </w:pPr>
+            <w:r>
+              <w:rPr>
+                <w:rFonts w:ascii="Liberation Serif" w:hAnsi="Liberation Serif"/>
+                <w:b/>
+                <w:color w:val="202932"/>
+                <w:sz w:val="24"/>
+              </w:rPr>
+              <w:t>Group member</w:t>
+            </w:r>
+          </w:p>
+        </w:tc>
+        <w:tc>
+          <w:tcPr>
+            <w:tcW w:type="dxa" w:w="2880"/>
+          </w:tcPr>
+          <w:p>
+            <w:pPr>
+              <w:keepNext/>
+              <w:spacing w:line="240" w:lineRule="auto" w:before="60" w:after="100"/>
+            </w:pPr>
+            <w:r>
+              <w:rPr>
+                <w:rFonts w:ascii="Liberation Serif" w:hAnsi="Liberation Serif"/>
+                <w:b/>
+                <w:color w:val="202932"/>
+                <w:sz w:val="24"/>
+              </w:rPr>
+              <w:t>Student ID</w:t>
+            </w:r>
+          </w:p>
+        </w:tc>
+      </w:tr>
+      <w:tr>
+        <w:trPr>
+          <w:cantSplit/>
+        </w:trPr>
+        <w:tc>
+          <w:tcPr>
+            <w:tcW w:type="dxa" w:w="5184"/>
+          </w:tcPr>
+          <w:p>
+            <w:pPr>
+              <w:keepNext/>
+              <w:spacing w:line="240" w:lineRule="auto" w:before="60" w:after="100"/>
+            </w:pPr>
+            <w:r>
+              <w:rPr>
+                <w:rFonts w:ascii="Liberation Serif" w:hAnsi="Liberation Serif"/>
+                <w:b w:val="0"/>
+                <w:color w:val="202932"/>
+                <w:sz w:val="24"/>
+              </w:rPr>
+              <w:t>Karthik Ramesh</w:t>
+            </w:r>
+          </w:p>
+        </w:tc>
+        <w:tc>
+          <w:tcPr>
+            <w:tcW w:type="dxa" w:w="2880"/>
+          </w:tcPr>
+          <w:p>
+            <w:pPr>
+              <w:keepNext/>
+              <w:spacing w:line="240" w:lineRule="auto" w:before="60" w:after="100"/>
+            </w:pPr>
+            <w:r>
+              <w:rPr>
+                <w:rFonts w:ascii="Liberation Serif" w:hAnsi="Liberation Serif"/>
+                <w:b w:val="0"/>
+                <w:color w:val="202932"/>
+                <w:sz w:val="24"/>
+              </w:rPr>
+              <w:t>26043455</w:t>
+            </w:r>
+          </w:p>
+        </w:tc>
+      </w:tr>
+      <w:tr>
+        <w:trPr>
+          <w:cantSplit/>
+        </w:trPr>
+        <w:tc>
+          <w:tcPr>
+            <w:tcW w:type="dxa" w:w="5184"/>
+          </w:tcPr>
+          <w:p>
+            <w:pPr>
+              <w:keepNext/>
+              <w:spacing w:line="240" w:lineRule="auto" w:before="60" w:after="100"/>
+            </w:pPr>
+            <w:r>
+              <w:rPr>
+                <w:rFonts w:ascii="Liberation Serif" w:hAnsi="Liberation Serif"/>
+                <w:b w:val="0"/>
+                <w:color w:val="202932"/>
+                <w:sz w:val="24"/>
+              </w:rPr>
+              <w:t>Avanish Rao</w:t>
+            </w:r>
+          </w:p>
+        </w:tc>
+        <w:tc>
+          <w:tcPr>
+            <w:tcW w:type="dxa" w:w="2880"/>
+          </w:tcPr>
+          <w:p>
+            <w:pPr>
+              <w:keepNext/>
+              <w:spacing w:line="240" w:lineRule="auto" w:before="60" w:after="100"/>
+            </w:pPr>
+            <w:r>
+              <w:rPr>
+                <w:rFonts w:ascii="Liberation Serif" w:hAnsi="Liberation Serif"/>
+                <w:b w:val="0"/>
+                <w:color w:val="202932"/>
+                <w:sz w:val="24"/>
+              </w:rPr>
+            </w:r>
+          </w:p>
+        </w:tc>
+      </w:tr>
+      <w:tr>
+        <w:trPr>
+          <w:cantSplit/>
+        </w:trPr>
+        <w:tc>
+          <w:tcPr>
+            <w:tcW w:type="dxa" w:w="5184"/>
+          </w:tcPr>
+          <w:p>
+            <w:pPr>
+              <w:keepNext/>
+              <w:spacing w:line="240" w:lineRule="auto" w:before="60" w:after="100"/>
+            </w:pPr>
+            <w:r>
+              <w:rPr>
+                <w:rFonts w:ascii="Liberation Serif" w:hAnsi="Liberation Serif"/>
+                <w:b w:val="0"/>
+                <w:color w:val="202932"/>
+                <w:sz w:val="24"/>
+              </w:rPr>
+              <w:t>Pranav Chhetri</w:t>
+            </w:r>
+          </w:p>
+        </w:tc>
+        <w:tc>
+          <w:tcPr>
+            <w:tcW w:type="dxa" w:w="2880"/>
+          </w:tcPr>
+          <w:p>
+            <w:pPr>
+              <w:keepNext/>
+              <w:spacing w:line="240" w:lineRule="auto" w:before="60" w:after="100"/>
+            </w:pPr>
+            <w:r>
+              <w:rPr>
+                <w:rFonts w:ascii="Liberation Serif" w:hAnsi="Liberation Serif"/>
+                <w:b w:val="0"/>
+                <w:color w:val="202932"/>
+                <w:sz w:val="24"/>
+              </w:rPr>
+            </w:r>
+          </w:p>
+        </w:tc>
+      </w:tr>
+      <w:tr>
+        <w:trPr>
+          <w:cantSplit/>
+        </w:trPr>
+        <w:tc>
+          <w:tcPr>
+            <w:tcW w:type="dxa" w:w="5184"/>
+          </w:tcPr>
+          <w:p>
+            <w:pPr>
+              <w:keepNext/>
+              <w:spacing w:line="240" w:lineRule="auto" w:before="60" w:after="100"/>
+            </w:pPr>
+            <w:r>
+              <w:rPr>
+                <w:rFonts w:ascii="Liberation Serif" w:hAnsi="Liberation Serif"/>
+                <w:b w:val="0"/>
+                <w:color w:val="202932"/>
+                <w:sz w:val="24"/>
+              </w:rPr>
+              <w:t>Shivom Karnad</w:t>
+            </w:r>
+          </w:p>
+        </w:tc>
+        <w:tc>
+          <w:tcPr>
+            <w:tcW w:type="dxa" w:w="2880"/>
+          </w:tcPr>
+          <w:p>
+            <w:pPr>
+              <w:keepNext/>
+              <w:spacing w:line="240" w:lineRule="auto" w:before="60" w:after="100"/>
+            </w:pPr>
+            <w:r>
+              <w:rPr>
+                <w:rFonts w:ascii="Liberation Serif" w:hAnsi="Liberation Serif"/>
+                <w:b w:val="0"/>
+                <w:color w:val="202932"/>
+                <w:sz w:val="24"/>
+              </w:rPr>
+            </w:r>
+          </w:p>
+        </w:tc>
+      </w:tr>
+      <w:tr>
+        <w:trPr>
+          <w:cantSplit/>
+        </w:trPr>
+        <w:tc>
+          <w:tcPr>
+            <w:tcW w:type="dxa" w:w="5184"/>
+          </w:tcPr>
+          <w:p>
+            <w:pPr>
+              <w:keepNext/>
+              <w:spacing w:line="240" w:lineRule="auto" w:before="60" w:after="100"/>
+            </w:pPr>
+            <w:r>
+              <w:rPr>
+                <w:rFonts w:ascii="Liberation Serif" w:hAnsi="Liberation Serif"/>
+                <w:b w:val="0"/>
+                <w:color w:val="202932"/>
+                <w:sz w:val="24"/>
+              </w:rPr>
+              <w:t>Rishi Mundra</w:t>
+            </w:r>
+          </w:p>
+        </w:tc>
+        <w:tc>
+          <w:tcPr>
+            <w:tcW w:type="dxa" w:w="2880"/>
+          </w:tcPr>
+          <w:p>
+            <w:pPr>
+              <w:keepNext/>
+              <w:spacing w:line="240" w:lineRule="auto" w:before="60" w:after="100"/>
+            </w:pPr>
+            <w:r>
+              <w:rPr>
+                <w:rFonts w:ascii="Liberation Serif" w:hAnsi="Liberation Serif"/>
+                <w:b w:val="0"/>
+                <w:color w:val="202932"/>
+                <w:sz w:val="24"/>
+              </w:rPr>
+            </w:r>
+          </w:p>
+        </w:tc>
+      </w:tr>
+    </w:tbl>
     <w:p>
       <w:pPr>
-        <w:keepNext/>
-        <w:spacing w:after="100" w:line="240" w:lineRule="auto"/>
+        <w:keepNext w:val="0"/>
+        <w:spacing w:after="360" w:line="240" w:lineRule="auto" w:before="440"/>
         <w:jc w:val="left"/>
       </w:pPr>
       <w:r>
@@ -121,22 +407,6 @@
           <w:sz w:val="24"/>
         </w:rPr>
         <w:t>Submitted by: Karthik Ramesh</w:t>
-      </w:r>
-    </w:p>
-    <w:p>
-      <w:pPr>
-        <w:keepNext w:val="0"/>
-        <w:spacing w:after="360" w:line="240" w:lineRule="auto"/>
-        <w:jc w:val="left"/>
-      </w:pPr>
-      <w:r>
-        <w:rPr>
-          <w:rFonts w:ascii="Liberation Serif" w:hAnsi="Liberation Serif"/>
-          <w:b/>
-          <w:color w:val="202932"/>
-          <w:sz w:val="24"/>
-        </w:rPr>
-        <w:t>Student ID: 26043455</w:t>
       </w:r>
     </w:p>
     <w:p>

</xml_diff>

<commit_message>
Allocate final group review responsibilities in the report
</commit_message>
<xml_diff>
--- a/docs/assessment/FormBridge-AT2-Report.docx
+++ b/docs/assessment/FormBridge-AT2-Report.docx
@@ -5761,7 +5761,16 @@
           <w:b w:val="0"/>
           <w:i w:val="0"/>
         </w:rPr>
-        <w:t>Our project began with five booking fields and expanded into a shared enquiry workflow. Table 8 summarises the main phases and their outputs.</w:t>
+        <w:t>We began by defining the restaurant enquiry problem and five booking fields. We then implemented and compared the NLP methods, investigated errors and expanded the interface into a shared enquiry workflow. Deployment checks, setup instructions and product videos completed the delivery phase.</w:t>
+      </w:r>
+    </w:p>
+    <w:p>
+      <w:r>
+        <w:rPr>
+          <w:b w:val="0"/>
+          <w:i w:val="0"/>
+        </w:rPr>
+        <w:t>Karthik Ramesh (26043455) took the technical lead, with responsibility for the application, NLP integration, evaluation tooling, deployment and technical verification.</w:t>
       </w:r>
     </w:p>
     <w:p>
@@ -5774,7 +5783,7 @@
           <w:b w:val="0"/>
           <w:i w:val="0"/>
         </w:rPr>
-        <w:t>Table 8. Project phases and outputs.</w:t>
+        <w:t>Table 8. Planned responsibilities for the final group review.</w:t>
       </w:r>
     </w:p>
     <w:tbl>
@@ -5824,7 +5833,7 @@
                 <w:color w:val="FFFFFF"/>
                 <w:sz w:val="20"/>
               </w:rPr>
-              <w:t>Phase</w:t>
+              <w:t>Group member</w:t>
             </w:r>
           </w:p>
         </w:tc>
@@ -5851,7 +5860,7 @@
                 <w:color w:val="FFFFFF"/>
                 <w:sz w:val="20"/>
               </w:rPr>
-              <w:t>Main output</w:t>
+              <w:t>Assigned review responsibility</w:t>
             </w:r>
           </w:p>
         </w:tc>
@@ -5882,7 +5891,7 @@
                 <w:i w:val="0"/>
                 <w:sz w:val="20"/>
               </w:rPr>
-              <w:t>Problem definition</w:t>
+              <w:t>Karthik Ramesh</w:t>
             </w:r>
           </w:p>
         </w:tc>
@@ -5908,7 +5917,7 @@
                 <w:i w:val="0"/>
                 <w:sz w:val="20"/>
               </w:rPr>
-              <w:t>Restaurant enquiry scope, five booking fields and staff review requirements</w:t>
+              <w:t>Technical accuracy, reproducibility and deployment details</w:t>
             </w:r>
           </w:p>
         </w:tc>
@@ -5939,7 +5948,7 @@
                 <w:i w:val="0"/>
                 <w:sz w:val="20"/>
               </w:rPr>
-              <w:t>NLP implementation</w:t>
+              <w:t>Avanish Rao</w:t>
             </w:r>
           </w:p>
         </w:tc>
@@ -5965,7 +5974,7 @@
                 <w:i w:val="0"/>
                 <w:sz w:val="20"/>
               </w:rPr>
-              <w:t>Rules, model extraction, source checks, controlled updates and limited repair calls</w:t>
+              <w:t>Dataset selection, preparation and experimental comparisons</w:t>
             </w:r>
           </w:p>
         </w:tc>
@@ -5996,7 +6005,7 @@
                 <w:i w:val="0"/>
                 <w:sz w:val="20"/>
               </w:rPr>
-              <w:t>Evaluation and correction</w:t>
+              <w:t>Pranav Chhetri</w:t>
             </w:r>
           </w:p>
         </w:tc>
@@ -6022,7 +6031,7 @@
                 <w:i w:val="0"/>
                 <w:sz w:val="20"/>
               </w:rPr>
-              <w:t>Dataset preparation, scoring, investigation of errors and regression tests</w:t>
+              <w:t>Scenario tests, error analysis and interpretation of results</w:t>
             </w:r>
           </w:p>
         </w:tc>
@@ -6053,7 +6062,7 @@
                 <w:i w:val="0"/>
                 <w:sz w:val="20"/>
               </w:rPr>
-              <w:t>Product development</w:t>
+              <w:t>Shivom Karnad</w:t>
             </w:r>
           </w:p>
         </w:tc>
@@ -6079,7 +6088,7 @@
                 <w:i w:val="0"/>
                 <w:sz w:val="20"/>
               </w:rPr>
-              <w:t>Restaurant interface, voice input, saved enquiries, team access and guest review</w:t>
+              <w:t>User journeys, interface clarity and product screenshots</w:t>
             </w:r>
           </w:p>
         </w:tc>
@@ -6110,7 +6119,7 @@
                 <w:i w:val="0"/>
                 <w:sz w:val="20"/>
               </w:rPr>
-              <w:t>Release and communication</w:t>
+              <w:t>Rishi Mundra</w:t>
             </w:r>
           </w:p>
         </w:tc>
@@ -6136,7 +6145,7 @@
                 <w:i w:val="0"/>
                 <w:sz w:val="20"/>
               </w:rPr>
-              <w:t>Deployment checks, setup instructions, product videos and analysis of results</w:t>
+              <w:t>Related research, APA references and consistency across report sections</w:t>
             </w:r>
           </w:p>
         </w:tc>
@@ -6150,15 +6159,6 @@
         <w:rPr>
           <w:sz w:val="4"/>
         </w:rPr>
-      </w:r>
-    </w:p>
-    <w:p>
-      <w:r>
-        <w:rPr>
-          <w:b w:val="0"/>
-          <w:i w:val="0"/>
-        </w:rPr>
-        <w:t>Within the group, Karthik Ramesh (26043455) took responsibility for technical implementation, including the application, NLP integration, evaluation tooling, deployment and technical verification.</w:t>
       </w:r>
     </w:p>
     <w:p>

</xml_diff>